<commit_message>
Java  sprites 1 (#20)
</commit_message>
<xml_diff>
--- a/LECTURES/DecadesOfSprites/Decades of SPRITES.docx
+++ b/LECTURES/DecadesOfSprites/Decades of SPRITES.docx
@@ -79,7 +79,7 @@
           <w:iCs/>
           <w:color w:val="FFFFFF" w:themeColor="background1"/>
         </w:rPr>
-        <w:t>It’s not a speed-run, it’s speed-coding</w:t>
+        <w:t>Are sprites still in use?</w:t>
       </w:r>
     </w:p>
     <w:p>
@@ -636,12 +636,14 @@
         <w:rPr>
           <w:rFonts w:ascii="C64 Pro Mono" w:hAnsi="C64 Pro Mono"/>
           <w:color w:val="FFFFFF" w:themeColor="background1"/>
-        </w:rPr>
-      </w:pPr>
-      <w:r>
-        <w:rPr>
-          <w:rFonts w:ascii="C64 Pro Mono" w:hAnsi="C64 Pro Mono"/>
-          <w:color w:val="FFFFFF" w:themeColor="background1"/>
+          <w:lang w:val="fr-FR"/>
+        </w:rPr>
+      </w:pPr>
+      <w:r>
+        <w:rPr>
+          <w:rFonts w:ascii="C64 Pro Mono" w:hAnsi="C64 Pro Mono"/>
+          <w:color w:val="FFFFFF" w:themeColor="background1"/>
+          <w:lang w:val="fr-FR"/>
         </w:rPr>
         <w:lastRenderedPageBreak/>
         <w:t>Atari 800XL (1981)</w:t>
@@ -652,23 +654,54 @@
         <w:rPr>
           <w:rFonts w:ascii="C64 Pro Mono" w:hAnsi="C64 Pro Mono"/>
           <w:color w:val="FFFFFF" w:themeColor="background1"/>
-        </w:rPr>
-      </w:pPr>
-    </w:p>
-    <w:p>
-      <w:pPr>
-        <w:rPr>
-          <w:rFonts w:ascii="C64 Pro Mono" w:hAnsi="C64 Pro Mono"/>
-          <w:color w:val="FFFFFF" w:themeColor="background1"/>
-        </w:rPr>
-      </w:pPr>
-      <w:r>
-        <w:rPr>
-          <w:rFonts w:ascii="C64 Pro Mono" w:hAnsi="C64 Pro Mono"/>
-          <w:color w:val="FFFFFF" w:themeColor="background1"/>
-        </w:rPr>
-        <w:t>8-bit microprocessor MOS 6502:</w:t>
-      </w:r>
+          <w:lang w:val="fr-FR"/>
+        </w:rPr>
+      </w:pPr>
+    </w:p>
+    <w:p>
+      <w:pPr>
+        <w:rPr>
+          <w:rFonts w:ascii="C64 Pro Mono" w:hAnsi="C64 Pro Mono"/>
+          <w:color w:val="FFFFFF" w:themeColor="background1"/>
+          <w:lang w:val="fr-FR"/>
+        </w:rPr>
+      </w:pPr>
+      <w:r>
+        <w:rPr>
+          <w:rFonts w:ascii="C64 Pro Mono" w:hAnsi="C64 Pro Mono"/>
+          <w:color w:val="FFFFFF" w:themeColor="background1"/>
+          <w:lang w:val="fr-FR"/>
+        </w:rPr>
+        <w:t xml:space="preserve">8-bit </w:t>
+      </w:r>
+      <w:proofErr w:type="spellStart"/>
+      <w:r>
+        <w:rPr>
+          <w:rFonts w:ascii="C64 Pro Mono" w:hAnsi="C64 Pro Mono"/>
+          <w:color w:val="FFFFFF" w:themeColor="background1"/>
+          <w:lang w:val="fr-FR"/>
+        </w:rPr>
+        <w:t>microprocessor</w:t>
+      </w:r>
+      <w:proofErr w:type="spellEnd"/>
+      <w:r>
+        <w:rPr>
+          <w:rFonts w:ascii="C64 Pro Mono" w:hAnsi="C64 Pro Mono"/>
+          <w:color w:val="FFFFFF" w:themeColor="background1"/>
+          <w:lang w:val="fr-FR"/>
+        </w:rPr>
+        <w:t xml:space="preserve"> MOS </w:t>
+      </w:r>
+      <w:proofErr w:type="gramStart"/>
+      <w:r>
+        <w:rPr>
+          <w:rFonts w:ascii="C64 Pro Mono" w:hAnsi="C64 Pro Mono"/>
+          <w:color w:val="FFFFFF" w:themeColor="background1"/>
+          <w:lang w:val="fr-FR"/>
+        </w:rPr>
+        <w:t>6502:</w:t>
+      </w:r>
+      <w:proofErr w:type="gramEnd"/>
     </w:p>
     <w:p>
       <w:pPr>
@@ -1100,6 +1133,2142 @@
         </w:rPr>
       </w:pPr>
     </w:p>
+    <w:p>
+      <w:pPr>
+        <w:rPr>
+          <w:rFonts w:ascii="C64 Pro Mono" w:hAnsi="C64 Pro Mono"/>
+          <w:color w:val="FFFFFF" w:themeColor="background1"/>
+        </w:rPr>
+      </w:pPr>
+    </w:p>
+    <w:p>
+      <w:pPr>
+        <w:rPr>
+          <w:rFonts w:ascii="C64 Pro Mono" w:hAnsi="C64 Pro Mono"/>
+          <w:color w:val="FFFFFF" w:themeColor="background1"/>
+        </w:rPr>
+      </w:pPr>
+    </w:p>
+    <w:p>
+      <w:pPr>
+        <w:rPr>
+          <w:rFonts w:ascii="C64 Pro Mono" w:hAnsi="C64 Pro Mono"/>
+          <w:color w:val="FFFFFF" w:themeColor="background1"/>
+        </w:rPr>
+      </w:pPr>
+    </w:p>
+    <w:p>
+      <w:pPr>
+        <w:rPr>
+          <w:rFonts w:ascii="C64 Pro Mono" w:hAnsi="C64 Pro Mono"/>
+          <w:color w:val="FFFFFF" w:themeColor="background1"/>
+        </w:rPr>
+      </w:pPr>
+      <w:r>
+        <w:rPr>
+          <w:rFonts w:ascii="C64 Pro Mono" w:hAnsi="C64 Pro Mono"/>
+          <w:color w:val="FFFFFF" w:themeColor="background1"/>
+        </w:rPr>
+        <w:br w:type="page"/>
+      </w:r>
+    </w:p>
+    <w:p>
+      <w:pPr>
+        <w:rPr>
+          <w:rFonts w:ascii="C64 Pro Mono" w:hAnsi="C64 Pro Mono"/>
+          <w:color w:val="FFFFFF" w:themeColor="background1"/>
+          <w:lang w:val="fr-FR"/>
+        </w:rPr>
+      </w:pPr>
+      <w:r>
+        <w:rPr>
+          <w:rFonts w:ascii="C64 Pro Mono" w:hAnsi="C64 Pro Mono"/>
+          <w:color w:val="FFFFFF" w:themeColor="background1"/>
+          <w:lang w:val="fr-FR"/>
+        </w:rPr>
+        <w:lastRenderedPageBreak/>
+        <w:t>Sprite manipulation :</w:t>
+      </w:r>
+      <w:r>
+        <w:rPr>
+          <w:rFonts w:ascii="C64 Pro Mono" w:hAnsi="C64 Pro Mono"/>
+          <w:color w:val="FFFFFF" w:themeColor="background1"/>
+          <w:lang w:val="fr-FR"/>
+        </w:rPr>
+        <w:t xml:space="preserve"> </w:t>
+      </w:r>
+      <w:r>
+        <w:rPr>
+          <w:rFonts w:ascii="C64 Pro Mono" w:hAnsi="C64 Pro Mono"/>
+          <w:color w:val="FFFFFF" w:themeColor="background1"/>
+          <w:lang w:val="fr-FR"/>
+        </w:rPr>
+        <w:t>C64 vs J</w:t>
+      </w:r>
+      <w:r>
+        <w:rPr>
+          <w:rFonts w:ascii="C64 Pro Mono" w:hAnsi="C64 Pro Mono"/>
+          <w:color w:val="FFFFFF" w:themeColor="background1"/>
+          <w:lang w:val="fr-FR"/>
+        </w:rPr>
+        <w:t xml:space="preserve">ava vs JS </w:t>
+      </w:r>
+    </w:p>
+    <w:p>
+      <w:pPr>
+        <w:rPr>
+          <w:rFonts w:ascii="C64 Pro Mono" w:hAnsi="C64 Pro Mono"/>
+          <w:color w:val="FFFFFF" w:themeColor="background1"/>
+          <w:lang w:val="fr-FR"/>
+        </w:rPr>
+      </w:pPr>
+    </w:p>
+    <w:p>
+      <w:pPr>
+        <w:pStyle w:val="ListParagraph"/>
+        <w:numPr>
+          <w:ilvl w:val="1"/>
+          <w:numId w:val="3"/>
+        </w:numPr>
+        <w:rPr>
+          <w:rFonts w:ascii="C64 Pro Mono" w:hAnsi="C64 Pro Mono"/>
+          <w:color w:val="FFFFFF" w:themeColor="background1"/>
+          <w:lang w:val="fr-FR"/>
+        </w:rPr>
+      </w:pPr>
+      <w:r>
+        <w:rPr>
+          <w:rFonts w:ascii="C64 Pro Mono" w:hAnsi="C64 Pro Mono"/>
+          <w:color w:val="FFFFFF" w:themeColor="background1"/>
+          <w:lang w:val="fr-FR"/>
+        </w:rPr>
+        <w:t>Position/</w:t>
+      </w:r>
+      <w:proofErr w:type="spellStart"/>
+      <w:r>
+        <w:rPr>
+          <w:rFonts w:ascii="C64 Pro Mono" w:hAnsi="C64 Pro Mono"/>
+          <w:color w:val="FFFFFF" w:themeColor="background1"/>
+          <w:lang w:val="fr-FR"/>
+        </w:rPr>
+        <w:t>Movement</w:t>
+      </w:r>
+      <w:proofErr w:type="spellEnd"/>
+    </w:p>
+    <w:tbl>
+      <w:tblPr>
+        <w:tblStyle w:val="TableGrid"/>
+        <w:tblW w:w="0" w:type="auto"/>
+        <w:tblLook w:val="04A0" w:firstRow="1" w:lastRow="0" w:firstColumn="1" w:lastColumn="0" w:noHBand="0" w:noVBand="1"/>
+      </w:tblPr>
+      <w:tblGrid>
+        <w:gridCol w:w="3005"/>
+        <w:gridCol w:w="3005"/>
+        <w:gridCol w:w="3006"/>
+      </w:tblGrid>
+      <w:tr>
+        <w:tc>
+          <w:tcPr>
+            <w:tcW w:w="3005" w:type="dxa"/>
+          </w:tcPr>
+          <w:p>
+            <w:pPr>
+              <w:rPr>
+                <w:rFonts w:ascii="C64 Pro Mono" w:hAnsi="C64 Pro Mono"/>
+                <w:color w:val="FFFFFF" w:themeColor="background1"/>
+                <w:lang w:val="fr-FR"/>
+              </w:rPr>
+            </w:pPr>
+            <w:r>
+              <w:rPr>
+                <w:rFonts w:ascii="C64 Pro Mono" w:hAnsi="C64 Pro Mono"/>
+                <w:color w:val="FFFFFF" w:themeColor="background1"/>
+                <w:lang w:val="fr-FR"/>
+              </w:rPr>
+              <w:t xml:space="preserve">Commodore </w:t>
+            </w:r>
+          </w:p>
+        </w:tc>
+        <w:tc>
+          <w:tcPr>
+            <w:tcW w:w="3005" w:type="dxa"/>
+          </w:tcPr>
+          <w:p>
+            <w:pPr>
+              <w:rPr>
+                <w:rFonts w:ascii="C64 Pro Mono" w:hAnsi="C64 Pro Mono"/>
+                <w:color w:val="FFFFFF" w:themeColor="background1"/>
+                <w:lang w:val="fr-FR"/>
+              </w:rPr>
+            </w:pPr>
+            <w:r>
+              <w:rPr>
+                <w:rFonts w:ascii="C64 Pro Mono" w:hAnsi="C64 Pro Mono"/>
+                <w:color w:val="FFFFFF" w:themeColor="background1"/>
+                <w:lang w:val="fr-FR"/>
+              </w:rPr>
+              <w:t>Java GDX</w:t>
+            </w:r>
+          </w:p>
+        </w:tc>
+        <w:tc>
+          <w:tcPr>
+            <w:tcW w:w="3006" w:type="dxa"/>
+          </w:tcPr>
+          <w:p>
+            <w:pPr>
+              <w:rPr>
+                <w:rFonts w:ascii="C64 Pro Mono" w:hAnsi="C64 Pro Mono"/>
+                <w:color w:val="FFFFFF" w:themeColor="background1"/>
+                <w:lang w:val="fr-FR"/>
+              </w:rPr>
+            </w:pPr>
+            <w:r>
+              <w:rPr>
+                <w:rFonts w:ascii="C64 Pro Mono" w:hAnsi="C64 Pro Mono"/>
+                <w:color w:val="FFFFFF" w:themeColor="background1"/>
+                <w:lang w:val="fr-FR"/>
+              </w:rPr>
+              <w:t>JS Phaser</w:t>
+            </w:r>
+          </w:p>
+        </w:tc>
+      </w:tr>
+      <w:tr>
+        <w:trPr>
+          <w:trHeight w:val="2087"/>
+        </w:trPr>
+        <w:tc>
+          <w:tcPr>
+            <w:tcW w:w="3005" w:type="dxa"/>
+          </w:tcPr>
+          <w:p>
+            <w:pPr>
+              <w:rPr>
+                <w:rFonts w:ascii="Abadi" w:hAnsi="Abadi"/>
+                <w:color w:val="FFFFFF" w:themeColor="background1"/>
+                <w:lang w:val="fr-FR"/>
+              </w:rPr>
+            </w:pPr>
+            <w:proofErr w:type="spellStart"/>
+            <w:r>
+              <w:rPr>
+                <w:rFonts w:ascii="Abadi" w:hAnsi="Abadi"/>
+                <w:color w:val="FFFFFF" w:themeColor="background1"/>
+                <w:lang w:val="fr-FR"/>
+              </w:rPr>
+              <w:t>Cells</w:t>
+            </w:r>
+            <w:proofErr w:type="spellEnd"/>
+            <w:r>
+              <w:rPr>
+                <w:rFonts w:ascii="Abadi" w:hAnsi="Abadi"/>
+                <w:color w:val="FFFFFF" w:themeColor="background1"/>
+                <w:lang w:val="fr-FR"/>
+              </w:rPr>
+              <w:t xml:space="preserve"> : </w:t>
+            </w:r>
+          </w:p>
+          <w:tbl>
+            <w:tblPr>
+              <w:tblpPr w:leftFromText="45" w:rightFromText="45" w:vertAnchor="text"/>
+              <w:tblW w:w="5000" w:type="pct"/>
+              <w:tblCellSpacing w:w="15" w:type="dxa"/>
+              <w:tblBorders>
+                <w:top w:val="outset" w:sz="6" w:space="0" w:color="auto"/>
+                <w:left w:val="outset" w:sz="6" w:space="0" w:color="auto"/>
+                <w:bottom w:val="outset" w:sz="6" w:space="0" w:color="auto"/>
+                <w:right w:val="outset" w:sz="6" w:space="0" w:color="auto"/>
+              </w:tblBorders>
+              <w:tblCellMar>
+                <w:top w:w="15" w:type="dxa"/>
+                <w:left w:w="15" w:type="dxa"/>
+                <w:bottom w:w="15" w:type="dxa"/>
+                <w:right w:w="15" w:type="dxa"/>
+              </w:tblCellMar>
+              <w:tblLook w:val="04A0" w:firstRow="1" w:lastRow="0" w:firstColumn="1" w:lastColumn="0" w:noHBand="0" w:noVBand="1"/>
+            </w:tblPr>
+            <w:tblGrid>
+              <w:gridCol w:w="775"/>
+              <w:gridCol w:w="1998"/>
+            </w:tblGrid>
+            <w:tr>
+              <w:trPr>
+                <w:tblCellSpacing w:w="15" w:type="dxa"/>
+              </w:trPr>
+              <w:tc>
+                <w:tcPr>
+                  <w:tcW w:w="0" w:type="auto"/>
+                  <w:tcBorders>
+                    <w:top w:val="outset" w:sz="6" w:space="0" w:color="auto"/>
+                    <w:left w:val="outset" w:sz="6" w:space="0" w:color="auto"/>
+                    <w:bottom w:val="outset" w:sz="6" w:space="0" w:color="auto"/>
+                    <w:right w:val="outset" w:sz="6" w:space="0" w:color="auto"/>
+                  </w:tcBorders>
+                  <w:hideMark/>
+                </w:tcPr>
+                <w:p>
+                  <w:pPr>
+                    <w:spacing w:after="0" w:line="240" w:lineRule="auto"/>
+                    <w:rPr>
+                      <w:rFonts w:ascii="Abadi" w:hAnsi="Abadi"/>
+                      <w:color w:val="FFFFFF" w:themeColor="background1"/>
+                    </w:rPr>
+                  </w:pPr>
+                  <w:r>
+                    <w:rPr>
+                      <w:rFonts w:ascii="Abadi" w:hAnsi="Abadi"/>
+                      <w:color w:val="FFFFFF" w:themeColor="background1"/>
+                    </w:rPr>
+                    <w:t>$D000</w:t>
+                  </w:r>
+                  <w:r>
+                    <w:rPr>
+                      <w:rFonts w:ascii="Abadi" w:hAnsi="Abadi"/>
+                      <w:color w:val="FFFFFF" w:themeColor="background1"/>
+                    </w:rPr>
+                    <w:br/>
+                    <w:t>53248</w:t>
+                  </w:r>
+                </w:p>
+              </w:tc>
+              <w:tc>
+                <w:tcPr>
+                  <w:tcW w:w="0" w:type="auto"/>
+                  <w:tcBorders>
+                    <w:top w:val="outset" w:sz="6" w:space="0" w:color="auto"/>
+                    <w:left w:val="outset" w:sz="6" w:space="0" w:color="auto"/>
+                    <w:bottom w:val="outset" w:sz="6" w:space="0" w:color="auto"/>
+                    <w:right w:val="outset" w:sz="6" w:space="0" w:color="auto"/>
+                  </w:tcBorders>
+                  <w:hideMark/>
+                </w:tcPr>
+                <w:p>
+                  <w:pPr>
+                    <w:spacing w:after="0" w:line="240" w:lineRule="auto"/>
+                    <w:rPr>
+                      <w:rFonts w:ascii="Abadi" w:hAnsi="Abadi"/>
+                      <w:color w:val="FFFFFF" w:themeColor="background1"/>
+                    </w:rPr>
+                  </w:pPr>
+                  <w:r>
+                    <w:rPr>
+                      <w:rFonts w:ascii="Abadi" w:hAnsi="Abadi"/>
+                      <w:color w:val="FFFFFF" w:themeColor="background1"/>
+                    </w:rPr>
+                    <w:t>Sprite #0 X-coordinate (only bits #0-#7).</w:t>
+                  </w:r>
+                </w:p>
+              </w:tc>
+            </w:tr>
+            <w:tr>
+              <w:trPr>
+                <w:tblCellSpacing w:w="15" w:type="dxa"/>
+              </w:trPr>
+              <w:tc>
+                <w:tcPr>
+                  <w:tcW w:w="0" w:type="auto"/>
+                  <w:tcBorders>
+                    <w:top w:val="outset" w:sz="6" w:space="0" w:color="auto"/>
+                    <w:left w:val="outset" w:sz="6" w:space="0" w:color="auto"/>
+                    <w:bottom w:val="outset" w:sz="6" w:space="0" w:color="auto"/>
+                    <w:right w:val="outset" w:sz="6" w:space="0" w:color="auto"/>
+                  </w:tcBorders>
+                  <w:hideMark/>
+                </w:tcPr>
+                <w:p>
+                  <w:pPr>
+                    <w:spacing w:after="0" w:line="240" w:lineRule="auto"/>
+                    <w:rPr>
+                      <w:rFonts w:ascii="Abadi" w:hAnsi="Abadi"/>
+                      <w:color w:val="FFFFFF" w:themeColor="background1"/>
+                    </w:rPr>
+                  </w:pPr>
+                  <w:r>
+                    <w:rPr>
+                      <w:rFonts w:ascii="Abadi" w:hAnsi="Abadi"/>
+                      <w:color w:val="FFFFFF" w:themeColor="background1"/>
+                    </w:rPr>
+                    <w:t>$D001</w:t>
+                  </w:r>
+                  <w:r>
+                    <w:rPr>
+                      <w:rFonts w:ascii="Abadi" w:hAnsi="Abadi"/>
+                      <w:color w:val="FFFFFF" w:themeColor="background1"/>
+                    </w:rPr>
+                    <w:br/>
+                    <w:t>53249</w:t>
+                  </w:r>
+                </w:p>
+              </w:tc>
+              <w:tc>
+                <w:tcPr>
+                  <w:tcW w:w="0" w:type="auto"/>
+                  <w:tcBorders>
+                    <w:top w:val="outset" w:sz="6" w:space="0" w:color="auto"/>
+                    <w:left w:val="outset" w:sz="6" w:space="0" w:color="auto"/>
+                    <w:bottom w:val="outset" w:sz="6" w:space="0" w:color="auto"/>
+                    <w:right w:val="outset" w:sz="6" w:space="0" w:color="auto"/>
+                  </w:tcBorders>
+                  <w:hideMark/>
+                </w:tcPr>
+                <w:p>
+                  <w:pPr>
+                    <w:spacing w:after="0" w:line="240" w:lineRule="auto"/>
+                    <w:rPr>
+                      <w:rFonts w:ascii="Abadi" w:hAnsi="Abadi"/>
+                      <w:color w:val="FFFFFF" w:themeColor="background1"/>
+                    </w:rPr>
+                  </w:pPr>
+                  <w:r>
+                    <w:rPr>
+                      <w:rFonts w:ascii="Abadi" w:hAnsi="Abadi"/>
+                      <w:color w:val="FFFFFF" w:themeColor="background1"/>
+                    </w:rPr>
+                    <w:t>Sprite #0 Y-coordinate.</w:t>
+                  </w:r>
+                </w:p>
+              </w:tc>
+            </w:tr>
+          </w:tbl>
+          <w:p>
+            <w:pPr>
+              <w:rPr>
+                <w:rFonts w:ascii="Abadi" w:hAnsi="Abadi"/>
+                <w:color w:val="FFFFFF" w:themeColor="background1"/>
+                <w:lang w:val="fr-FR"/>
+              </w:rPr>
+            </w:pPr>
+          </w:p>
+          <w:p>
+            <w:pPr>
+              <w:rPr>
+                <w:rFonts w:ascii="Abadi" w:hAnsi="Abadi"/>
+                <w:color w:val="FFFFFF" w:themeColor="background1"/>
+              </w:rPr>
+            </w:pPr>
+            <w:r>
+              <w:rPr>
+                <w:rFonts w:ascii="Abadi" w:hAnsi="Abadi"/>
+                <w:color w:val="FFFFFF" w:themeColor="background1"/>
+              </w:rPr>
+              <w:t xml:space="preserve">Cells $D002 - $D010 – </w:t>
+            </w:r>
+            <w:proofErr w:type="spellStart"/>
+            <w:r>
+              <w:rPr>
+                <w:rFonts w:ascii="Abadi" w:hAnsi="Abadi"/>
+                <w:color w:val="FFFFFF" w:themeColor="background1"/>
+              </w:rPr>
+              <w:t>remaing</w:t>
+            </w:r>
+            <w:proofErr w:type="spellEnd"/>
+            <w:r>
+              <w:rPr>
+                <w:rFonts w:ascii="Abadi" w:hAnsi="Abadi"/>
+                <w:color w:val="FFFFFF" w:themeColor="background1"/>
+              </w:rPr>
+              <w:t xml:space="preserve"> 7 s</w:t>
+            </w:r>
+            <w:r>
+              <w:rPr>
+                <w:rFonts w:ascii="Abadi" w:hAnsi="Abadi"/>
+                <w:color w:val="FFFFFF" w:themeColor="background1"/>
+              </w:rPr>
+              <w:t>prites</w:t>
+            </w:r>
+          </w:p>
+        </w:tc>
+        <w:tc>
+          <w:tcPr>
+            <w:tcW w:w="3005" w:type="dxa"/>
+          </w:tcPr>
+          <w:p>
+            <w:pPr>
+              <w:rPr>
+                <w:rFonts w:ascii="Abadi" w:hAnsi="Abadi"/>
+                <w:color w:val="FFFFFF" w:themeColor="background1"/>
+              </w:rPr>
+            </w:pPr>
+          </w:p>
+          <w:p>
+            <w:pPr>
+              <w:rPr>
+                <w:rFonts w:ascii="Abadi" w:hAnsi="Abadi"/>
+                <w:color w:val="FFFFFF" w:themeColor="background1"/>
+              </w:rPr>
+            </w:pPr>
+            <w:proofErr w:type="spellStart"/>
+            <w:proofErr w:type="gramStart"/>
+            <w:r>
+              <w:rPr>
+                <w:rFonts w:ascii="Abadi" w:hAnsi="Abadi"/>
+                <w:color w:val="FFFFFF" w:themeColor="background1"/>
+              </w:rPr>
+              <w:t>sprite.setPosition</w:t>
+            </w:r>
+            <w:proofErr w:type="spellEnd"/>
+            <w:proofErr w:type="gramEnd"/>
+            <w:r>
+              <w:rPr>
+                <w:rFonts w:ascii="Abadi" w:hAnsi="Abadi"/>
+                <w:color w:val="FFFFFF" w:themeColor="background1"/>
+              </w:rPr>
+              <w:t>(</w:t>
+            </w:r>
+            <w:r>
+              <w:rPr>
+                <w:rFonts w:ascii="Abadi" w:hAnsi="Abadi"/>
+                <w:color w:val="FFFFFF" w:themeColor="background1"/>
+              </w:rPr>
+              <w:t>100,200</w:t>
+            </w:r>
+            <w:proofErr w:type="gramStart"/>
+            <w:r>
+              <w:rPr>
+                <w:rFonts w:ascii="Abadi" w:hAnsi="Abadi"/>
+                <w:color w:val="FFFFFF" w:themeColor="background1"/>
+              </w:rPr>
+              <w:t>);</w:t>
+            </w:r>
+            <w:proofErr w:type="gramEnd"/>
+          </w:p>
+          <w:p>
+            <w:pPr>
+              <w:rPr>
+                <w:rFonts w:ascii="Abadi" w:hAnsi="Abadi"/>
+                <w:color w:val="FFFFFF" w:themeColor="background1"/>
+                <w:lang w:val="fr-FR"/>
+              </w:rPr>
+            </w:pPr>
+          </w:p>
+        </w:tc>
+        <w:tc>
+          <w:tcPr>
+            <w:tcW w:w="3006" w:type="dxa"/>
+          </w:tcPr>
+          <w:p>
+            <w:pPr>
+              <w:rPr>
+                <w:rFonts w:ascii="Abadi" w:hAnsi="Abadi"/>
+                <w:color w:val="FFFFFF" w:themeColor="background1"/>
+                <w:lang w:val="fr-FR"/>
+              </w:rPr>
+            </w:pPr>
+          </w:p>
+          <w:p>
+            <w:pPr>
+              <w:rPr>
+                <w:rFonts w:ascii="Abadi" w:hAnsi="Abadi"/>
+                <w:color w:val="FFFFFF" w:themeColor="background1"/>
+                <w:lang w:val="fr-FR"/>
+              </w:rPr>
+            </w:pPr>
+            <w:proofErr w:type="spellStart"/>
+            <w:proofErr w:type="gramStart"/>
+            <w:r>
+              <w:rPr>
+                <w:rFonts w:ascii="Abadi" w:hAnsi="Abadi"/>
+                <w:color w:val="FFFFFF" w:themeColor="background1"/>
+                <w:lang w:val="fr-FR"/>
+              </w:rPr>
+              <w:t>sprite.</w:t>
+            </w:r>
+            <w:r>
+              <w:rPr>
+                <w:rFonts w:ascii="Abadi" w:hAnsi="Abadi"/>
+                <w:color w:val="FFFFFF" w:themeColor="background1"/>
+                <w:lang w:val="fr-FR"/>
+              </w:rPr>
+              <w:t>y</w:t>
+            </w:r>
+            <w:proofErr w:type="spellEnd"/>
+            <w:proofErr w:type="gramEnd"/>
+            <w:r>
+              <w:rPr>
+                <w:rFonts w:ascii="Abadi" w:hAnsi="Abadi"/>
+                <w:color w:val="FFFFFF" w:themeColor="background1"/>
+                <w:lang w:val="fr-FR"/>
+              </w:rPr>
+              <w:t xml:space="preserve"> = 200 ;</w:t>
+            </w:r>
+          </w:p>
+        </w:tc>
+      </w:tr>
+    </w:tbl>
+    <w:p>
+      <w:pPr>
+        <w:rPr>
+          <w:rFonts w:ascii="C64 Pro Mono" w:hAnsi="C64 Pro Mono"/>
+          <w:color w:val="FFFFFF" w:themeColor="background1"/>
+          <w:lang w:val="fr-FR"/>
+        </w:rPr>
+      </w:pPr>
+    </w:p>
+    <w:p>
+      <w:pPr>
+        <w:pStyle w:val="ListParagraph"/>
+        <w:numPr>
+          <w:ilvl w:val="1"/>
+          <w:numId w:val="6"/>
+        </w:numPr>
+        <w:rPr>
+          <w:rFonts w:ascii="C64 Pro Mono" w:hAnsi="C64 Pro Mono"/>
+          <w:color w:val="FFFFFF" w:themeColor="background1"/>
+          <w:lang w:val="fr-FR"/>
+        </w:rPr>
+      </w:pPr>
+      <w:proofErr w:type="spellStart"/>
+      <w:r>
+        <w:rPr>
+          <w:rFonts w:ascii="C64 Pro Mono" w:hAnsi="C64 Pro Mono"/>
+          <w:color w:val="FFFFFF" w:themeColor="background1"/>
+          <w:lang w:val="fr-FR"/>
+        </w:rPr>
+        <w:t>Scaling</w:t>
+      </w:r>
+      <w:proofErr w:type="spellEnd"/>
+    </w:p>
+    <w:tbl>
+      <w:tblPr>
+        <w:tblStyle w:val="TableGrid"/>
+        <w:tblW w:w="0" w:type="auto"/>
+        <w:tblLook w:val="04A0" w:firstRow="1" w:lastRow="0" w:firstColumn="1" w:lastColumn="0" w:noHBand="0" w:noVBand="1"/>
+      </w:tblPr>
+      <w:tblGrid>
+        <w:gridCol w:w="3005"/>
+        <w:gridCol w:w="3005"/>
+        <w:gridCol w:w="3006"/>
+      </w:tblGrid>
+      <w:tr>
+        <w:tc>
+          <w:tcPr>
+            <w:tcW w:w="3005" w:type="dxa"/>
+          </w:tcPr>
+          <w:p>
+            <w:pPr>
+              <w:rPr>
+                <w:rFonts w:ascii="C64 Pro Mono" w:hAnsi="C64 Pro Mono"/>
+                <w:color w:val="FFFFFF" w:themeColor="background1"/>
+                <w:lang w:val="fr-FR"/>
+              </w:rPr>
+            </w:pPr>
+            <w:r>
+              <w:rPr>
+                <w:rFonts w:ascii="C64 Pro Mono" w:hAnsi="C64 Pro Mono"/>
+                <w:color w:val="FFFFFF" w:themeColor="background1"/>
+                <w:lang w:val="fr-FR"/>
+              </w:rPr>
+              <w:t xml:space="preserve">Commodore </w:t>
+            </w:r>
+          </w:p>
+        </w:tc>
+        <w:tc>
+          <w:tcPr>
+            <w:tcW w:w="3005" w:type="dxa"/>
+          </w:tcPr>
+          <w:p>
+            <w:pPr>
+              <w:rPr>
+                <w:rFonts w:ascii="C64 Pro Mono" w:hAnsi="C64 Pro Mono"/>
+                <w:color w:val="FFFFFF" w:themeColor="background1"/>
+                <w:lang w:val="fr-FR"/>
+              </w:rPr>
+            </w:pPr>
+            <w:r>
+              <w:rPr>
+                <w:rFonts w:ascii="C64 Pro Mono" w:hAnsi="C64 Pro Mono"/>
+                <w:color w:val="FFFFFF" w:themeColor="background1"/>
+                <w:lang w:val="fr-FR"/>
+              </w:rPr>
+              <w:t>Java GDX</w:t>
+            </w:r>
+          </w:p>
+        </w:tc>
+        <w:tc>
+          <w:tcPr>
+            <w:tcW w:w="3006" w:type="dxa"/>
+          </w:tcPr>
+          <w:p>
+            <w:pPr>
+              <w:rPr>
+                <w:rFonts w:ascii="C64 Pro Mono" w:hAnsi="C64 Pro Mono"/>
+                <w:color w:val="FFFFFF" w:themeColor="background1"/>
+                <w:lang w:val="fr-FR"/>
+              </w:rPr>
+            </w:pPr>
+            <w:r>
+              <w:rPr>
+                <w:rFonts w:ascii="C64 Pro Mono" w:hAnsi="C64 Pro Mono"/>
+                <w:color w:val="FFFFFF" w:themeColor="background1"/>
+                <w:lang w:val="fr-FR"/>
+              </w:rPr>
+              <w:t>JS Phaser</w:t>
+            </w:r>
+          </w:p>
+        </w:tc>
+      </w:tr>
+      <w:tr>
+        <w:tc>
+          <w:tcPr>
+            <w:tcW w:w="3005" w:type="dxa"/>
+          </w:tcPr>
+          <w:p>
+            <w:pPr>
+              <w:rPr>
+                <w:rFonts w:ascii="Abadi" w:hAnsi="Abadi"/>
+                <w:color w:val="FFFFFF" w:themeColor="background1"/>
+                <w:lang w:val="fr-FR"/>
+              </w:rPr>
+            </w:pPr>
+            <w:proofErr w:type="spellStart"/>
+            <w:r>
+              <w:rPr>
+                <w:rFonts w:ascii="Abadi" w:hAnsi="Abadi"/>
+                <w:color w:val="FFFFFF" w:themeColor="background1"/>
+                <w:lang w:val="fr-FR"/>
+              </w:rPr>
+              <w:t>Cells</w:t>
+            </w:r>
+            <w:proofErr w:type="spellEnd"/>
+            <w:r>
+              <w:rPr>
+                <w:rFonts w:ascii="Abadi" w:hAnsi="Abadi"/>
+                <w:color w:val="FFFFFF" w:themeColor="background1"/>
+                <w:lang w:val="fr-FR"/>
+              </w:rPr>
+              <w:t xml:space="preserve"> : </w:t>
+            </w:r>
+          </w:p>
+          <w:tbl>
+            <w:tblPr>
+              <w:tblpPr w:leftFromText="45" w:rightFromText="45" w:vertAnchor="text"/>
+              <w:tblW w:w="5000" w:type="pct"/>
+              <w:tblCellSpacing w:w="15" w:type="dxa"/>
+              <w:tblBorders>
+                <w:top w:val="outset" w:sz="6" w:space="0" w:color="auto"/>
+                <w:left w:val="outset" w:sz="6" w:space="0" w:color="auto"/>
+                <w:bottom w:val="outset" w:sz="6" w:space="0" w:color="auto"/>
+                <w:right w:val="outset" w:sz="6" w:space="0" w:color="auto"/>
+              </w:tblBorders>
+              <w:tblCellMar>
+                <w:top w:w="15" w:type="dxa"/>
+                <w:left w:w="15" w:type="dxa"/>
+                <w:bottom w:w="15" w:type="dxa"/>
+                <w:right w:w="15" w:type="dxa"/>
+              </w:tblCellMar>
+              <w:tblLook w:val="04A0" w:firstRow="1" w:lastRow="0" w:firstColumn="1" w:lastColumn="0" w:noHBand="0" w:noVBand="1"/>
+            </w:tblPr>
+            <w:tblGrid>
+              <w:gridCol w:w="793"/>
+              <w:gridCol w:w="1980"/>
+            </w:tblGrid>
+            <w:tr>
+              <w:trPr>
+                <w:trHeight w:val="645"/>
+                <w:tblCellSpacing w:w="15" w:type="dxa"/>
+              </w:trPr>
+              <w:tc>
+                <w:tcPr>
+                  <w:tcW w:w="0" w:type="auto"/>
+                  <w:tcBorders>
+                    <w:top w:val="outset" w:sz="6" w:space="0" w:color="auto"/>
+                    <w:left w:val="outset" w:sz="6" w:space="0" w:color="auto"/>
+                    <w:bottom w:val="outset" w:sz="6" w:space="0" w:color="auto"/>
+                    <w:right w:val="outset" w:sz="6" w:space="0" w:color="auto"/>
+                  </w:tcBorders>
+                </w:tcPr>
+                <w:p>
+                  <w:pPr>
+                    <w:spacing w:after="0" w:line="240" w:lineRule="auto"/>
+                    <w:rPr>
+                      <w:rFonts w:ascii="Abadi" w:hAnsi="Abadi"/>
+                      <w:color w:val="FFFFFF" w:themeColor="background1"/>
+                    </w:rPr>
+                  </w:pPr>
+                  <w:r>
+                    <w:rPr>
+                      <w:rFonts w:ascii="Abadi" w:hAnsi="Abadi"/>
+                      <w:color w:val="FFFFFF" w:themeColor="background1"/>
+                    </w:rPr>
+                    <w:lastRenderedPageBreak/>
+                    <w:t>$D017</w:t>
+                  </w:r>
+                  <w:r>
+                    <w:rPr>
+                      <w:rFonts w:ascii="Abadi" w:hAnsi="Abadi"/>
+                      <w:color w:val="FFFFFF" w:themeColor="background1"/>
+                    </w:rPr>
+                    <w:br/>
+                    <w:t>53271</w:t>
+                  </w:r>
+                </w:p>
+              </w:tc>
+              <w:tc>
+                <w:tcPr>
+                  <w:tcW w:w="0" w:type="auto"/>
+                  <w:vMerge w:val="restart"/>
+                  <w:tcBorders>
+                    <w:top w:val="outset" w:sz="6" w:space="0" w:color="auto"/>
+                    <w:left w:val="outset" w:sz="6" w:space="0" w:color="auto"/>
+                    <w:right w:val="outset" w:sz="6" w:space="0" w:color="auto"/>
+                  </w:tcBorders>
+                </w:tcPr>
+                <w:p>
+                  <w:pPr>
+                    <w:spacing w:after="0" w:line="240" w:lineRule="auto"/>
+                    <w:rPr>
+                      <w:rFonts w:ascii="Abadi" w:hAnsi="Abadi"/>
+                      <w:color w:val="FFFFFF" w:themeColor="background1"/>
+                    </w:rPr>
+                  </w:pPr>
+                  <w:r>
+                    <w:rPr>
+                      <w:rFonts w:ascii="Abadi" w:hAnsi="Abadi"/>
+                      <w:color w:val="FFFFFF" w:themeColor="background1"/>
+                    </w:rPr>
+                    <w:t xml:space="preserve">Sprite double </w:t>
+                  </w:r>
+                  <w:r>
+                    <w:rPr>
+                      <w:rFonts w:ascii="Abadi" w:hAnsi="Abadi"/>
+                      <w:color w:val="FFFFFF" w:themeColor="background1"/>
+                    </w:rPr>
+                    <w:t>height/</w:t>
+                  </w:r>
+                  <w:r>
+                    <w:rPr>
+                      <w:rFonts w:ascii="Abadi" w:hAnsi="Abadi"/>
+                      <w:color w:val="FFFFFF" w:themeColor="background1"/>
+                    </w:rPr>
+                    <w:t>width register. Bits:</w:t>
+                  </w:r>
+                  <w:r>
+                    <w:rPr>
+                      <w:rFonts w:ascii="Abadi" w:hAnsi="Abadi"/>
+                      <w:color w:val="FFFFFF" w:themeColor="background1"/>
+                    </w:rPr>
+                    <w:t xml:space="preserve"> </w:t>
+                  </w:r>
+                  <w:r>
+                    <w:rPr>
+                      <w:rFonts w:ascii="Abadi" w:hAnsi="Abadi"/>
+                      <w:color w:val="FFFFFF" w:themeColor="background1"/>
+                    </w:rPr>
+                    <w:t>Bit #x: 1 = Sprite #x is stretched to double width.</w:t>
+                  </w:r>
+                </w:p>
+              </w:tc>
+            </w:tr>
+            <w:tr>
+              <w:trPr>
+                <w:tblCellSpacing w:w="15" w:type="dxa"/>
+              </w:trPr>
+              <w:tc>
+                <w:tcPr>
+                  <w:tcW w:w="0" w:type="auto"/>
+                  <w:tcBorders>
+                    <w:top w:val="outset" w:sz="6" w:space="0" w:color="auto"/>
+                    <w:left w:val="outset" w:sz="6" w:space="0" w:color="auto"/>
+                    <w:bottom w:val="outset" w:sz="6" w:space="0" w:color="auto"/>
+                    <w:right w:val="outset" w:sz="6" w:space="0" w:color="auto"/>
+                  </w:tcBorders>
+                  <w:hideMark/>
+                </w:tcPr>
+                <w:p>
+                  <w:pPr>
+                    <w:spacing w:after="0" w:line="240" w:lineRule="auto"/>
+                    <w:rPr>
+                      <w:rFonts w:ascii="Abadi" w:hAnsi="Abadi"/>
+                      <w:color w:val="FFFFFF" w:themeColor="background1"/>
+                    </w:rPr>
+                  </w:pPr>
+                  <w:r>
+                    <w:rPr>
+                      <w:rFonts w:ascii="Abadi" w:hAnsi="Abadi"/>
+                      <w:color w:val="FFFFFF" w:themeColor="background1"/>
+                    </w:rPr>
+                    <w:t>$D01D</w:t>
+                  </w:r>
+                  <w:r>
+                    <w:rPr>
+                      <w:rFonts w:ascii="Abadi" w:hAnsi="Abadi"/>
+                      <w:color w:val="FFFFFF" w:themeColor="background1"/>
+                    </w:rPr>
+                    <w:br/>
+                    <w:t>53277</w:t>
+                  </w:r>
+                </w:p>
+              </w:tc>
+              <w:tc>
+                <w:tcPr>
+                  <w:tcW w:w="0" w:type="auto"/>
+                  <w:vMerge/>
+                  <w:tcBorders>
+                    <w:left w:val="outset" w:sz="6" w:space="0" w:color="auto"/>
+                    <w:bottom w:val="outset" w:sz="6" w:space="0" w:color="auto"/>
+                    <w:right w:val="outset" w:sz="6" w:space="0" w:color="auto"/>
+                  </w:tcBorders>
+                  <w:hideMark/>
+                </w:tcPr>
+                <w:p>
+                  <w:pPr>
+                    <w:spacing w:after="0" w:line="240" w:lineRule="auto"/>
+                    <w:rPr>
+                      <w:rFonts w:ascii="Abadi" w:hAnsi="Abadi"/>
+                      <w:color w:val="FFFFFF" w:themeColor="background1"/>
+                    </w:rPr>
+                  </w:pPr>
+                </w:p>
+              </w:tc>
+            </w:tr>
+          </w:tbl>
+          <w:p>
+            <w:pPr>
+              <w:rPr>
+                <w:rFonts w:ascii="Abadi" w:hAnsi="Abadi"/>
+                <w:color w:val="FFFFFF" w:themeColor="background1"/>
+              </w:rPr>
+            </w:pPr>
+          </w:p>
+        </w:tc>
+        <w:tc>
+          <w:tcPr>
+            <w:tcW w:w="3005" w:type="dxa"/>
+          </w:tcPr>
+          <w:p>
+            <w:pPr>
+              <w:rPr>
+                <w:rFonts w:ascii="Abadi" w:hAnsi="Abadi"/>
+                <w:color w:val="FFFFFF" w:themeColor="background1"/>
+              </w:rPr>
+            </w:pPr>
+            <w:proofErr w:type="spellStart"/>
+            <w:proofErr w:type="gramStart"/>
+            <w:r>
+              <w:rPr>
+                <w:rFonts w:ascii="Abadi" w:hAnsi="Abadi"/>
+                <w:color w:val="FFFFFF" w:themeColor="background1"/>
+              </w:rPr>
+              <w:lastRenderedPageBreak/>
+              <w:t>sprite</w:t>
+            </w:r>
+            <w:r>
+              <w:rPr>
+                <w:rFonts w:ascii="Abadi" w:hAnsi="Abadi"/>
+                <w:color w:val="FFFFFF" w:themeColor="background1"/>
+              </w:rPr>
+              <w:t>.setScale</w:t>
+            </w:r>
+            <w:proofErr w:type="spellEnd"/>
+            <w:proofErr w:type="gramEnd"/>
+            <w:r>
+              <w:rPr>
+                <w:rFonts w:ascii="Abadi" w:hAnsi="Abadi"/>
+                <w:color w:val="FFFFFF" w:themeColor="background1"/>
+              </w:rPr>
+              <w:t>(10,3</w:t>
+            </w:r>
+            <w:proofErr w:type="gramStart"/>
+            <w:r>
+              <w:rPr>
+                <w:rFonts w:ascii="Abadi" w:hAnsi="Abadi"/>
+                <w:color w:val="FFFFFF" w:themeColor="background1"/>
+              </w:rPr>
+              <w:t>)</w:t>
+            </w:r>
+            <w:r>
+              <w:rPr>
+                <w:rFonts w:ascii="Abadi" w:hAnsi="Abadi"/>
+                <w:color w:val="FFFFFF" w:themeColor="background1"/>
+              </w:rPr>
+              <w:t>;</w:t>
+            </w:r>
+            <w:proofErr w:type="gramEnd"/>
+          </w:p>
+          <w:p>
+            <w:pPr>
+              <w:rPr>
+                <w:rFonts w:ascii="Abadi" w:hAnsi="Abadi"/>
+                <w:color w:val="FFFFFF" w:themeColor="background1"/>
+                <w:lang w:val="fr-FR"/>
+              </w:rPr>
+            </w:pPr>
+          </w:p>
+        </w:tc>
+        <w:tc>
+          <w:tcPr>
+            <w:tcW w:w="3006" w:type="dxa"/>
+          </w:tcPr>
+          <w:p>
+            <w:pPr>
+              <w:rPr>
+                <w:rFonts w:ascii="Abadi" w:hAnsi="Abadi"/>
+                <w:color w:val="FFFFFF" w:themeColor="background1"/>
+                <w:lang w:val="fr-FR"/>
+              </w:rPr>
+            </w:pPr>
+            <w:proofErr w:type="spellStart"/>
+            <w:proofErr w:type="gramStart"/>
+            <w:r>
+              <w:rPr>
+                <w:rFonts w:ascii="Abadi" w:hAnsi="Abadi"/>
+                <w:color w:val="FFFFFF" w:themeColor="background1"/>
+                <w:lang w:val="fr-FR"/>
+              </w:rPr>
+              <w:t>sprite.scaleX</w:t>
+            </w:r>
+            <w:proofErr w:type="spellEnd"/>
+            <w:proofErr w:type="gramEnd"/>
+            <w:r>
+              <w:rPr>
+                <w:rFonts w:ascii="Abadi" w:hAnsi="Abadi"/>
+                <w:color w:val="FFFFFF" w:themeColor="background1"/>
+                <w:lang w:val="fr-FR"/>
+              </w:rPr>
+              <w:t xml:space="preserve"> = 7 ;</w:t>
+            </w:r>
+          </w:p>
+        </w:tc>
+      </w:tr>
+    </w:tbl>
+    <w:p>
+      <w:pPr>
+        <w:rPr>
+          <w:rFonts w:ascii="C64 Pro Mono" w:hAnsi="C64 Pro Mono"/>
+          <w:color w:val="FFFFFF" w:themeColor="background1"/>
+          <w:lang w:val="fr-FR"/>
+        </w:rPr>
+      </w:pPr>
+    </w:p>
+    <w:p>
+      <w:pPr>
+        <w:ind w:left="1080"/>
+        <w:rPr>
+          <w:rFonts w:ascii="C64 Pro Mono" w:hAnsi="C64 Pro Mono"/>
+          <w:color w:val="FFFFFF" w:themeColor="background1"/>
+          <w:lang w:val="fr-FR"/>
+        </w:rPr>
+      </w:pPr>
+      <w:r>
+        <w:rPr>
+          <w:rFonts w:ascii="C64 Pro Mono" w:hAnsi="C64 Pro Mono"/>
+          <w:color w:val="FFFFFF" w:themeColor="background1"/>
+          <w:lang w:val="fr-FR"/>
+        </w:rPr>
+        <w:t xml:space="preserve">2. </w:t>
+      </w:r>
+      <w:proofErr w:type="spellStart"/>
+      <w:r>
+        <w:rPr>
+          <w:rFonts w:ascii="C64 Pro Mono" w:hAnsi="C64 Pro Mono"/>
+          <w:color w:val="FFFFFF" w:themeColor="background1"/>
+          <w:lang w:val="fr-FR"/>
+        </w:rPr>
+        <w:t>Flipping</w:t>
+      </w:r>
+      <w:proofErr w:type="spellEnd"/>
+    </w:p>
+    <w:tbl>
+      <w:tblPr>
+        <w:tblStyle w:val="TableGrid"/>
+        <w:tblW w:w="0" w:type="auto"/>
+        <w:tblLook w:val="04A0" w:firstRow="1" w:lastRow="0" w:firstColumn="1" w:lastColumn="0" w:noHBand="0" w:noVBand="1"/>
+      </w:tblPr>
+      <w:tblGrid>
+        <w:gridCol w:w="3005"/>
+        <w:gridCol w:w="3005"/>
+        <w:gridCol w:w="3006"/>
+      </w:tblGrid>
+      <w:tr>
+        <w:tc>
+          <w:tcPr>
+            <w:tcW w:w="3005" w:type="dxa"/>
+          </w:tcPr>
+          <w:p>
+            <w:pPr>
+              <w:rPr>
+                <w:rFonts w:ascii="C64 Pro Mono" w:hAnsi="C64 Pro Mono"/>
+                <w:color w:val="FFFFFF" w:themeColor="background1"/>
+                <w:lang w:val="fr-FR"/>
+              </w:rPr>
+            </w:pPr>
+            <w:r>
+              <w:rPr>
+                <w:rFonts w:ascii="C64 Pro Mono" w:hAnsi="C64 Pro Mono"/>
+                <w:color w:val="FFFFFF" w:themeColor="background1"/>
+                <w:lang w:val="fr-FR"/>
+              </w:rPr>
+              <w:t xml:space="preserve">Commodore </w:t>
+            </w:r>
+          </w:p>
+        </w:tc>
+        <w:tc>
+          <w:tcPr>
+            <w:tcW w:w="3005" w:type="dxa"/>
+          </w:tcPr>
+          <w:p>
+            <w:pPr>
+              <w:rPr>
+                <w:rFonts w:ascii="C64 Pro Mono" w:hAnsi="C64 Pro Mono"/>
+                <w:color w:val="FFFFFF" w:themeColor="background1"/>
+                <w:lang w:val="fr-FR"/>
+              </w:rPr>
+            </w:pPr>
+            <w:r>
+              <w:rPr>
+                <w:rFonts w:ascii="C64 Pro Mono" w:hAnsi="C64 Pro Mono"/>
+                <w:color w:val="FFFFFF" w:themeColor="background1"/>
+                <w:lang w:val="fr-FR"/>
+              </w:rPr>
+              <w:t>Java GDX</w:t>
+            </w:r>
+          </w:p>
+        </w:tc>
+        <w:tc>
+          <w:tcPr>
+            <w:tcW w:w="3006" w:type="dxa"/>
+          </w:tcPr>
+          <w:p>
+            <w:pPr>
+              <w:rPr>
+                <w:rFonts w:ascii="C64 Pro Mono" w:hAnsi="C64 Pro Mono"/>
+                <w:color w:val="FFFFFF" w:themeColor="background1"/>
+                <w:lang w:val="fr-FR"/>
+              </w:rPr>
+            </w:pPr>
+            <w:r>
+              <w:rPr>
+                <w:rFonts w:ascii="C64 Pro Mono" w:hAnsi="C64 Pro Mono"/>
+                <w:color w:val="FFFFFF" w:themeColor="background1"/>
+                <w:lang w:val="fr-FR"/>
+              </w:rPr>
+              <w:t>JS Phaser</w:t>
+            </w:r>
+          </w:p>
+        </w:tc>
+      </w:tr>
+      <w:tr>
+        <w:tc>
+          <w:tcPr>
+            <w:tcW w:w="3005" w:type="dxa"/>
+          </w:tcPr>
+          <w:p>
+            <w:pPr>
+              <w:rPr>
+                <w:rFonts w:ascii="Abadi" w:hAnsi="Abadi"/>
+                <w:color w:val="FFFFFF" w:themeColor="background1"/>
+                <w:lang w:val="fr-FR"/>
+              </w:rPr>
+            </w:pPr>
+            <w:proofErr w:type="spellStart"/>
+            <w:r>
+              <w:rPr>
+                <w:rFonts w:ascii="Abadi" w:hAnsi="Abadi"/>
+                <w:color w:val="FFFFFF" w:themeColor="background1"/>
+                <w:lang w:val="fr-FR"/>
+              </w:rPr>
+              <w:t>Cells</w:t>
+            </w:r>
+            <w:proofErr w:type="spellEnd"/>
+            <w:r>
+              <w:rPr>
+                <w:rFonts w:ascii="Abadi" w:hAnsi="Abadi"/>
+                <w:color w:val="FFFFFF" w:themeColor="background1"/>
+                <w:lang w:val="fr-FR"/>
+              </w:rPr>
+              <w:t xml:space="preserve"> : </w:t>
+            </w:r>
+          </w:p>
+        </w:tc>
+        <w:tc>
+          <w:tcPr>
+            <w:tcW w:w="3005" w:type="dxa"/>
+          </w:tcPr>
+          <w:p>
+            <w:pPr>
+              <w:rPr>
+                <w:rFonts w:ascii="Abadi" w:hAnsi="Abadi"/>
+                <w:color w:val="FFFFFF" w:themeColor="background1"/>
+              </w:rPr>
+            </w:pPr>
+            <w:proofErr w:type="spellStart"/>
+            <w:proofErr w:type="gramStart"/>
+            <w:r>
+              <w:rPr>
+                <w:rFonts w:ascii="Abadi" w:hAnsi="Abadi"/>
+                <w:color w:val="FFFFFF" w:themeColor="background1"/>
+              </w:rPr>
+              <w:t>sprite</w:t>
+            </w:r>
+            <w:r>
+              <w:rPr>
+                <w:rFonts w:ascii="Abadi" w:hAnsi="Abadi"/>
+                <w:color w:val="FFFFFF" w:themeColor="background1"/>
+              </w:rPr>
+              <w:t>.setScale</w:t>
+            </w:r>
+            <w:proofErr w:type="spellEnd"/>
+            <w:proofErr w:type="gramEnd"/>
+            <w:r>
+              <w:rPr>
+                <w:rFonts w:ascii="Abadi" w:hAnsi="Abadi"/>
+                <w:color w:val="FFFFFF" w:themeColor="background1"/>
+              </w:rPr>
+              <w:t>(10,3</w:t>
+            </w:r>
+            <w:proofErr w:type="gramStart"/>
+            <w:r>
+              <w:rPr>
+                <w:rFonts w:ascii="Abadi" w:hAnsi="Abadi"/>
+                <w:color w:val="FFFFFF" w:themeColor="background1"/>
+              </w:rPr>
+              <w:t>)</w:t>
+            </w:r>
+            <w:r>
+              <w:rPr>
+                <w:rFonts w:ascii="Abadi" w:hAnsi="Abadi"/>
+                <w:color w:val="FFFFFF" w:themeColor="background1"/>
+              </w:rPr>
+              <w:t>;</w:t>
+            </w:r>
+            <w:proofErr w:type="gramEnd"/>
+          </w:p>
+          <w:p>
+            <w:pPr>
+              <w:rPr>
+                <w:rFonts w:ascii="Abadi" w:hAnsi="Abadi"/>
+                <w:color w:val="FFFFFF" w:themeColor="background1"/>
+                <w:lang w:val="fr-FR"/>
+              </w:rPr>
+            </w:pPr>
+          </w:p>
+        </w:tc>
+        <w:tc>
+          <w:tcPr>
+            <w:tcW w:w="3006" w:type="dxa"/>
+          </w:tcPr>
+          <w:p>
+            <w:pPr>
+              <w:rPr>
+                <w:rFonts w:ascii="Abadi" w:hAnsi="Abadi"/>
+                <w:color w:val="FFFFFF" w:themeColor="background1"/>
+                <w:lang w:val="fr-FR"/>
+              </w:rPr>
+            </w:pPr>
+            <w:proofErr w:type="spellStart"/>
+            <w:proofErr w:type="gramStart"/>
+            <w:r>
+              <w:rPr>
+                <w:rFonts w:ascii="Abadi" w:hAnsi="Abadi"/>
+                <w:color w:val="FFFFFF" w:themeColor="background1"/>
+                <w:lang w:val="fr-FR"/>
+              </w:rPr>
+              <w:t>sprite.scaleX</w:t>
+            </w:r>
+            <w:proofErr w:type="spellEnd"/>
+            <w:proofErr w:type="gramEnd"/>
+            <w:r>
+              <w:rPr>
+                <w:rFonts w:ascii="Abadi" w:hAnsi="Abadi"/>
+                <w:color w:val="FFFFFF" w:themeColor="background1"/>
+                <w:lang w:val="fr-FR"/>
+              </w:rPr>
+              <w:t xml:space="preserve"> = 7 ;</w:t>
+            </w:r>
+          </w:p>
+        </w:tc>
+      </w:tr>
+    </w:tbl>
+    <w:p>
+      <w:pPr>
+        <w:pStyle w:val="ListParagraph"/>
+        <w:ind w:left="1800"/>
+        <w:rPr>
+          <w:rFonts w:ascii="C64 Pro Mono" w:hAnsi="C64 Pro Mono"/>
+          <w:color w:val="FFFFFF" w:themeColor="background1"/>
+          <w:lang w:val="fr-FR"/>
+        </w:rPr>
+      </w:pPr>
+    </w:p>
+    <w:p>
+      <w:pPr>
+        <w:ind w:left="1080"/>
+        <w:rPr>
+          <w:rFonts w:ascii="C64 Pro Mono" w:hAnsi="C64 Pro Mono"/>
+          <w:color w:val="FFFFFF" w:themeColor="background1"/>
+          <w:lang w:val="fr-FR"/>
+        </w:rPr>
+      </w:pPr>
+      <w:r>
+        <w:rPr>
+          <w:rFonts w:ascii="C64 Pro Mono" w:hAnsi="C64 Pro Mono"/>
+          <w:color w:val="FFFFFF" w:themeColor="background1"/>
+          <w:lang w:val="fr-FR"/>
+        </w:rPr>
+        <w:t xml:space="preserve">3. </w:t>
+      </w:r>
+      <w:r>
+        <w:rPr>
+          <w:rFonts w:ascii="C64 Pro Mono" w:hAnsi="C64 Pro Mono"/>
+          <w:color w:val="FFFFFF" w:themeColor="background1"/>
+          <w:lang w:val="fr-FR"/>
+        </w:rPr>
+        <w:t>Sprites collision</w:t>
+      </w:r>
+    </w:p>
+    <w:tbl>
+      <w:tblPr>
+        <w:tblStyle w:val="TableGrid"/>
+        <w:tblW w:w="0" w:type="auto"/>
+        <w:tblLayout w:type="fixed"/>
+        <w:tblLook w:val="04A0" w:firstRow="1" w:lastRow="0" w:firstColumn="1" w:lastColumn="0" w:noHBand="0" w:noVBand="1"/>
+      </w:tblPr>
+      <w:tblGrid>
+        <w:gridCol w:w="2875"/>
+        <w:gridCol w:w="3060"/>
+        <w:gridCol w:w="3081"/>
+      </w:tblGrid>
+      <w:tr>
+        <w:tc>
+          <w:tcPr>
+            <w:tcW w:w="2875" w:type="dxa"/>
+          </w:tcPr>
+          <w:p>
+            <w:pPr>
+              <w:rPr>
+                <w:rFonts w:ascii="C64 Pro Mono" w:hAnsi="C64 Pro Mono"/>
+                <w:color w:val="FFFFFF" w:themeColor="background1"/>
+                <w:lang w:val="fr-FR"/>
+              </w:rPr>
+            </w:pPr>
+            <w:r>
+              <w:rPr>
+                <w:rFonts w:ascii="C64 Pro Mono" w:hAnsi="C64 Pro Mono"/>
+                <w:color w:val="FFFFFF" w:themeColor="background1"/>
+                <w:lang w:val="fr-FR"/>
+              </w:rPr>
+              <w:t xml:space="preserve">Commodore </w:t>
+            </w:r>
+          </w:p>
+        </w:tc>
+        <w:tc>
+          <w:tcPr>
+            <w:tcW w:w="3060" w:type="dxa"/>
+          </w:tcPr>
+          <w:p>
+            <w:pPr>
+              <w:rPr>
+                <w:rFonts w:ascii="C64 Pro Mono" w:hAnsi="C64 Pro Mono"/>
+                <w:color w:val="FFFFFF" w:themeColor="background1"/>
+                <w:lang w:val="fr-FR"/>
+              </w:rPr>
+            </w:pPr>
+            <w:r>
+              <w:rPr>
+                <w:rFonts w:ascii="C64 Pro Mono" w:hAnsi="C64 Pro Mono"/>
+                <w:color w:val="FFFFFF" w:themeColor="background1"/>
+                <w:lang w:val="fr-FR"/>
+              </w:rPr>
+              <w:t>Java GDX</w:t>
+            </w:r>
+          </w:p>
+        </w:tc>
+        <w:tc>
+          <w:tcPr>
+            <w:tcW w:w="3081" w:type="dxa"/>
+          </w:tcPr>
+          <w:p>
+            <w:pPr>
+              <w:rPr>
+                <w:rFonts w:ascii="C64 Pro Mono" w:hAnsi="C64 Pro Mono"/>
+                <w:color w:val="FFFFFF" w:themeColor="background1"/>
+                <w:lang w:val="fr-FR"/>
+              </w:rPr>
+            </w:pPr>
+            <w:r>
+              <w:rPr>
+                <w:rFonts w:ascii="C64 Pro Mono" w:hAnsi="C64 Pro Mono"/>
+                <w:color w:val="FFFFFF" w:themeColor="background1"/>
+                <w:lang w:val="fr-FR"/>
+              </w:rPr>
+              <w:t>JS Phaser</w:t>
+            </w:r>
+          </w:p>
+        </w:tc>
+      </w:tr>
+      <w:tr>
+        <w:tc>
+          <w:tcPr>
+            <w:tcW w:w="2875" w:type="dxa"/>
+          </w:tcPr>
+          <w:p>
+            <w:pPr>
+              <w:rPr>
+                <w:rFonts w:ascii="Abadi" w:hAnsi="Abadi"/>
+                <w:color w:val="FFFFFF" w:themeColor="background1"/>
+                <w:lang w:val="fr-FR"/>
+              </w:rPr>
+            </w:pPr>
+            <w:proofErr w:type="spellStart"/>
+            <w:r>
+              <w:rPr>
+                <w:rFonts w:ascii="Abadi" w:hAnsi="Abadi"/>
+                <w:color w:val="FFFFFF" w:themeColor="background1"/>
+                <w:lang w:val="fr-FR"/>
+              </w:rPr>
+              <w:t>Cell</w:t>
+            </w:r>
+            <w:proofErr w:type="spellEnd"/>
+            <w:r>
+              <w:rPr>
+                <w:rFonts w:ascii="Abadi" w:hAnsi="Abadi"/>
+                <w:color w:val="FFFFFF" w:themeColor="background1"/>
+                <w:lang w:val="fr-FR"/>
+              </w:rPr>
+              <w:t xml:space="preserve"> $d019 (53273) bit #2</w:t>
+            </w:r>
+            <w:r>
+              <w:rPr>
+                <w:rFonts w:ascii="Abadi" w:hAnsi="Abadi"/>
+                <w:color w:val="FFFFFF" w:themeColor="background1"/>
+                <w:lang w:val="fr-FR"/>
+              </w:rPr>
+              <w:t xml:space="preserve"> </w:t>
+            </w:r>
+          </w:p>
+        </w:tc>
+        <w:tc>
+          <w:tcPr>
+            <w:tcW w:w="3060" w:type="dxa"/>
+          </w:tcPr>
+          <w:p>
+            <w:pPr>
+              <w:rPr>
+                <w:rFonts w:ascii="Abadi" w:hAnsi="Abadi"/>
+                <w:color w:val="FFFFFF" w:themeColor="background1"/>
+              </w:rPr>
+            </w:pPr>
+            <w:proofErr w:type="spellStart"/>
+            <w:proofErr w:type="gramStart"/>
+            <w:r>
+              <w:rPr>
+                <w:rFonts w:ascii="Abadi" w:hAnsi="Abadi"/>
+                <w:color w:val="FFFFFF" w:themeColor="background1"/>
+              </w:rPr>
+              <w:t>sprite</w:t>
+            </w:r>
+            <w:r>
+              <w:rPr>
+                <w:rFonts w:ascii="Abadi" w:hAnsi="Abadi"/>
+                <w:color w:val="FFFFFF" w:themeColor="background1"/>
+              </w:rPr>
+              <w:t>.setScale</w:t>
+            </w:r>
+            <w:proofErr w:type="spellEnd"/>
+            <w:proofErr w:type="gramEnd"/>
+            <w:r>
+              <w:rPr>
+                <w:rFonts w:ascii="Abadi" w:hAnsi="Abadi"/>
+                <w:color w:val="FFFFFF" w:themeColor="background1"/>
+              </w:rPr>
+              <w:t>(10,3</w:t>
+            </w:r>
+            <w:proofErr w:type="gramStart"/>
+            <w:r>
+              <w:rPr>
+                <w:rFonts w:ascii="Abadi" w:hAnsi="Abadi"/>
+                <w:color w:val="FFFFFF" w:themeColor="background1"/>
+              </w:rPr>
+              <w:t>)</w:t>
+            </w:r>
+            <w:r>
+              <w:rPr>
+                <w:rFonts w:ascii="Abadi" w:hAnsi="Abadi"/>
+                <w:color w:val="FFFFFF" w:themeColor="background1"/>
+              </w:rPr>
+              <w:t>;</w:t>
+            </w:r>
+            <w:proofErr w:type="gramEnd"/>
+          </w:p>
+          <w:p>
+            <w:pPr>
+              <w:rPr>
+                <w:rFonts w:ascii="Abadi" w:hAnsi="Abadi"/>
+                <w:color w:val="FFFFFF" w:themeColor="background1"/>
+                <w:lang w:val="fr-FR"/>
+              </w:rPr>
+            </w:pPr>
+          </w:p>
+        </w:tc>
+        <w:tc>
+          <w:tcPr>
+            <w:tcW w:w="3081" w:type="dxa"/>
+          </w:tcPr>
+          <w:p>
+            <w:pPr>
+              <w:rPr>
+                <w:rFonts w:ascii="Abadi" w:hAnsi="Abadi"/>
+                <w:color w:val="FFFFFF" w:themeColor="background1"/>
+              </w:rPr>
+            </w:pPr>
+            <w:proofErr w:type="spellStart"/>
+            <w:proofErr w:type="gramStart"/>
+            <w:r>
+              <w:rPr>
+                <w:rFonts w:ascii="Abadi" w:hAnsi="Abadi"/>
+                <w:color w:val="FFFFFF" w:themeColor="background1"/>
+              </w:rPr>
+              <w:t>Phaser.Math.Distance.Between</w:t>
+            </w:r>
+            <w:proofErr w:type="spellEnd"/>
+            <w:proofErr w:type="gramEnd"/>
+            <w:r>
+              <w:rPr>
+                <w:rFonts w:ascii="Abadi" w:hAnsi="Abadi"/>
+                <w:color w:val="FFFFFF" w:themeColor="background1"/>
+              </w:rPr>
+              <w:t>(sprite</w:t>
+            </w:r>
+            <w:r>
+              <w:rPr>
+                <w:rFonts w:ascii="Abadi" w:hAnsi="Abadi"/>
+                <w:color w:val="FFFFFF" w:themeColor="background1"/>
+              </w:rPr>
+              <w:t>1</w:t>
+            </w:r>
+            <w:r>
+              <w:rPr>
+                <w:rFonts w:ascii="Abadi" w:hAnsi="Abadi"/>
+                <w:color w:val="FFFFFF" w:themeColor="background1"/>
+              </w:rPr>
+              <w:t>.x, sprite</w:t>
+            </w:r>
+            <w:r>
+              <w:rPr>
+                <w:rFonts w:ascii="Abadi" w:hAnsi="Abadi"/>
+                <w:color w:val="FFFFFF" w:themeColor="background1"/>
+              </w:rPr>
+              <w:t>1</w:t>
+            </w:r>
+            <w:r>
+              <w:rPr>
+                <w:rFonts w:ascii="Abadi" w:hAnsi="Abadi"/>
+                <w:color w:val="FFFFFF" w:themeColor="background1"/>
+              </w:rPr>
+              <w:t>.y, sprite</w:t>
+            </w:r>
+            <w:r>
+              <w:rPr>
+                <w:rFonts w:ascii="Abadi" w:hAnsi="Abadi"/>
+                <w:color w:val="FFFFFF" w:themeColor="background1"/>
+              </w:rPr>
+              <w:t>2</w:t>
+            </w:r>
+            <w:r>
+              <w:rPr>
+                <w:rFonts w:ascii="Abadi" w:hAnsi="Abadi"/>
+                <w:color w:val="FFFFFF" w:themeColor="background1"/>
+              </w:rPr>
+              <w:t>.x, sprite</w:t>
+            </w:r>
+            <w:r>
+              <w:rPr>
+                <w:rFonts w:ascii="Abadi" w:hAnsi="Abadi"/>
+                <w:color w:val="FFFFFF" w:themeColor="background1"/>
+              </w:rPr>
+              <w:t>2</w:t>
+            </w:r>
+            <w:proofErr w:type="gramStart"/>
+            <w:r>
+              <w:rPr>
+                <w:rFonts w:ascii="Abadi" w:hAnsi="Abadi"/>
+                <w:color w:val="FFFFFF" w:themeColor="background1"/>
+              </w:rPr>
+              <w:t>.y</w:t>
+            </w:r>
+            <w:proofErr w:type="gramEnd"/>
+            <w:r>
+              <w:rPr>
+                <w:rFonts w:ascii="Abadi" w:hAnsi="Abadi"/>
+                <w:color w:val="FFFFFF" w:themeColor="background1"/>
+              </w:rPr>
+              <w:t>)</w:t>
+            </w:r>
+          </w:p>
+          <w:p>
+            <w:pPr>
+              <w:rPr>
+                <w:rFonts w:ascii="Abadi" w:hAnsi="Abadi"/>
+                <w:color w:val="FFFFFF" w:themeColor="background1"/>
+              </w:rPr>
+            </w:pPr>
+          </w:p>
+        </w:tc>
+      </w:tr>
+    </w:tbl>
+    <w:p>
+      <w:pPr>
+        <w:pStyle w:val="ListParagraph"/>
+        <w:numPr>
+          <w:ilvl w:val="1"/>
+          <w:numId w:val="2"/>
+        </w:numPr>
+        <w:rPr>
+          <w:rFonts w:ascii="C64 Pro Mono" w:hAnsi="C64 Pro Mono"/>
+          <w:color w:val="FFFFFF" w:themeColor="background1"/>
+        </w:rPr>
+      </w:pPr>
+      <w:r>
+        <w:rPr>
+          <w:rFonts w:ascii="C64 Pro Mono" w:hAnsi="C64 Pro Mono"/>
+          <w:color w:val="FFFFFF" w:themeColor="background1"/>
+        </w:rPr>
+        <w:br w:type="page"/>
+      </w:r>
+    </w:p>
+    <w:p>
+      <w:pPr>
+        <w:rPr>
+          <w:rFonts w:ascii="C64 Pro Mono" w:hAnsi="C64 Pro Mono"/>
+          <w:color w:val="FFFFFF" w:themeColor="background1"/>
+        </w:rPr>
+      </w:pPr>
+      <w:r>
+        <w:rPr>
+          <w:rFonts w:ascii="C64 Pro Mono" w:hAnsi="C64 Pro Mono"/>
+          <w:noProof/>
+          <w:color w:val="FFFFFF" w:themeColor="background1"/>
+          <w:lang w:val="fr-FR"/>
+        </w:rPr>
+        <w:lastRenderedPageBreak/>
+        <w:drawing>
+          <wp:anchor distT="0" distB="0" distL="114300" distR="114300" simplePos="0" relativeHeight="251659264" behindDoc="0" locked="0" layoutInCell="1" allowOverlap="1" wp14:anchorId="193182F6" wp14:editId="37A166BB">
+            <wp:simplePos x="0" y="0"/>
+            <wp:positionH relativeFrom="column">
+              <wp:posOffset>3615055</wp:posOffset>
+            </wp:positionH>
+            <wp:positionV relativeFrom="paragraph">
+              <wp:posOffset>7074</wp:posOffset>
+            </wp:positionV>
+            <wp:extent cx="2615565" cy="4067504"/>
+            <wp:effectExtent l="0" t="0" r="0" b="9525"/>
+            <wp:wrapNone/>
+            <wp:docPr id="811231460" name="Picture 1" descr="A long shot of a timeline&#10;&#10;AI-generated content may be incorrect."/>
+            <wp:cNvGraphicFramePr>
+              <a:graphicFrameLocks xmlns:a="http://schemas.openxmlformats.org/drawingml/2006/main" noChangeAspect="1"/>
+            </wp:cNvGraphicFramePr>
+            <a:graphic xmlns:a="http://schemas.openxmlformats.org/drawingml/2006/main">
+              <a:graphicData uri="http://schemas.openxmlformats.org/drawingml/2006/picture">
+                <pic:pic xmlns:pic="http://schemas.openxmlformats.org/drawingml/2006/picture">
+                  <pic:nvPicPr>
+                    <pic:cNvPr id="811231460" name="Picture 1" descr="A long shot of a timeline&#10;&#10;AI-generated content may be incorrect."/>
+                    <pic:cNvPicPr/>
+                  </pic:nvPicPr>
+                  <pic:blipFill>
+                    <a:blip r:embed="rId10">
+                      <a:extLst>
+                        <a:ext uri="{28A0092B-C50C-407E-A947-70E740481C1C}">
+                          <a14:useLocalDpi xmlns:a14="http://schemas.microsoft.com/office/drawing/2010/main" val="0"/>
+                        </a:ext>
+                      </a:extLst>
+                    </a:blip>
+                    <a:stretch>
+                      <a:fillRect/>
+                    </a:stretch>
+                  </pic:blipFill>
+                  <pic:spPr>
+                    <a:xfrm>
+                      <a:off x="0" y="0"/>
+                      <a:ext cx="2615565" cy="4067504"/>
+                    </a:xfrm>
+                    <a:prstGeom prst="rect">
+                      <a:avLst/>
+                    </a:prstGeom>
+                  </pic:spPr>
+                </pic:pic>
+              </a:graphicData>
+            </a:graphic>
+            <wp14:sizeRelV relativeFrom="margin">
+              <wp14:pctHeight>0</wp14:pctHeight>
+            </wp14:sizeRelV>
+          </wp:anchor>
+        </w:drawing>
+      </w:r>
+    </w:p>
+    <w:p>
+      <w:pPr>
+        <w:rPr>
+          <w:rFonts w:ascii="C64 Pro Mono" w:hAnsi="C64 Pro Mono"/>
+          <w:color w:val="FFFFFF" w:themeColor="background1"/>
+        </w:rPr>
+      </w:pPr>
+    </w:p>
+    <w:p>
+      <w:pPr>
+        <w:rPr>
+          <w:rFonts w:ascii="C64 Pro Mono" w:hAnsi="C64 Pro Mono"/>
+          <w:color w:val="FFFFFF" w:themeColor="background1"/>
+        </w:rPr>
+      </w:pPr>
+      <w:r>
+        <w:rPr>
+          <w:rFonts w:ascii="C64 Pro Mono" w:hAnsi="C64 Pro Mono"/>
+          <w:color w:val="FFFFFF" w:themeColor="background1"/>
+        </w:rPr>
+        <w:t xml:space="preserve">First game </w:t>
+      </w:r>
+      <w:r>
+        <w:rPr>
+          <w:rFonts w:ascii="C64 Pro Mono" w:hAnsi="C64 Pro Mono"/>
+          <w:color w:val="FFFFFF" w:themeColor="background1"/>
+        </w:rPr>
+        <w:tab/>
+        <w:t>1958</w:t>
+      </w:r>
+    </w:p>
+    <w:p>
+      <w:pPr>
+        <w:rPr>
+          <w:rFonts w:ascii="C64 Pro Mono" w:hAnsi="C64 Pro Mono"/>
+          <w:color w:val="FFFFFF" w:themeColor="background1"/>
+        </w:rPr>
+      </w:pPr>
+      <w:r>
+        <w:rPr>
+          <w:rFonts w:ascii="C64 Pro Mono" w:hAnsi="C64 Pro Mono"/>
+          <w:color w:val="FFFFFF" w:themeColor="background1"/>
+        </w:rPr>
+        <w:t>Atari 800</w:t>
+      </w:r>
+      <w:r>
+        <w:rPr>
+          <w:rFonts w:ascii="C64 Pro Mono" w:hAnsi="C64 Pro Mono"/>
+          <w:color w:val="FFFFFF" w:themeColor="background1"/>
+        </w:rPr>
+        <w:tab/>
+      </w:r>
+      <w:r>
+        <w:rPr>
+          <w:rFonts w:ascii="C64 Pro Mono" w:hAnsi="C64 Pro Mono"/>
+          <w:color w:val="FFFFFF" w:themeColor="background1"/>
+        </w:rPr>
+        <w:tab/>
+        <w:t>1980</w:t>
+      </w:r>
+    </w:p>
+    <w:p>
+      <w:pPr>
+        <w:rPr>
+          <w:rFonts w:ascii="C64 Pro Mono" w:hAnsi="C64 Pro Mono"/>
+          <w:color w:val="FFFFFF" w:themeColor="background1"/>
+        </w:rPr>
+      </w:pPr>
+      <w:r>
+        <w:rPr>
+          <w:rFonts w:ascii="C64 Pro Mono" w:hAnsi="C64 Pro Mono"/>
+          <w:color w:val="FFFFFF" w:themeColor="background1"/>
+        </w:rPr>
+        <w:t xml:space="preserve">IBM PC </w:t>
+      </w:r>
+      <w:r>
+        <w:rPr>
+          <w:rFonts w:ascii="C64 Pro Mono" w:hAnsi="C64 Pro Mono"/>
+          <w:color w:val="FFFFFF" w:themeColor="background1"/>
+        </w:rPr>
+        <w:tab/>
+      </w:r>
+      <w:r>
+        <w:rPr>
+          <w:rFonts w:ascii="C64 Pro Mono" w:hAnsi="C64 Pro Mono"/>
+          <w:color w:val="FFFFFF" w:themeColor="background1"/>
+        </w:rPr>
+        <w:tab/>
+        <w:t>1981</w:t>
+      </w:r>
+    </w:p>
+    <w:p>
+      <w:pPr>
+        <w:rPr>
+          <w:rFonts w:ascii="C64 Pro Mono" w:hAnsi="C64 Pro Mono"/>
+          <w:color w:val="FFFFFF" w:themeColor="background1"/>
+        </w:rPr>
+      </w:pPr>
+      <w:r>
+        <w:rPr>
+          <w:rFonts w:ascii="C64 Pro Mono" w:hAnsi="C64 Pro Mono"/>
+          <w:color w:val="FFFFFF" w:themeColor="background1"/>
+        </w:rPr>
+        <w:t>Commodore 64</w:t>
+      </w:r>
+      <w:r>
+        <w:rPr>
+          <w:rFonts w:ascii="C64 Pro Mono" w:hAnsi="C64 Pro Mono"/>
+          <w:color w:val="FFFFFF" w:themeColor="background1"/>
+        </w:rPr>
+        <w:tab/>
+        <w:t>1982</w:t>
+      </w:r>
+    </w:p>
+    <w:p>
+      <w:pPr>
+        <w:rPr>
+          <w:rFonts w:ascii="C64 Pro Mono" w:hAnsi="C64 Pro Mono"/>
+          <w:color w:val="FFFFFF" w:themeColor="background1"/>
+        </w:rPr>
+      </w:pPr>
+      <w:r>
+        <w:rPr>
+          <w:rFonts w:ascii="C64 Pro Mono" w:hAnsi="C64 Pro Mono"/>
+          <w:color w:val="FFFFFF" w:themeColor="background1"/>
+        </w:rPr>
+        <w:t xml:space="preserve">Amiga </w:t>
+      </w:r>
+      <w:r>
+        <w:rPr>
+          <w:rFonts w:ascii="C64 Pro Mono" w:hAnsi="C64 Pro Mono"/>
+          <w:color w:val="FFFFFF" w:themeColor="background1"/>
+        </w:rPr>
+        <w:t>10</w:t>
+      </w:r>
+      <w:r>
+        <w:rPr>
+          <w:rFonts w:ascii="C64 Pro Mono" w:hAnsi="C64 Pro Mono"/>
+          <w:color w:val="FFFFFF" w:themeColor="background1"/>
+        </w:rPr>
+        <w:t>00</w:t>
+      </w:r>
+      <w:r>
+        <w:rPr>
+          <w:rFonts w:ascii="C64 Pro Mono" w:hAnsi="C64 Pro Mono"/>
+          <w:color w:val="FFFFFF" w:themeColor="background1"/>
+        </w:rPr>
+        <w:tab/>
+        <w:t>1985</w:t>
+      </w:r>
+      <w:r>
+        <w:rPr>
+          <w:rFonts w:ascii="C64 Pro Mono" w:hAnsi="C64 Pro Mono"/>
+          <w:color w:val="FFFFFF" w:themeColor="background1"/>
+        </w:rPr>
+        <w:tab/>
+      </w:r>
+    </w:p>
+    <w:p>
+      <w:pPr>
+        <w:ind w:firstLine="720"/>
+        <w:rPr>
+          <w:rFonts w:ascii="C64 Pro Mono" w:hAnsi="C64 Pro Mono"/>
+          <w:color w:val="FFFFFF" w:themeColor="background1"/>
+        </w:rPr>
+      </w:pPr>
+      <w:proofErr w:type="gramStart"/>
+      <w:r>
+        <w:rPr>
+          <w:rFonts w:ascii="C64 Pro Mono" w:hAnsi="C64 Pro Mono"/>
+          <w:color w:val="FFFFFF" w:themeColor="background1"/>
+        </w:rPr>
+        <w:t>language</w:t>
+      </w:r>
+      <w:proofErr w:type="gramEnd"/>
+      <w:r>
+        <w:rPr>
+          <w:rFonts w:ascii="C64 Pro Mono" w:hAnsi="C64 Pro Mono"/>
+          <w:color w:val="FFFFFF" w:themeColor="background1"/>
+        </w:rPr>
+        <w:t xml:space="preserve"> Amos</w:t>
+      </w:r>
+      <w:r>
+        <w:rPr>
+          <w:rFonts w:ascii="C64 Pro Mono" w:hAnsi="C64 Pro Mono"/>
+          <w:color w:val="FFFFFF" w:themeColor="background1"/>
+        </w:rPr>
+        <w:tab/>
+      </w:r>
+      <w:r>
+        <w:rPr>
+          <w:rFonts w:ascii="C64 Pro Mono" w:hAnsi="C64 Pro Mono"/>
+          <w:color w:val="FFFFFF" w:themeColor="background1"/>
+        </w:rPr>
+        <w:tab/>
+        <w:t>1987</w:t>
+      </w:r>
+    </w:p>
+    <w:p>
+      <w:pPr>
+        <w:rPr>
+          <w:rFonts w:ascii="C64 Pro Mono" w:hAnsi="C64 Pro Mono"/>
+          <w:color w:val="FFFFFF" w:themeColor="background1"/>
+        </w:rPr>
+      </w:pPr>
+      <w:r>
+        <w:rPr>
+          <w:rFonts w:ascii="C64 Pro Mono" w:hAnsi="C64 Pro Mono"/>
+          <w:color w:val="FFFFFF" w:themeColor="background1"/>
+        </w:rPr>
+        <w:t>Python</w:t>
+      </w:r>
+      <w:r>
+        <w:rPr>
+          <w:rFonts w:ascii="C64 Pro Mono" w:hAnsi="C64 Pro Mono"/>
+          <w:color w:val="FFFFFF" w:themeColor="background1"/>
+        </w:rPr>
+        <w:tab/>
+      </w:r>
+      <w:r>
+        <w:rPr>
+          <w:rFonts w:ascii="C64 Pro Mono" w:hAnsi="C64 Pro Mono"/>
+          <w:color w:val="FFFFFF" w:themeColor="background1"/>
+        </w:rPr>
+        <w:tab/>
+      </w:r>
+      <w:r>
+        <w:rPr>
+          <w:rFonts w:ascii="C64 Pro Mono" w:hAnsi="C64 Pro Mono"/>
+          <w:color w:val="FFFFFF" w:themeColor="background1"/>
+        </w:rPr>
+        <w:tab/>
+        <w:t>1991</w:t>
+      </w:r>
+      <w:r>
+        <w:rPr>
+          <w:rFonts w:ascii="C64 Pro Mono" w:hAnsi="C64 Pro Mono"/>
+          <w:color w:val="FFFFFF" w:themeColor="background1"/>
+        </w:rPr>
+        <w:tab/>
+      </w:r>
+    </w:p>
+    <w:p>
+      <w:pPr>
+        <w:ind w:firstLine="720"/>
+        <w:rPr>
+          <w:rFonts w:ascii="C64 Pro Mono" w:hAnsi="C64 Pro Mono"/>
+          <w:color w:val="FFFFFF" w:themeColor="background1"/>
+        </w:rPr>
+      </w:pPr>
+      <w:r>
+        <w:rPr>
+          <w:rFonts w:ascii="C64 Pro Mono" w:hAnsi="C64 Pro Mono"/>
+          <w:color w:val="FFFFFF" w:themeColor="background1"/>
+        </w:rPr>
+        <w:t xml:space="preserve">library </w:t>
+      </w:r>
+      <w:r>
+        <w:rPr>
+          <w:rFonts w:ascii="C64 Pro Mono" w:hAnsi="C64 Pro Mono"/>
+          <w:color w:val="FFFFFF" w:themeColor="background1"/>
+        </w:rPr>
+        <w:t>A</w:t>
+      </w:r>
+      <w:r>
+        <w:rPr>
+          <w:rFonts w:ascii="C64 Pro Mono" w:hAnsi="C64 Pro Mono"/>
+          <w:color w:val="FFFFFF" w:themeColor="background1"/>
+        </w:rPr>
+        <w:t>rc</w:t>
+      </w:r>
+      <w:r>
+        <w:rPr>
+          <w:rFonts w:ascii="C64 Pro Mono" w:hAnsi="C64 Pro Mono"/>
+          <w:color w:val="FFFFFF" w:themeColor="background1"/>
+        </w:rPr>
+        <w:t>ade</w:t>
+      </w:r>
+      <w:r>
+        <w:rPr>
+          <w:rFonts w:ascii="C64 Pro Mono" w:hAnsi="C64 Pro Mono"/>
+          <w:color w:val="FFFFFF" w:themeColor="background1"/>
+        </w:rPr>
+        <w:tab/>
+        <w:t>2014</w:t>
+      </w:r>
+    </w:p>
+    <w:p>
+      <w:pPr>
+        <w:rPr>
+          <w:rFonts w:ascii="C64 Pro Mono" w:hAnsi="C64 Pro Mono"/>
+          <w:color w:val="FFFFFF" w:themeColor="background1"/>
+        </w:rPr>
+      </w:pPr>
+      <w:r>
+        <w:rPr>
+          <w:rFonts w:ascii="C64 Pro Mono" w:hAnsi="C64 Pro Mono"/>
+          <w:color w:val="FFFFFF" w:themeColor="background1"/>
+        </w:rPr>
+        <w:t>Java</w:t>
+      </w:r>
+      <w:r>
+        <w:rPr>
+          <w:rFonts w:ascii="C64 Pro Mono" w:hAnsi="C64 Pro Mono"/>
+          <w:color w:val="FFFFFF" w:themeColor="background1"/>
+        </w:rPr>
+        <w:tab/>
+      </w:r>
+      <w:r>
+        <w:rPr>
+          <w:rFonts w:ascii="C64 Pro Mono" w:hAnsi="C64 Pro Mono"/>
+          <w:color w:val="FFFFFF" w:themeColor="background1"/>
+        </w:rPr>
+        <w:tab/>
+      </w:r>
+      <w:r>
+        <w:rPr>
+          <w:rFonts w:ascii="C64 Pro Mono" w:hAnsi="C64 Pro Mono"/>
+          <w:color w:val="FFFFFF" w:themeColor="background1"/>
+        </w:rPr>
+        <w:tab/>
+        <w:t>1995</w:t>
+      </w:r>
+      <w:r>
+        <w:rPr>
+          <w:rFonts w:ascii="C64 Pro Mono" w:hAnsi="C64 Pro Mono"/>
+          <w:color w:val="FFFFFF" w:themeColor="background1"/>
+        </w:rPr>
+        <w:tab/>
+      </w:r>
+    </w:p>
+    <w:p>
+      <w:pPr>
+        <w:ind w:firstLine="720"/>
+        <w:rPr>
+          <w:rFonts w:ascii="C64 Pro Mono" w:hAnsi="C64 Pro Mono"/>
+          <w:color w:val="FFFFFF" w:themeColor="background1"/>
+        </w:rPr>
+      </w:pPr>
+      <w:r>
+        <w:rPr>
+          <w:rFonts w:ascii="C64 Pro Mono" w:hAnsi="C64 Pro Mono"/>
+          <w:color w:val="FFFFFF" w:themeColor="background1"/>
+        </w:rPr>
+        <w:t>library GDX</w:t>
+      </w:r>
+      <w:r>
+        <w:rPr>
+          <w:rFonts w:ascii="C64 Pro Mono" w:hAnsi="C64 Pro Mono"/>
+          <w:color w:val="FFFFFF" w:themeColor="background1"/>
+        </w:rPr>
+        <w:tab/>
+      </w:r>
+      <w:r>
+        <w:rPr>
+          <w:rFonts w:ascii="C64 Pro Mono" w:hAnsi="C64 Pro Mono"/>
+          <w:color w:val="FFFFFF" w:themeColor="background1"/>
+        </w:rPr>
+        <w:tab/>
+        <w:t>2011</w:t>
+      </w:r>
+    </w:p>
+    <w:p>
+      <w:pPr>
+        <w:rPr>
+          <w:rFonts w:ascii="C64 Pro Mono" w:hAnsi="C64 Pro Mono"/>
+          <w:color w:val="FFFFFF" w:themeColor="background1"/>
+        </w:rPr>
+      </w:pPr>
+      <w:r>
+        <w:rPr>
+          <w:rFonts w:ascii="C64 Pro Mono" w:hAnsi="C64 Pro Mono"/>
+          <w:color w:val="FFFFFF" w:themeColor="background1"/>
+        </w:rPr>
+        <w:t>JavaScript</w:t>
+      </w:r>
+      <w:r>
+        <w:rPr>
+          <w:rFonts w:ascii="C64 Pro Mono" w:hAnsi="C64 Pro Mono"/>
+          <w:color w:val="FFFFFF" w:themeColor="background1"/>
+        </w:rPr>
+        <w:tab/>
+        <w:t>1995</w:t>
+      </w:r>
+      <w:r>
+        <w:rPr>
+          <w:rFonts w:ascii="C64 Pro Mono" w:hAnsi="C64 Pro Mono"/>
+          <w:color w:val="FFFFFF" w:themeColor="background1"/>
+        </w:rPr>
+        <w:tab/>
+      </w:r>
+    </w:p>
+    <w:p>
+      <w:pPr>
+        <w:ind w:firstLine="720"/>
+        <w:rPr>
+          <w:rFonts w:ascii="C64 Pro Mono" w:hAnsi="C64 Pro Mono"/>
+          <w:color w:val="FFFFFF" w:themeColor="background1"/>
+        </w:rPr>
+      </w:pPr>
+      <w:r>
+        <w:rPr>
+          <w:rFonts w:ascii="C64 Pro Mono" w:hAnsi="C64 Pro Mono"/>
+          <w:color w:val="FFFFFF" w:themeColor="background1"/>
+        </w:rPr>
+        <w:t>library Phaser</w:t>
+      </w:r>
+      <w:r>
+        <w:rPr>
+          <w:rFonts w:ascii="C64 Pro Mono" w:hAnsi="C64 Pro Mono"/>
+          <w:color w:val="FFFFFF" w:themeColor="background1"/>
+        </w:rPr>
+        <w:tab/>
+        <w:t>2013</w:t>
+      </w:r>
+    </w:p>
+    <w:p>
+      <w:pPr>
+        <w:ind w:firstLine="720"/>
+        <w:rPr>
+          <w:rFonts w:ascii="C64 Pro Mono" w:hAnsi="C64 Pro Mono"/>
+          <w:color w:val="FFFFFF" w:themeColor="background1"/>
+        </w:rPr>
+      </w:pPr>
+    </w:p>
+    <w:p>
+      <w:pPr>
+        <w:rPr>
+          <w:rFonts w:ascii="C64 Pro Mono" w:hAnsi="C64 Pro Mono"/>
+          <w:color w:val="FFFFFF" w:themeColor="background1"/>
+        </w:rPr>
+      </w:pPr>
+    </w:p>
+    <w:p>
+      <w:pPr>
+        <w:rPr>
+          <w:rFonts w:ascii="C64 Pro Mono" w:hAnsi="C64 Pro Mono"/>
+          <w:color w:val="FFFFFF" w:themeColor="background1"/>
+        </w:rPr>
+      </w:pPr>
+    </w:p>
+    <w:p>
+      <w:pPr>
+        <w:rPr>
+          <w:rFonts w:ascii="C64 Pro Mono" w:hAnsi="C64 Pro Mono"/>
+          <w:color w:val="FFFFFF" w:themeColor="background1"/>
+        </w:rPr>
+      </w:pPr>
+    </w:p>
+    <w:p>
+      <w:pPr>
+        <w:rPr>
+          <w:rFonts w:ascii="C64 Pro Mono" w:hAnsi="C64 Pro Mono"/>
+          <w:color w:val="FFFFFF" w:themeColor="background1"/>
+        </w:rPr>
+      </w:pPr>
+    </w:p>
+    <w:p>
+      <w:pPr>
+        <w:rPr>
+          <w:rFonts w:ascii="C64 Pro Mono" w:hAnsi="C64 Pro Mono"/>
+          <w:color w:val="FFFFFF" w:themeColor="background1"/>
+        </w:rPr>
+      </w:pPr>
+    </w:p>
+    <w:p>
+      <w:pPr>
+        <w:rPr>
+          <w:rFonts w:ascii="C64 Pro Mono" w:hAnsi="C64 Pro Mono"/>
+          <w:color w:val="FFFFFF" w:themeColor="background1"/>
+        </w:rPr>
+      </w:pPr>
+    </w:p>
     <w:sectPr>
       <w:pgSz w:w="11906" w:h="8391" w:orient="landscape" w:code="11"/>
       <w:pgMar w:top="1440" w:right="1440" w:bottom="1440" w:left="1440" w:header="720" w:footer="720" w:gutter="0"/>
@@ -1115,7 +3284,7 @@
   <w:abstractNum w:abstractNumId="0" w15:restartNumberingAfterBreak="0">
     <w:nsid w:val="07503E67"/>
     <w:multiLevelType w:val="multilevel"/>
-    <w:tmpl w:val="7A0EDEEC"/>
+    <w:tmpl w:val="E98C5140"/>
     <w:lvl w:ilvl="0">
       <w:start w:val="1"/>
       <w:numFmt w:val="bullet"/>
@@ -1132,20 +3301,16 @@
         <w:sz w:val="20"/>
       </w:rPr>
     </w:lvl>
-    <w:lvl w:ilvl="1" w:tentative="1">
-      <w:start w:val="1"/>
-      <w:numFmt w:val="bullet"/>
-      <w:lvlText w:val="o"/>
-      <w:lvlJc w:val="left"/>
-      <w:pPr>
-        <w:tabs>
-          <w:tab w:val="num" w:pos="1440"/>
-        </w:tabs>
-        <w:ind w:left="1440" w:hanging="360"/>
-      </w:pPr>
-      <w:rPr>
-        <w:rFonts w:ascii="Courier New" w:hAnsi="Courier New" w:hint="default"/>
-        <w:sz w:val="20"/>
+    <w:lvl w:ilvl="1">
+      <w:start w:val="3"/>
+      <w:numFmt w:val="decimal"/>
+      <w:lvlText w:val="%2."/>
+      <w:lvlJc w:val="left"/>
+      <w:pPr>
+        <w:ind w:left="1800" w:hanging="720"/>
+      </w:pPr>
+      <w:rPr>
+        <w:rFonts w:hint="default"/>
       </w:rPr>
     </w:lvl>
     <w:lvl w:ilvl="2" w:tentative="1">
@@ -1264,7 +3429,7 @@
   <w:abstractNum w:abstractNumId="1" w15:restartNumberingAfterBreak="0">
     <w:nsid w:val="081C51D4"/>
     <w:multiLevelType w:val="multilevel"/>
-    <w:tmpl w:val="17160A38"/>
+    <w:tmpl w:val="BE4606E4"/>
     <w:lvl w:ilvl="0">
       <w:start w:val="1"/>
       <w:numFmt w:val="bullet"/>
@@ -1281,20 +3446,16 @@
         <w:sz w:val="20"/>
       </w:rPr>
     </w:lvl>
-    <w:lvl w:ilvl="1" w:tentative="1">
-      <w:start w:val="1"/>
-      <w:numFmt w:val="bullet"/>
-      <w:lvlText w:val="o"/>
-      <w:lvlJc w:val="left"/>
-      <w:pPr>
-        <w:tabs>
-          <w:tab w:val="num" w:pos="1440"/>
-        </w:tabs>
-        <w:ind w:left="1440" w:hanging="360"/>
-      </w:pPr>
-      <w:rPr>
-        <w:rFonts w:ascii="Courier New" w:hAnsi="Courier New" w:hint="default"/>
-        <w:sz w:val="20"/>
+    <w:lvl w:ilvl="1">
+      <w:start w:val="1"/>
+      <w:numFmt w:val="decimal"/>
+      <w:lvlText w:val="%2."/>
+      <w:lvlJc w:val="left"/>
+      <w:pPr>
+        <w:ind w:left="1800" w:hanging="720"/>
+      </w:pPr>
+      <w:rPr>
+        <w:rFonts w:hint="default"/>
       </w:rPr>
     </w:lvl>
     <w:lvl w:ilvl="2" w:tentative="1">
@@ -1524,6 +3685,155 @@
     </w:lvl>
   </w:abstractNum>
   <w:abstractNum w:abstractNumId="3" w15:restartNumberingAfterBreak="0">
+    <w:nsid w:val="4F397F76"/>
+    <w:multiLevelType w:val="multilevel"/>
+    <w:tmpl w:val="705E445C"/>
+    <w:lvl w:ilvl="0">
+      <w:start w:val="1"/>
+      <w:numFmt w:val="bullet"/>
+      <w:lvlText w:val=""/>
+      <w:lvlJc w:val="left"/>
+      <w:pPr>
+        <w:tabs>
+          <w:tab w:val="num" w:pos="720"/>
+        </w:tabs>
+        <w:ind w:left="720" w:hanging="360"/>
+      </w:pPr>
+      <w:rPr>
+        <w:rFonts w:ascii="Symbol" w:hAnsi="Symbol" w:hint="default"/>
+        <w:sz w:val="20"/>
+      </w:rPr>
+    </w:lvl>
+    <w:lvl w:ilvl="1" w:tentative="1">
+      <w:start w:val="1"/>
+      <w:numFmt w:val="bullet"/>
+      <w:lvlText w:val="o"/>
+      <w:lvlJc w:val="left"/>
+      <w:pPr>
+        <w:tabs>
+          <w:tab w:val="num" w:pos="1440"/>
+        </w:tabs>
+        <w:ind w:left="1440" w:hanging="360"/>
+      </w:pPr>
+      <w:rPr>
+        <w:rFonts w:ascii="Courier New" w:hAnsi="Courier New" w:hint="default"/>
+        <w:sz w:val="20"/>
+      </w:rPr>
+    </w:lvl>
+    <w:lvl w:ilvl="2" w:tentative="1">
+      <w:start w:val="1"/>
+      <w:numFmt w:val="bullet"/>
+      <w:lvlText w:val=""/>
+      <w:lvlJc w:val="left"/>
+      <w:pPr>
+        <w:tabs>
+          <w:tab w:val="num" w:pos="2160"/>
+        </w:tabs>
+        <w:ind w:left="2160" w:hanging="360"/>
+      </w:pPr>
+      <w:rPr>
+        <w:rFonts w:ascii="Wingdings" w:hAnsi="Wingdings" w:hint="default"/>
+        <w:sz w:val="20"/>
+      </w:rPr>
+    </w:lvl>
+    <w:lvl w:ilvl="3" w:tentative="1">
+      <w:start w:val="1"/>
+      <w:numFmt w:val="bullet"/>
+      <w:lvlText w:val=""/>
+      <w:lvlJc w:val="left"/>
+      <w:pPr>
+        <w:tabs>
+          <w:tab w:val="num" w:pos="2880"/>
+        </w:tabs>
+        <w:ind w:left="2880" w:hanging="360"/>
+      </w:pPr>
+      <w:rPr>
+        <w:rFonts w:ascii="Wingdings" w:hAnsi="Wingdings" w:hint="default"/>
+        <w:sz w:val="20"/>
+      </w:rPr>
+    </w:lvl>
+    <w:lvl w:ilvl="4" w:tentative="1">
+      <w:start w:val="1"/>
+      <w:numFmt w:val="bullet"/>
+      <w:lvlText w:val=""/>
+      <w:lvlJc w:val="left"/>
+      <w:pPr>
+        <w:tabs>
+          <w:tab w:val="num" w:pos="3600"/>
+        </w:tabs>
+        <w:ind w:left="3600" w:hanging="360"/>
+      </w:pPr>
+      <w:rPr>
+        <w:rFonts w:ascii="Wingdings" w:hAnsi="Wingdings" w:hint="default"/>
+        <w:sz w:val="20"/>
+      </w:rPr>
+    </w:lvl>
+    <w:lvl w:ilvl="5" w:tentative="1">
+      <w:start w:val="1"/>
+      <w:numFmt w:val="bullet"/>
+      <w:lvlText w:val=""/>
+      <w:lvlJc w:val="left"/>
+      <w:pPr>
+        <w:tabs>
+          <w:tab w:val="num" w:pos="4320"/>
+        </w:tabs>
+        <w:ind w:left="4320" w:hanging="360"/>
+      </w:pPr>
+      <w:rPr>
+        <w:rFonts w:ascii="Wingdings" w:hAnsi="Wingdings" w:hint="default"/>
+        <w:sz w:val="20"/>
+      </w:rPr>
+    </w:lvl>
+    <w:lvl w:ilvl="6" w:tentative="1">
+      <w:start w:val="1"/>
+      <w:numFmt w:val="bullet"/>
+      <w:lvlText w:val=""/>
+      <w:lvlJc w:val="left"/>
+      <w:pPr>
+        <w:tabs>
+          <w:tab w:val="num" w:pos="5040"/>
+        </w:tabs>
+        <w:ind w:left="5040" w:hanging="360"/>
+      </w:pPr>
+      <w:rPr>
+        <w:rFonts w:ascii="Wingdings" w:hAnsi="Wingdings" w:hint="default"/>
+        <w:sz w:val="20"/>
+      </w:rPr>
+    </w:lvl>
+    <w:lvl w:ilvl="7" w:tentative="1">
+      <w:start w:val="1"/>
+      <w:numFmt w:val="bullet"/>
+      <w:lvlText w:val=""/>
+      <w:lvlJc w:val="left"/>
+      <w:pPr>
+        <w:tabs>
+          <w:tab w:val="num" w:pos="5760"/>
+        </w:tabs>
+        <w:ind w:left="5760" w:hanging="360"/>
+      </w:pPr>
+      <w:rPr>
+        <w:rFonts w:ascii="Wingdings" w:hAnsi="Wingdings" w:hint="default"/>
+        <w:sz w:val="20"/>
+      </w:rPr>
+    </w:lvl>
+    <w:lvl w:ilvl="8" w:tentative="1">
+      <w:start w:val="1"/>
+      <w:numFmt w:val="bullet"/>
+      <w:lvlText w:val=""/>
+      <w:lvlJc w:val="left"/>
+      <w:pPr>
+        <w:tabs>
+          <w:tab w:val="num" w:pos="6480"/>
+        </w:tabs>
+        <w:ind w:left="6480" w:hanging="360"/>
+      </w:pPr>
+      <w:rPr>
+        <w:rFonts w:ascii="Wingdings" w:hAnsi="Wingdings" w:hint="default"/>
+        <w:sz w:val="20"/>
+      </w:rPr>
+    </w:lvl>
+  </w:abstractNum>
+  <w:abstractNum w:abstractNumId="4" w15:restartNumberingAfterBreak="0">
     <w:nsid w:val="67951287"/>
     <w:multiLevelType w:val="multilevel"/>
     <w:tmpl w:val="FC3E6EC6"/>
@@ -1557,6 +3867,296 @@
       <w:rPr>
         <w:rFonts w:ascii="Courier New" w:hAnsi="Courier New" w:hint="default"/>
         <w:sz w:val="20"/>
+      </w:rPr>
+    </w:lvl>
+    <w:lvl w:ilvl="2" w:tentative="1">
+      <w:start w:val="1"/>
+      <w:numFmt w:val="bullet"/>
+      <w:lvlText w:val=""/>
+      <w:lvlJc w:val="left"/>
+      <w:pPr>
+        <w:tabs>
+          <w:tab w:val="num" w:pos="2160"/>
+        </w:tabs>
+        <w:ind w:left="2160" w:hanging="360"/>
+      </w:pPr>
+      <w:rPr>
+        <w:rFonts w:ascii="Wingdings" w:hAnsi="Wingdings" w:hint="default"/>
+        <w:sz w:val="20"/>
+      </w:rPr>
+    </w:lvl>
+    <w:lvl w:ilvl="3" w:tentative="1">
+      <w:start w:val="1"/>
+      <w:numFmt w:val="bullet"/>
+      <w:lvlText w:val=""/>
+      <w:lvlJc w:val="left"/>
+      <w:pPr>
+        <w:tabs>
+          <w:tab w:val="num" w:pos="2880"/>
+        </w:tabs>
+        <w:ind w:left="2880" w:hanging="360"/>
+      </w:pPr>
+      <w:rPr>
+        <w:rFonts w:ascii="Wingdings" w:hAnsi="Wingdings" w:hint="default"/>
+        <w:sz w:val="20"/>
+      </w:rPr>
+    </w:lvl>
+    <w:lvl w:ilvl="4" w:tentative="1">
+      <w:start w:val="1"/>
+      <w:numFmt w:val="bullet"/>
+      <w:lvlText w:val=""/>
+      <w:lvlJc w:val="left"/>
+      <w:pPr>
+        <w:tabs>
+          <w:tab w:val="num" w:pos="3600"/>
+        </w:tabs>
+        <w:ind w:left="3600" w:hanging="360"/>
+      </w:pPr>
+      <w:rPr>
+        <w:rFonts w:ascii="Wingdings" w:hAnsi="Wingdings" w:hint="default"/>
+        <w:sz w:val="20"/>
+      </w:rPr>
+    </w:lvl>
+    <w:lvl w:ilvl="5" w:tentative="1">
+      <w:start w:val="1"/>
+      <w:numFmt w:val="bullet"/>
+      <w:lvlText w:val=""/>
+      <w:lvlJc w:val="left"/>
+      <w:pPr>
+        <w:tabs>
+          <w:tab w:val="num" w:pos="4320"/>
+        </w:tabs>
+        <w:ind w:left="4320" w:hanging="360"/>
+      </w:pPr>
+      <w:rPr>
+        <w:rFonts w:ascii="Wingdings" w:hAnsi="Wingdings" w:hint="default"/>
+        <w:sz w:val="20"/>
+      </w:rPr>
+    </w:lvl>
+    <w:lvl w:ilvl="6" w:tentative="1">
+      <w:start w:val="1"/>
+      <w:numFmt w:val="bullet"/>
+      <w:lvlText w:val=""/>
+      <w:lvlJc w:val="left"/>
+      <w:pPr>
+        <w:tabs>
+          <w:tab w:val="num" w:pos="5040"/>
+        </w:tabs>
+        <w:ind w:left="5040" w:hanging="360"/>
+      </w:pPr>
+      <w:rPr>
+        <w:rFonts w:ascii="Wingdings" w:hAnsi="Wingdings" w:hint="default"/>
+        <w:sz w:val="20"/>
+      </w:rPr>
+    </w:lvl>
+    <w:lvl w:ilvl="7" w:tentative="1">
+      <w:start w:val="1"/>
+      <w:numFmt w:val="bullet"/>
+      <w:lvlText w:val=""/>
+      <w:lvlJc w:val="left"/>
+      <w:pPr>
+        <w:tabs>
+          <w:tab w:val="num" w:pos="5760"/>
+        </w:tabs>
+        <w:ind w:left="5760" w:hanging="360"/>
+      </w:pPr>
+      <w:rPr>
+        <w:rFonts w:ascii="Wingdings" w:hAnsi="Wingdings" w:hint="default"/>
+        <w:sz w:val="20"/>
+      </w:rPr>
+    </w:lvl>
+    <w:lvl w:ilvl="8" w:tentative="1">
+      <w:start w:val="1"/>
+      <w:numFmt w:val="bullet"/>
+      <w:lvlText w:val=""/>
+      <w:lvlJc w:val="left"/>
+      <w:pPr>
+        <w:tabs>
+          <w:tab w:val="num" w:pos="6480"/>
+        </w:tabs>
+        <w:ind w:left="6480" w:hanging="360"/>
+      </w:pPr>
+      <w:rPr>
+        <w:rFonts w:ascii="Wingdings" w:hAnsi="Wingdings" w:hint="default"/>
+        <w:sz w:val="20"/>
+      </w:rPr>
+    </w:lvl>
+  </w:abstractNum>
+  <w:abstractNum w:abstractNumId="5" w15:restartNumberingAfterBreak="0">
+    <w:nsid w:val="750877E6"/>
+    <w:multiLevelType w:val="multilevel"/>
+    <w:tmpl w:val="BE4606E4"/>
+    <w:lvl w:ilvl="0">
+      <w:start w:val="1"/>
+      <w:numFmt w:val="bullet"/>
+      <w:lvlText w:val=""/>
+      <w:lvlJc w:val="left"/>
+      <w:pPr>
+        <w:tabs>
+          <w:tab w:val="num" w:pos="720"/>
+        </w:tabs>
+        <w:ind w:left="720" w:hanging="360"/>
+      </w:pPr>
+      <w:rPr>
+        <w:rFonts w:ascii="Symbol" w:hAnsi="Symbol" w:hint="default"/>
+        <w:sz w:val="20"/>
+      </w:rPr>
+    </w:lvl>
+    <w:lvl w:ilvl="1">
+      <w:start w:val="1"/>
+      <w:numFmt w:val="decimal"/>
+      <w:lvlText w:val="%2."/>
+      <w:lvlJc w:val="left"/>
+      <w:pPr>
+        <w:ind w:left="1800" w:hanging="720"/>
+      </w:pPr>
+      <w:rPr>
+        <w:rFonts w:hint="default"/>
+      </w:rPr>
+    </w:lvl>
+    <w:lvl w:ilvl="2" w:tentative="1">
+      <w:start w:val="1"/>
+      <w:numFmt w:val="bullet"/>
+      <w:lvlText w:val=""/>
+      <w:lvlJc w:val="left"/>
+      <w:pPr>
+        <w:tabs>
+          <w:tab w:val="num" w:pos="2160"/>
+        </w:tabs>
+        <w:ind w:left="2160" w:hanging="360"/>
+      </w:pPr>
+      <w:rPr>
+        <w:rFonts w:ascii="Wingdings" w:hAnsi="Wingdings" w:hint="default"/>
+        <w:sz w:val="20"/>
+      </w:rPr>
+    </w:lvl>
+    <w:lvl w:ilvl="3" w:tentative="1">
+      <w:start w:val="1"/>
+      <w:numFmt w:val="bullet"/>
+      <w:lvlText w:val=""/>
+      <w:lvlJc w:val="left"/>
+      <w:pPr>
+        <w:tabs>
+          <w:tab w:val="num" w:pos="2880"/>
+        </w:tabs>
+        <w:ind w:left="2880" w:hanging="360"/>
+      </w:pPr>
+      <w:rPr>
+        <w:rFonts w:ascii="Wingdings" w:hAnsi="Wingdings" w:hint="default"/>
+        <w:sz w:val="20"/>
+      </w:rPr>
+    </w:lvl>
+    <w:lvl w:ilvl="4" w:tentative="1">
+      <w:start w:val="1"/>
+      <w:numFmt w:val="bullet"/>
+      <w:lvlText w:val=""/>
+      <w:lvlJc w:val="left"/>
+      <w:pPr>
+        <w:tabs>
+          <w:tab w:val="num" w:pos="3600"/>
+        </w:tabs>
+        <w:ind w:left="3600" w:hanging="360"/>
+      </w:pPr>
+      <w:rPr>
+        <w:rFonts w:ascii="Wingdings" w:hAnsi="Wingdings" w:hint="default"/>
+        <w:sz w:val="20"/>
+      </w:rPr>
+    </w:lvl>
+    <w:lvl w:ilvl="5" w:tentative="1">
+      <w:start w:val="1"/>
+      <w:numFmt w:val="bullet"/>
+      <w:lvlText w:val=""/>
+      <w:lvlJc w:val="left"/>
+      <w:pPr>
+        <w:tabs>
+          <w:tab w:val="num" w:pos="4320"/>
+        </w:tabs>
+        <w:ind w:left="4320" w:hanging="360"/>
+      </w:pPr>
+      <w:rPr>
+        <w:rFonts w:ascii="Wingdings" w:hAnsi="Wingdings" w:hint="default"/>
+        <w:sz w:val="20"/>
+      </w:rPr>
+    </w:lvl>
+    <w:lvl w:ilvl="6" w:tentative="1">
+      <w:start w:val="1"/>
+      <w:numFmt w:val="bullet"/>
+      <w:lvlText w:val=""/>
+      <w:lvlJc w:val="left"/>
+      <w:pPr>
+        <w:tabs>
+          <w:tab w:val="num" w:pos="5040"/>
+        </w:tabs>
+        <w:ind w:left="5040" w:hanging="360"/>
+      </w:pPr>
+      <w:rPr>
+        <w:rFonts w:ascii="Wingdings" w:hAnsi="Wingdings" w:hint="default"/>
+        <w:sz w:val="20"/>
+      </w:rPr>
+    </w:lvl>
+    <w:lvl w:ilvl="7" w:tentative="1">
+      <w:start w:val="1"/>
+      <w:numFmt w:val="bullet"/>
+      <w:lvlText w:val=""/>
+      <w:lvlJc w:val="left"/>
+      <w:pPr>
+        <w:tabs>
+          <w:tab w:val="num" w:pos="5760"/>
+        </w:tabs>
+        <w:ind w:left="5760" w:hanging="360"/>
+      </w:pPr>
+      <w:rPr>
+        <w:rFonts w:ascii="Wingdings" w:hAnsi="Wingdings" w:hint="default"/>
+        <w:sz w:val="20"/>
+      </w:rPr>
+    </w:lvl>
+    <w:lvl w:ilvl="8" w:tentative="1">
+      <w:start w:val="1"/>
+      <w:numFmt w:val="bullet"/>
+      <w:lvlText w:val=""/>
+      <w:lvlJc w:val="left"/>
+      <w:pPr>
+        <w:tabs>
+          <w:tab w:val="num" w:pos="6480"/>
+        </w:tabs>
+        <w:ind w:left="6480" w:hanging="360"/>
+      </w:pPr>
+      <w:rPr>
+        <w:rFonts w:ascii="Wingdings" w:hAnsi="Wingdings" w:hint="default"/>
+        <w:sz w:val="20"/>
+      </w:rPr>
+    </w:lvl>
+  </w:abstractNum>
+  <w:abstractNum w:abstractNumId="6" w15:restartNumberingAfterBreak="0">
+    <w:nsid w:val="76B70BC6"/>
+    <w:multiLevelType w:val="multilevel"/>
+    <w:tmpl w:val="BE4606E4"/>
+    <w:lvl w:ilvl="0">
+      <w:start w:val="1"/>
+      <w:numFmt w:val="bullet"/>
+      <w:lvlText w:val=""/>
+      <w:lvlJc w:val="left"/>
+      <w:pPr>
+        <w:tabs>
+          <w:tab w:val="num" w:pos="720"/>
+        </w:tabs>
+        <w:ind w:left="720" w:hanging="360"/>
+      </w:pPr>
+      <w:rPr>
+        <w:rFonts w:ascii="Symbol" w:hAnsi="Symbol" w:hint="default"/>
+        <w:sz w:val="20"/>
+      </w:rPr>
+    </w:lvl>
+    <w:lvl w:ilvl="1">
+      <w:start w:val="1"/>
+      <w:numFmt w:val="decimal"/>
+      <w:lvlText w:val="%2."/>
+      <w:lvlJc w:val="left"/>
+      <w:pPr>
+        <w:ind w:left="1800" w:hanging="720"/>
+      </w:pPr>
+      <w:rPr>
+        <w:rFonts w:hint="default"/>
       </w:rPr>
     </w:lvl>
     <w:lvl w:ilvl="2" w:tentative="1">
@@ -1682,6 +4282,15 @@
     <w:abstractNumId w:val="1"/>
   </w:num>
   <w:num w:numId="4" w16cid:durableId="182060749">
+    <w:abstractNumId w:val="4"/>
+  </w:num>
+  <w:num w:numId="5" w16cid:durableId="96872561">
+    <w:abstractNumId w:val="5"/>
+  </w:num>
+  <w:num w:numId="6" w16cid:durableId="1247377091">
+    <w:abstractNumId w:val="6"/>
+  </w:num>
+  <w:num w:numId="7" w16cid:durableId="1836219126">
     <w:abstractNumId w:val="3"/>
   </w:num>
 </w:numbering>
@@ -2604,6 +5213,25 @@
       <w:spacing w:val="5"/>
     </w:rPr>
   </w:style>
+  <w:style w:type="table" w:styleId="TableGrid">
+    <w:name w:val="Table Grid"/>
+    <w:basedOn w:val="TableNormal"/>
+    <w:uiPriority w:val="39"/>
+    <w:rsid w:val="00147D32"/>
+    <w:pPr>
+      <w:spacing w:after="0" w:line="240" w:lineRule="auto"/>
+    </w:pPr>
+    <w:tblPr>
+      <w:tblBorders>
+        <w:top w:val="single" w:sz="4" w:space="0" w:color="auto"/>
+        <w:left w:val="single" w:sz="4" w:space="0" w:color="auto"/>
+        <w:bottom w:val="single" w:sz="4" w:space="0" w:color="auto"/>
+        <w:right w:val="single" w:sz="4" w:space="0" w:color="auto"/>
+        <w:insideH w:val="single" w:sz="4" w:space="0" w:color="auto"/>
+        <w:insideV w:val="single" w:sz="4" w:space="0" w:color="auto"/>
+      </w:tblBorders>
+    </w:tblPr>
+  </w:style>
 </w:styles>
 </file>
 

</xml_diff>

<commit_message>
Decades of sprites2 (#23)
</commit_message>
<xml_diff>
--- a/LECTURES/DecadesOfSprites/Decades of SPRITES.docx
+++ b/LECTURES/DecadesOfSprites/Decades of SPRITES.docx
@@ -35,8 +35,21 @@
           <w:sz w:val="48"/>
           <w:szCs w:val="48"/>
         </w:rPr>
-        <w:t xml:space="preserve"> of sprites ?</w:t>
-      </w:r>
+        <w:t xml:space="preserve"> of </w:t>
+      </w:r>
+      <w:proofErr w:type="gramStart"/>
+      <w:r>
+        <w:rPr>
+          <w:rFonts w:ascii="C64 Pro Mono" w:hAnsi="C64 Pro Mono"/>
+          <w:i w:val="0"/>
+          <w:iCs w:val="0"/>
+          <w:color w:val="FFFFFF" w:themeColor="background1"/>
+          <w:sz w:val="48"/>
+          <w:szCs w:val="48"/>
+        </w:rPr>
+        <w:t>sprites ?</w:t>
+      </w:r>
+      <w:proofErr w:type="gramEnd"/>
     </w:p>
     <w:p>
       <w:pPr>
@@ -633,6 +646,57 @@
           <w:lang w:val="fr-FR"/>
         </w:rPr>
         <w:lastRenderedPageBreak/>
+        <w:t xml:space="preserve">Atari </w:t>
+      </w:r>
+      <w:proofErr w:type="spellStart"/>
+      <w:r>
+        <w:rPr>
+          <w:rFonts w:ascii="C64 Pro Mono" w:hAnsi="C64 Pro Mono"/>
+          <w:color w:val="FFFFFF" w:themeColor="background1"/>
+          <w:lang w:val="fr-FR"/>
+        </w:rPr>
+        <w:t>company</w:t>
+      </w:r>
+      <w:proofErr w:type="spellEnd"/>
+      <w:r>
+        <w:rPr>
+          <w:rFonts w:ascii="C64 Pro Mono" w:hAnsi="C64 Pro Mono"/>
+          <w:color w:val="FFFFFF" w:themeColor="background1"/>
+          <w:lang w:val="fr-FR"/>
+        </w:rPr>
+        <w:t xml:space="preserve"> (1972 </w:t>
+      </w:r>
+      <w:r>
+        <w:rPr>
+          <w:rFonts w:ascii="Courier New" w:hAnsi="Courier New" w:cs="Courier New"/>
+          <w:color w:val="FFFFFF" w:themeColor="background1"/>
+          <w:lang w:val="fr-FR"/>
+        </w:rPr>
+        <w:t>–</w:t>
+      </w:r>
+      <w:r>
+        <w:rPr>
+          <w:rFonts w:ascii="C64 Pro Mono" w:hAnsi="C64 Pro Mono"/>
+          <w:color w:val="FFFFFF" w:themeColor="background1"/>
+          <w:lang w:val="fr-FR"/>
+        </w:rPr>
+        <w:t xml:space="preserve"> 1992)</w:t>
+      </w:r>
+    </w:p>
+    <w:p>
+      <w:pPr>
+        <w:rPr>
+          <w:rFonts w:ascii="C64 Pro Mono" w:hAnsi="C64 Pro Mono"/>
+          <w:color w:val="FFFFFF" w:themeColor="background1"/>
+          <w:lang w:val="fr-FR"/>
+        </w:rPr>
+      </w:pPr>
+      <w:r>
+        <w:rPr>
+          <w:rFonts w:ascii="C64 Pro Mono" w:hAnsi="C64 Pro Mono"/>
+          <w:color w:val="FFFFFF" w:themeColor="background1"/>
+          <w:lang w:val="fr-FR"/>
+        </w:rPr>
         <w:t>Atari 800XL (1981)</w:t>
       </w:r>
     </w:p>
@@ -659,8 +723,18 @@
           <w:color w:val="FFFFFF" w:themeColor="background1"/>
           <w:lang w:val="fr-FR"/>
         </w:rPr>
-        <w:t>8-bit microprocessor MOS 6502:</w:t>
-      </w:r>
+        <w:t xml:space="preserve">8-bit microprocessor MOS </w:t>
+      </w:r>
+      <w:proofErr w:type="gramStart"/>
+      <w:r>
+        <w:rPr>
+          <w:rFonts w:ascii="C64 Pro Mono" w:hAnsi="C64 Pro Mono"/>
+          <w:color w:val="FFFFFF" w:themeColor="background1"/>
+          <w:lang w:val="fr-FR"/>
+        </w:rPr>
+        <w:t>6502:</w:t>
+      </w:r>
+      <w:proofErr w:type="gramEnd"/>
     </w:p>
     <w:p>
       <w:pPr>
@@ -686,46 +760,16 @@
       </w:pPr>
       <w:r>
         <w:rPr>
-          <w:rFonts w:ascii="C64 Pro Mono" w:hAnsi="C64 Pro Mono"/>
-          <w:b/>
-          <w:bCs/>
-          <w:color w:val="FFFFFF" w:themeColor="background1"/>
-        </w:rPr>
-        <w:t>Player/Missile Graphics</w:t>
-      </w:r>
-      <w:r>
-        <w:rPr>
-          <w:rFonts w:ascii="C64 Pro Mono" w:hAnsi="C64 Pro Mono"/>
-          <w:b/>
-          <w:bCs/>
-          <w:color w:val="FFFFFF" w:themeColor="background1"/>
-        </w:rPr>
-        <w:t>:</w:t>
-      </w:r>
-    </w:p>
-    <w:p>
-      <w:pPr>
-        <w:numPr>
-          <w:ilvl w:val="0"/>
-          <w:numId w:val="2"/>
-        </w:numPr>
-        <w:rPr>
-          <w:rFonts w:ascii="C64 Pro Mono" w:hAnsi="C64 Pro Mono"/>
-          <w:color w:val="FFFFFF" w:themeColor="background1"/>
-        </w:rPr>
-      </w:pPr>
-      <w:r>
-        <w:rPr>
           <w:noProof/>
         </w:rPr>
         <w:drawing>
-          <wp:anchor distT="0" distB="0" distL="114300" distR="114300" simplePos="0" relativeHeight="251658240" behindDoc="1" locked="0" layoutInCell="1" allowOverlap="1" wp14:anchorId="1BDECB92" wp14:editId="16D97FC6">
+          <wp:anchor distT="0" distB="0" distL="114300" distR="114300" simplePos="0" relativeHeight="251658240" behindDoc="1" locked="0" layoutInCell="1" allowOverlap="1" wp14:anchorId="1BDECB92" wp14:editId="43A7014B">
             <wp:simplePos x="0" y="0"/>
             <wp:positionH relativeFrom="column">
-              <wp:posOffset>3123858</wp:posOffset>
+              <wp:posOffset>3139440</wp:posOffset>
             </wp:positionH>
             <wp:positionV relativeFrom="paragraph">
-              <wp:posOffset>2540</wp:posOffset>
+              <wp:posOffset>4445</wp:posOffset>
             </wp:positionV>
             <wp:extent cx="3049270" cy="1546860"/>
             <wp:effectExtent l="0" t="0" r="0" b="0"/>
@@ -792,9 +836,20 @@
       <w:r>
         <w:rPr>
           <w:rFonts w:ascii="C64 Pro Mono" w:hAnsi="C64 Pro Mono"/>
-          <w:color w:val="FFFFFF" w:themeColor="background1"/>
-        </w:rPr>
-        <w:t>up to 4 players</w:t>
+          <w:b/>
+          <w:bCs/>
+          <w:color w:val="FFFFFF" w:themeColor="background1"/>
+        </w:rPr>
+        <w:t>Player/Missile Graphics</w:t>
+      </w:r>
+      <w:r>
+        <w:rPr>
+          <w:rFonts w:ascii="C64 Pro Mono" w:hAnsi="C64 Pro Mono"/>
+          <w:b/>
+          <w:bCs/>
+          <w:color w:val="FFFFFF" w:themeColor="background1"/>
+        </w:rPr>
+        <w:t>:</w:t>
       </w:r>
     </w:p>
     <w:p>
@@ -813,40 +868,62 @@
           <w:rFonts w:ascii="C64 Pro Mono" w:hAnsi="C64 Pro Mono"/>
           <w:color w:val="FFFFFF" w:themeColor="background1"/>
         </w:rPr>
+        <w:t>up to 4 players</w:t>
+      </w:r>
+    </w:p>
+    <w:p>
+      <w:pPr>
+        <w:numPr>
+          <w:ilvl w:val="0"/>
+          <w:numId w:val="2"/>
+        </w:numPr>
+        <w:rPr>
+          <w:rFonts w:ascii="C64 Pro Mono" w:hAnsi="C64 Pro Mono"/>
+          <w:color w:val="FFFFFF" w:themeColor="background1"/>
+        </w:rPr>
+      </w:pPr>
+      <w:r>
+        <w:rPr>
+          <w:rFonts w:ascii="C64 Pro Mono" w:hAnsi="C64 Pro Mono"/>
+          <w:color w:val="FFFFFF" w:themeColor="background1"/>
+        </w:rPr>
         <w:t>Multiple missiles</w:t>
       </w:r>
     </w:p>
     <w:p>
       <w:pPr>
-        <w:rPr>
-          <w:rFonts w:ascii="C64 Pro Mono" w:hAnsi="C64 Pro Mono"/>
-          <w:color w:val="FFFFFF" w:themeColor="background1"/>
-        </w:rPr>
-      </w:pPr>
-    </w:p>
-    <w:p>
-      <w:pPr>
-        <w:rPr>
-          <w:rFonts w:ascii="C64 Pro Mono" w:hAnsi="C64 Pro Mono"/>
-          <w:color w:val="FFFFFF" w:themeColor="background1"/>
-        </w:rPr>
-      </w:pPr>
-    </w:p>
-    <w:p>
-      <w:pPr>
-        <w:rPr>
-          <w:rFonts w:ascii="C64 Pro Mono" w:hAnsi="C64 Pro Mono"/>
-          <w:color w:val="FFFFFF" w:themeColor="background1"/>
-        </w:rPr>
-      </w:pPr>
-    </w:p>
-    <w:p>
-      <w:pPr>
-        <w:rPr>
-          <w:rFonts w:ascii="C64 Pro Mono" w:hAnsi="C64 Pro Mono"/>
-          <w:color w:val="FFFFFF" w:themeColor="background1"/>
-        </w:rPr>
-      </w:pPr>
+        <w:numPr>
+          <w:ilvl w:val="0"/>
+          <w:numId w:val="2"/>
+        </w:numPr>
+        <w:rPr>
+          <w:rFonts w:ascii="C64 Pro Mono" w:hAnsi="C64 Pro Mono"/>
+          <w:color w:val="FFFFFF" w:themeColor="background1"/>
+        </w:rPr>
+      </w:pPr>
+      <w:r>
+        <w:rPr>
+          <w:rFonts w:ascii="C64 Pro Mono" w:hAnsi="C64 Pro Mono"/>
+          <w:color w:val="FFFFFF" w:themeColor="background1"/>
+        </w:rPr>
+        <w:t>Special graphics mode is required (</w:t>
+      </w:r>
+      <w:proofErr w:type="spellStart"/>
+      <w:r>
+        <w:rPr>
+          <w:rFonts w:ascii="C64 Pro Mono" w:hAnsi="C64 Pro Mono"/>
+          <w:color w:val="FFFFFF" w:themeColor="background1"/>
+        </w:rPr>
+        <w:t>eg.</w:t>
+      </w:r>
+      <w:proofErr w:type="spellEnd"/>
+      <w:r>
+        <w:rPr>
+          <w:rFonts w:ascii="C64 Pro Mono" w:hAnsi="C64 Pro Mono"/>
+          <w:color w:val="FFFFFF" w:themeColor="background1"/>
+        </w:rPr>
+        <w:t xml:space="preserve"> GRAPHICS 8)</w:t>
+      </w:r>
     </w:p>
     <w:p>
       <w:pPr>
@@ -1227,7 +1304,23 @@
                                 <w:sz w:val="20"/>
                                 <w:szCs w:val="20"/>
                               </w:rPr>
-                              <w:t>($2C0 to $2C8) are the color registers for players, missiles,and playfields</w:t>
+                              <w:t xml:space="preserve">($2C0 to $2C8) are the color registers for players, </w:t>
+                            </w:r>
+                            <w:proofErr w:type="spellStart"/>
+                            <w:r>
+                              <w:rPr>
+                                <w:sz w:val="20"/>
+                                <w:szCs w:val="20"/>
+                              </w:rPr>
+                              <w:t>missiles,and</w:t>
+                            </w:r>
+                            <w:proofErr w:type="spellEnd"/>
+                            <w:r>
+                              <w:rPr>
+                                <w:sz w:val="20"/>
+                                <w:szCs w:val="20"/>
+                              </w:rPr>
+                              <w:t xml:space="preserve"> playfields</w:t>
                             </w:r>
                             <w:r>
                               <w:rPr>
@@ -1849,7 +1942,7 @@
                                 <w:sz w:val="20"/>
                                 <w:szCs w:val="20"/>
                               </w:rPr>
-                              <w:t>60</w:t>
+                              <w:t>128</w:t>
                             </w:r>
                             <w:r>
                               <w:rPr>
@@ -1865,14 +1958,7 @@
                                 <w:sz w:val="20"/>
                                 <w:szCs w:val="20"/>
                               </w:rPr>
-                              <w:t>60</w:t>
-                            </w:r>
-                            <w:r>
-                              <w:rPr>
-                                <w:sz w:val="20"/>
-                                <w:szCs w:val="20"/>
-                              </w:rPr>
-                              <w:t>,</w:t>
+                              <w:t>6</w:t>
                             </w:r>
                             <w:r>
                               <w:rPr>
@@ -1881,7 +1967,7 @@
                                 <w:sz w:val="20"/>
                                 <w:szCs w:val="20"/>
                               </w:rPr>
-                              <w:t>60</w:t>
+                              <w:t>4</w:t>
                             </w:r>
                             <w:r>
                               <w:rPr>
@@ -1897,7 +1983,7 @@
                                 <w:sz w:val="20"/>
                                 <w:szCs w:val="20"/>
                               </w:rPr>
-                              <w:t>60</w:t>
+                              <w:t>44</w:t>
                             </w:r>
                             <w:r>
                               <w:rPr>
@@ -1913,7 +1999,7 @@
                                 <w:sz w:val="20"/>
                                 <w:szCs w:val="20"/>
                               </w:rPr>
-                              <w:t>60</w:t>
+                              <w:t>18</w:t>
                             </w:r>
                             <w:r>
                               <w:rPr>
@@ -1929,7 +2015,14 @@
                                 <w:sz w:val="20"/>
                                 <w:szCs w:val="20"/>
                               </w:rPr>
-                              <w:t>60</w:t>
+                              <w:t>18</w:t>
+                            </w:r>
+                            <w:r>
+                              <w:rPr>
+                                <w:sz w:val="20"/>
+                                <w:szCs w:val="20"/>
+                              </w:rPr>
+                              <w:t>,</w:t>
                             </w:r>
                             <w:r>
                               <w:rPr>
@@ -1938,6 +2031,15 @@
                                 <w:sz w:val="20"/>
                                 <w:szCs w:val="20"/>
                               </w:rPr>
+                              <w:t>127</w:t>
+                            </w:r>
+                            <w:r>
+                              <w:rPr>
+                                <w:i/>
+                                <w:iCs/>
+                                <w:sz w:val="20"/>
+                                <w:szCs w:val="20"/>
+                              </w:rPr>
                               <w:br/>
                               <w:t>610</w:t>
                             </w:r>
@@ -1955,7 +2057,7 @@
                                 <w:sz w:val="20"/>
                                 <w:szCs w:val="20"/>
                               </w:rPr>
-                              <w:t>255</w:t>
+                              <w:t>126</w:t>
                             </w:r>
                             <w:r>
                               <w:rPr>
@@ -1971,7 +2073,7 @@
                                 <w:sz w:val="20"/>
                                 <w:szCs w:val="20"/>
                               </w:rPr>
-                              <w:t>255</w:t>
+                              <w:t>60</w:t>
                             </w:r>
                             <w:r>
                               <w:rPr>
@@ -1987,7 +2089,7 @@
                                 <w:sz w:val="20"/>
                                 <w:szCs w:val="20"/>
                               </w:rPr>
-                              <w:t>255</w:t>
+                              <w:t>195</w:t>
                             </w:r>
                             <w:r>
                               <w:rPr>
@@ -2003,7 +2105,7 @@
                                 <w:sz w:val="20"/>
                                 <w:szCs w:val="20"/>
                               </w:rPr>
-                              <w:t>255</w:t>
+                              <w:t>153</w:t>
                             </w:r>
                             <w:r>
                               <w:rPr>
@@ -2019,7 +2121,7 @@
                                 <w:sz w:val="20"/>
                                 <w:szCs w:val="20"/>
                               </w:rPr>
-                              <w:t>255</w:t>
+                              <w:t>195</w:t>
                             </w:r>
                             <w:r>
                               <w:rPr>
@@ -2035,7 +2137,7 @@
                                 <w:sz w:val="20"/>
                                 <w:szCs w:val="20"/>
                               </w:rPr>
-                              <w:t>255</w:t>
+                              <w:t>60</w:t>
                             </w:r>
                             <w:r>
                               <w:rPr>
@@ -2061,7 +2163,7 @@
                                 <w:sz w:val="20"/>
                                 <w:szCs w:val="20"/>
                               </w:rPr>
-                              <w:t>60</w:t>
+                              <w:t>0</w:t>
                             </w:r>
                             <w:r>
                               <w:rPr>
@@ -2077,7 +2179,7 @@
                                 <w:sz w:val="20"/>
                                 <w:szCs w:val="20"/>
                               </w:rPr>
-                              <w:t>60</w:t>
+                              <w:t>0</w:t>
                             </w:r>
                             <w:r>
                               <w:rPr>
@@ -2093,7 +2195,7 @@
                                 <w:sz w:val="20"/>
                                 <w:szCs w:val="20"/>
                               </w:rPr>
-                              <w:t>60</w:t>
+                              <w:t>0</w:t>
                             </w:r>
                             <w:r>
                               <w:rPr>
@@ -2109,7 +2211,7 @@
                                 <w:sz w:val="20"/>
                                 <w:szCs w:val="20"/>
                               </w:rPr>
-                              <w:t>60</w:t>
+                              <w:t>0</w:t>
                             </w:r>
                             <w:r>
                               <w:rPr>
@@ -2125,7 +2227,7 @@
                                 <w:sz w:val="20"/>
                                 <w:szCs w:val="20"/>
                               </w:rPr>
-                              <w:t>60</w:t>
+                              <w:t>0</w:t>
                             </w:r>
                             <w:r>
                               <w:rPr>
@@ -2141,7 +2243,7 @@
                                 <w:sz w:val="20"/>
                                 <w:szCs w:val="20"/>
                               </w:rPr>
-                              <w:t>60</w:t>
+                              <w:t>0</w:t>
                             </w:r>
                           </w:p>
                           <w:p>
@@ -2473,7 +2575,23 @@
                           <w:sz w:val="20"/>
                           <w:szCs w:val="20"/>
                         </w:rPr>
-                        <w:t>($2C0 to $2C8) are the color registers for players, missiles,and playfields</w:t>
+                        <w:t xml:space="preserve">($2C0 to $2C8) are the color registers for players, </w:t>
+                      </w:r>
+                      <w:proofErr w:type="spellStart"/>
+                      <w:r>
+                        <w:rPr>
+                          <w:sz w:val="20"/>
+                          <w:szCs w:val="20"/>
+                        </w:rPr>
+                        <w:t>missiles,and</w:t>
+                      </w:r>
+                      <w:proofErr w:type="spellEnd"/>
+                      <w:r>
+                        <w:rPr>
+                          <w:sz w:val="20"/>
+                          <w:szCs w:val="20"/>
+                        </w:rPr>
+                        <w:t xml:space="preserve"> playfields</w:t>
                       </w:r>
                       <w:r>
                         <w:rPr>
@@ -3095,7 +3213,7 @@
                           <w:sz w:val="20"/>
                           <w:szCs w:val="20"/>
                         </w:rPr>
-                        <w:t>60</w:t>
+                        <w:t>128</w:t>
                       </w:r>
                       <w:r>
                         <w:rPr>
@@ -3111,14 +3229,7 @@
                           <w:sz w:val="20"/>
                           <w:szCs w:val="20"/>
                         </w:rPr>
-                        <w:t>60</w:t>
-                      </w:r>
-                      <w:r>
-                        <w:rPr>
-                          <w:sz w:val="20"/>
-                          <w:szCs w:val="20"/>
-                        </w:rPr>
-                        <w:t>,</w:t>
+                        <w:t>6</w:t>
                       </w:r>
                       <w:r>
                         <w:rPr>
@@ -3127,7 +3238,7 @@
                           <w:sz w:val="20"/>
                           <w:szCs w:val="20"/>
                         </w:rPr>
-                        <w:t>60</w:t>
+                        <w:t>4</w:t>
                       </w:r>
                       <w:r>
                         <w:rPr>
@@ -3143,7 +3254,7 @@
                           <w:sz w:val="20"/>
                           <w:szCs w:val="20"/>
                         </w:rPr>
-                        <w:t>60</w:t>
+                        <w:t>44</w:t>
                       </w:r>
                       <w:r>
                         <w:rPr>
@@ -3159,7 +3270,7 @@
                           <w:sz w:val="20"/>
                           <w:szCs w:val="20"/>
                         </w:rPr>
-                        <w:t>60</w:t>
+                        <w:t>18</w:t>
                       </w:r>
                       <w:r>
                         <w:rPr>
@@ -3175,7 +3286,14 @@
                           <w:sz w:val="20"/>
                           <w:szCs w:val="20"/>
                         </w:rPr>
-                        <w:t>60</w:t>
+                        <w:t>18</w:t>
+                      </w:r>
+                      <w:r>
+                        <w:rPr>
+                          <w:sz w:val="20"/>
+                          <w:szCs w:val="20"/>
+                        </w:rPr>
+                        <w:t>,</w:t>
                       </w:r>
                       <w:r>
                         <w:rPr>
@@ -3184,6 +3302,15 @@
                           <w:sz w:val="20"/>
                           <w:szCs w:val="20"/>
                         </w:rPr>
+                        <w:t>127</w:t>
+                      </w:r>
+                      <w:r>
+                        <w:rPr>
+                          <w:i/>
+                          <w:iCs/>
+                          <w:sz w:val="20"/>
+                          <w:szCs w:val="20"/>
+                        </w:rPr>
                         <w:br/>
                         <w:t>610</w:t>
                       </w:r>
@@ -3201,7 +3328,7 @@
                           <w:sz w:val="20"/>
                           <w:szCs w:val="20"/>
                         </w:rPr>
-                        <w:t>255</w:t>
+                        <w:t>126</w:t>
                       </w:r>
                       <w:r>
                         <w:rPr>
@@ -3217,7 +3344,7 @@
                           <w:sz w:val="20"/>
                           <w:szCs w:val="20"/>
                         </w:rPr>
-                        <w:t>255</w:t>
+                        <w:t>60</w:t>
                       </w:r>
                       <w:r>
                         <w:rPr>
@@ -3233,7 +3360,7 @@
                           <w:sz w:val="20"/>
                           <w:szCs w:val="20"/>
                         </w:rPr>
-                        <w:t>255</w:t>
+                        <w:t>195</w:t>
                       </w:r>
                       <w:r>
                         <w:rPr>
@@ -3249,7 +3376,7 @@
                           <w:sz w:val="20"/>
                           <w:szCs w:val="20"/>
                         </w:rPr>
-                        <w:t>255</w:t>
+                        <w:t>153</w:t>
                       </w:r>
                       <w:r>
                         <w:rPr>
@@ -3265,7 +3392,7 @@
                           <w:sz w:val="20"/>
                           <w:szCs w:val="20"/>
                         </w:rPr>
-                        <w:t>255</w:t>
+                        <w:t>195</w:t>
                       </w:r>
                       <w:r>
                         <w:rPr>
@@ -3281,7 +3408,7 @@
                           <w:sz w:val="20"/>
                           <w:szCs w:val="20"/>
                         </w:rPr>
-                        <w:t>255</w:t>
+                        <w:t>60</w:t>
                       </w:r>
                       <w:r>
                         <w:rPr>
@@ -3307,7 +3434,7 @@
                           <w:sz w:val="20"/>
                           <w:szCs w:val="20"/>
                         </w:rPr>
-                        <w:t>60</w:t>
+                        <w:t>0</w:t>
                       </w:r>
                       <w:r>
                         <w:rPr>
@@ -3323,7 +3450,7 @@
                           <w:sz w:val="20"/>
                           <w:szCs w:val="20"/>
                         </w:rPr>
-                        <w:t>60</w:t>
+                        <w:t>0</w:t>
                       </w:r>
                       <w:r>
                         <w:rPr>
@@ -3339,7 +3466,7 @@
                           <w:sz w:val="20"/>
                           <w:szCs w:val="20"/>
                         </w:rPr>
-                        <w:t>60</w:t>
+                        <w:t>0</w:t>
                       </w:r>
                       <w:r>
                         <w:rPr>
@@ -3355,7 +3482,7 @@
                           <w:sz w:val="20"/>
                           <w:szCs w:val="20"/>
                         </w:rPr>
-                        <w:t>60</w:t>
+                        <w:t>0</w:t>
                       </w:r>
                       <w:r>
                         <w:rPr>
@@ -3371,7 +3498,7 @@
                           <w:sz w:val="20"/>
                           <w:szCs w:val="20"/>
                         </w:rPr>
-                        <w:t>60</w:t>
+                        <w:t>0</w:t>
                       </w:r>
                       <w:r>
                         <w:rPr>
@@ -3387,7 +3514,7 @@
                           <w:sz w:val="20"/>
                           <w:szCs w:val="20"/>
                         </w:rPr>
-                        <w:t>60</w:t>
+                        <w:t>0</w:t>
                       </w:r>
                     </w:p>
                     <w:p>
@@ -3417,9 +3544,80 @@
       <w:r>
         <w:rPr>
           <w:rFonts w:ascii="C64 Pro Mono" w:hAnsi="C64 Pro Mono"/>
+          <w:noProof/>
           <w:color w:val="FFFFFF" w:themeColor="background1"/>
         </w:rPr>
         <w:lastRenderedPageBreak/>
+        <w:drawing>
+          <wp:inline distT="0" distB="0" distL="0" distR="0" wp14:anchorId="2AFC72E7" wp14:editId="6D92916A">
+            <wp:extent cx="5587365" cy="3498215"/>
+            <wp:effectExtent l="0" t="0" r="0" b="6985"/>
+            <wp:docPr id="1745413131" name="Picture 6"/>
+            <wp:cNvGraphicFramePr>
+              <a:graphicFrameLocks xmlns:a="http://schemas.openxmlformats.org/drawingml/2006/main" noChangeAspect="1"/>
+            </wp:cNvGraphicFramePr>
+            <a:graphic xmlns:a="http://schemas.openxmlformats.org/drawingml/2006/main">
+              <a:graphicData uri="http://schemas.openxmlformats.org/drawingml/2006/picture">
+                <pic:pic xmlns:pic="http://schemas.openxmlformats.org/drawingml/2006/picture">
+                  <pic:nvPicPr>
+                    <pic:cNvPr id="0" name="Picture 1"/>
+                    <pic:cNvPicPr>
+                      <a:picLocks noChangeAspect="1" noChangeArrowheads="1"/>
+                    </pic:cNvPicPr>
+                  </pic:nvPicPr>
+                  <pic:blipFill>
+                    <a:blip r:embed="rId10">
+                      <a:extLst>
+                        <a:ext uri="{28A0092B-C50C-407E-A947-70E740481C1C}">
+                          <a14:useLocalDpi xmlns:a14="http://schemas.microsoft.com/office/drawing/2010/main" val="0"/>
+                        </a:ext>
+                      </a:extLst>
+                    </a:blip>
+                    <a:srcRect/>
+                    <a:stretch>
+                      <a:fillRect/>
+                    </a:stretch>
+                  </pic:blipFill>
+                  <pic:spPr bwMode="auto">
+                    <a:xfrm>
+                      <a:off x="0" y="0"/>
+                      <a:ext cx="5587365" cy="3498215"/>
+                    </a:xfrm>
+                    <a:prstGeom prst="rect">
+                      <a:avLst/>
+                    </a:prstGeom>
+                    <a:noFill/>
+                    <a:ln>
+                      <a:noFill/>
+                    </a:ln>
+                  </pic:spPr>
+                </pic:pic>
+              </a:graphicData>
+            </a:graphic>
+          </wp:inline>
+        </w:drawing>
+      </w:r>
+      <w:r>
+        <w:rPr>
+          <w:rFonts w:ascii="C64 Pro Mono" w:hAnsi="C64 Pro Mono"/>
+          <w:color w:val="FFFFFF" w:themeColor="background1"/>
+        </w:rPr>
+        <w:lastRenderedPageBreak/>
+        <w:t>Commodore company (1976 - 1994)</w:t>
+      </w:r>
+    </w:p>
+    <w:p>
+      <w:pPr>
+        <w:rPr>
+          <w:rFonts w:ascii="C64 Pro Mono" w:hAnsi="C64 Pro Mono"/>
+          <w:color w:val="FFFFFF" w:themeColor="background1"/>
+        </w:rPr>
+      </w:pPr>
+      <w:r>
+        <w:rPr>
+          <w:rFonts w:ascii="C64 Pro Mono" w:hAnsi="C64 Pro Mono"/>
+          <w:color w:val="FFFFFF" w:themeColor="background1"/>
+        </w:rPr>
         <w:t>Commodore 64 (1982)</w:t>
       </w:r>
     </w:p>
@@ -3480,7 +3678,7 @@
                     </pic:cNvPicPr>
                   </pic:nvPicPr>
                   <pic:blipFill>
-                    <a:blip r:embed="rId10" cstate="print">
+                    <a:blip r:embed="rId11" cstate="print">
                       <a:extLst>
                         <a:ext uri="{28A0092B-C50C-407E-A947-70E740481C1C}">
                           <a14:useLocalDpi xmlns:a14="http://schemas.microsoft.com/office/drawing/2010/main" val="0"/>
@@ -3604,7 +3802,7 @@
           <w:sz w:val="18"/>
           <w:szCs w:val="18"/>
         </w:rPr>
-        <w:t xml:space="preserve">Sprites created and controlled by specific RAM cells </w:t>
+        <w:t>Sprites are independent on graphical/text mode</w:t>
       </w:r>
     </w:p>
     <w:p>
@@ -3627,97 +3825,7 @@
           <w:sz w:val="18"/>
           <w:szCs w:val="18"/>
         </w:rPr>
-        <w:t>Total</w:t>
-      </w:r>
-      <w:r>
-        <w:rPr>
-          <w:rFonts w:ascii="C64 Pro Mono" w:hAnsi="C64 Pro Mono"/>
-          <w:color w:val="FFFFFF" w:themeColor="background1"/>
-          <w:sz w:val="18"/>
-          <w:szCs w:val="18"/>
-        </w:rPr>
-        <w:t xml:space="preserve"> </w:t>
-      </w:r>
-      <w:r>
-        <w:rPr>
-          <w:rFonts w:ascii="C64 Pro Mono" w:hAnsi="C64 Pro Mono"/>
-          <w:color w:val="FFFFFF" w:themeColor="background1"/>
-          <w:sz w:val="18"/>
-          <w:szCs w:val="18"/>
-        </w:rPr>
-        <w:t>RAM 64</w:t>
-      </w:r>
-      <w:r>
-        <w:rPr>
-          <w:rFonts w:ascii="C64 Pro Mono" w:hAnsi="C64 Pro Mono"/>
-          <w:color w:val="FFFFFF" w:themeColor="background1"/>
-          <w:sz w:val="18"/>
-          <w:szCs w:val="18"/>
-        </w:rPr>
-        <w:t xml:space="preserve"> </w:t>
-      </w:r>
-      <w:r>
-        <w:rPr>
-          <w:rFonts w:ascii="C64 Pro Mono" w:hAnsi="C64 Pro Mono"/>
-          <w:color w:val="FFFFFF" w:themeColor="background1"/>
-          <w:sz w:val="18"/>
-          <w:szCs w:val="18"/>
-        </w:rPr>
-        <w:t>KB</w:t>
-      </w:r>
-      <w:r>
-        <w:rPr>
-          <w:rFonts w:ascii="C64 Pro Mono" w:hAnsi="C64 Pro Mono"/>
-          <w:color w:val="FFFFFF" w:themeColor="background1"/>
-          <w:sz w:val="18"/>
-          <w:szCs w:val="18"/>
-        </w:rPr>
-        <w:t xml:space="preserve"> </w:t>
-      </w:r>
-      <w:r>
-        <w:rPr>
-          <w:rFonts w:ascii="C64 Pro Mono" w:hAnsi="C64 Pro Mono"/>
-          <w:color w:val="FFFFFF" w:themeColor="background1"/>
-          <w:sz w:val="18"/>
-          <w:szCs w:val="18"/>
-        </w:rPr>
-        <w:t>=</w:t>
-      </w:r>
-      <w:r>
-        <w:rPr>
-          <w:rFonts w:ascii="C64 Pro Mono" w:hAnsi="C64 Pro Mono"/>
-          <w:color w:val="FFFFFF" w:themeColor="background1"/>
-          <w:sz w:val="18"/>
-          <w:szCs w:val="18"/>
-        </w:rPr>
-        <w:t xml:space="preserve"> </w:t>
-      </w:r>
-      <w:r>
-        <w:rPr>
-          <w:rFonts w:ascii="C64 Pro Mono" w:hAnsi="C64 Pro Mono"/>
-          <w:color w:val="FFFFFF" w:themeColor="background1"/>
-          <w:sz w:val="18"/>
-          <w:szCs w:val="18"/>
-        </w:rPr>
-        <w:t>65535</w:t>
-      </w:r>
-      <w:r>
-        <w:rPr>
-          <w:rFonts w:ascii="C64 Pro Mono" w:hAnsi="C64 Pro Mono"/>
-          <w:color w:val="FFFFFF" w:themeColor="background1"/>
-          <w:sz w:val="18"/>
-          <w:szCs w:val="18"/>
-        </w:rPr>
-        <w:t xml:space="preserve"> </w:t>
-      </w:r>
-      <w:r>
-        <w:rPr>
-          <w:rFonts w:ascii="C64 Pro Mono" w:hAnsi="C64 Pro Mono"/>
-          <w:color w:val="FFFFFF" w:themeColor="background1"/>
-          <w:sz w:val="18"/>
-          <w:szCs w:val="18"/>
-        </w:rPr>
-        <w:t>B</w:t>
+        <w:t xml:space="preserve">Sprites created and controlled by specific RAM cells </w:t>
       </w:r>
     </w:p>
     <w:p>
@@ -3740,34 +3848,7 @@
           <w:sz w:val="18"/>
           <w:szCs w:val="18"/>
         </w:rPr>
-        <w:t>53248</w:t>
-      </w:r>
-      <w:r>
-        <w:rPr>
-          <w:rFonts w:ascii="C64 Pro Mono" w:hAnsi="C64 Pro Mono"/>
-          <w:color w:val="FFFFFF" w:themeColor="background1"/>
-          <w:sz w:val="12"/>
-          <w:szCs w:val="12"/>
-        </w:rPr>
-        <w:t>($</w:t>
-      </w:r>
-      <w:r>
-        <w:rPr>
-          <w:rFonts w:ascii="C64 Pro Mono" w:hAnsi="C64 Pro Mono"/>
-          <w:color w:val="FFFFFF" w:themeColor="background1"/>
-          <w:sz w:val="12"/>
-          <w:szCs w:val="12"/>
-        </w:rPr>
-        <w:t>d</w:t>
-      </w:r>
-      <w:r>
-        <w:rPr>
-          <w:rFonts w:ascii="C64 Pro Mono" w:hAnsi="C64 Pro Mono"/>
-          <w:color w:val="FFFFFF" w:themeColor="background1"/>
-          <w:sz w:val="12"/>
-          <w:szCs w:val="12"/>
-        </w:rPr>
-        <w:t>000)</w:t>
+        <w:t>Total</w:t>
       </w:r>
       <w:r>
         <w:rPr>
@@ -3776,7 +3857,88 @@
           <w:sz w:val="18"/>
           <w:szCs w:val="18"/>
         </w:rPr>
-        <w:t xml:space="preserve"> S0 position X</w:t>
+        <w:t xml:space="preserve"> </w:t>
+      </w:r>
+      <w:r>
+        <w:rPr>
+          <w:rFonts w:ascii="C64 Pro Mono" w:hAnsi="C64 Pro Mono"/>
+          <w:color w:val="FFFFFF" w:themeColor="background1"/>
+          <w:sz w:val="18"/>
+          <w:szCs w:val="18"/>
+        </w:rPr>
+        <w:t>RAM 64</w:t>
+      </w:r>
+      <w:r>
+        <w:rPr>
+          <w:rFonts w:ascii="C64 Pro Mono" w:hAnsi="C64 Pro Mono"/>
+          <w:color w:val="FFFFFF" w:themeColor="background1"/>
+          <w:sz w:val="18"/>
+          <w:szCs w:val="18"/>
+        </w:rPr>
+        <w:t xml:space="preserve"> </w:t>
+      </w:r>
+      <w:r>
+        <w:rPr>
+          <w:rFonts w:ascii="C64 Pro Mono" w:hAnsi="C64 Pro Mono"/>
+          <w:color w:val="FFFFFF" w:themeColor="background1"/>
+          <w:sz w:val="18"/>
+          <w:szCs w:val="18"/>
+        </w:rPr>
+        <w:t>KB</w:t>
+      </w:r>
+      <w:r>
+        <w:rPr>
+          <w:rFonts w:ascii="C64 Pro Mono" w:hAnsi="C64 Pro Mono"/>
+          <w:color w:val="FFFFFF" w:themeColor="background1"/>
+          <w:sz w:val="18"/>
+          <w:szCs w:val="18"/>
+        </w:rPr>
+        <w:t xml:space="preserve"> </w:t>
+      </w:r>
+      <w:r>
+        <w:rPr>
+          <w:rFonts w:ascii="C64 Pro Mono" w:hAnsi="C64 Pro Mono"/>
+          <w:color w:val="FFFFFF" w:themeColor="background1"/>
+          <w:sz w:val="18"/>
+          <w:szCs w:val="18"/>
+        </w:rPr>
+        <w:t>=</w:t>
+      </w:r>
+      <w:r>
+        <w:rPr>
+          <w:rFonts w:ascii="C64 Pro Mono" w:hAnsi="C64 Pro Mono"/>
+          <w:color w:val="FFFFFF" w:themeColor="background1"/>
+          <w:sz w:val="18"/>
+          <w:szCs w:val="18"/>
+        </w:rPr>
+        <w:t xml:space="preserve"> </w:t>
+      </w:r>
+      <w:r>
+        <w:rPr>
+          <w:rFonts w:ascii="C64 Pro Mono" w:hAnsi="C64 Pro Mono"/>
+          <w:color w:val="FFFFFF" w:themeColor="background1"/>
+          <w:sz w:val="18"/>
+          <w:szCs w:val="18"/>
+        </w:rPr>
+        <w:t>65535</w:t>
+      </w:r>
+      <w:r>
+        <w:rPr>
+          <w:rFonts w:ascii="C64 Pro Mono" w:hAnsi="C64 Pro Mono"/>
+          <w:color w:val="FFFFFF" w:themeColor="background1"/>
+          <w:sz w:val="18"/>
+          <w:szCs w:val="18"/>
+        </w:rPr>
+        <w:t xml:space="preserve"> </w:t>
+      </w:r>
+      <w:r>
+        <w:rPr>
+          <w:rFonts w:ascii="C64 Pro Mono" w:hAnsi="C64 Pro Mono"/>
+          <w:color w:val="FFFFFF" w:themeColor="background1"/>
+          <w:sz w:val="18"/>
+          <w:szCs w:val="18"/>
+        </w:rPr>
+        <w:t>B</w:t>
       </w:r>
     </w:p>
     <w:p>
@@ -3799,7 +3961,7 @@
           <w:sz w:val="18"/>
           <w:szCs w:val="18"/>
         </w:rPr>
-        <w:t>53249</w:t>
+        <w:t>53248</w:t>
       </w:r>
       <w:r>
         <w:rPr>
@@ -3826,25 +3988,7 @@
           <w:sz w:val="12"/>
           <w:szCs w:val="12"/>
         </w:rPr>
-        <w:t>00</w:t>
-      </w:r>
-      <w:r>
-        <w:rPr>
-          <w:rFonts w:ascii="C64 Pro Mono" w:hAnsi="C64 Pro Mono"/>
-          <w:color w:val="FFFFFF" w:themeColor="background1"/>
-          <w:sz w:val="12"/>
-          <w:szCs w:val="12"/>
-        </w:rPr>
-        <w:t>1</w:t>
-      </w:r>
-      <w:r>
-        <w:rPr>
-          <w:rFonts w:ascii="C64 Pro Mono" w:hAnsi="C64 Pro Mono"/>
-          <w:color w:val="FFFFFF" w:themeColor="background1"/>
-          <w:sz w:val="12"/>
-          <w:szCs w:val="12"/>
-        </w:rPr>
-        <w:t>)</w:t>
+        <w:t>000)</w:t>
       </w:r>
       <w:r>
         <w:rPr>
@@ -3853,7 +3997,7 @@
           <w:sz w:val="18"/>
           <w:szCs w:val="18"/>
         </w:rPr>
-        <w:t xml:space="preserve"> S1 position Y</w:t>
+        <w:t xml:space="preserve"> S0 position X</w:t>
       </w:r>
     </w:p>
     <w:p>
@@ -3876,7 +4020,52 @@
           <w:sz w:val="18"/>
           <w:szCs w:val="18"/>
         </w:rPr>
-        <w:t>53248-5326</w:t>
+        <w:t>53249</w:t>
+      </w:r>
+      <w:r>
+        <w:rPr>
+          <w:rFonts w:ascii="C64 Pro Mono" w:hAnsi="C64 Pro Mono"/>
+          <w:color w:val="FFFFFF" w:themeColor="background1"/>
+          <w:sz w:val="12"/>
+          <w:szCs w:val="12"/>
+        </w:rPr>
+        <w:t>($</w:t>
+      </w:r>
+      <w:r>
+        <w:rPr>
+          <w:rFonts w:ascii="C64 Pro Mono" w:hAnsi="C64 Pro Mono"/>
+          <w:color w:val="FFFFFF" w:themeColor="background1"/>
+          <w:sz w:val="12"/>
+          <w:szCs w:val="12"/>
+        </w:rPr>
+        <w:t>d</w:t>
+      </w:r>
+      <w:r>
+        <w:rPr>
+          <w:rFonts w:ascii="C64 Pro Mono" w:hAnsi="C64 Pro Mono"/>
+          <w:color w:val="FFFFFF" w:themeColor="background1"/>
+          <w:sz w:val="12"/>
+          <w:szCs w:val="12"/>
+        </w:rPr>
+        <w:t>00</w:t>
+      </w:r>
+      <w:r>
+        <w:rPr>
+          <w:rFonts w:ascii="C64 Pro Mono" w:hAnsi="C64 Pro Mono"/>
+          <w:color w:val="FFFFFF" w:themeColor="background1"/>
+          <w:sz w:val="12"/>
+          <w:szCs w:val="12"/>
+        </w:rPr>
+        <w:t>1</w:t>
+      </w:r>
+      <w:r>
+        <w:rPr>
+          <w:rFonts w:ascii="C64 Pro Mono" w:hAnsi="C64 Pro Mono"/>
+          <w:color w:val="FFFFFF" w:themeColor="background1"/>
+          <w:sz w:val="12"/>
+          <w:szCs w:val="12"/>
+        </w:rPr>
+        <w:t>)</w:t>
       </w:r>
       <w:r>
         <w:rPr>
@@ -3885,79 +4074,7 @@
           <w:sz w:val="18"/>
           <w:szCs w:val="18"/>
         </w:rPr>
-        <w:t>3</w:t>
-      </w:r>
-      <w:r>
-        <w:rPr>
-          <w:rFonts w:ascii="C64 Pro Mono" w:hAnsi="C64 Pro Mono"/>
-          <w:color w:val="FFFFFF" w:themeColor="background1"/>
-          <w:sz w:val="12"/>
-          <w:szCs w:val="12"/>
-        </w:rPr>
-        <w:t>($</w:t>
-      </w:r>
-      <w:r>
-        <w:rPr>
-          <w:rFonts w:ascii="C64 Pro Mono" w:hAnsi="C64 Pro Mono"/>
-          <w:color w:val="FFFFFF" w:themeColor="background1"/>
-          <w:sz w:val="12"/>
-          <w:szCs w:val="12"/>
-        </w:rPr>
-        <w:t>d</w:t>
-      </w:r>
-      <w:r>
-        <w:rPr>
-          <w:rFonts w:ascii="C64 Pro Mono" w:hAnsi="C64 Pro Mono"/>
-          <w:color w:val="FFFFFF" w:themeColor="background1"/>
-          <w:sz w:val="12"/>
-          <w:szCs w:val="12"/>
-        </w:rPr>
-        <w:t>000</w:t>
-      </w:r>
-      <w:r>
-        <w:rPr>
-          <w:rFonts w:ascii="C64 Pro Mono" w:hAnsi="C64 Pro Mono"/>
-          <w:color w:val="FFFFFF" w:themeColor="background1"/>
-          <w:sz w:val="12"/>
-          <w:szCs w:val="12"/>
-        </w:rPr>
-        <w:t>-$d00f</w:t>
-      </w:r>
-      <w:r>
-        <w:rPr>
-          <w:rFonts w:ascii="C64 Pro Mono" w:hAnsi="C64 Pro Mono"/>
-          <w:color w:val="FFFFFF" w:themeColor="background1"/>
-          <w:sz w:val="12"/>
-          <w:szCs w:val="12"/>
-        </w:rPr>
-        <w:t>)</w:t>
-      </w:r>
-      <w:r>
-        <w:rPr>
-          <w:rFonts w:ascii="C64 Pro Mono" w:hAnsi="C64 Pro Mono"/>
-          <w:color w:val="FFFFFF" w:themeColor="background1"/>
-          <w:sz w:val="18"/>
-          <w:szCs w:val="18"/>
-        </w:rPr>
-        <w:t xml:space="preserve"> </w:t>
-      </w:r>
-      <w:r>
-        <w:rPr>
-          <w:rFonts w:ascii="Courier New" w:hAnsi="Courier New" w:cs="Courier New"/>
-          <w:color w:val="FFFFFF" w:themeColor="background1"/>
-          <w:sz w:val="18"/>
-          <w:szCs w:val="18"/>
-        </w:rPr>
-        <w:t>–</w:t>
-      </w:r>
-      <w:r>
-        <w:rPr>
-          <w:rFonts w:ascii="C64 Pro Mono" w:hAnsi="C64 Pro Mono"/>
-          <w:color w:val="FFFFFF" w:themeColor="background1"/>
-          <w:sz w:val="18"/>
-          <w:szCs w:val="18"/>
-        </w:rPr>
-        <w:t xml:space="preserve"> positions X, Y of all sprites</w:t>
+        <w:t xml:space="preserve"> S1 position Y</w:t>
       </w:r>
     </w:p>
     <w:p>
@@ -3980,7 +4097,16 @@
           <w:sz w:val="18"/>
           <w:szCs w:val="18"/>
         </w:rPr>
-        <w:t>53269</w:t>
+        <w:t>53248-5326</w:t>
+      </w:r>
+      <w:r>
+        <w:rPr>
+          <w:rFonts w:ascii="C64 Pro Mono" w:hAnsi="C64 Pro Mono"/>
+          <w:color w:val="FFFFFF" w:themeColor="background1"/>
+          <w:sz w:val="18"/>
+          <w:szCs w:val="18"/>
+        </w:rPr>
+        <w:t>3</w:t>
       </w:r>
       <w:r>
         <w:rPr>
@@ -4007,7 +4133,7 @@
           <w:sz w:val="12"/>
           <w:szCs w:val="12"/>
         </w:rPr>
-        <w:t>0</w:t>
+        <w:t>000</w:t>
       </w:r>
       <w:r>
         <w:rPr>
@@ -4016,7 +4142,7 @@
           <w:sz w:val="12"/>
           <w:szCs w:val="12"/>
         </w:rPr>
-        <w:t>15</w:t>
+        <w:t>-$d00f</w:t>
       </w:r>
       <w:r>
         <w:rPr>
@@ -4052,7 +4178,7 @@
           <w:sz w:val="18"/>
           <w:szCs w:val="18"/>
         </w:rPr>
-        <w:t xml:space="preserve"> sprites enable</w:t>
+        <w:t xml:space="preserve"> positions X, Y of all sprites</w:t>
       </w:r>
     </w:p>
     <w:p>
@@ -4075,7 +4201,53 @@
           <w:sz w:val="18"/>
           <w:szCs w:val="18"/>
         </w:rPr>
-        <w:t>5328</w:t>
+        <w:lastRenderedPageBreak/>
+        <w:t>53269</w:t>
+      </w:r>
+      <w:r>
+        <w:rPr>
+          <w:rFonts w:ascii="C64 Pro Mono" w:hAnsi="C64 Pro Mono"/>
+          <w:color w:val="FFFFFF" w:themeColor="background1"/>
+          <w:sz w:val="12"/>
+          <w:szCs w:val="12"/>
+        </w:rPr>
+        <w:t>($</w:t>
+      </w:r>
+      <w:r>
+        <w:rPr>
+          <w:rFonts w:ascii="C64 Pro Mono" w:hAnsi="C64 Pro Mono"/>
+          <w:color w:val="FFFFFF" w:themeColor="background1"/>
+          <w:sz w:val="12"/>
+          <w:szCs w:val="12"/>
+        </w:rPr>
+        <w:t>d</w:t>
+      </w:r>
+      <w:r>
+        <w:rPr>
+          <w:rFonts w:ascii="C64 Pro Mono" w:hAnsi="C64 Pro Mono"/>
+          <w:color w:val="FFFFFF" w:themeColor="background1"/>
+          <w:sz w:val="12"/>
+          <w:szCs w:val="12"/>
+        </w:rPr>
+        <w:t>0</w:t>
+      </w:r>
+      <w:r>
+        <w:rPr>
+          <w:rFonts w:ascii="C64 Pro Mono" w:hAnsi="C64 Pro Mono"/>
+          <w:color w:val="FFFFFF" w:themeColor="background1"/>
+          <w:sz w:val="12"/>
+          <w:szCs w:val="12"/>
+        </w:rPr>
+        <w:t>15</w:t>
+      </w:r>
+      <w:r>
+        <w:rPr>
+          <w:rFonts w:ascii="C64 Pro Mono" w:hAnsi="C64 Pro Mono"/>
+          <w:color w:val="FFFFFF" w:themeColor="background1"/>
+          <w:sz w:val="12"/>
+          <w:szCs w:val="12"/>
+        </w:rPr>
+        <w:t>)</w:t>
       </w:r>
       <w:r>
         <w:rPr>
@@ -4084,7 +4256,7 @@
           <w:sz w:val="18"/>
           <w:szCs w:val="18"/>
         </w:rPr>
-        <w:t xml:space="preserve">7 </w:t>
+        <w:t xml:space="preserve"> </w:t>
       </w:r>
       <w:r>
         <w:rPr>
@@ -4102,61 +4274,7 @@
           <w:sz w:val="18"/>
           <w:szCs w:val="18"/>
         </w:rPr>
-        <w:t xml:space="preserve"> 53294</w:t>
-      </w:r>
-      <w:r>
-        <w:rPr>
-          <w:rFonts w:ascii="C64 Pro Mono" w:hAnsi="C64 Pro Mono"/>
-          <w:color w:val="FFFFFF" w:themeColor="background1"/>
-          <w:sz w:val="12"/>
-          <w:szCs w:val="12"/>
-        </w:rPr>
-        <w:t>($</w:t>
-      </w:r>
-      <w:r>
-        <w:rPr>
-          <w:rFonts w:ascii="C64 Pro Mono" w:hAnsi="C64 Pro Mono"/>
-          <w:color w:val="FFFFFF" w:themeColor="background1"/>
-          <w:sz w:val="12"/>
-          <w:szCs w:val="12"/>
-        </w:rPr>
-        <w:t>d027-$d02e</w:t>
-      </w:r>
-      <w:r>
-        <w:rPr>
-          <w:rFonts w:ascii="C64 Pro Mono" w:hAnsi="C64 Pro Mono"/>
-          <w:color w:val="FFFFFF" w:themeColor="background1"/>
-          <w:sz w:val="12"/>
-          <w:szCs w:val="12"/>
-        </w:rPr>
-        <w:t>)</w:t>
-      </w:r>
-      <w:r>
-        <w:rPr>
-          <w:rFonts w:ascii="C64 Pro Mono" w:hAnsi="C64 Pro Mono"/>
-          <w:color w:val="FFFFFF" w:themeColor="background1"/>
-          <w:sz w:val="18"/>
-          <w:szCs w:val="18"/>
-        </w:rPr>
-        <w:t xml:space="preserve"> </w:t>
-      </w:r>
-      <w:r>
-        <w:rPr>
-          <w:rFonts w:ascii="Courier New" w:hAnsi="Courier New" w:cs="Courier New"/>
-          <w:color w:val="FFFFFF" w:themeColor="background1"/>
-          <w:sz w:val="18"/>
-          <w:szCs w:val="18"/>
-        </w:rPr>
-        <w:t>–</w:t>
-      </w:r>
-      <w:r>
-        <w:rPr>
-          <w:rFonts w:ascii="C64 Pro Mono" w:hAnsi="C64 Pro Mono"/>
-          <w:color w:val="FFFFFF" w:themeColor="background1"/>
-          <w:sz w:val="18"/>
-          <w:szCs w:val="18"/>
-        </w:rPr>
-        <w:t xml:space="preserve"> sprite colors</w:t>
+        <w:t xml:space="preserve"> sprites enable</w:t>
       </w:r>
     </w:p>
     <w:p>
@@ -4179,8 +4297,34 @@
           <w:sz w:val="18"/>
           <w:szCs w:val="18"/>
         </w:rPr>
-        <w:lastRenderedPageBreak/>
-        <w:t>2040-2047</w:t>
+        <w:t>5328</w:t>
+      </w:r>
+      <w:r>
+        <w:rPr>
+          <w:rFonts w:ascii="C64 Pro Mono" w:hAnsi="C64 Pro Mono"/>
+          <w:color w:val="FFFFFF" w:themeColor="background1"/>
+          <w:sz w:val="18"/>
+          <w:szCs w:val="18"/>
+        </w:rPr>
+        <w:t xml:space="preserve">7 </w:t>
+      </w:r>
+      <w:r>
+        <w:rPr>
+          <w:rFonts w:ascii="Courier New" w:hAnsi="Courier New" w:cs="Courier New"/>
+          <w:color w:val="FFFFFF" w:themeColor="background1"/>
+          <w:sz w:val="18"/>
+          <w:szCs w:val="18"/>
+        </w:rPr>
+        <w:t>–</w:t>
+      </w:r>
+      <w:r>
+        <w:rPr>
+          <w:rFonts w:ascii="C64 Pro Mono" w:hAnsi="C64 Pro Mono"/>
+          <w:color w:val="FFFFFF" w:themeColor="background1"/>
+          <w:sz w:val="18"/>
+          <w:szCs w:val="18"/>
+        </w:rPr>
+        <w:t xml:space="preserve"> 53294</w:t>
       </w:r>
       <w:r>
         <w:rPr>
@@ -4189,7 +4333,7 @@
           <w:sz w:val="12"/>
           <w:szCs w:val="12"/>
         </w:rPr>
-        <w:t>($0</w:t>
+        <w:t>($</w:t>
       </w:r>
       <w:r>
         <w:rPr>
@@ -4198,7 +4342,7 @@
           <w:sz w:val="12"/>
           <w:szCs w:val="12"/>
         </w:rPr>
-        <w:t>7f8-$07ff</w:t>
+        <w:t>d027-$d02e</w:t>
       </w:r>
       <w:r>
         <w:rPr>
@@ -4234,7 +4378,7 @@
           <w:sz w:val="18"/>
           <w:szCs w:val="18"/>
         </w:rPr>
-        <w:t xml:space="preserve"> sprite pointers</w:t>
+        <w:t xml:space="preserve"> sprite colors</w:t>
       </w:r>
     </w:p>
     <w:p>
@@ -4257,7 +4401,7 @@
           <w:sz w:val="18"/>
           <w:szCs w:val="18"/>
         </w:rPr>
-        <w:t>53278-53279</w:t>
+        <w:t>2040-2047</w:t>
       </w:r>
       <w:r>
         <w:rPr>
@@ -4266,7 +4410,7 @@
           <w:sz w:val="12"/>
           <w:szCs w:val="12"/>
         </w:rPr>
-        <w:t>($</w:t>
+        <w:t>($0</w:t>
       </w:r>
       <w:r>
         <w:rPr>
@@ -4275,7 +4419,7 @@
           <w:sz w:val="12"/>
           <w:szCs w:val="12"/>
         </w:rPr>
-        <w:t>d027-$d028</w:t>
+        <w:t>7f8-$07ff</w:t>
       </w:r>
       <w:r>
         <w:rPr>
@@ -4293,17 +4437,105 @@
           <w:sz w:val="18"/>
           <w:szCs w:val="18"/>
         </w:rPr>
-        <w:t xml:space="preserve"> -</w:t>
-      </w:r>
-      <w:r>
-        <w:rPr>
-          <w:rFonts w:ascii="C64 Pro Mono" w:hAnsi="C64 Pro Mono"/>
+        <w:t xml:space="preserve"> </w:t>
+      </w:r>
+      <w:r>
+        <w:rPr>
+          <w:rFonts w:ascii="Courier New" w:hAnsi="Courier New" w:cs="Courier New"/>
           <w:color w:val="FFFFFF" w:themeColor="background1"/>
           <w:sz w:val="18"/>
           <w:szCs w:val="18"/>
         </w:rPr>
-        <w:t xml:space="preserve"> sprite collisions</w:t>
-      </w:r>
+        <w:t>–</w:t>
+      </w:r>
+      <w:r>
+        <w:rPr>
+          <w:rFonts w:ascii="C64 Pro Mono" w:hAnsi="C64 Pro Mono"/>
+          <w:color w:val="FFFFFF" w:themeColor="background1"/>
+          <w:sz w:val="18"/>
+          <w:szCs w:val="18"/>
+        </w:rPr>
+        <w:t xml:space="preserve"> sprite pointers</w:t>
+      </w:r>
+    </w:p>
+    <w:p>
+      <w:pPr>
+        <w:numPr>
+          <w:ilvl w:val="0"/>
+          <w:numId w:val="2"/>
+        </w:numPr>
+        <w:rPr>
+          <w:rFonts w:ascii="C64 Pro Mono" w:hAnsi="C64 Pro Mono"/>
+          <w:color w:val="FFFFFF" w:themeColor="background1"/>
+          <w:sz w:val="18"/>
+          <w:szCs w:val="18"/>
+        </w:rPr>
+      </w:pPr>
+      <w:r>
+        <w:rPr>
+          <w:rFonts w:ascii="C64 Pro Mono" w:hAnsi="C64 Pro Mono"/>
+          <w:color w:val="FFFFFF" w:themeColor="background1"/>
+          <w:sz w:val="18"/>
+          <w:szCs w:val="18"/>
+        </w:rPr>
+        <w:t>53278-53279</w:t>
+      </w:r>
+      <w:r>
+        <w:rPr>
+          <w:rFonts w:ascii="C64 Pro Mono" w:hAnsi="C64 Pro Mono"/>
+          <w:color w:val="FFFFFF" w:themeColor="background1"/>
+          <w:sz w:val="12"/>
+          <w:szCs w:val="12"/>
+        </w:rPr>
+        <w:t>($</w:t>
+      </w:r>
+      <w:r>
+        <w:rPr>
+          <w:rFonts w:ascii="C64 Pro Mono" w:hAnsi="C64 Pro Mono"/>
+          <w:color w:val="FFFFFF" w:themeColor="background1"/>
+          <w:sz w:val="12"/>
+          <w:szCs w:val="12"/>
+        </w:rPr>
+        <w:t>d027-$d028</w:t>
+      </w:r>
+      <w:r>
+        <w:rPr>
+          <w:rFonts w:ascii="C64 Pro Mono" w:hAnsi="C64 Pro Mono"/>
+          <w:color w:val="FFFFFF" w:themeColor="background1"/>
+          <w:sz w:val="12"/>
+          <w:szCs w:val="12"/>
+        </w:rPr>
+        <w:t>)</w:t>
+      </w:r>
+      <w:r>
+        <w:rPr>
+          <w:rFonts w:ascii="C64 Pro Mono" w:hAnsi="C64 Pro Mono"/>
+          <w:color w:val="FFFFFF" w:themeColor="background1"/>
+          <w:sz w:val="18"/>
+          <w:szCs w:val="18"/>
+        </w:rPr>
+        <w:t xml:space="preserve"> -</w:t>
+      </w:r>
+      <w:r>
+        <w:rPr>
+          <w:rFonts w:ascii="C64 Pro Mono" w:hAnsi="C64 Pro Mono"/>
+          <w:color w:val="FFFFFF" w:themeColor="background1"/>
+          <w:sz w:val="18"/>
+          <w:szCs w:val="18"/>
+        </w:rPr>
+        <w:t xml:space="preserve"> </w:t>
+      </w:r>
+      <w:proofErr w:type="gramStart"/>
+      <w:r>
+        <w:rPr>
+          <w:rFonts w:ascii="C64 Pro Mono" w:hAnsi="C64 Pro Mono"/>
+          <w:color w:val="FFFFFF" w:themeColor="background1"/>
+          <w:sz w:val="18"/>
+          <w:szCs w:val="18"/>
+        </w:rPr>
+        <w:t>sprite collisions</w:t>
+      </w:r>
+      <w:proofErr w:type="gramEnd"/>
     </w:p>
     <w:p>
       <w:pPr>
@@ -4389,7 +4621,7 @@
                     <pic:cNvPicPr/>
                   </pic:nvPicPr>
                   <pic:blipFill>
-                    <a:blip r:embed="rId11">
+                    <a:blip r:embed="rId12">
                       <a:extLst>
                         <a:ext uri="{28A0092B-C50C-407E-A947-70E740481C1C}">
                           <a14:useLocalDpi xmlns:a14="http://schemas.microsoft.com/office/drawing/2010/main" val="0"/>
@@ -4492,10 +4724,25 @@
       <w:r>
         <w:rPr>
           <w:rFonts w:ascii="C64 Pro Mono" w:hAnsi="C64 Pro Mono"/>
+          <w:color w:val="FFFFFF" w:themeColor="background1"/>
+        </w:rPr>
+        <w:lastRenderedPageBreak/>
+        <w:t>IBM company (since 1911)</w:t>
+      </w:r>
+    </w:p>
+    <w:p>
+      <w:pPr>
+        <w:rPr>
+          <w:rFonts w:ascii="C64 Pro Mono" w:hAnsi="C64 Pro Mono"/>
+          <w:color w:val="FFFFFF" w:themeColor="background1"/>
+        </w:rPr>
+      </w:pPr>
+      <w:r>
+        <w:rPr>
+          <w:rFonts w:ascii="C64 Pro Mono" w:hAnsi="C64 Pro Mono"/>
           <w:noProof/>
           <w:color w:val="FFFFFF" w:themeColor="background1"/>
         </w:rPr>
-        <w:lastRenderedPageBreak/>
         <w:drawing>
           <wp:anchor distT="0" distB="0" distL="114300" distR="114300" simplePos="0" relativeHeight="251664384" behindDoc="0" locked="0" layoutInCell="1" allowOverlap="1" wp14:anchorId="4BA7D5B0" wp14:editId="3C8C59FF">
             <wp:simplePos x="0" y="0"/>
@@ -4520,7 +4767,7 @@
                     <pic:cNvPicPr/>
                   </pic:nvPicPr>
                   <pic:blipFill>
-                    <a:blip r:embed="rId12">
+                    <a:blip r:embed="rId13">
                       <a:extLst>
                         <a:ext uri="{28A0092B-C50C-407E-A947-70E740481C1C}">
                           <a14:useLocalDpi xmlns:a14="http://schemas.microsoft.com/office/drawing/2010/main" val="0"/>
@@ -4635,7 +4882,23 @@
           <w:rFonts w:ascii="C64 Pro Mono" w:hAnsi="C64 Pro Mono"/>
           <w:color w:val="FFFFFF" w:themeColor="background1"/>
         </w:rPr>
-        <w:t>No sprites!!!</w:t>
+        <w:t xml:space="preserve">No </w:t>
+      </w:r>
+      <w:proofErr w:type="gramStart"/>
+      <w:r>
+        <w:rPr>
+          <w:rFonts w:ascii="C64 Pro Mono" w:hAnsi="C64 Pro Mono"/>
+          <w:color w:val="FFFFFF" w:themeColor="background1"/>
+        </w:rPr>
+        <w:t>sprites</w:t>
+      </w:r>
+      <w:proofErr w:type="gramEnd"/>
+      <w:r>
+        <w:rPr>
+          <w:rFonts w:ascii="C64 Pro Mono" w:hAnsi="C64 Pro Mono"/>
+          <w:color w:val="FFFFFF" w:themeColor="background1"/>
+        </w:rPr>
+        <w:t>!!!</w:t>
       </w:r>
     </w:p>
     <w:p>
@@ -4685,7 +4948,22 @@
           <w:color w:val="FFFFFF" w:themeColor="background1"/>
         </w:rPr>
         <w:br/>
-        <w:t xml:space="preserve">pulating with background </w:t>
+      </w:r>
+      <w:proofErr w:type="spellStart"/>
+      <w:r>
+        <w:rPr>
+          <w:rFonts w:ascii="C64 Pro Mono" w:hAnsi="C64 Pro Mono"/>
+          <w:color w:val="FFFFFF" w:themeColor="background1"/>
+        </w:rPr>
+        <w:t>pulating</w:t>
+      </w:r>
+      <w:proofErr w:type="spellEnd"/>
+      <w:r>
+        <w:rPr>
+          <w:rFonts w:ascii="C64 Pro Mono" w:hAnsi="C64 Pro Mono"/>
+          <w:color w:val="FFFFFF" w:themeColor="background1"/>
+        </w:rPr>
+        <w:t xml:space="preserve"> with background </w:t>
       </w:r>
       <w:r>
         <w:rPr>
@@ -4730,7 +5008,7 @@
           <w:color w:val="FFFFFF" w:themeColor="background1"/>
           <w:lang w:val="fr-FR"/>
         </w:rPr>
-        <w:t>Graphics mode 13h (320x200, 256 c</w:t>
+        <w:t>Graphics mode</w:t>
       </w:r>
       <w:r>
         <w:rPr>
@@ -4738,7 +5016,23 @@
           <w:color w:val="FFFFFF" w:themeColor="background1"/>
           <w:lang w:val="fr-FR"/>
         </w:rPr>
-        <w:t>olors)</w:t>
+        <w:t>s</w:t>
+      </w:r>
+      <w:r>
+        <w:rPr>
+          <w:rFonts w:ascii="C64 Pro Mono" w:hAnsi="C64 Pro Mono"/>
+          <w:color w:val="FFFFFF" w:themeColor="background1"/>
+          <w:lang w:val="fr-FR"/>
+        </w:rPr>
+        <w:t xml:space="preserve"> </w:t>
+      </w:r>
+      <w:r>
+        <w:rPr>
+          <w:rFonts w:ascii="C64 Pro Mono" w:hAnsi="C64 Pro Mono"/>
+          <w:color w:val="FFFFFF" w:themeColor="background1"/>
+          <w:lang w:val="fr-FR"/>
+        </w:rPr>
+        <w:t>13h, CGA, EGA, VGA</w:t>
       </w:r>
     </w:p>
     <w:p>
@@ -4750,13 +5044,86 @@
           <w:lang w:val="fr-FR"/>
         </w:rPr>
       </w:pPr>
+    </w:p>
+    <w:p>
+      <w:pPr>
+        <w:rPr>
+          <w:rFonts w:ascii="C64 Pro Mono" w:hAnsi="C64 Pro Mono"/>
+          <w:color w:val="FFFFFF" w:themeColor="background1"/>
+          <w:lang w:val="fr-FR"/>
+        </w:rPr>
+      </w:pPr>
+    </w:p>
+    <w:p>
+      <w:pPr>
+        <w:rPr>
+          <w:rFonts w:ascii="C64 Pro Mono" w:hAnsi="C64 Pro Mono"/>
+          <w:color w:val="FFFFFF" w:themeColor="background1"/>
+          <w:lang w:val="fr-FR"/>
+        </w:rPr>
+      </w:pPr>
+    </w:p>
+    <w:p>
+      <w:pPr>
+        <w:rPr>
+          <w:rFonts w:ascii="C64 Pro Mono" w:hAnsi="C64 Pro Mono"/>
+          <w:color w:val="FFFFFF" w:themeColor="background1"/>
+          <w:lang w:val="fr-FR"/>
+        </w:rPr>
+      </w:pPr>
+    </w:p>
+    <w:p>
+      <w:pPr>
+        <w:rPr>
+          <w:rFonts w:ascii="C64 Pro Mono" w:hAnsi="C64 Pro Mono"/>
+          <w:color w:val="FFFFFF" w:themeColor="background1"/>
+        </w:rPr>
+      </w:pPr>
+      <w:r>
+        <w:rPr>
+          <w:rFonts w:ascii="C64 Pro Mono" w:hAnsi="C64 Pro Mono"/>
+          <w:color w:val="FFFFFF" w:themeColor="background1"/>
+        </w:rPr>
+        <w:lastRenderedPageBreak/>
+        <w:t>Borland company (1983-2015)</w:t>
+      </w:r>
+    </w:p>
+    <w:p>
+      <w:pPr>
+        <w:rPr>
+          <w:rFonts w:ascii="C64 Pro Mono" w:hAnsi="C64 Pro Mono"/>
+          <w:color w:val="FFFFFF" w:themeColor="background1"/>
+        </w:rPr>
+      </w:pPr>
+    </w:p>
+    <w:p>
+      <w:pPr>
+        <w:rPr>
+          <w:rFonts w:ascii="C64 Pro Mono" w:hAnsi="C64 Pro Mono"/>
+          <w:color w:val="FFFFFF" w:themeColor="background1"/>
+        </w:rPr>
+      </w:pPr>
+      <w:r>
+        <w:rPr>
+          <w:rFonts w:ascii="C64 Pro Mono" w:hAnsi="C64 Pro Mono"/>
+          <w:color w:val="FFFFFF" w:themeColor="background1"/>
+        </w:rPr>
+        <w:t>Borland C++ 3 for D</w:t>
+      </w:r>
+      <w:r>
+        <w:rPr>
+          <w:rFonts w:ascii="C64 Pro Mono" w:hAnsi="C64 Pro Mono"/>
+          <w:color w:val="FFFFFF" w:themeColor="background1"/>
+        </w:rPr>
+        <w:t>OS</w:t>
+      </w:r>
     </w:p>
     <w:p>
       <w:pPr>
         <w:pStyle w:val="ListParagraph"/>
         <w:numPr>
           <w:ilvl w:val="0"/>
-          <w:numId w:val="13"/>
+          <w:numId w:val="14"/>
         </w:numPr>
         <w:rPr>
           <w:rFonts w:ascii="C64 Pro Mono" w:hAnsi="C64 Pro Mono"/>
@@ -4768,29 +5135,53 @@
           <w:rFonts w:ascii="C64 Pro Mono" w:hAnsi="C64 Pro Mono"/>
           <w:color w:val="FFFFFF" w:themeColor="background1"/>
         </w:rPr>
-        <w:t xml:space="preserve">Screen memory </w:t>
-      </w:r>
-      <w:r>
-        <w:rPr>
-          <w:rFonts w:ascii="Courier New" w:hAnsi="Courier New" w:cs="Courier New"/>
-          <w:color w:val="FFFFFF" w:themeColor="background1"/>
-        </w:rPr>
-        <w:t>–</w:t>
-      </w:r>
-      <w:r>
-        <w:rPr>
-          <w:rFonts w:ascii="C64 Pro Mono" w:hAnsi="C64 Pro Mono"/>
-          <w:color w:val="FFFFFF" w:themeColor="background1"/>
-        </w:rPr>
-        <w:t xml:space="preserve"> 62 KB beginning wi</w:t>
-      </w:r>
-      <w:r>
-        <w:rPr>
-          <w:rFonts w:ascii="C64 Pro Mono" w:hAnsi="C64 Pro Mono"/>
-          <w:color w:val="FFFFFF" w:themeColor="background1"/>
-        </w:rPr>
-        <w:t>th a000 address</w:t>
-      </w:r>
+        <w:t>Graphics display supported by BGI (Borland Graphical Interface)</w:t>
+      </w:r>
+    </w:p>
+    <w:p>
+      <w:pPr>
+        <w:pStyle w:val="ListParagraph"/>
+        <w:rPr>
+          <w:rFonts w:ascii="C64 Pro Mono" w:hAnsi="C64 Pro Mono"/>
+          <w:color w:val="FFFFFF" w:themeColor="background1"/>
+        </w:rPr>
+      </w:pPr>
+    </w:p>
+    <w:p>
+      <w:pPr>
+        <w:pStyle w:val="ListParagraph"/>
+        <w:numPr>
+          <w:ilvl w:val="0"/>
+          <w:numId w:val="14"/>
+        </w:numPr>
+        <w:rPr>
+          <w:rFonts w:ascii="C64 Pro Mono" w:hAnsi="C64 Pro Mono"/>
+          <w:color w:val="FFFFFF" w:themeColor="background1"/>
+        </w:rPr>
+      </w:pPr>
+      <w:r>
+        <w:rPr>
+          <w:rFonts w:ascii="C64 Pro Mono" w:hAnsi="C64 Pro Mono"/>
+          <w:color w:val="FFFFFF" w:themeColor="background1"/>
+        </w:rPr>
+        <w:t xml:space="preserve">Instead of sprites, </w:t>
+      </w:r>
+      <w:r>
+        <w:rPr>
+          <w:rFonts w:ascii="C64 Pro Mono" w:hAnsi="C64 Pro Mono"/>
+          <w:color w:val="FFFFFF" w:themeColor="background1"/>
+        </w:rPr>
+        <w:t>a graphical object is simply drawn atop its background</w:t>
+      </w:r>
+    </w:p>
+    <w:p>
+      <w:pPr>
+        <w:pStyle w:val="ListParagraph"/>
+        <w:rPr>
+          <w:rFonts w:ascii="C64 Pro Mono" w:hAnsi="C64 Pro Mono"/>
+          <w:color w:val="FFFFFF" w:themeColor="background1"/>
+        </w:rPr>
+      </w:pPr>
     </w:p>
     <w:p>
       <w:pPr>
@@ -4828,6 +5219,21 @@
           <w:color w:val="FFFFFF" w:themeColor="background1"/>
         </w:rPr>
         <w:lastRenderedPageBreak/>
+        <w:t>Guido van Rossum (born 1956)</w:t>
+      </w:r>
+    </w:p>
+    <w:p>
+      <w:pPr>
+        <w:rPr>
+          <w:rFonts w:ascii="C64 Pro Mono" w:hAnsi="C64 Pro Mono"/>
+          <w:color w:val="FFFFFF" w:themeColor="background1"/>
+        </w:rPr>
+      </w:pPr>
+      <w:r>
+        <w:rPr>
+          <w:rFonts w:ascii="C64 Pro Mono" w:hAnsi="C64 Pro Mono"/>
+          <w:color w:val="FFFFFF" w:themeColor="background1"/>
+        </w:rPr>
         <w:t>Python (1991)</w:t>
       </w:r>
     </w:p>
@@ -4873,7 +5279,7 @@
                     </pic:cNvPicPr>
                   </pic:nvPicPr>
                   <pic:blipFill>
-                    <a:blip r:embed="rId13" cstate="print">
+                    <a:blip r:embed="rId14" cstate="print">
                       <a:extLst>
                         <a:ext uri="{28A0092B-C50C-407E-A947-70E740481C1C}">
                           <a14:useLocalDpi xmlns:a14="http://schemas.microsoft.com/office/drawing/2010/main" val="0"/>
@@ -4981,36 +5387,31 @@
     </w:p>
     <w:p>
       <w:pPr>
-        <w:pStyle w:val="ListParagraph"/>
-        <w:numPr>
-          <w:ilvl w:val="0"/>
-          <w:numId w:val="11"/>
-        </w:numPr>
-        <w:rPr>
-          <w:rFonts w:ascii="C64 Pro Mono" w:hAnsi="C64 Pro Mono"/>
-          <w:color w:val="FFFFFF" w:themeColor="background1"/>
-        </w:rPr>
-      </w:pPr>
-      <w:r>
-        <w:rPr>
-          <w:rFonts w:ascii="C64 Pro Mono" w:hAnsi="C64 Pro Mono"/>
-          <w:color w:val="FFFFFF" w:themeColor="background1"/>
-        </w:rPr>
-        <w:t xml:space="preserve">2014 </w:t>
-      </w:r>
-      <w:r>
-        <w:rPr>
-          <w:rFonts w:ascii="Courier New" w:hAnsi="Courier New" w:cs="Courier New"/>
-          <w:color w:val="FFFFFF" w:themeColor="background1"/>
-        </w:rPr>
-        <w:t>–</w:t>
-      </w:r>
-      <w:r>
-        <w:rPr>
-          <w:rFonts w:ascii="C64 Pro Mono" w:hAnsi="C64 Pro Mono"/>
-          <w:color w:val="FFFFFF" w:themeColor="background1"/>
-        </w:rPr>
-        <w:t xml:space="preserve"> library ARCADE </w:t>
+        <w:rPr>
+          <w:rFonts w:ascii="C64 Pro Mono" w:hAnsi="C64 Pro Mono"/>
+          <w:color w:val="FFFFFF" w:themeColor="background1"/>
+        </w:rPr>
+      </w:pPr>
+      <w:r>
+        <w:rPr>
+          <w:rFonts w:ascii="C64 Pro Mono" w:hAnsi="C64 Pro Mono"/>
+          <w:color w:val="FFFFFF" w:themeColor="background1"/>
+        </w:rPr>
+        <w:t>L</w:t>
+      </w:r>
+      <w:r>
+        <w:rPr>
+          <w:rFonts w:ascii="C64 Pro Mono" w:hAnsi="C64 Pro Mono"/>
+          <w:color w:val="FFFFFF" w:themeColor="background1"/>
+        </w:rPr>
+        <w:t xml:space="preserve">ibrary ARCADE </w:t>
+      </w:r>
+      <w:r>
+        <w:rPr>
+          <w:rFonts w:ascii="C64 Pro Mono" w:hAnsi="C64 Pro Mono"/>
+          <w:color w:val="FFFFFF" w:themeColor="background1"/>
+        </w:rPr>
+        <w:t>(2014)</w:t>
       </w:r>
       <w:r>
         <w:rPr>
@@ -5136,7 +5537,30 @@
                               <w:t>monster</w:t>
                             </w:r>
                             <w:r>
-                              <w:t xml:space="preserve"> = arcade.Sprite("monster.bmp",scale=</w:t>
+                              <w:t xml:space="preserve"> = </w:t>
+                            </w:r>
+                            <w:proofErr w:type="spellStart"/>
+                            <w:proofErr w:type="gramStart"/>
+                            <w:r>
+                              <w:t>arcade.Sprite</w:t>
+                            </w:r>
+                            <w:proofErr w:type="spellEnd"/>
+                            <w:proofErr w:type="gramEnd"/>
+                            <w:r>
+                              <w:t>("</w:t>
+                            </w:r>
+                            <w:proofErr w:type="spellStart"/>
+                            <w:r>
+                              <w:t>monster.bmp</w:t>
+                            </w:r>
+                            <w:proofErr w:type="gramStart"/>
+                            <w:r>
+                              <w:t>",scale</w:t>
+                            </w:r>
+                            <w:proofErr w:type="spellEnd"/>
+                            <w:proofErr w:type="gramEnd"/>
+                            <w:r>
+                              <w:t>=</w:t>
                             </w:r>
                             <w:r>
                               <w:rPr>
@@ -5153,7 +5577,17 @@
                               <w:t>skull</w:t>
                             </w:r>
                             <w:r>
-                              <w:t xml:space="preserve"> = arcade.Sprite("</w:t>
+                              <w:t xml:space="preserve"> = </w:t>
+                            </w:r>
+                            <w:proofErr w:type="spellStart"/>
+                            <w:proofErr w:type="gramStart"/>
+                            <w:r>
+                              <w:t>arcade.Sprite</w:t>
+                            </w:r>
+                            <w:proofErr w:type="spellEnd"/>
+                            <w:proofErr w:type="gramEnd"/>
+                            <w:r>
+                              <w:t>("</w:t>
                             </w:r>
                             <w:r>
                               <w:t>skull</w:t>
@@ -5169,24 +5603,73 @@
                             </w:r>
                           </w:p>
                           <w:p>
-                            <w:r>
-                              <w:t>enemy_list = arcade.SpriteList()</w:t>
+                            <w:proofErr w:type="spellStart"/>
+                            <w:r>
+                              <w:t>enemy_list</w:t>
+                            </w:r>
+                            <w:proofErr w:type="spellEnd"/>
+                            <w:r>
+                              <w:t xml:space="preserve"> = </w:t>
+                            </w:r>
+                            <w:proofErr w:type="spellStart"/>
+                            <w:proofErr w:type="gramStart"/>
+                            <w:r>
+                              <w:t>arcade.SpriteList</w:t>
+                            </w:r>
+                            <w:proofErr w:type="spellEnd"/>
+                            <w:proofErr w:type="gramEnd"/>
+                            <w:r>
+                              <w:t>()</w:t>
                             </w:r>
                             <w:r>
                               <w:br/>
+                            </w:r>
+                            <w:proofErr w:type="spellStart"/>
+                            <w:r>
                               <w:t>enem</w:t>
                             </w:r>
                             <w:r>
-                              <w:t>y_list.append(monster)</w:t>
+                              <w:t>y_</w:t>
+                            </w:r>
+                            <w:proofErr w:type="gramStart"/>
+                            <w:r>
+                              <w:t>list.append</w:t>
+                            </w:r>
+                            <w:proofErr w:type="spellEnd"/>
+                            <w:proofErr w:type="gramEnd"/>
+                            <w:r>
+                              <w:t>(monster)</w:t>
                             </w:r>
                             <w:r>
                               <w:br/>
-                              <w:t>enemy_list.append(skull)</w:t>
+                            </w:r>
+                            <w:proofErr w:type="spellStart"/>
+                            <w:r>
+                              <w:t>enemy_</w:t>
+                            </w:r>
+                            <w:proofErr w:type="gramStart"/>
+                            <w:r>
+                              <w:t>list.append</w:t>
+                            </w:r>
+                            <w:proofErr w:type="spellEnd"/>
+                            <w:proofErr w:type="gramEnd"/>
+                            <w:r>
+                              <w:t>(skull)</w:t>
                             </w:r>
                           </w:p>
                           <w:p>
-                            <w:r>
-                              <w:t>enemy_list.draw()</w:t>
+                            <w:proofErr w:type="spellStart"/>
+                            <w:r>
+                              <w:t>enemy_</w:t>
+                            </w:r>
+                            <w:proofErr w:type="gramStart"/>
+                            <w:r>
+                              <w:t>list.draw</w:t>
+                            </w:r>
+                            <w:proofErr w:type="spellEnd"/>
+                            <w:proofErr w:type="gramEnd"/>
+                            <w:r>
+                              <w:t>()</w:t>
                             </w:r>
                           </w:p>
                           <w:p/>
@@ -5220,7 +5703,30 @@
                         <w:t>monster</w:t>
                       </w:r>
                       <w:r>
-                        <w:t xml:space="preserve"> = arcade.Sprite("monster.bmp",scale=</w:t>
+                        <w:t xml:space="preserve"> = </w:t>
+                      </w:r>
+                      <w:proofErr w:type="spellStart"/>
+                      <w:proofErr w:type="gramStart"/>
+                      <w:r>
+                        <w:t>arcade.Sprite</w:t>
+                      </w:r>
+                      <w:proofErr w:type="spellEnd"/>
+                      <w:proofErr w:type="gramEnd"/>
+                      <w:r>
+                        <w:t>("</w:t>
+                      </w:r>
+                      <w:proofErr w:type="spellStart"/>
+                      <w:r>
+                        <w:t>monster.bmp</w:t>
+                      </w:r>
+                      <w:proofErr w:type="gramStart"/>
+                      <w:r>
+                        <w:t>",scale</w:t>
+                      </w:r>
+                      <w:proofErr w:type="spellEnd"/>
+                      <w:proofErr w:type="gramEnd"/>
+                      <w:r>
+                        <w:t>=</w:t>
                       </w:r>
                       <w:r>
                         <w:rPr>
@@ -5237,7 +5743,17 @@
                         <w:t>skull</w:t>
                       </w:r>
                       <w:r>
-                        <w:t xml:space="preserve"> = arcade.Sprite("</w:t>
+                        <w:t xml:space="preserve"> = </w:t>
+                      </w:r>
+                      <w:proofErr w:type="spellStart"/>
+                      <w:proofErr w:type="gramStart"/>
+                      <w:r>
+                        <w:t>arcade.Sprite</w:t>
+                      </w:r>
+                      <w:proofErr w:type="spellEnd"/>
+                      <w:proofErr w:type="gramEnd"/>
+                      <w:r>
+                        <w:t>("</w:t>
                       </w:r>
                       <w:r>
                         <w:t>skull</w:t>
@@ -5253,24 +5769,73 @@
                       </w:r>
                     </w:p>
                     <w:p>
-                      <w:r>
-                        <w:t>enemy_list = arcade.SpriteList()</w:t>
+                      <w:proofErr w:type="spellStart"/>
+                      <w:r>
+                        <w:t>enemy_list</w:t>
+                      </w:r>
+                      <w:proofErr w:type="spellEnd"/>
+                      <w:r>
+                        <w:t xml:space="preserve"> = </w:t>
+                      </w:r>
+                      <w:proofErr w:type="spellStart"/>
+                      <w:proofErr w:type="gramStart"/>
+                      <w:r>
+                        <w:t>arcade.SpriteList</w:t>
+                      </w:r>
+                      <w:proofErr w:type="spellEnd"/>
+                      <w:proofErr w:type="gramEnd"/>
+                      <w:r>
+                        <w:t>()</w:t>
                       </w:r>
                       <w:r>
                         <w:br/>
+                      </w:r>
+                      <w:proofErr w:type="spellStart"/>
+                      <w:r>
                         <w:t>enem</w:t>
                       </w:r>
                       <w:r>
-                        <w:t>y_list.append(monster)</w:t>
+                        <w:t>y_</w:t>
+                      </w:r>
+                      <w:proofErr w:type="gramStart"/>
+                      <w:r>
+                        <w:t>list.append</w:t>
+                      </w:r>
+                      <w:proofErr w:type="spellEnd"/>
+                      <w:proofErr w:type="gramEnd"/>
+                      <w:r>
+                        <w:t>(monster)</w:t>
                       </w:r>
                       <w:r>
                         <w:br/>
-                        <w:t>enemy_list.append(skull)</w:t>
+                      </w:r>
+                      <w:proofErr w:type="spellStart"/>
+                      <w:r>
+                        <w:t>enemy_</w:t>
+                      </w:r>
+                      <w:proofErr w:type="gramStart"/>
+                      <w:r>
+                        <w:t>list.append</w:t>
+                      </w:r>
+                      <w:proofErr w:type="spellEnd"/>
+                      <w:proofErr w:type="gramEnd"/>
+                      <w:r>
+                        <w:t>(skull)</w:t>
                       </w:r>
                     </w:p>
                     <w:p>
-                      <w:r>
-                        <w:t>enemy_list.draw()</w:t>
+                      <w:proofErr w:type="spellStart"/>
+                      <w:r>
+                        <w:t>enemy_</w:t>
+                      </w:r>
+                      <w:proofErr w:type="gramStart"/>
+                      <w:r>
+                        <w:t>list.draw</w:t>
+                      </w:r>
+                      <w:proofErr w:type="spellEnd"/>
+                      <w:proofErr w:type="gramEnd"/>
+                      <w:r>
+                        <w:t>()</w:t>
                       </w:r>
                     </w:p>
                     <w:p/>
@@ -5338,12 +5903,21 @@
                       <wps:txbx>
                         <w:txbxContent>
                           <w:p>
+                            <w:proofErr w:type="spellStart"/>
                             <w:r>
                               <w:t>tankSprite</w:t>
                             </w:r>
-                            <w:r>
-                              <w:t xml:space="preserve"> = arcade.Sprite</w:t>
-                            </w:r>
+                            <w:proofErr w:type="spellEnd"/>
+                            <w:r>
+                              <w:t xml:space="preserve"> = </w:t>
+                            </w:r>
+                            <w:proofErr w:type="spellStart"/>
+                            <w:proofErr w:type="gramStart"/>
+                            <w:r>
+                              <w:t>arcade.Sprite</w:t>
+                            </w:r>
+                            <w:proofErr w:type="spellEnd"/>
+                            <w:proofErr w:type="gramEnd"/>
                             <w:r>
                               <w:t>(</w:t>
                             </w:r>
@@ -5357,11 +5931,19 @@
                                 <w:lang w:val="fr-FR"/>
                               </w:rPr>
                             </w:pPr>
+                            <w:proofErr w:type="spellStart"/>
                             <w:r>
                               <w:rPr>
                                 <w:lang w:val="fr-FR"/>
                               </w:rPr>
-                              <w:t xml:space="preserve">tankSprite.center_x = </w:t>
+                              <w:t>tankSprite.center_x</w:t>
+                            </w:r>
+                            <w:proofErr w:type="spellEnd"/>
+                            <w:r>
+                              <w:rPr>
+                                <w:lang w:val="fr-FR"/>
+                              </w:rPr>
+                              <w:t xml:space="preserve"> = </w:t>
                             </w:r>
                             <w:r>
                               <w:rPr>
@@ -5379,14 +5961,30 @@
                               </w:rPr>
                               <w:br/>
                             </w:r>
+                            <w:proofErr w:type="spellStart"/>
                             <w:r>
                               <w:t>tankSprite</w:t>
                             </w:r>
+                            <w:proofErr w:type="spellEnd"/>
                             <w:r>
                               <w:rPr>
                                 <w:lang w:val="fr-FR"/>
                               </w:rPr>
-                              <w:t xml:space="preserve">.center_y = </w:t>
+                              <w:t>.</w:t>
+                            </w:r>
+                            <w:proofErr w:type="spellStart"/>
+                            <w:r>
+                              <w:rPr>
+                                <w:lang w:val="fr-FR"/>
+                              </w:rPr>
+                              <w:t>center_y</w:t>
+                            </w:r>
+                            <w:proofErr w:type="spellEnd"/>
+                            <w:r>
+                              <w:rPr>
+                                <w:lang w:val="fr-FR"/>
+                              </w:rPr>
+                              <w:t xml:space="preserve"> = </w:t>
                             </w:r>
                             <w:r>
                               <w:rPr>
@@ -5434,12 +6032,21 @@
                 <v:textbox>
                   <w:txbxContent>
                     <w:p>
+                      <w:proofErr w:type="spellStart"/>
                       <w:r>
                         <w:t>tankSprite</w:t>
                       </w:r>
-                      <w:r>
-                        <w:t xml:space="preserve"> = arcade.Sprite</w:t>
-                      </w:r>
+                      <w:proofErr w:type="spellEnd"/>
+                      <w:r>
+                        <w:t xml:space="preserve"> = </w:t>
+                      </w:r>
+                      <w:proofErr w:type="spellStart"/>
+                      <w:proofErr w:type="gramStart"/>
+                      <w:r>
+                        <w:t>arcade.Sprite</w:t>
+                      </w:r>
+                      <w:proofErr w:type="spellEnd"/>
+                      <w:proofErr w:type="gramEnd"/>
                       <w:r>
                         <w:t>(</w:t>
                       </w:r>
@@ -5453,11 +6060,19 @@
                           <w:lang w:val="fr-FR"/>
                         </w:rPr>
                       </w:pPr>
+                      <w:proofErr w:type="spellStart"/>
                       <w:r>
                         <w:rPr>
                           <w:lang w:val="fr-FR"/>
                         </w:rPr>
-                        <w:t xml:space="preserve">tankSprite.center_x = </w:t>
+                        <w:t>tankSprite.center_x</w:t>
+                      </w:r>
+                      <w:proofErr w:type="spellEnd"/>
+                      <w:r>
+                        <w:rPr>
+                          <w:lang w:val="fr-FR"/>
+                        </w:rPr>
+                        <w:t xml:space="preserve"> = </w:t>
                       </w:r>
                       <w:r>
                         <w:rPr>
@@ -5475,14 +6090,30 @@
                         </w:rPr>
                         <w:br/>
                       </w:r>
+                      <w:proofErr w:type="spellStart"/>
                       <w:r>
                         <w:t>tankSprite</w:t>
                       </w:r>
+                      <w:proofErr w:type="spellEnd"/>
                       <w:r>
                         <w:rPr>
                           <w:lang w:val="fr-FR"/>
                         </w:rPr>
-                        <w:t xml:space="preserve">.center_y = </w:t>
+                        <w:t>.</w:t>
+                      </w:r>
+                      <w:proofErr w:type="spellStart"/>
+                      <w:r>
+                        <w:rPr>
+                          <w:lang w:val="fr-FR"/>
+                        </w:rPr>
+                        <w:t>center_y</w:t>
+                      </w:r>
+                      <w:proofErr w:type="spellEnd"/>
+                      <w:r>
+                        <w:rPr>
+                          <w:lang w:val="fr-FR"/>
+                        </w:rPr>
+                        <w:t xml:space="preserve"> = </w:t>
                       </w:r>
                       <w:r>
                         <w:rPr>
@@ -5532,9 +6163,24 @@
       </w:pPr>
       <w:r>
         <w:rPr>
+          <w:rFonts w:ascii="C64 Pro Mono" w:hAnsi="C64 Pro Mono"/>
+          <w:color w:val="FFFFFF" w:themeColor="background1"/>
+        </w:rPr>
+        <w:lastRenderedPageBreak/>
+        <w:t>Sun Microsystems (1982-2010)</w:t>
+      </w:r>
+    </w:p>
+    <w:p>
+      <w:pPr>
+        <w:rPr>
+          <w:rFonts w:ascii="C64 Pro Mono" w:hAnsi="C64 Pro Mono"/>
+          <w:color w:val="FFFFFF" w:themeColor="background1"/>
+        </w:rPr>
+      </w:pPr>
+      <w:r>
+        <w:rPr>
           <w:noProof/>
         </w:rPr>
-        <w:lastRenderedPageBreak/>
         <w:drawing>
           <wp:anchor distT="0" distB="0" distL="114300" distR="114300" simplePos="0" relativeHeight="251670528" behindDoc="0" locked="0" layoutInCell="1" allowOverlap="1" wp14:anchorId="75475698" wp14:editId="14679916">
             <wp:simplePos x="0" y="0"/>
@@ -5561,7 +6207,7 @@
                     </pic:cNvPicPr>
                   </pic:nvPicPr>
                   <pic:blipFill>
-                    <a:blip r:embed="rId14">
+                    <a:blip r:embed="rId15">
                       <a:extLst>
                         <a:ext uri="{28A0092B-C50C-407E-A947-70E740481C1C}">
                           <a14:useLocalDpi xmlns:a14="http://schemas.microsoft.com/office/drawing/2010/main" val="0"/>
@@ -5698,7 +6344,23 @@
           <w:rFonts w:ascii="C64 Pro Mono" w:hAnsi="C64 Pro Mono"/>
           <w:color w:val="FFFFFF" w:themeColor="background1"/>
         </w:rPr>
-        <w:t>"Java is like a wheel. Invented long time ago, but still needed"</w:t>
+        <w:t xml:space="preserve">"Java is like a wheel. </w:t>
+      </w:r>
+      <w:proofErr w:type="gramStart"/>
+      <w:r>
+        <w:rPr>
+          <w:rFonts w:ascii="C64 Pro Mono" w:hAnsi="C64 Pro Mono"/>
+          <w:color w:val="FFFFFF" w:themeColor="background1"/>
+        </w:rPr>
+        <w:t>Invented</w:t>
+      </w:r>
+      <w:proofErr w:type="gramEnd"/>
+      <w:r>
+        <w:rPr>
+          <w:rFonts w:ascii="C64 Pro Mono" w:hAnsi="C64 Pro Mono"/>
+          <w:color w:val="FFFFFF" w:themeColor="background1"/>
+        </w:rPr>
+        <w:t xml:space="preserve"> long time ago, but still needed"</w:t>
       </w:r>
     </w:p>
     <w:p>
@@ -5755,6 +6417,37 @@
     </w:p>
     <w:p>
       <w:pPr>
+        <w:rPr>
+          <w:rFonts w:ascii="C64 Pro Mono" w:hAnsi="C64 Pro Mono"/>
+          <w:color w:val="FFFFFF" w:themeColor="background1"/>
+        </w:rPr>
+      </w:pPr>
+      <w:r>
+        <w:rPr>
+          <w:rFonts w:ascii="C64 Pro Mono" w:hAnsi="C64 Pro Mono"/>
+          <w:color w:val="FFFFFF" w:themeColor="background1"/>
+        </w:rPr>
+        <w:t>GDX library</w:t>
+      </w:r>
+      <w:r>
+        <w:rPr>
+          <w:rFonts w:ascii="C64 Pro Mono" w:hAnsi="C64 Pro Mono"/>
+          <w:color w:val="FFFFFF" w:themeColor="background1"/>
+        </w:rPr>
+        <w:t xml:space="preserve"> (2014)</w:t>
+      </w:r>
+    </w:p>
+    <w:p>
+      <w:pPr>
+        <w:pStyle w:val="ListParagraph"/>
+        <w:rPr>
+          <w:rFonts w:ascii="C64 Pro Mono" w:hAnsi="C64 Pro Mono"/>
+          <w:color w:val="FFFFFF" w:themeColor="background1"/>
+        </w:rPr>
+      </w:pPr>
+    </w:p>
+    <w:p>
+      <w:pPr>
         <w:pStyle w:val="ListParagraph"/>
         <w:numPr>
           <w:ilvl w:val="0"/>
@@ -5770,31 +6463,8 @@
           <w:rFonts w:ascii="C64 Pro Mono" w:hAnsi="C64 Pro Mono"/>
           <w:color w:val="FFFFFF" w:themeColor="background1"/>
         </w:rPr>
-        <w:t xml:space="preserve">2014 </w:t>
-      </w:r>
-      <w:r>
-        <w:rPr>
-          <w:rFonts w:ascii="Courier New" w:hAnsi="Courier New" w:cs="Courier New"/>
-          <w:color w:val="FFFFFF" w:themeColor="background1"/>
-        </w:rPr>
-        <w:t>–</w:t>
-      </w:r>
-      <w:r>
-        <w:rPr>
-          <w:rFonts w:ascii="C64 Pro Mono" w:hAnsi="C64 Pro Mono"/>
-          <w:color w:val="FFFFFF" w:themeColor="background1"/>
-        </w:rPr>
-        <w:t xml:space="preserve"> GDX library</w:t>
-      </w:r>
-    </w:p>
-    <w:p>
-      <w:pPr>
-        <w:pStyle w:val="ListParagraph"/>
-        <w:rPr>
-          <w:rFonts w:ascii="C64 Pro Mono" w:hAnsi="C64 Pro Mono"/>
-          <w:color w:val="FFFFFF" w:themeColor="background1"/>
-        </w:rPr>
-      </w:pPr>
+        <w:t>GDX contains Sprite class</w:t>
+      </w:r>
     </w:p>
     <w:p>
       <w:pPr>
@@ -5813,7 +6483,7 @@
           <w:rFonts w:ascii="C64 Pro Mono" w:hAnsi="C64 Pro Mono"/>
           <w:color w:val="FFFFFF" w:themeColor="background1"/>
         </w:rPr>
-        <w:t>GDX contains Sprite class</w:t>
+        <w:t>Number of sprites limited only by RAM assigned to JVM</w:t>
       </w:r>
     </w:p>
     <w:p>
@@ -5841,7 +6511,6 @@
         <w:rPr>
           <w:rFonts w:ascii="C64 Pro Mono" w:hAnsi="C64 Pro Mono"/>
           <w:color w:val="FFFFFF" w:themeColor="background1"/>
-          <w:lang w:val="fr-FR"/>
         </w:rPr>
       </w:pPr>
       <w:r>
@@ -5902,13 +6571,28 @@
                               <w:t xml:space="preserve">var </w:t>
                             </w:r>
                             <w:r>
-                              <w:t>batch = new SpriteBatch();</w:t>
+                              <w:t xml:space="preserve">batch = new </w:t>
+                            </w:r>
+                            <w:proofErr w:type="spellStart"/>
+                            <w:r>
+                              <w:t>SpriteBatch</w:t>
+                            </w:r>
+                            <w:proofErr w:type="spellEnd"/>
+                            <w:r>
+                              <w:t>();</w:t>
                             </w:r>
                             <w:r>
                               <w:br/>
                             </w:r>
-                            <w:r>
-                              <w:t>batch.begin();</w:t>
+                            <w:proofErr w:type="spellStart"/>
+                            <w:proofErr w:type="gramStart"/>
+                            <w:r>
+                              <w:t>batch.begin</w:t>
+                            </w:r>
+                            <w:proofErr w:type="spellEnd"/>
+                            <w:proofErr w:type="gramEnd"/>
+                            <w:r>
+                              <w:t>();</w:t>
                             </w:r>
                             <w:r>
                               <w:br/>
@@ -5918,15 +6602,19 @@
                             <w:r>
                               <w:br/>
                             </w:r>
+                            <w:proofErr w:type="spellStart"/>
+                            <w:proofErr w:type="gramStart"/>
                             <w:r>
                               <w:t>batch.</w:t>
                             </w:r>
                             <w:r>
                               <w:t>end</w:t>
                             </w:r>
+                            <w:proofErr w:type="spellEnd"/>
                             <w:r>
                               <w:t>();</w:t>
                             </w:r>
+                            <w:proofErr w:type="gramEnd"/>
                           </w:p>
                           <w:p/>
                           <w:p/>
@@ -5963,13 +6651,28 @@
                         <w:t xml:space="preserve">var </w:t>
                       </w:r>
                       <w:r>
-                        <w:t>batch = new SpriteBatch();</w:t>
+                        <w:t xml:space="preserve">batch = new </w:t>
+                      </w:r>
+                      <w:proofErr w:type="spellStart"/>
+                      <w:r>
+                        <w:t>SpriteBatch</w:t>
+                      </w:r>
+                      <w:proofErr w:type="spellEnd"/>
+                      <w:r>
+                        <w:t>();</w:t>
                       </w:r>
                       <w:r>
                         <w:br/>
                       </w:r>
-                      <w:r>
-                        <w:t>batch.begin();</w:t>
+                      <w:proofErr w:type="spellStart"/>
+                      <w:proofErr w:type="gramStart"/>
+                      <w:r>
+                        <w:t>batch.begin</w:t>
+                      </w:r>
+                      <w:proofErr w:type="spellEnd"/>
+                      <w:proofErr w:type="gramEnd"/>
+                      <w:r>
+                        <w:t>();</w:t>
                       </w:r>
                       <w:r>
                         <w:br/>
@@ -5979,15 +6682,19 @@
                       <w:r>
                         <w:br/>
                       </w:r>
+                      <w:proofErr w:type="spellStart"/>
+                      <w:proofErr w:type="gramStart"/>
                       <w:r>
                         <w:t>batch.</w:t>
                       </w:r>
                       <w:r>
                         <w:t>end</w:t>
                       </w:r>
+                      <w:proofErr w:type="spellEnd"/>
                       <w:r>
                         <w:t>();</w:t>
                       </w:r>
+                      <w:proofErr w:type="gramEnd"/>
                     </w:p>
                     <w:p/>
                     <w:p/>
@@ -6062,7 +6769,15 @@
                               <w:t xml:space="preserve">var </w:t>
                             </w:r>
                             <w:r>
-                              <w:t>texture = new Texture(Gdx.</w:t>
+                              <w:t xml:space="preserve">texture = new </w:t>
+                            </w:r>
+                            <w:proofErr w:type="gramStart"/>
+                            <w:r>
+                              <w:t>Texture(</w:t>
+                            </w:r>
+                            <w:proofErr w:type="spellStart"/>
+                            <w:r>
+                              <w:t>Gdx.</w:t>
                             </w:r>
                             <w:r>
                               <w:rPr>
@@ -6072,7 +6787,12 @@
                               <w:t>files</w:t>
                             </w:r>
                             <w:r>
-                              <w:t>.internal(</w:t>
+                              <w:t>.internal</w:t>
+                            </w:r>
+                            <w:proofErr w:type="spellEnd"/>
+                            <w:proofErr w:type="gramEnd"/>
+                            <w:r>
+                              <w:t>(</w:t>
                             </w:r>
                             <w:r>
                               <w:t>“tank.bmp”</w:t>
@@ -6092,8 +6812,22 @@
                             </w:r>
                             <w:r>
                               <w:br/>
-                              <w:t>sprite.setPosition(100, 40);</w:t>
-                            </w:r>
+                            </w:r>
+                            <w:proofErr w:type="spellStart"/>
+                            <w:proofErr w:type="gramStart"/>
+                            <w:r>
+                              <w:t>sprite.setPosition</w:t>
+                            </w:r>
+                            <w:proofErr w:type="spellEnd"/>
+                            <w:proofErr w:type="gramEnd"/>
+                            <w:r>
+                              <w:t>(100, 40</w:t>
+                            </w:r>
+                            <w:proofErr w:type="gramStart"/>
+                            <w:r>
+                              <w:t>);</w:t>
+                            </w:r>
+                            <w:proofErr w:type="gramEnd"/>
                           </w:p>
                           <w:p/>
                         </w:txbxContent>
@@ -6123,7 +6857,15 @@
                         <w:t xml:space="preserve">var </w:t>
                       </w:r>
                       <w:r>
-                        <w:t>texture = new Texture(Gdx.</w:t>
+                        <w:t xml:space="preserve">texture = new </w:t>
+                      </w:r>
+                      <w:proofErr w:type="gramStart"/>
+                      <w:r>
+                        <w:t>Texture(</w:t>
+                      </w:r>
+                      <w:proofErr w:type="spellStart"/>
+                      <w:r>
+                        <w:t>Gdx.</w:t>
                       </w:r>
                       <w:r>
                         <w:rPr>
@@ -6133,7 +6875,12 @@
                         <w:t>files</w:t>
                       </w:r>
                       <w:r>
-                        <w:t>.internal(</w:t>
+                        <w:t>.internal</w:t>
+                      </w:r>
+                      <w:proofErr w:type="spellEnd"/>
+                      <w:proofErr w:type="gramEnd"/>
+                      <w:r>
+                        <w:t>(</w:t>
                       </w:r>
                       <w:r>
                         <w:t>“tank.bmp”</w:t>
@@ -6153,8 +6900,22 @@
                       </w:r>
                       <w:r>
                         <w:br/>
-                        <w:t>sprite.setPosition(100, 40);</w:t>
-                      </w:r>
+                      </w:r>
+                      <w:proofErr w:type="spellStart"/>
+                      <w:proofErr w:type="gramStart"/>
+                      <w:r>
+                        <w:t>sprite.setPosition</w:t>
+                      </w:r>
+                      <w:proofErr w:type="spellEnd"/>
+                      <w:proofErr w:type="gramEnd"/>
+                      <w:r>
+                        <w:t>(100, 40</w:t>
+                      </w:r>
+                      <w:proofErr w:type="gramStart"/>
+                      <w:r>
+                        <w:t>);</w:t>
+                      </w:r>
+                      <w:proofErr w:type="gramEnd"/>
                     </w:p>
                     <w:p/>
                   </w:txbxContent>
@@ -6169,7 +6930,265 @@
         <w:rPr>
           <w:rFonts w:ascii="C64 Pro Mono" w:hAnsi="C64 Pro Mono"/>
           <w:color w:val="FFFFFF" w:themeColor="background1"/>
+        </w:rPr>
+        <w:br w:type="page"/>
+      </w:r>
+    </w:p>
+    <w:p>
+      <w:pPr>
+        <w:rPr>
+          <w:rFonts w:ascii="C64 Pro Mono" w:hAnsi="C64 Pro Mono"/>
+          <w:color w:val="FFFFFF" w:themeColor="background1"/>
           <w:lang w:val="fr-FR"/>
+        </w:rPr>
+      </w:pPr>
+      <w:r>
+        <w:rPr>
+          <w:rFonts w:ascii="C64 Pro Mono" w:hAnsi="C64 Pro Mono"/>
+          <w:color w:val="FFFFFF" w:themeColor="background1"/>
+          <w:lang w:val="fr-FR"/>
+        </w:rPr>
+        <w:lastRenderedPageBreak/>
+        <w:t xml:space="preserve">Netscape </w:t>
+      </w:r>
+      <w:proofErr w:type="spellStart"/>
+      <w:r>
+        <w:rPr>
+          <w:rFonts w:ascii="C64 Pro Mono" w:hAnsi="C64 Pro Mono"/>
+          <w:color w:val="FFFFFF" w:themeColor="background1"/>
+          <w:lang w:val="fr-FR"/>
+        </w:rPr>
+        <w:t>company</w:t>
+      </w:r>
+      <w:proofErr w:type="spellEnd"/>
+      <w:r>
+        <w:rPr>
+          <w:rFonts w:ascii="C64 Pro Mono" w:hAnsi="C64 Pro Mono"/>
+          <w:color w:val="FFFFFF" w:themeColor="background1"/>
+          <w:lang w:val="fr-FR"/>
+        </w:rPr>
+        <w:t xml:space="preserve"> (1994 </w:t>
+      </w:r>
+      <w:r>
+        <w:rPr>
+          <w:rFonts w:ascii="Courier New" w:hAnsi="Courier New" w:cs="Courier New"/>
+          <w:color w:val="FFFFFF" w:themeColor="background1"/>
+          <w:lang w:val="fr-FR"/>
+        </w:rPr>
+        <w:t>–</w:t>
+      </w:r>
+      <w:r>
+        <w:rPr>
+          <w:rFonts w:ascii="C64 Pro Mono" w:hAnsi="C64 Pro Mono"/>
+          <w:color w:val="FFFFFF" w:themeColor="background1"/>
+          <w:lang w:val="fr-FR"/>
+        </w:rPr>
+        <w:t xml:space="preserve"> 2008)</w:t>
+      </w:r>
+    </w:p>
+    <w:p>
+      <w:pPr>
+        <w:rPr>
+          <w:rFonts w:ascii="C64 Pro Mono" w:hAnsi="C64 Pro Mono"/>
+          <w:color w:val="FFFFFF" w:themeColor="background1"/>
+          <w:lang w:val="fr-FR"/>
+        </w:rPr>
+      </w:pPr>
+      <w:r>
+        <w:rPr>
+          <w:rFonts w:ascii="C64 Pro Mono" w:hAnsi="C64 Pro Mono"/>
+          <w:color w:val="FFFFFF" w:themeColor="background1"/>
+          <w:lang w:val="fr-FR"/>
+        </w:rPr>
+        <w:t>JavaScript (1995)</w:t>
+      </w:r>
+    </w:p>
+    <w:p>
+      <w:pPr>
+        <w:pStyle w:val="ListParagraph"/>
+        <w:numPr>
+          <w:ilvl w:val="0"/>
+          <w:numId w:val="15"/>
+        </w:numPr>
+        <w:rPr>
+          <w:rFonts w:ascii="C64 Pro Mono" w:hAnsi="C64 Pro Mono"/>
+          <w:color w:val="FFFFFF" w:themeColor="background1"/>
+        </w:rPr>
+      </w:pPr>
+      <w:proofErr w:type="spellStart"/>
+      <w:r>
+        <w:rPr>
+          <w:rFonts w:ascii="C64 Pro Mono" w:hAnsi="C64 Pro Mono"/>
+          <w:color w:val="FFFFFF" w:themeColor="background1"/>
+        </w:rPr>
+        <w:t>LiveScript</w:t>
+      </w:r>
+      <w:proofErr w:type="spellEnd"/>
+      <w:r>
+        <w:rPr>
+          <w:rFonts w:ascii="C64 Pro Mono" w:hAnsi="C64 Pro Mono"/>
+          <w:color w:val="FFFFFF" w:themeColor="background1"/>
+        </w:rPr>
+        <w:t xml:space="preserve"> </w:t>
+      </w:r>
+      <w:r>
+        <w:rPr>
+          <w:rFonts w:ascii="Courier New" w:hAnsi="Courier New" w:cs="Courier New"/>
+          <w:color w:val="FFFFFF" w:themeColor="background1"/>
+        </w:rPr>
+        <w:t>–</w:t>
+      </w:r>
+      <w:r>
+        <w:rPr>
+          <w:rFonts w:ascii="C64 Pro Mono" w:hAnsi="C64 Pro Mono"/>
+          <w:color w:val="FFFFFF" w:themeColor="background1"/>
+        </w:rPr>
+        <w:t xml:space="preserve"> initial name</w:t>
+      </w:r>
+    </w:p>
+    <w:p>
+      <w:pPr>
+        <w:pStyle w:val="ListParagraph"/>
+        <w:numPr>
+          <w:ilvl w:val="0"/>
+          <w:numId w:val="15"/>
+        </w:numPr>
+        <w:rPr>
+          <w:rFonts w:ascii="C64 Pro Mono" w:hAnsi="C64 Pro Mono"/>
+          <w:color w:val="FFFFFF" w:themeColor="background1"/>
+        </w:rPr>
+      </w:pPr>
+      <w:r>
+        <w:rPr>
+          <w:rFonts w:ascii="C64 Pro Mono" w:hAnsi="C64 Pro Mono"/>
+          <w:color w:val="FFFFFF" w:themeColor="background1"/>
+        </w:rPr>
+        <w:t>l</w:t>
+      </w:r>
+      <w:r>
+        <w:rPr>
+          <w:rFonts w:ascii="C64 Pro Mono" w:hAnsi="C64 Pro Mono"/>
+          <w:color w:val="FFFFFF" w:themeColor="background1"/>
+        </w:rPr>
+        <w:t>anguage for web browsers (</w:t>
+      </w:r>
+      <w:r>
+        <w:rPr>
+          <w:rFonts w:ascii="C64 Pro Mono" w:hAnsi="C64 Pro Mono"/>
+          <w:color w:val="FFFFFF" w:themeColor="background1"/>
+        </w:rPr>
+        <w:t>addition</w:t>
+      </w:r>
+      <w:r>
+        <w:rPr>
+          <w:rFonts w:ascii="C64 Pro Mono" w:hAnsi="C64 Pro Mono"/>
+          <w:color w:val="FFFFFF" w:themeColor="background1"/>
+        </w:rPr>
+        <w:t xml:space="preserve"> to static HTML)</w:t>
+      </w:r>
+    </w:p>
+    <w:p>
+      <w:pPr>
+        <w:pStyle w:val="ListParagraph"/>
+        <w:numPr>
+          <w:ilvl w:val="0"/>
+          <w:numId w:val="15"/>
+        </w:numPr>
+        <w:rPr>
+          <w:rFonts w:ascii="C64 Pro Mono" w:hAnsi="C64 Pro Mono"/>
+          <w:color w:val="FFFFFF" w:themeColor="background1"/>
+        </w:rPr>
+      </w:pPr>
+      <w:r>
+        <w:rPr>
+          <w:rFonts w:ascii="C64 Pro Mono" w:hAnsi="C64 Pro Mono"/>
+          <w:color w:val="FFFFFF" w:themeColor="background1"/>
+        </w:rPr>
+        <w:t>totally different than Java</w:t>
+      </w:r>
+    </w:p>
+    <w:p>
+      <w:pPr>
+        <w:rPr>
+          <w:rFonts w:ascii="C64 Pro Mono" w:hAnsi="C64 Pro Mono"/>
+          <w:color w:val="FFFFFF" w:themeColor="background1"/>
+        </w:rPr>
+      </w:pPr>
+    </w:p>
+    <w:p>
+      <w:pPr>
+        <w:rPr>
+          <w:rFonts w:ascii="C64 Pro Mono" w:hAnsi="C64 Pro Mono"/>
+          <w:color w:val="FFFFFF" w:themeColor="background1"/>
+        </w:rPr>
+      </w:pPr>
+      <w:r>
+        <w:rPr>
+          <w:rFonts w:ascii="C64 Pro Mono" w:hAnsi="C64 Pro Mono"/>
+          <w:color w:val="FFFFFF" w:themeColor="background1"/>
+        </w:rPr>
+        <w:t>Phaser library (2013)</w:t>
+      </w:r>
+    </w:p>
+    <w:p>
+      <w:pPr>
+        <w:pStyle w:val="ListParagraph"/>
+        <w:numPr>
+          <w:ilvl w:val="0"/>
+          <w:numId w:val="16"/>
+        </w:numPr>
+        <w:rPr>
+          <w:rFonts w:ascii="C64 Pro Mono" w:hAnsi="C64 Pro Mono"/>
+          <w:color w:val="FFFFFF" w:themeColor="background1"/>
+        </w:rPr>
+      </w:pPr>
+      <w:r>
+        <w:rPr>
+          <w:rFonts w:ascii="C64 Pro Mono" w:hAnsi="C64 Pro Mono"/>
+          <w:color w:val="FFFFFF" w:themeColor="background1"/>
+        </w:rPr>
+        <w:t>sprites (non-hardware)</w:t>
+      </w:r>
+    </w:p>
+    <w:p>
+      <w:pPr>
+        <w:pStyle w:val="ListParagraph"/>
+        <w:numPr>
+          <w:ilvl w:val="0"/>
+          <w:numId w:val="16"/>
+        </w:numPr>
+        <w:rPr>
+          <w:rFonts w:ascii="C64 Pro Mono" w:hAnsi="C64 Pro Mono"/>
+          <w:color w:val="FFFFFF" w:themeColor="background1"/>
+        </w:rPr>
+      </w:pPr>
+      <w:r>
+        <w:rPr>
+          <w:rFonts w:ascii="C64 Pro Mono" w:hAnsi="C64 Pro Mono"/>
+          <w:color w:val="FFFFFF" w:themeColor="background1"/>
+        </w:rPr>
+        <w:t>number of sprites limited only by RAM assigned for browser</w:t>
+      </w:r>
+    </w:p>
+    <w:p>
+      <w:pPr>
+        <w:rPr>
+          <w:rFonts w:ascii="C64 Pro Mono" w:hAnsi="C64 Pro Mono"/>
+          <w:color w:val="FFFFFF" w:themeColor="background1"/>
+        </w:rPr>
+      </w:pPr>
+    </w:p>
+    <w:p>
+      <w:pPr>
+        <w:rPr>
+          <w:rFonts w:ascii="C64 Pro Mono" w:hAnsi="C64 Pro Mono"/>
+          <w:color w:val="FFFFFF" w:themeColor="background1"/>
+        </w:rPr>
+      </w:pPr>
+      <w:r>
+        <w:rPr>
+          <w:rFonts w:ascii="C64 Pro Mono" w:hAnsi="C64 Pro Mono"/>
+          <w:color w:val="FFFFFF" w:themeColor="background1"/>
         </w:rPr>
         <w:br w:type="page"/>
       </w:r>
@@ -6350,13 +7369,23 @@
                 <w:lang w:val="fr-FR"/>
               </w:rPr>
             </w:pPr>
+            <w:proofErr w:type="spellStart"/>
             <w:r>
               <w:rPr>
                 <w:rFonts w:ascii="Abadi" w:hAnsi="Abadi"/>
                 <w:color w:val="FFFFFF" w:themeColor="background1"/>
                 <w:lang w:val="fr-FR"/>
               </w:rPr>
-              <w:t xml:space="preserve">Cells : </w:t>
+              <w:t>Cells</w:t>
+            </w:r>
+            <w:proofErr w:type="spellEnd"/>
+            <w:r>
+              <w:rPr>
+                <w:rFonts w:ascii="Abadi" w:hAnsi="Abadi"/>
+                <w:color w:val="FFFFFF" w:themeColor="background1"/>
+                <w:lang w:val="fr-FR"/>
+              </w:rPr>
+              <w:t xml:space="preserve"> : </w:t>
             </w:r>
           </w:p>
           <w:tbl>
@@ -6612,20 +7641,40 @@
                 <w:color w:val="FFFFFF" w:themeColor="background1"/>
               </w:rPr>
             </w:pPr>
+            <w:proofErr w:type="spellStart"/>
+            <w:proofErr w:type="gramStart"/>
             <w:r>
               <w:rPr>
                 <w:rFonts w:ascii="Abadi" w:hAnsi="Abadi"/>
                 <w:color w:val="FFFFFF" w:themeColor="background1"/>
               </w:rPr>
-              <w:t>sprite.setPosition(</w:t>
+              <w:t>sprite.setPosition</w:t>
+            </w:r>
+            <w:proofErr w:type="spellEnd"/>
+            <w:proofErr w:type="gramEnd"/>
+            <w:r>
+              <w:rPr>
+                <w:rFonts w:ascii="Abadi" w:hAnsi="Abadi"/>
+                <w:color w:val="FFFFFF" w:themeColor="background1"/>
+              </w:rPr>
+              <w:t>(</w:t>
             </w:r>
             <w:r>
               <w:rPr>
                 <w:rFonts w:ascii="Abadi" w:hAnsi="Abadi"/>
                 <w:color w:val="FFFFFF" w:themeColor="background1"/>
               </w:rPr>
-              <w:t>100,200);</w:t>
+              <w:t>100,200</w:t>
             </w:r>
+            <w:proofErr w:type="gramStart"/>
+            <w:r>
+              <w:rPr>
+                <w:rFonts w:ascii="Abadi" w:hAnsi="Abadi"/>
+                <w:color w:val="FFFFFF" w:themeColor="background1"/>
+              </w:rPr>
+              <w:t>);</w:t>
+            </w:r>
+            <w:proofErr w:type="gramEnd"/>
           </w:p>
           <w:p>
             <w:pPr>
@@ -6658,13 +7707,25 @@
                 <w:lang w:val="fr-FR"/>
               </w:rPr>
             </w:pPr>
+            <w:proofErr w:type="spellStart"/>
+            <w:proofErr w:type="gramStart"/>
             <w:r>
               <w:rPr>
                 <w:rFonts w:ascii="Abadi" w:hAnsi="Abadi"/>
                 <w:color w:val="FFFFFF" w:themeColor="background1"/>
                 <w:lang w:val="fr-FR"/>
               </w:rPr>
-              <w:t>sprite.y = 200 ;</w:t>
+              <w:t>sprite.y</w:t>
+            </w:r>
+            <w:proofErr w:type="spellEnd"/>
+            <w:proofErr w:type="gramEnd"/>
+            <w:r>
+              <w:rPr>
+                <w:rFonts w:ascii="Abadi" w:hAnsi="Abadi"/>
+                <w:color w:val="FFFFFF" w:themeColor="background1"/>
+                <w:lang w:val="fr-FR"/>
+              </w:rPr>
+              <w:t xml:space="preserve"> = 200 ;</w:t>
             </w:r>
           </w:p>
         </w:tc>
@@ -6719,6 +7780,7 @@
           <w:lang w:val="fr-FR"/>
         </w:rPr>
       </w:pPr>
+      <w:proofErr w:type="spellStart"/>
       <w:r>
         <w:rPr>
           <w:rFonts w:ascii="C64 Pro Mono" w:hAnsi="C64 Pro Mono"/>
@@ -6728,6 +7790,7 @@
         <w:lastRenderedPageBreak/>
         <w:t>Scaling</w:t>
       </w:r>
+      <w:proofErr w:type="spellEnd"/>
     </w:p>
     <w:tbl>
       <w:tblPr>
@@ -6821,13 +7884,23 @@
                 <w:lang w:val="fr-FR"/>
               </w:rPr>
             </w:pPr>
+            <w:proofErr w:type="spellStart"/>
             <w:r>
               <w:rPr>
                 <w:rFonts w:ascii="Abadi" w:hAnsi="Abadi"/>
                 <w:color w:val="FFFFFF" w:themeColor="background1"/>
                 <w:lang w:val="fr-FR"/>
               </w:rPr>
-              <w:t xml:space="preserve">Cells : </w:t>
+              <w:t>Cells</w:t>
+            </w:r>
+            <w:proofErr w:type="spellEnd"/>
+            <w:r>
+              <w:rPr>
+                <w:rFonts w:ascii="Abadi" w:hAnsi="Abadi"/>
+                <w:color w:val="FFFFFF" w:themeColor="background1"/>
+                <w:lang w:val="fr-FR"/>
+              </w:rPr>
+              <w:t xml:space="preserve"> : </w:t>
             </w:r>
           </w:p>
           <w:tbl>
@@ -7040,6 +8113,8 @@
                 <w:color w:val="FFFFFF" w:themeColor="background1"/>
               </w:rPr>
             </w:pPr>
+            <w:proofErr w:type="spellStart"/>
+            <w:proofErr w:type="gramStart"/>
             <w:r>
               <w:rPr>
                 <w:rFonts w:ascii="Abadi" w:hAnsi="Abadi"/>
@@ -7052,7 +8127,24 @@
                 <w:rFonts w:ascii="Abadi" w:hAnsi="Abadi"/>
                 <w:color w:val="FFFFFF" w:themeColor="background1"/>
               </w:rPr>
-              <w:t>.setScale(10,3)</w:t>
+              <w:t>.setScale</w:t>
+            </w:r>
+            <w:proofErr w:type="spellEnd"/>
+            <w:proofErr w:type="gramEnd"/>
+            <w:r>
+              <w:rPr>
+                <w:rFonts w:ascii="Abadi" w:hAnsi="Abadi"/>
+                <w:color w:val="FFFFFF" w:themeColor="background1"/>
+              </w:rPr>
+              <w:t>(10,3</w:t>
+            </w:r>
+            <w:proofErr w:type="gramStart"/>
+            <w:r>
+              <w:rPr>
+                <w:rFonts w:ascii="Abadi" w:hAnsi="Abadi"/>
+                <w:color w:val="FFFFFF" w:themeColor="background1"/>
+              </w:rPr>
+              <w:t>)</w:t>
             </w:r>
             <w:r>
               <w:rPr>
@@ -7061,6 +8153,7 @@
               </w:rPr>
               <w:t>;</w:t>
             </w:r>
+            <w:proofErr w:type="gramEnd"/>
           </w:p>
           <w:p>
             <w:pPr>
@@ -7093,13 +8186,25 @@
                 <w:lang w:val="fr-FR"/>
               </w:rPr>
             </w:pPr>
+            <w:proofErr w:type="spellStart"/>
+            <w:proofErr w:type="gramStart"/>
             <w:r>
               <w:rPr>
                 <w:rFonts w:ascii="Abadi" w:hAnsi="Abadi"/>
                 <w:color w:val="FFFFFF" w:themeColor="background1"/>
                 <w:lang w:val="fr-FR"/>
               </w:rPr>
-              <w:t>sprite.scaleX = 7 ;</w:t>
+              <w:t>sprite.scaleX</w:t>
+            </w:r>
+            <w:proofErr w:type="spellEnd"/>
+            <w:proofErr w:type="gramEnd"/>
+            <w:r>
+              <w:rPr>
+                <w:rFonts w:ascii="Abadi" w:hAnsi="Abadi"/>
+                <w:color w:val="FFFFFF" w:themeColor="background1"/>
+                <w:lang w:val="fr-FR"/>
+              </w:rPr>
+              <w:t xml:space="preserve"> = 7 ;</w:t>
             </w:r>
           </w:p>
         </w:tc>
@@ -7139,6 +8244,7 @@
         </w:rPr>
         <w:t xml:space="preserve">. </w:t>
       </w:r>
+      <w:proofErr w:type="spellStart"/>
       <w:r>
         <w:rPr>
           <w:rFonts w:ascii="C64 Pro Mono" w:hAnsi="C64 Pro Mono"/>
@@ -7147,6 +8253,7 @@
         </w:rPr>
         <w:t>Flipping</w:t>
       </w:r>
+      <w:proofErr w:type="spellEnd"/>
     </w:p>
     <w:tbl>
       <w:tblPr>
@@ -7246,7 +8353,61 @@
                 <w:color w:val="FFFFFF" w:themeColor="background1"/>
                 <w:lang w:val="fr-FR"/>
               </w:rPr>
-              <w:t>Not implemented. Workaround needed.</w:t>
+              <w:t xml:space="preserve">Not </w:t>
+            </w:r>
+            <w:proofErr w:type="spellStart"/>
+            <w:r>
+              <w:rPr>
+                <w:rFonts w:ascii="Abadi" w:hAnsi="Abadi"/>
+                <w:color w:val="FFFFFF" w:themeColor="background1"/>
+                <w:lang w:val="fr-FR"/>
+              </w:rPr>
+              <w:t>implemented</w:t>
+            </w:r>
+            <w:proofErr w:type="spellEnd"/>
+            <w:r>
+              <w:rPr>
+                <w:rFonts w:ascii="Abadi" w:hAnsi="Abadi"/>
+                <w:color w:val="FFFFFF" w:themeColor="background1"/>
+                <w:lang w:val="fr-FR"/>
+              </w:rPr>
+              <w:t xml:space="preserve">. </w:t>
+            </w:r>
+            <w:proofErr w:type="spellStart"/>
+            <w:r>
+              <w:rPr>
+                <w:rFonts w:ascii="Abadi" w:hAnsi="Abadi"/>
+                <w:color w:val="FFFFFF" w:themeColor="background1"/>
+                <w:lang w:val="fr-FR"/>
+              </w:rPr>
+              <w:t>Workaround</w:t>
+            </w:r>
+            <w:proofErr w:type="spellEnd"/>
+            <w:r>
+              <w:rPr>
+                <w:rFonts w:ascii="Abadi" w:hAnsi="Abadi"/>
+                <w:color w:val="FFFFFF" w:themeColor="background1"/>
+                <w:lang w:val="fr-FR"/>
+              </w:rPr>
+              <w:t xml:space="preserve"> </w:t>
+            </w:r>
+            <w:proofErr w:type="spellStart"/>
+            <w:r>
+              <w:rPr>
+                <w:rFonts w:ascii="Abadi" w:hAnsi="Abadi"/>
+                <w:color w:val="FFFFFF" w:themeColor="background1"/>
+                <w:lang w:val="fr-FR"/>
+              </w:rPr>
+              <w:t>needed</w:t>
+            </w:r>
+            <w:proofErr w:type="spellEnd"/>
+            <w:r>
+              <w:rPr>
+                <w:rFonts w:ascii="Abadi" w:hAnsi="Abadi"/>
+                <w:color w:val="FFFFFF" w:themeColor="background1"/>
+                <w:lang w:val="fr-FR"/>
+              </w:rPr>
+              <w:t>.</w:t>
             </w:r>
           </w:p>
         </w:tc>
@@ -7269,6 +8430,8 @@
                 <w:color w:val="FFFFFF" w:themeColor="background1"/>
               </w:rPr>
             </w:pPr>
+            <w:proofErr w:type="spellStart"/>
+            <w:proofErr w:type="gramStart"/>
             <w:r>
               <w:rPr>
                 <w:rFonts w:ascii="Abadi" w:hAnsi="Abadi"/>
@@ -7281,8 +8444,35 @@
                 <w:rFonts w:ascii="Abadi" w:hAnsi="Abadi"/>
                 <w:color w:val="FFFFFF" w:themeColor="background1"/>
               </w:rPr>
-              <w:t>.setFlip(false,true);</w:t>
+              <w:t>.setFlip</w:t>
             </w:r>
+            <w:proofErr w:type="spellEnd"/>
+            <w:proofErr w:type="gramEnd"/>
+            <w:r>
+              <w:rPr>
+                <w:rFonts w:ascii="Abadi" w:hAnsi="Abadi"/>
+                <w:color w:val="FFFFFF" w:themeColor="background1"/>
+              </w:rPr>
+              <w:t>(</w:t>
+            </w:r>
+            <w:proofErr w:type="spellStart"/>
+            <w:proofErr w:type="gramStart"/>
+            <w:r>
+              <w:rPr>
+                <w:rFonts w:ascii="Abadi" w:hAnsi="Abadi"/>
+                <w:color w:val="FFFFFF" w:themeColor="background1"/>
+              </w:rPr>
+              <w:t>false,true</w:t>
+            </w:r>
+            <w:proofErr w:type="spellEnd"/>
+            <w:r>
+              <w:rPr>
+                <w:rFonts w:ascii="Abadi" w:hAnsi="Abadi"/>
+                <w:color w:val="FFFFFF" w:themeColor="background1"/>
+              </w:rPr>
+              <w:t>);</w:t>
+            </w:r>
+            <w:proofErr w:type="gramEnd"/>
           </w:p>
           <w:p>
             <w:pPr>
@@ -7321,6 +8511,8 @@
                 <w:color w:val="FFFFFF" w:themeColor="background1"/>
               </w:rPr>
             </w:pPr>
+            <w:proofErr w:type="spellStart"/>
+            <w:proofErr w:type="gramStart"/>
             <w:r>
               <w:rPr>
                 <w:rFonts w:ascii="Abadi" w:hAnsi="Abadi"/>
@@ -7333,7 +8525,16 @@
                 <w:rFonts w:ascii="Abadi" w:hAnsi="Abadi"/>
                 <w:color w:val="FFFFFF" w:themeColor="background1"/>
               </w:rPr>
-              <w:t>setFlipY(true)</w:t>
+              <w:t>setFlipY</w:t>
+            </w:r>
+            <w:proofErr w:type="spellEnd"/>
+            <w:proofErr w:type="gramEnd"/>
+            <w:r>
+              <w:rPr>
+                <w:rFonts w:ascii="Abadi" w:hAnsi="Abadi"/>
+                <w:color w:val="FFFFFF" w:themeColor="background1"/>
+              </w:rPr>
+              <w:t>(true)</w:t>
             </w:r>
           </w:p>
           <w:p>
@@ -7418,13 +8619,23 @@
         </w:rPr>
         <w:t xml:space="preserve">. </w:t>
       </w:r>
+      <w:proofErr w:type="spellStart"/>
       <w:r>
         <w:rPr>
           <w:rFonts w:ascii="C64 Pro Mono" w:hAnsi="C64 Pro Mono"/>
           <w:color w:val="FFFFFF" w:themeColor="background1"/>
           <w:lang w:val="fr-FR"/>
         </w:rPr>
-        <w:t>Sprites collision</w:t>
+        <w:t>Sprites</w:t>
+      </w:r>
+      <w:proofErr w:type="spellEnd"/>
+      <w:r>
+        <w:rPr>
+          <w:rFonts w:ascii="C64 Pro Mono" w:hAnsi="C64 Pro Mono"/>
+          <w:color w:val="FFFFFF" w:themeColor="background1"/>
+          <w:lang w:val="fr-FR"/>
+        </w:rPr>
+        <w:t xml:space="preserve"> collision</w:t>
       </w:r>
     </w:p>
     <w:tbl>
@@ -7529,13 +8740,23 @@
                 <w:lang w:val="fr-FR"/>
               </w:rPr>
             </w:pPr>
+            <w:proofErr w:type="spellStart"/>
             <w:r>
               <w:rPr>
                 <w:rFonts w:ascii="Abadi" w:hAnsi="Abadi"/>
                 <w:color w:val="FFFFFF" w:themeColor="background1"/>
                 <w:lang w:val="fr-FR"/>
               </w:rPr>
-              <w:t xml:space="preserve">Cell $d019 (53273) bit #2 </w:t>
+              <w:t>Cell</w:t>
+            </w:r>
+            <w:proofErr w:type="spellEnd"/>
+            <w:r>
+              <w:rPr>
+                <w:rFonts w:ascii="Abadi" w:hAnsi="Abadi"/>
+                <w:color w:val="FFFFFF" w:themeColor="background1"/>
+                <w:lang w:val="fr-FR"/>
+              </w:rPr>
+              <w:t xml:space="preserve"> $d019 (53273) bit #2 </w:t>
             </w:r>
           </w:p>
         </w:tc>
@@ -7555,8 +8776,17 @@
                 <w:rFonts w:ascii="Abadi" w:hAnsi="Abadi"/>
                 <w:color w:val="FFFFFF" w:themeColor="background1"/>
               </w:rPr>
-              <w:t>float x1 = sprite0.getX();</w:t>
+              <w:t>float x1 = sprite0.getX(</w:t>
             </w:r>
+            <w:proofErr w:type="gramStart"/>
+            <w:r>
+              <w:rPr>
+                <w:rFonts w:ascii="Abadi" w:hAnsi="Abadi"/>
+                <w:color w:val="FFFFFF" w:themeColor="background1"/>
+              </w:rPr>
+              <w:t>);</w:t>
+            </w:r>
+            <w:proofErr w:type="gramEnd"/>
           </w:p>
           <w:p>
             <w:pPr>
@@ -7570,8 +8800,17 @@
                 <w:rFonts w:ascii="Abadi" w:hAnsi="Abadi"/>
                 <w:color w:val="FFFFFF" w:themeColor="background1"/>
               </w:rPr>
-              <w:t>float y1 = sprite0.getY();</w:t>
+              <w:t>float y1 = sprite0.getY(</w:t>
             </w:r>
+            <w:proofErr w:type="gramStart"/>
+            <w:r>
+              <w:rPr>
+                <w:rFonts w:ascii="Abadi" w:hAnsi="Abadi"/>
+                <w:color w:val="FFFFFF" w:themeColor="background1"/>
+              </w:rPr>
+              <w:t>);</w:t>
+            </w:r>
+            <w:proofErr w:type="gramEnd"/>
           </w:p>
           <w:p>
             <w:pPr>
@@ -7585,8 +8824,17 @@
                 <w:rFonts w:ascii="Abadi" w:hAnsi="Abadi"/>
                 <w:color w:val="FFFFFF" w:themeColor="background1"/>
               </w:rPr>
-              <w:t>float x2 = sprite1.getX();</w:t>
+              <w:t>float x2 = sprite1.getX(</w:t>
             </w:r>
+            <w:proofErr w:type="gramStart"/>
+            <w:r>
+              <w:rPr>
+                <w:rFonts w:ascii="Abadi" w:hAnsi="Abadi"/>
+                <w:color w:val="FFFFFF" w:themeColor="background1"/>
+              </w:rPr>
+              <w:t>);</w:t>
+            </w:r>
+            <w:proofErr w:type="gramEnd"/>
           </w:p>
           <w:p>
             <w:pPr>
@@ -7600,8 +8848,17 @@
                 <w:rFonts w:ascii="Abadi" w:hAnsi="Abadi"/>
                 <w:color w:val="FFFFFF" w:themeColor="background1"/>
               </w:rPr>
-              <w:t>float y2 = sprite1.getY();</w:t>
+              <w:t>float y2 = sprite1.getY(</w:t>
             </w:r>
+            <w:proofErr w:type="gramStart"/>
+            <w:r>
+              <w:rPr>
+                <w:rFonts w:ascii="Abadi" w:hAnsi="Abadi"/>
+                <w:color w:val="FFFFFF" w:themeColor="background1"/>
+              </w:rPr>
+              <w:t>);</w:t>
+            </w:r>
+            <w:proofErr w:type="gramEnd"/>
           </w:p>
           <w:p>
             <w:pPr>
@@ -7619,14 +8876,110 @@
                 <w:lang w:val="fr-FR"/>
               </w:rPr>
             </w:pPr>
+            <w:proofErr w:type="spellStart"/>
+            <w:proofErr w:type="gramStart"/>
             <w:r>
               <w:rPr>
                 <w:rFonts w:ascii="Abadi" w:hAnsi="Abadi"/>
                 <w:color w:val="FFFFFF" w:themeColor="background1"/>
                 <w:lang w:val="fr-FR"/>
               </w:rPr>
-              <w:t>float distance = MathUtils.sqrt(MathUtils.pow(x2 - x1, 2) + MathUtils.pow(y2 - y1, 2));</w:t>
+              <w:t>float</w:t>
             </w:r>
+            <w:proofErr w:type="spellEnd"/>
+            <w:proofErr w:type="gramEnd"/>
+            <w:r>
+              <w:rPr>
+                <w:rFonts w:ascii="Abadi" w:hAnsi="Abadi"/>
+                <w:color w:val="FFFFFF" w:themeColor="background1"/>
+                <w:lang w:val="fr-FR"/>
+              </w:rPr>
+              <w:t xml:space="preserve"> distance = </w:t>
+            </w:r>
+            <w:proofErr w:type="spellStart"/>
+            <w:r>
+              <w:rPr>
+                <w:rFonts w:ascii="Abadi" w:hAnsi="Abadi"/>
+                <w:color w:val="FFFFFF" w:themeColor="background1"/>
+                <w:lang w:val="fr-FR"/>
+              </w:rPr>
+              <w:t>MathUtils.sqrt</w:t>
+            </w:r>
+            <w:proofErr w:type="spellEnd"/>
+            <w:r>
+              <w:rPr>
+                <w:rFonts w:ascii="Abadi" w:hAnsi="Abadi"/>
+                <w:color w:val="FFFFFF" w:themeColor="background1"/>
+                <w:lang w:val="fr-FR"/>
+              </w:rPr>
+              <w:t>(</w:t>
+            </w:r>
+            <w:proofErr w:type="spellStart"/>
+            <w:proofErr w:type="gramStart"/>
+            <w:r>
+              <w:rPr>
+                <w:rFonts w:ascii="Abadi" w:hAnsi="Abadi"/>
+                <w:color w:val="FFFFFF" w:themeColor="background1"/>
+                <w:lang w:val="fr-FR"/>
+              </w:rPr>
+              <w:t>MathUtils.pow</w:t>
+            </w:r>
+            <w:proofErr w:type="spellEnd"/>
+            <w:r>
+              <w:rPr>
+                <w:rFonts w:ascii="Abadi" w:hAnsi="Abadi"/>
+                <w:color w:val="FFFFFF" w:themeColor="background1"/>
+                <w:lang w:val="fr-FR"/>
+              </w:rPr>
+              <w:t>(</w:t>
+            </w:r>
+            <w:proofErr w:type="gramEnd"/>
+            <w:r>
+              <w:rPr>
+                <w:rFonts w:ascii="Abadi" w:hAnsi="Abadi"/>
+                <w:color w:val="FFFFFF" w:themeColor="background1"/>
+                <w:lang w:val="fr-FR"/>
+              </w:rPr>
+              <w:t xml:space="preserve">x2 - x1, 2) + </w:t>
+            </w:r>
+            <w:proofErr w:type="spellStart"/>
+            <w:proofErr w:type="gramStart"/>
+            <w:r>
+              <w:rPr>
+                <w:rFonts w:ascii="Abadi" w:hAnsi="Abadi"/>
+                <w:color w:val="FFFFFF" w:themeColor="background1"/>
+                <w:lang w:val="fr-FR"/>
+              </w:rPr>
+              <w:t>MathUtils.pow</w:t>
+            </w:r>
+            <w:proofErr w:type="spellEnd"/>
+            <w:r>
+              <w:rPr>
+                <w:rFonts w:ascii="Abadi" w:hAnsi="Abadi"/>
+                <w:color w:val="FFFFFF" w:themeColor="background1"/>
+                <w:lang w:val="fr-FR"/>
+              </w:rPr>
+              <w:t>(</w:t>
+            </w:r>
+            <w:proofErr w:type="gramEnd"/>
+            <w:r>
+              <w:rPr>
+                <w:rFonts w:ascii="Abadi" w:hAnsi="Abadi"/>
+                <w:color w:val="FFFFFF" w:themeColor="background1"/>
+                <w:lang w:val="fr-FR"/>
+              </w:rPr>
+              <w:t>y2 - y1, 2)</w:t>
+            </w:r>
+            <w:proofErr w:type="gramStart"/>
+            <w:r>
+              <w:rPr>
+                <w:rFonts w:ascii="Abadi" w:hAnsi="Abadi"/>
+                <w:color w:val="FFFFFF" w:themeColor="background1"/>
+                <w:lang w:val="fr-FR"/>
+              </w:rPr>
+              <w:t>);</w:t>
+            </w:r>
+            <w:proofErr w:type="gramEnd"/>
           </w:p>
           <w:p>
             <w:pPr>
@@ -7649,12 +9002,23 @@
                 <w:color w:val="FFFFFF" w:themeColor="background1"/>
               </w:rPr>
             </w:pPr>
+            <w:proofErr w:type="spellStart"/>
+            <w:proofErr w:type="gramStart"/>
             <w:r>
               <w:rPr>
                 <w:rFonts w:ascii="Abadi" w:hAnsi="Abadi"/>
                 <w:color w:val="FFFFFF" w:themeColor="background1"/>
               </w:rPr>
-              <w:t>Phaser.Math.Distance.Between(sprite</w:t>
+              <w:t>Phaser.Math.Distance.Between</w:t>
+            </w:r>
+            <w:proofErr w:type="spellEnd"/>
+            <w:proofErr w:type="gramEnd"/>
+            <w:r>
+              <w:rPr>
+                <w:rFonts w:ascii="Abadi" w:hAnsi="Abadi"/>
+                <w:color w:val="FFFFFF" w:themeColor="background1"/>
+              </w:rPr>
+              <w:t>(sprite</w:t>
             </w:r>
             <w:r>
               <w:rPr>
@@ -7705,12 +9069,21 @@
               </w:rPr>
               <w:t>2</w:t>
             </w:r>
+            <w:proofErr w:type="gramStart"/>
             <w:r>
               <w:rPr>
                 <w:rFonts w:ascii="Abadi" w:hAnsi="Abadi"/>
                 <w:color w:val="FFFFFF" w:themeColor="background1"/>
               </w:rPr>
-              <w:t>.y)</w:t>
+              <w:t>.y</w:t>
+            </w:r>
+            <w:proofErr w:type="gramEnd"/>
+            <w:r>
+              <w:rPr>
+                <w:rFonts w:ascii="Abadi" w:hAnsi="Abadi"/>
+                <w:color w:val="FFFFFF" w:themeColor="background1"/>
+              </w:rPr>
+              <w:t>)</w:t>
             </w:r>
           </w:p>
           <w:p>
@@ -7754,13 +9127,200 @@
       <w:r>
         <w:rPr>
           <w:rFonts w:ascii="C64 Pro Mono" w:hAnsi="C64 Pro Mono"/>
+          <w:color w:val="FFFFFF" w:themeColor="background1"/>
+        </w:rPr>
+        <w:lastRenderedPageBreak/>
+        <w:t>Summary</w:t>
+      </w:r>
+    </w:p>
+    <w:p>
+      <w:pPr>
+        <w:rPr>
+          <w:rFonts w:ascii="C64 Pro Mono" w:hAnsi="C64 Pro Mono"/>
+          <w:color w:val="FFFFFF" w:themeColor="background1"/>
+        </w:rPr>
+      </w:pPr>
+    </w:p>
+    <w:p>
+      <w:pPr>
+        <w:pStyle w:val="ListParagraph"/>
+        <w:numPr>
+          <w:ilvl w:val="0"/>
+          <w:numId w:val="17"/>
+        </w:numPr>
+        <w:rPr>
+          <w:rFonts w:ascii="C64 Pro Mono" w:hAnsi="C64 Pro Mono"/>
+          <w:color w:val="FFFFFF" w:themeColor="background1"/>
+          <w:sz w:val="16"/>
+          <w:szCs w:val="16"/>
+        </w:rPr>
+      </w:pPr>
+      <w:r>
+        <w:rPr>
+          <w:rFonts w:ascii="C64 Pro Mono" w:hAnsi="C64 Pro Mono"/>
+          <w:color w:val="FFFFFF" w:themeColor="background1"/>
+        </w:rPr>
+        <w:t xml:space="preserve">7 environments were analyzed, regarding sprite support </w:t>
+      </w:r>
+      <w:r>
+        <w:rPr>
+          <w:rFonts w:ascii="C64 Pro Mono" w:hAnsi="C64 Pro Mono"/>
+          <w:color w:val="FFFFFF" w:themeColor="background1"/>
+        </w:rPr>
+        <w:br/>
+      </w:r>
+      <w:r>
+        <w:rPr>
+          <w:rFonts w:ascii="C64 Pro Mono" w:hAnsi="C64 Pro Mono"/>
+          <w:color w:val="FFFFFF" w:themeColor="background1"/>
+          <w:sz w:val="14"/>
+          <w:szCs w:val="14"/>
+        </w:rPr>
+        <w:t>(Atari 800, C64, Amiga, PC DOS C, Python, Java, JavaScript)</w:t>
+      </w:r>
+      <w:r>
+        <w:rPr>
+          <w:rFonts w:ascii="C64 Pro Mono" w:hAnsi="C64 Pro Mono"/>
+          <w:color w:val="FFFFFF" w:themeColor="background1"/>
+          <w:sz w:val="16"/>
+          <w:szCs w:val="16"/>
+        </w:rPr>
+        <w:t xml:space="preserve"> </w:t>
+      </w:r>
+    </w:p>
+    <w:p>
+      <w:pPr>
+        <w:pStyle w:val="ListParagraph"/>
+        <w:rPr>
+          <w:rFonts w:ascii="C64 Pro Mono" w:hAnsi="C64 Pro Mono"/>
+          <w:color w:val="FFFFFF" w:themeColor="background1"/>
+        </w:rPr>
+      </w:pPr>
+    </w:p>
+    <w:p>
+      <w:pPr>
+        <w:pStyle w:val="ListParagraph"/>
+        <w:numPr>
+          <w:ilvl w:val="0"/>
+          <w:numId w:val="12"/>
+        </w:numPr>
+        <w:rPr>
+          <w:rFonts w:ascii="C64 Pro Mono" w:hAnsi="C64 Pro Mono"/>
+          <w:color w:val="FFFFFF" w:themeColor="background1"/>
+        </w:rPr>
+      </w:pPr>
+      <w:r>
+        <w:rPr>
+          <w:rFonts w:ascii="C64 Pro Mono" w:hAnsi="C64 Pro Mono"/>
+          <w:color w:val="FFFFFF" w:themeColor="background1"/>
+        </w:rPr>
+        <w:t xml:space="preserve">Sprites still exist in </w:t>
+      </w:r>
+      <w:proofErr w:type="spellStart"/>
+      <w:r>
+        <w:rPr>
+          <w:rFonts w:ascii="C64 Pro Mono" w:hAnsi="C64 Pro Mono"/>
+          <w:color w:val="FFFFFF" w:themeColor="background1"/>
+        </w:rPr>
+        <w:t>pogramming</w:t>
+      </w:r>
+      <w:proofErr w:type="spellEnd"/>
+      <w:r>
+        <w:rPr>
+          <w:rFonts w:ascii="C64 Pro Mono" w:hAnsi="C64 Pro Mono"/>
+          <w:color w:val="FFFFFF" w:themeColor="background1"/>
+        </w:rPr>
+        <w:t xml:space="preserve"> languages</w:t>
+      </w:r>
+    </w:p>
+    <w:p>
+      <w:pPr>
+        <w:rPr>
+          <w:rFonts w:ascii="C64 Pro Mono" w:hAnsi="C64 Pro Mono"/>
+          <w:color w:val="FFFFFF" w:themeColor="background1"/>
+        </w:rPr>
+      </w:pPr>
+    </w:p>
+    <w:p>
+      <w:pPr>
+        <w:pStyle w:val="ListParagraph"/>
+        <w:numPr>
+          <w:ilvl w:val="0"/>
+          <w:numId w:val="12"/>
+        </w:numPr>
+        <w:rPr>
+          <w:rFonts w:ascii="C64 Pro Mono" w:hAnsi="C64 Pro Mono"/>
+          <w:color w:val="FFFFFF" w:themeColor="background1"/>
+        </w:rPr>
+      </w:pPr>
+      <w:r>
+        <w:rPr>
+          <w:rFonts w:ascii="C64 Pro Mono" w:hAnsi="C64 Pro Mono"/>
+          <w:color w:val="FFFFFF" w:themeColor="background1"/>
+        </w:rPr>
+        <w:t>Sprites are no more hardware-based</w:t>
+      </w:r>
+    </w:p>
+    <w:p>
+      <w:pPr>
+        <w:rPr>
+          <w:rFonts w:ascii="C64 Pro Mono" w:hAnsi="C64 Pro Mono"/>
+          <w:color w:val="FFFFFF" w:themeColor="background1"/>
+        </w:rPr>
+      </w:pPr>
+    </w:p>
+    <w:p>
+      <w:pPr>
+        <w:pStyle w:val="ListParagraph"/>
+        <w:numPr>
+          <w:ilvl w:val="0"/>
+          <w:numId w:val="12"/>
+        </w:numPr>
+        <w:rPr>
+          <w:rFonts w:ascii="C64 Pro Mono" w:hAnsi="C64 Pro Mono"/>
+          <w:color w:val="FFFFFF" w:themeColor="background1"/>
+        </w:rPr>
+      </w:pPr>
+      <w:r>
+        <w:rPr>
+          <w:rFonts w:ascii="C64 Pro Mono" w:hAnsi="C64 Pro Mono"/>
+          <w:color w:val="FFFFFF" w:themeColor="background1"/>
+        </w:rPr>
+        <w:t>Games went 3D, making 2D sprites not that crucial in game development</w:t>
+      </w:r>
+    </w:p>
+    <w:p>
+      <w:pPr>
+        <w:rPr>
+          <w:rFonts w:ascii="C64 Pro Mono" w:hAnsi="C64 Pro Mono"/>
+          <w:color w:val="FFFFFF" w:themeColor="background1"/>
+        </w:rPr>
+      </w:pPr>
+      <w:r>
+        <w:rPr>
+          <w:rFonts w:ascii="C64 Pro Mono" w:hAnsi="C64 Pro Mono"/>
+          <w:color w:val="FFFFFF" w:themeColor="background1"/>
+        </w:rPr>
+        <w:br w:type="page"/>
+      </w:r>
+    </w:p>
+    <w:p>
+      <w:pPr>
+        <w:rPr>
+          <w:rFonts w:ascii="C64 Pro Mono" w:hAnsi="C64 Pro Mono"/>
+          <w:color w:val="FFFFFF" w:themeColor="background1"/>
+        </w:rPr>
+      </w:pPr>
+      <w:r>
+        <w:rPr>
+          <w:rFonts w:ascii="C64 Pro Mono" w:hAnsi="C64 Pro Mono"/>
           <w:noProof/>
           <w:color w:val="FFFFFF" w:themeColor="background1"/>
           <w:lang w:val="fr-FR"/>
         </w:rPr>
         <w:lastRenderedPageBreak/>
         <w:drawing>
-          <wp:anchor distT="0" distB="0" distL="114300" distR="114300" simplePos="0" relativeHeight="251659264" behindDoc="0" locked="0" layoutInCell="1" allowOverlap="1" wp14:anchorId="193182F6" wp14:editId="37A166BB">
+          <wp:anchor distT="0" distB="0" distL="114300" distR="114300" simplePos="0" relativeHeight="251676672" behindDoc="0" locked="0" layoutInCell="1" allowOverlap="1" wp14:anchorId="5F9C6093" wp14:editId="0D31C1EB">
             <wp:simplePos x="0" y="0"/>
             <wp:positionH relativeFrom="column">
               <wp:posOffset>3615055</wp:posOffset>
@@ -7783,7 +9343,7 @@
                     <pic:cNvPicPr/>
                   </pic:nvPicPr>
                   <pic:blipFill>
-                    <a:blip r:embed="rId15">
+                    <a:blip r:embed="rId16">
                       <a:extLst>
                         <a:ext uri="{28A0092B-C50C-407E-A947-70E740481C1C}">
                           <a14:useLocalDpi xmlns:a14="http://schemas.microsoft.com/office/drawing/2010/main" val="0"/>
@@ -7923,21 +9483,7 @@
           <w:rFonts w:ascii="C64 Pro Mono" w:hAnsi="C64 Pro Mono"/>
           <w:color w:val="FFFFFF" w:themeColor="background1"/>
         </w:rPr>
-        <w:t xml:space="preserve">Amiga </w:t>
-      </w:r>
-      <w:r>
-        <w:rPr>
-          <w:rFonts w:ascii="C64 Pro Mono" w:hAnsi="C64 Pro Mono"/>
-          <w:color w:val="FFFFFF" w:themeColor="background1"/>
-        </w:rPr>
-        <w:t>10</w:t>
-      </w:r>
-      <w:r>
-        <w:rPr>
-          <w:rFonts w:ascii="C64 Pro Mono" w:hAnsi="C64 Pro Mono"/>
-          <w:color w:val="FFFFFF" w:themeColor="background1"/>
-        </w:rPr>
-        <w:t>00</w:t>
+        <w:t>Amiga 1000</w:t>
       </w:r>
       <w:r>
         <w:rPr>
@@ -7963,12 +9509,21 @@
           <w:color w:val="FFFFFF" w:themeColor="background1"/>
         </w:rPr>
       </w:pPr>
-      <w:r>
-        <w:rPr>
-          <w:rFonts w:ascii="C64 Pro Mono" w:hAnsi="C64 Pro Mono"/>
-          <w:color w:val="FFFFFF" w:themeColor="background1"/>
-        </w:rPr>
-        <w:t>language Amos</w:t>
+      <w:proofErr w:type="gramStart"/>
+      <w:r>
+        <w:rPr>
+          <w:rFonts w:ascii="C64 Pro Mono" w:hAnsi="C64 Pro Mono"/>
+          <w:color w:val="FFFFFF" w:themeColor="background1"/>
+        </w:rPr>
+        <w:t>language</w:t>
+      </w:r>
+      <w:proofErr w:type="gramEnd"/>
+      <w:r>
+        <w:rPr>
+          <w:rFonts w:ascii="C64 Pro Mono" w:hAnsi="C64 Pro Mono"/>
+          <w:color w:val="FFFFFF" w:themeColor="background1"/>
+        </w:rPr>
+        <w:t xml:space="preserve"> Amos</w:t>
       </w:r>
       <w:r>
         <w:rPr>
@@ -8202,123 +9757,6 @@
         </w:rPr>
         <w:tab/>
         <w:t>2013</w:t>
-      </w:r>
-    </w:p>
-    <w:p>
-      <w:pPr>
-        <w:ind w:firstLine="720"/>
-        <w:rPr>
-          <w:rFonts w:ascii="C64 Pro Mono" w:hAnsi="C64 Pro Mono"/>
-          <w:color w:val="FFFFFF" w:themeColor="background1"/>
-        </w:rPr>
-      </w:pPr>
-    </w:p>
-    <w:p>
-      <w:pPr>
-        <w:rPr>
-          <w:rFonts w:ascii="C64 Pro Mono" w:hAnsi="C64 Pro Mono"/>
-          <w:color w:val="FFFFFF" w:themeColor="background1"/>
-        </w:rPr>
-      </w:pPr>
-    </w:p>
-    <w:p>
-      <w:pPr>
-        <w:rPr>
-          <w:rFonts w:ascii="C64 Pro Mono" w:hAnsi="C64 Pro Mono"/>
-          <w:color w:val="FFFFFF" w:themeColor="background1"/>
-        </w:rPr>
-      </w:pPr>
-      <w:r>
-        <w:rPr>
-          <w:rFonts w:ascii="C64 Pro Mono" w:hAnsi="C64 Pro Mono"/>
-          <w:color w:val="FFFFFF" w:themeColor="background1"/>
-        </w:rPr>
-        <w:lastRenderedPageBreak/>
-        <w:t>Summary</w:t>
-      </w:r>
-    </w:p>
-    <w:p>
-      <w:pPr>
-        <w:rPr>
-          <w:rFonts w:ascii="C64 Pro Mono" w:hAnsi="C64 Pro Mono"/>
-          <w:color w:val="FFFFFF" w:themeColor="background1"/>
-        </w:rPr>
-      </w:pPr>
-    </w:p>
-    <w:p>
-      <w:pPr>
-        <w:pStyle w:val="ListParagraph"/>
-        <w:numPr>
-          <w:ilvl w:val="0"/>
-          <w:numId w:val="12"/>
-        </w:numPr>
-        <w:rPr>
-          <w:rFonts w:ascii="C64 Pro Mono" w:hAnsi="C64 Pro Mono"/>
-          <w:color w:val="FFFFFF" w:themeColor="background1"/>
-        </w:rPr>
-      </w:pPr>
-      <w:r>
-        <w:rPr>
-          <w:rFonts w:ascii="C64 Pro Mono" w:hAnsi="C64 Pro Mono"/>
-          <w:color w:val="FFFFFF" w:themeColor="background1"/>
-        </w:rPr>
-        <w:t>Sprites still exist in pogramming languages</w:t>
-      </w:r>
-    </w:p>
-    <w:p>
-      <w:pPr>
-        <w:rPr>
-          <w:rFonts w:ascii="C64 Pro Mono" w:hAnsi="C64 Pro Mono"/>
-          <w:color w:val="FFFFFF" w:themeColor="background1"/>
-        </w:rPr>
-      </w:pPr>
-    </w:p>
-    <w:p>
-      <w:pPr>
-        <w:pStyle w:val="ListParagraph"/>
-        <w:numPr>
-          <w:ilvl w:val="0"/>
-          <w:numId w:val="12"/>
-        </w:numPr>
-        <w:rPr>
-          <w:rFonts w:ascii="C64 Pro Mono" w:hAnsi="C64 Pro Mono"/>
-          <w:color w:val="FFFFFF" w:themeColor="background1"/>
-        </w:rPr>
-      </w:pPr>
-      <w:r>
-        <w:rPr>
-          <w:rFonts w:ascii="C64 Pro Mono" w:hAnsi="C64 Pro Mono"/>
-          <w:color w:val="FFFFFF" w:themeColor="background1"/>
-        </w:rPr>
-        <w:t>Sprites are no more hardware-based</w:t>
-      </w:r>
-    </w:p>
-    <w:p>
-      <w:pPr>
-        <w:rPr>
-          <w:rFonts w:ascii="C64 Pro Mono" w:hAnsi="C64 Pro Mono"/>
-          <w:color w:val="FFFFFF" w:themeColor="background1"/>
-        </w:rPr>
-      </w:pPr>
-    </w:p>
-    <w:p>
-      <w:pPr>
-        <w:pStyle w:val="ListParagraph"/>
-        <w:numPr>
-          <w:ilvl w:val="0"/>
-          <w:numId w:val="12"/>
-        </w:numPr>
-        <w:rPr>
-          <w:rFonts w:ascii="C64 Pro Mono" w:hAnsi="C64 Pro Mono"/>
-          <w:color w:val="FFFFFF" w:themeColor="background1"/>
-        </w:rPr>
-      </w:pPr>
-      <w:r>
-        <w:rPr>
-          <w:rFonts w:ascii="C64 Pro Mono" w:hAnsi="C64 Pro Mono"/>
-          <w:color w:val="FFFFFF" w:themeColor="background1"/>
-        </w:rPr>
-        <w:t>Games went 3D, making 2D sprites not that crucial in game development</w:t>
       </w:r>
     </w:p>
     <w:p>
@@ -8350,6 +9788,119 @@
 <file path=word/numbering.xml><?xml version="1.0" encoding="utf-8"?>
 <w:numbering xmlns:wpc="http://schemas.microsoft.com/office/word/2010/wordprocessingCanvas" xmlns:cx="http://schemas.microsoft.com/office/drawing/2014/chartex" xmlns:cx1="http://schemas.microsoft.com/office/drawing/2015/9/8/chartex" xmlns:cx2="http://schemas.microsoft.com/office/drawing/2015/10/21/chartex" xmlns:cx3="http://schemas.microsoft.com/office/drawing/2016/5/9/chartex" xmlns:cx4="http://schemas.microsoft.com/office/drawing/2016/5/10/chartex" xmlns:cx5="http://schemas.microsoft.com/office/drawing/2016/5/11/chartex" xmlns:cx6="http://schemas.microsoft.com/office/drawing/2016/5/12/chartex" xmlns:cx7="http://schemas.microsoft.com/office/drawing/2016/5/13/chartex" xmlns:cx8="http://schemas.microsoft.com/office/drawing/2016/5/14/chartex" xmlns:mc="http://schemas.openxmlformats.org/markup-compatibility/2006" xmlns:aink="http://schemas.microsoft.com/office/drawing/2016/ink" xmlns:am3d="http://schemas.microsoft.com/office/drawing/2017/model3d" xmlns:o="urn:schemas-microsoft-com:office:office" xmlns:oel="http://schemas.microsoft.com/office/2019/extlst" xmlns:r="http://schemas.openxmlformats.org/officeDocument/2006/relationships" xmlns:m="http://schemas.openxmlformats.org/officeDocument/2006/math" xmlns:v="urn:schemas-microsoft-com:vml" xmlns:wp14="http://schemas.microsoft.com/office/word/2010/wordprocessingDrawing" xmlns:wp="http://schemas.openxmlformats.org/drawingml/2006/wordprocessingDrawing" xmlns:w10="urn:schemas-microsoft-com:office:word" xmlns:w="http://schemas.openxmlformats.org/wordprocessingml/2006/main" xmlns:w14="http://schemas.microsoft.com/office/word/2010/wordml" xmlns:w15="http://schemas.microsoft.com/office/word/2012/wordml" xmlns:w16cex="http://schemas.microsoft.com/office/word/2018/wordml/cex" xmlns:w16cid="http://schemas.microsoft.com/office/word/2016/wordml/cid" xmlns:w16="http://schemas.microsoft.com/office/word/2018/wordml" xmlns:w16du="http://schemas.microsoft.com/office/word/2023/wordml/word16du" xmlns:w16sdtdh="http://schemas.microsoft.com/office/word/2020/wordml/sdtdatahash" xmlns:w16sdtfl="http://schemas.microsoft.com/office/word/2024/wordml/sdtformatlock" xmlns:w16se="http://schemas.microsoft.com/office/word/2015/wordml/symex" xmlns:wpg="http://schemas.microsoft.com/office/word/2010/wordprocessingGroup" xmlns:wpi="http://schemas.microsoft.com/office/word/2010/wordprocessingInk" xmlns:wne="http://schemas.microsoft.com/office/word/2006/wordml" xmlns:wps="http://schemas.microsoft.com/office/word/2010/wordprocessingShape" mc:Ignorable="w14 w15 w16se w16cid w16 w16cex w16sdtdh w16sdtfl w16du wp14">
   <w:abstractNum w:abstractNumId="0" w15:restartNumberingAfterBreak="0">
+    <w:nsid w:val="072B2A12"/>
+    <w:multiLevelType w:val="hybridMultilevel"/>
+    <w:tmpl w:val="70C24C2C"/>
+    <w:lvl w:ilvl="0" w:tplc="04090001">
+      <w:start w:val="1"/>
+      <w:numFmt w:val="bullet"/>
+      <w:lvlText w:val=""/>
+      <w:lvlJc w:val="left"/>
+      <w:pPr>
+        <w:ind w:left="720" w:hanging="360"/>
+      </w:pPr>
+      <w:rPr>
+        <w:rFonts w:ascii="Symbol" w:hAnsi="Symbol" w:hint="default"/>
+      </w:rPr>
+    </w:lvl>
+    <w:lvl w:ilvl="1" w:tplc="04090003" w:tentative="1">
+      <w:start w:val="1"/>
+      <w:numFmt w:val="bullet"/>
+      <w:lvlText w:val="o"/>
+      <w:lvlJc w:val="left"/>
+      <w:pPr>
+        <w:ind w:left="1440" w:hanging="360"/>
+      </w:pPr>
+      <w:rPr>
+        <w:rFonts w:ascii="Courier New" w:hAnsi="Courier New" w:cs="Courier New" w:hint="default"/>
+      </w:rPr>
+    </w:lvl>
+    <w:lvl w:ilvl="2" w:tplc="04090005" w:tentative="1">
+      <w:start w:val="1"/>
+      <w:numFmt w:val="bullet"/>
+      <w:lvlText w:val=""/>
+      <w:lvlJc w:val="left"/>
+      <w:pPr>
+        <w:ind w:left="2160" w:hanging="360"/>
+      </w:pPr>
+      <w:rPr>
+        <w:rFonts w:ascii="Wingdings" w:hAnsi="Wingdings" w:hint="default"/>
+      </w:rPr>
+    </w:lvl>
+    <w:lvl w:ilvl="3" w:tplc="04090001" w:tentative="1">
+      <w:start w:val="1"/>
+      <w:numFmt w:val="bullet"/>
+      <w:lvlText w:val=""/>
+      <w:lvlJc w:val="left"/>
+      <w:pPr>
+        <w:ind w:left="2880" w:hanging="360"/>
+      </w:pPr>
+      <w:rPr>
+        <w:rFonts w:ascii="Symbol" w:hAnsi="Symbol" w:hint="default"/>
+      </w:rPr>
+    </w:lvl>
+    <w:lvl w:ilvl="4" w:tplc="04090003" w:tentative="1">
+      <w:start w:val="1"/>
+      <w:numFmt w:val="bullet"/>
+      <w:lvlText w:val="o"/>
+      <w:lvlJc w:val="left"/>
+      <w:pPr>
+        <w:ind w:left="3600" w:hanging="360"/>
+      </w:pPr>
+      <w:rPr>
+        <w:rFonts w:ascii="Courier New" w:hAnsi="Courier New" w:cs="Courier New" w:hint="default"/>
+      </w:rPr>
+    </w:lvl>
+    <w:lvl w:ilvl="5" w:tplc="04090005" w:tentative="1">
+      <w:start w:val="1"/>
+      <w:numFmt w:val="bullet"/>
+      <w:lvlText w:val=""/>
+      <w:lvlJc w:val="left"/>
+      <w:pPr>
+        <w:ind w:left="4320" w:hanging="360"/>
+      </w:pPr>
+      <w:rPr>
+        <w:rFonts w:ascii="Wingdings" w:hAnsi="Wingdings" w:hint="default"/>
+      </w:rPr>
+    </w:lvl>
+    <w:lvl w:ilvl="6" w:tplc="04090001" w:tentative="1">
+      <w:start w:val="1"/>
+      <w:numFmt w:val="bullet"/>
+      <w:lvlText w:val=""/>
+      <w:lvlJc w:val="left"/>
+      <w:pPr>
+        <w:ind w:left="5040" w:hanging="360"/>
+      </w:pPr>
+      <w:rPr>
+        <w:rFonts w:ascii="Symbol" w:hAnsi="Symbol" w:hint="default"/>
+      </w:rPr>
+    </w:lvl>
+    <w:lvl w:ilvl="7" w:tplc="04090003" w:tentative="1">
+      <w:start w:val="1"/>
+      <w:numFmt w:val="bullet"/>
+      <w:lvlText w:val="o"/>
+      <w:lvlJc w:val="left"/>
+      <w:pPr>
+        <w:ind w:left="5760" w:hanging="360"/>
+      </w:pPr>
+      <w:rPr>
+        <w:rFonts w:ascii="Courier New" w:hAnsi="Courier New" w:cs="Courier New" w:hint="default"/>
+      </w:rPr>
+    </w:lvl>
+    <w:lvl w:ilvl="8" w:tplc="04090005" w:tentative="1">
+      <w:start w:val="1"/>
+      <w:numFmt w:val="bullet"/>
+      <w:lvlText w:val=""/>
+      <w:lvlJc w:val="left"/>
+      <w:pPr>
+        <w:ind w:left="6480" w:hanging="360"/>
+      </w:pPr>
+      <w:rPr>
+        <w:rFonts w:ascii="Wingdings" w:hAnsi="Wingdings" w:hint="default"/>
+      </w:rPr>
+    </w:lvl>
+  </w:abstractNum>
+  <w:abstractNum w:abstractNumId="1" w15:restartNumberingAfterBreak="0">
     <w:nsid w:val="07503E67"/>
     <w:multiLevelType w:val="multilevel"/>
     <w:tmpl w:val="E98C5140"/>
@@ -8494,7 +10045,7 @@
       </w:rPr>
     </w:lvl>
   </w:abstractNum>
-  <w:abstractNum w:abstractNumId="1" w15:restartNumberingAfterBreak="0">
+  <w:abstractNum w:abstractNumId="2" w15:restartNumberingAfterBreak="0">
     <w:nsid w:val="081C51D4"/>
     <w:multiLevelType w:val="multilevel"/>
     <w:tmpl w:val="BE4606E4"/>
@@ -8639,7 +10190,7 @@
       </w:rPr>
     </w:lvl>
   </w:abstractNum>
-  <w:abstractNum w:abstractNumId="2" w15:restartNumberingAfterBreak="0">
+  <w:abstractNum w:abstractNumId="3" w15:restartNumberingAfterBreak="0">
     <w:nsid w:val="122E1B86"/>
     <w:multiLevelType w:val="hybridMultilevel"/>
     <w:tmpl w:val="4A1813A6"/>
@@ -8752,7 +10303,120 @@
       </w:rPr>
     </w:lvl>
   </w:abstractNum>
-  <w:abstractNum w:abstractNumId="3" w15:restartNumberingAfterBreak="0">
+  <w:abstractNum w:abstractNumId="4" w15:restartNumberingAfterBreak="0">
+    <w:nsid w:val="1A0C67A6"/>
+    <w:multiLevelType w:val="hybridMultilevel"/>
+    <w:tmpl w:val="2DEE76C6"/>
+    <w:lvl w:ilvl="0" w:tplc="04090001">
+      <w:start w:val="1"/>
+      <w:numFmt w:val="bullet"/>
+      <w:lvlText w:val=""/>
+      <w:lvlJc w:val="left"/>
+      <w:pPr>
+        <w:ind w:left="720" w:hanging="360"/>
+      </w:pPr>
+      <w:rPr>
+        <w:rFonts w:ascii="Symbol" w:hAnsi="Symbol" w:hint="default"/>
+      </w:rPr>
+    </w:lvl>
+    <w:lvl w:ilvl="1" w:tplc="04090003" w:tentative="1">
+      <w:start w:val="1"/>
+      <w:numFmt w:val="bullet"/>
+      <w:lvlText w:val="o"/>
+      <w:lvlJc w:val="left"/>
+      <w:pPr>
+        <w:ind w:left="1440" w:hanging="360"/>
+      </w:pPr>
+      <w:rPr>
+        <w:rFonts w:ascii="Courier New" w:hAnsi="Courier New" w:cs="Courier New" w:hint="default"/>
+      </w:rPr>
+    </w:lvl>
+    <w:lvl w:ilvl="2" w:tplc="04090005" w:tentative="1">
+      <w:start w:val="1"/>
+      <w:numFmt w:val="bullet"/>
+      <w:lvlText w:val=""/>
+      <w:lvlJc w:val="left"/>
+      <w:pPr>
+        <w:ind w:left="2160" w:hanging="360"/>
+      </w:pPr>
+      <w:rPr>
+        <w:rFonts w:ascii="Wingdings" w:hAnsi="Wingdings" w:hint="default"/>
+      </w:rPr>
+    </w:lvl>
+    <w:lvl w:ilvl="3" w:tplc="04090001" w:tentative="1">
+      <w:start w:val="1"/>
+      <w:numFmt w:val="bullet"/>
+      <w:lvlText w:val=""/>
+      <w:lvlJc w:val="left"/>
+      <w:pPr>
+        <w:ind w:left="2880" w:hanging="360"/>
+      </w:pPr>
+      <w:rPr>
+        <w:rFonts w:ascii="Symbol" w:hAnsi="Symbol" w:hint="default"/>
+      </w:rPr>
+    </w:lvl>
+    <w:lvl w:ilvl="4" w:tplc="04090003" w:tentative="1">
+      <w:start w:val="1"/>
+      <w:numFmt w:val="bullet"/>
+      <w:lvlText w:val="o"/>
+      <w:lvlJc w:val="left"/>
+      <w:pPr>
+        <w:ind w:left="3600" w:hanging="360"/>
+      </w:pPr>
+      <w:rPr>
+        <w:rFonts w:ascii="Courier New" w:hAnsi="Courier New" w:cs="Courier New" w:hint="default"/>
+      </w:rPr>
+    </w:lvl>
+    <w:lvl w:ilvl="5" w:tplc="04090005" w:tentative="1">
+      <w:start w:val="1"/>
+      <w:numFmt w:val="bullet"/>
+      <w:lvlText w:val=""/>
+      <w:lvlJc w:val="left"/>
+      <w:pPr>
+        <w:ind w:left="4320" w:hanging="360"/>
+      </w:pPr>
+      <w:rPr>
+        <w:rFonts w:ascii="Wingdings" w:hAnsi="Wingdings" w:hint="default"/>
+      </w:rPr>
+    </w:lvl>
+    <w:lvl w:ilvl="6" w:tplc="04090001" w:tentative="1">
+      <w:start w:val="1"/>
+      <w:numFmt w:val="bullet"/>
+      <w:lvlText w:val=""/>
+      <w:lvlJc w:val="left"/>
+      <w:pPr>
+        <w:ind w:left="5040" w:hanging="360"/>
+      </w:pPr>
+      <w:rPr>
+        <w:rFonts w:ascii="Symbol" w:hAnsi="Symbol" w:hint="default"/>
+      </w:rPr>
+    </w:lvl>
+    <w:lvl w:ilvl="7" w:tplc="04090003" w:tentative="1">
+      <w:start w:val="1"/>
+      <w:numFmt w:val="bullet"/>
+      <w:lvlText w:val="o"/>
+      <w:lvlJc w:val="left"/>
+      <w:pPr>
+        <w:ind w:left="5760" w:hanging="360"/>
+      </w:pPr>
+      <w:rPr>
+        <w:rFonts w:ascii="Courier New" w:hAnsi="Courier New" w:cs="Courier New" w:hint="default"/>
+      </w:rPr>
+    </w:lvl>
+    <w:lvl w:ilvl="8" w:tplc="04090005" w:tentative="1">
+      <w:start w:val="1"/>
+      <w:numFmt w:val="bullet"/>
+      <w:lvlText w:val=""/>
+      <w:lvlJc w:val="left"/>
+      <w:pPr>
+        <w:ind w:left="6480" w:hanging="360"/>
+      </w:pPr>
+      <w:rPr>
+        <w:rFonts w:ascii="Wingdings" w:hAnsi="Wingdings" w:hint="default"/>
+      </w:rPr>
+    </w:lvl>
+  </w:abstractNum>
+  <w:abstractNum w:abstractNumId="5" w15:restartNumberingAfterBreak="0">
     <w:nsid w:val="3A9C32EC"/>
     <w:multiLevelType w:val="hybridMultilevel"/>
     <w:tmpl w:val="3076A69A"/>
@@ -8864,7 +10528,7 @@
       </w:rPr>
     </w:lvl>
   </w:abstractNum>
-  <w:abstractNum w:abstractNumId="4" w15:restartNumberingAfterBreak="0">
+  <w:abstractNum w:abstractNumId="6" w15:restartNumberingAfterBreak="0">
     <w:nsid w:val="45CE40F5"/>
     <w:multiLevelType w:val="hybridMultilevel"/>
     <w:tmpl w:val="54F6DD68"/>
@@ -8977,7 +10641,120 @@
       </w:rPr>
     </w:lvl>
   </w:abstractNum>
-  <w:abstractNum w:abstractNumId="5" w15:restartNumberingAfterBreak="0">
+  <w:abstractNum w:abstractNumId="7" w15:restartNumberingAfterBreak="0">
+    <w:nsid w:val="48DD0394"/>
+    <w:multiLevelType w:val="hybridMultilevel"/>
+    <w:tmpl w:val="0852A38C"/>
+    <w:lvl w:ilvl="0" w:tplc="04090001">
+      <w:start w:val="1"/>
+      <w:numFmt w:val="bullet"/>
+      <w:lvlText w:val=""/>
+      <w:lvlJc w:val="left"/>
+      <w:pPr>
+        <w:ind w:left="720" w:hanging="360"/>
+      </w:pPr>
+      <w:rPr>
+        <w:rFonts w:ascii="Symbol" w:hAnsi="Symbol" w:hint="default"/>
+      </w:rPr>
+    </w:lvl>
+    <w:lvl w:ilvl="1" w:tplc="04090003" w:tentative="1">
+      <w:start w:val="1"/>
+      <w:numFmt w:val="bullet"/>
+      <w:lvlText w:val="o"/>
+      <w:lvlJc w:val="left"/>
+      <w:pPr>
+        <w:ind w:left="1440" w:hanging="360"/>
+      </w:pPr>
+      <w:rPr>
+        <w:rFonts w:ascii="Courier New" w:hAnsi="Courier New" w:cs="Courier New" w:hint="default"/>
+      </w:rPr>
+    </w:lvl>
+    <w:lvl w:ilvl="2" w:tplc="04090005" w:tentative="1">
+      <w:start w:val="1"/>
+      <w:numFmt w:val="bullet"/>
+      <w:lvlText w:val=""/>
+      <w:lvlJc w:val="left"/>
+      <w:pPr>
+        <w:ind w:left="2160" w:hanging="360"/>
+      </w:pPr>
+      <w:rPr>
+        <w:rFonts w:ascii="Wingdings" w:hAnsi="Wingdings" w:hint="default"/>
+      </w:rPr>
+    </w:lvl>
+    <w:lvl w:ilvl="3" w:tplc="04090001" w:tentative="1">
+      <w:start w:val="1"/>
+      <w:numFmt w:val="bullet"/>
+      <w:lvlText w:val=""/>
+      <w:lvlJc w:val="left"/>
+      <w:pPr>
+        <w:ind w:left="2880" w:hanging="360"/>
+      </w:pPr>
+      <w:rPr>
+        <w:rFonts w:ascii="Symbol" w:hAnsi="Symbol" w:hint="default"/>
+      </w:rPr>
+    </w:lvl>
+    <w:lvl w:ilvl="4" w:tplc="04090003" w:tentative="1">
+      <w:start w:val="1"/>
+      <w:numFmt w:val="bullet"/>
+      <w:lvlText w:val="o"/>
+      <w:lvlJc w:val="left"/>
+      <w:pPr>
+        <w:ind w:left="3600" w:hanging="360"/>
+      </w:pPr>
+      <w:rPr>
+        <w:rFonts w:ascii="Courier New" w:hAnsi="Courier New" w:cs="Courier New" w:hint="default"/>
+      </w:rPr>
+    </w:lvl>
+    <w:lvl w:ilvl="5" w:tplc="04090005" w:tentative="1">
+      <w:start w:val="1"/>
+      <w:numFmt w:val="bullet"/>
+      <w:lvlText w:val=""/>
+      <w:lvlJc w:val="left"/>
+      <w:pPr>
+        <w:ind w:left="4320" w:hanging="360"/>
+      </w:pPr>
+      <w:rPr>
+        <w:rFonts w:ascii="Wingdings" w:hAnsi="Wingdings" w:hint="default"/>
+      </w:rPr>
+    </w:lvl>
+    <w:lvl w:ilvl="6" w:tplc="04090001" w:tentative="1">
+      <w:start w:val="1"/>
+      <w:numFmt w:val="bullet"/>
+      <w:lvlText w:val=""/>
+      <w:lvlJc w:val="left"/>
+      <w:pPr>
+        <w:ind w:left="5040" w:hanging="360"/>
+      </w:pPr>
+      <w:rPr>
+        <w:rFonts w:ascii="Symbol" w:hAnsi="Symbol" w:hint="default"/>
+      </w:rPr>
+    </w:lvl>
+    <w:lvl w:ilvl="7" w:tplc="04090003" w:tentative="1">
+      <w:start w:val="1"/>
+      <w:numFmt w:val="bullet"/>
+      <w:lvlText w:val="o"/>
+      <w:lvlJc w:val="left"/>
+      <w:pPr>
+        <w:ind w:left="5760" w:hanging="360"/>
+      </w:pPr>
+      <w:rPr>
+        <w:rFonts w:ascii="Courier New" w:hAnsi="Courier New" w:cs="Courier New" w:hint="default"/>
+      </w:rPr>
+    </w:lvl>
+    <w:lvl w:ilvl="8" w:tplc="04090005" w:tentative="1">
+      <w:start w:val="1"/>
+      <w:numFmt w:val="bullet"/>
+      <w:lvlText w:val=""/>
+      <w:lvlJc w:val="left"/>
+      <w:pPr>
+        <w:ind w:left="6480" w:hanging="360"/>
+      </w:pPr>
+      <w:rPr>
+        <w:rFonts w:ascii="Wingdings" w:hAnsi="Wingdings" w:hint="default"/>
+      </w:rPr>
+    </w:lvl>
+  </w:abstractNum>
+  <w:abstractNum w:abstractNumId="8" w15:restartNumberingAfterBreak="0">
     <w:nsid w:val="4F397F76"/>
     <w:multiLevelType w:val="multilevel"/>
     <w:tmpl w:val="705E445C"/>
@@ -9126,7 +10903,7 @@
       </w:rPr>
     </w:lvl>
   </w:abstractNum>
-  <w:abstractNum w:abstractNumId="6" w15:restartNumberingAfterBreak="0">
+  <w:abstractNum w:abstractNumId="9" w15:restartNumberingAfterBreak="0">
     <w:nsid w:val="508A082F"/>
     <w:multiLevelType w:val="hybridMultilevel"/>
     <w:tmpl w:val="391669FE"/>
@@ -9238,7 +11015,120 @@
       </w:rPr>
     </w:lvl>
   </w:abstractNum>
-  <w:abstractNum w:abstractNumId="7" w15:restartNumberingAfterBreak="0">
+  <w:abstractNum w:abstractNumId="10" w15:restartNumberingAfterBreak="0">
+    <w:nsid w:val="64B53BE8"/>
+    <w:multiLevelType w:val="hybridMultilevel"/>
+    <w:tmpl w:val="D69EFEDE"/>
+    <w:lvl w:ilvl="0" w:tplc="04090001">
+      <w:start w:val="1"/>
+      <w:numFmt w:val="bullet"/>
+      <w:lvlText w:val=""/>
+      <w:lvlJc w:val="left"/>
+      <w:pPr>
+        <w:ind w:left="720" w:hanging="360"/>
+      </w:pPr>
+      <w:rPr>
+        <w:rFonts w:ascii="Symbol" w:hAnsi="Symbol" w:hint="default"/>
+      </w:rPr>
+    </w:lvl>
+    <w:lvl w:ilvl="1" w:tplc="04090003" w:tentative="1">
+      <w:start w:val="1"/>
+      <w:numFmt w:val="bullet"/>
+      <w:lvlText w:val="o"/>
+      <w:lvlJc w:val="left"/>
+      <w:pPr>
+        <w:ind w:left="1440" w:hanging="360"/>
+      </w:pPr>
+      <w:rPr>
+        <w:rFonts w:ascii="Courier New" w:hAnsi="Courier New" w:cs="Courier New" w:hint="default"/>
+      </w:rPr>
+    </w:lvl>
+    <w:lvl w:ilvl="2" w:tplc="04090005" w:tentative="1">
+      <w:start w:val="1"/>
+      <w:numFmt w:val="bullet"/>
+      <w:lvlText w:val=""/>
+      <w:lvlJc w:val="left"/>
+      <w:pPr>
+        <w:ind w:left="2160" w:hanging="360"/>
+      </w:pPr>
+      <w:rPr>
+        <w:rFonts w:ascii="Wingdings" w:hAnsi="Wingdings" w:hint="default"/>
+      </w:rPr>
+    </w:lvl>
+    <w:lvl w:ilvl="3" w:tplc="04090001" w:tentative="1">
+      <w:start w:val="1"/>
+      <w:numFmt w:val="bullet"/>
+      <w:lvlText w:val=""/>
+      <w:lvlJc w:val="left"/>
+      <w:pPr>
+        <w:ind w:left="2880" w:hanging="360"/>
+      </w:pPr>
+      <w:rPr>
+        <w:rFonts w:ascii="Symbol" w:hAnsi="Symbol" w:hint="default"/>
+      </w:rPr>
+    </w:lvl>
+    <w:lvl w:ilvl="4" w:tplc="04090003" w:tentative="1">
+      <w:start w:val="1"/>
+      <w:numFmt w:val="bullet"/>
+      <w:lvlText w:val="o"/>
+      <w:lvlJc w:val="left"/>
+      <w:pPr>
+        <w:ind w:left="3600" w:hanging="360"/>
+      </w:pPr>
+      <w:rPr>
+        <w:rFonts w:ascii="Courier New" w:hAnsi="Courier New" w:cs="Courier New" w:hint="default"/>
+      </w:rPr>
+    </w:lvl>
+    <w:lvl w:ilvl="5" w:tplc="04090005" w:tentative="1">
+      <w:start w:val="1"/>
+      <w:numFmt w:val="bullet"/>
+      <w:lvlText w:val=""/>
+      <w:lvlJc w:val="left"/>
+      <w:pPr>
+        <w:ind w:left="4320" w:hanging="360"/>
+      </w:pPr>
+      <w:rPr>
+        <w:rFonts w:ascii="Wingdings" w:hAnsi="Wingdings" w:hint="default"/>
+      </w:rPr>
+    </w:lvl>
+    <w:lvl w:ilvl="6" w:tplc="04090001" w:tentative="1">
+      <w:start w:val="1"/>
+      <w:numFmt w:val="bullet"/>
+      <w:lvlText w:val=""/>
+      <w:lvlJc w:val="left"/>
+      <w:pPr>
+        <w:ind w:left="5040" w:hanging="360"/>
+      </w:pPr>
+      <w:rPr>
+        <w:rFonts w:ascii="Symbol" w:hAnsi="Symbol" w:hint="default"/>
+      </w:rPr>
+    </w:lvl>
+    <w:lvl w:ilvl="7" w:tplc="04090003" w:tentative="1">
+      <w:start w:val="1"/>
+      <w:numFmt w:val="bullet"/>
+      <w:lvlText w:val="o"/>
+      <w:lvlJc w:val="left"/>
+      <w:pPr>
+        <w:ind w:left="5760" w:hanging="360"/>
+      </w:pPr>
+      <w:rPr>
+        <w:rFonts w:ascii="Courier New" w:hAnsi="Courier New" w:cs="Courier New" w:hint="default"/>
+      </w:rPr>
+    </w:lvl>
+    <w:lvl w:ilvl="8" w:tplc="04090005" w:tentative="1">
+      <w:start w:val="1"/>
+      <w:numFmt w:val="bullet"/>
+      <w:lvlText w:val=""/>
+      <w:lvlJc w:val="left"/>
+      <w:pPr>
+        <w:ind w:left="6480" w:hanging="360"/>
+      </w:pPr>
+      <w:rPr>
+        <w:rFonts w:ascii="Wingdings" w:hAnsi="Wingdings" w:hint="default"/>
+      </w:rPr>
+    </w:lvl>
+  </w:abstractNum>
+  <w:abstractNum w:abstractNumId="11" w15:restartNumberingAfterBreak="0">
     <w:nsid w:val="67951287"/>
     <w:multiLevelType w:val="multilevel"/>
     <w:tmpl w:val="FC3E6EC6"/>
@@ -9387,7 +11277,7 @@
       </w:rPr>
     </w:lvl>
   </w:abstractNum>
-  <w:abstractNum w:abstractNumId="8" w15:restartNumberingAfterBreak="0">
+  <w:abstractNum w:abstractNumId="12" w15:restartNumberingAfterBreak="0">
     <w:nsid w:val="74DA0D74"/>
     <w:multiLevelType w:val="hybridMultilevel"/>
     <w:tmpl w:val="AA88985A"/>
@@ -9500,7 +11390,7 @@
       </w:rPr>
     </w:lvl>
   </w:abstractNum>
-  <w:abstractNum w:abstractNumId="9" w15:restartNumberingAfterBreak="0">
+  <w:abstractNum w:abstractNumId="13" w15:restartNumberingAfterBreak="0">
     <w:nsid w:val="750877E6"/>
     <w:multiLevelType w:val="multilevel"/>
     <w:tmpl w:val="BE4606E4"/>
@@ -9645,7 +11535,7 @@
       </w:rPr>
     </w:lvl>
   </w:abstractNum>
-  <w:abstractNum w:abstractNumId="10" w15:restartNumberingAfterBreak="0">
+  <w:abstractNum w:abstractNumId="14" w15:restartNumberingAfterBreak="0">
     <w:nsid w:val="76B70BC6"/>
     <w:multiLevelType w:val="multilevel"/>
     <w:tmpl w:val="BE4606E4"/>
@@ -9790,7 +11680,7 @@
       </w:rPr>
     </w:lvl>
   </w:abstractNum>
-  <w:abstractNum w:abstractNumId="11" w15:restartNumberingAfterBreak="0">
+  <w:abstractNum w:abstractNumId="15" w15:restartNumberingAfterBreak="0">
     <w:nsid w:val="77BF203A"/>
     <w:multiLevelType w:val="hybridMultilevel"/>
     <w:tmpl w:val="5D32E0C0"/>
@@ -9903,7 +11793,7 @@
       </w:rPr>
     </w:lvl>
   </w:abstractNum>
-  <w:abstractNum w:abstractNumId="12" w15:restartNumberingAfterBreak="0">
+  <w:abstractNum w:abstractNumId="16" w15:restartNumberingAfterBreak="0">
     <w:nsid w:val="787A33FE"/>
     <w:multiLevelType w:val="hybridMultilevel"/>
     <w:tmpl w:val="9B0C91B0"/>
@@ -10017,43 +11907,55 @@
     </w:lvl>
   </w:abstractNum>
   <w:num w:numId="1" w16cid:durableId="366102741">
-    <w:abstractNumId w:val="4"/>
+    <w:abstractNumId w:val="6"/>
   </w:num>
   <w:num w:numId="2" w16cid:durableId="1399282567">
+    <w:abstractNumId w:val="1"/>
+  </w:num>
+  <w:num w:numId="3" w16cid:durableId="1088574508">
+    <w:abstractNumId w:val="2"/>
+  </w:num>
+  <w:num w:numId="4" w16cid:durableId="182060749">
+    <w:abstractNumId w:val="11"/>
+  </w:num>
+  <w:num w:numId="5" w16cid:durableId="96872561">
+    <w:abstractNumId w:val="13"/>
+  </w:num>
+  <w:num w:numId="6" w16cid:durableId="1247377091">
+    <w:abstractNumId w:val="14"/>
+  </w:num>
+  <w:num w:numId="7" w16cid:durableId="1836219126">
+    <w:abstractNumId w:val="8"/>
+  </w:num>
+  <w:num w:numId="8" w16cid:durableId="1001546471">
+    <w:abstractNumId w:val="5"/>
+  </w:num>
+  <w:num w:numId="9" w16cid:durableId="748502999">
+    <w:abstractNumId w:val="9"/>
+  </w:num>
+  <w:num w:numId="10" w16cid:durableId="466976073">
+    <w:abstractNumId w:val="15"/>
+  </w:num>
+  <w:num w:numId="11" w16cid:durableId="332074901">
+    <w:abstractNumId w:val="16"/>
+  </w:num>
+  <w:num w:numId="12" w16cid:durableId="1825468012">
+    <w:abstractNumId w:val="12"/>
+  </w:num>
+  <w:num w:numId="13" w16cid:durableId="1963490212">
+    <w:abstractNumId w:val="3"/>
+  </w:num>
+  <w:num w:numId="14" w16cid:durableId="54282666">
+    <w:abstractNumId w:val="7"/>
+  </w:num>
+  <w:num w:numId="15" w16cid:durableId="1514371116">
     <w:abstractNumId w:val="0"/>
   </w:num>
-  <w:num w:numId="3" w16cid:durableId="1088574508">
-    <w:abstractNumId w:val="1"/>
-  </w:num>
-  <w:num w:numId="4" w16cid:durableId="182060749">
-    <w:abstractNumId w:val="7"/>
-  </w:num>
-  <w:num w:numId="5" w16cid:durableId="96872561">
-    <w:abstractNumId w:val="9"/>
-  </w:num>
-  <w:num w:numId="6" w16cid:durableId="1247377091">
+  <w:num w:numId="16" w16cid:durableId="446852485">
     <w:abstractNumId w:val="10"/>
   </w:num>
-  <w:num w:numId="7" w16cid:durableId="1836219126">
-    <w:abstractNumId w:val="5"/>
-  </w:num>
-  <w:num w:numId="8" w16cid:durableId="1001546471">
-    <w:abstractNumId w:val="3"/>
-  </w:num>
-  <w:num w:numId="9" w16cid:durableId="748502999">
-    <w:abstractNumId w:val="6"/>
-  </w:num>
-  <w:num w:numId="10" w16cid:durableId="466976073">
-    <w:abstractNumId w:val="11"/>
-  </w:num>
-  <w:num w:numId="11" w16cid:durableId="332074901">
-    <w:abstractNumId w:val="12"/>
-  </w:num>
-  <w:num w:numId="12" w16cid:durableId="1825468012">
-    <w:abstractNumId w:val="8"/>
-  </w:num>
-  <w:num w:numId="13" w16cid:durableId="1963490212">
-    <w:abstractNumId w:val="2"/>
+  <w:num w:numId="17" w16cid:durableId="436877426">
+    <w:abstractNumId w:val="4"/>
   </w:num>
 </w:numbering>
 </file>

</xml_diff>

<commit_message>
Python Arcade Honda demo 1
</commit_message>
<xml_diff>
--- a/LECTURES/DecadesOfSprites/Decades of SPRITES.docx
+++ b/LECTURES/DecadesOfSprites/Decades of SPRITES.docx
@@ -1012,62 +1012,127 @@
                           <w:p>
                             <w:pPr>
                               <w:rPr>
-                                <w:sz w:val="20"/>
-                                <w:szCs w:val="20"/>
+                                <w:i/>
+                                <w:iCs/>
+                                <w:sz w:val="16"/>
+                                <w:szCs w:val="16"/>
                               </w:rPr>
                             </w:pPr>
                             <w:r>
                               <w:rPr>
                                 <w:i/>
                                 <w:iCs/>
-                                <w:sz w:val="20"/>
-                                <w:szCs w:val="20"/>
+                                <w:sz w:val="16"/>
+                                <w:szCs w:val="16"/>
                               </w:rPr>
-                              <w:t>10</w:t>
-                            </w:r>
-                            <w:r>
-                              <w:rPr>
-                                <w:sz w:val="20"/>
-                                <w:szCs w:val="20"/>
-                              </w:rPr>
-                              <w:t xml:space="preserve"> DIM A$(</w:t>
+                              <w:t>10 GRAPHICS 8</w:t>
                             </w:r>
                             <w:r>
                               <w:rPr>
                                 <w:i/>
                                 <w:iCs/>
-                                <w:sz w:val="20"/>
-                                <w:szCs w:val="20"/>
+                                <w:sz w:val="16"/>
+                                <w:szCs w:val="16"/>
                               </w:rPr>
-                              <w:t>10</w:t>
-                            </w:r>
-                            <w:r>
-                              <w:rPr>
-                                <w:sz w:val="20"/>
-                                <w:szCs w:val="20"/>
-                              </w:rPr>
-                              <w:t>),B$(</w:t>
+                              <w:br/>
+                              <w:t>20 POKE 559,62          :REM SDMCTL Direct Memory Access (DMA) enable</w:t>
                             </w:r>
                             <w:r>
                               <w:rPr>
                                 <w:i/>
                                 <w:iCs/>
-                                <w:sz w:val="20"/>
-                                <w:szCs w:val="20"/>
+                                <w:sz w:val="16"/>
+                                <w:szCs w:val="16"/>
                               </w:rPr>
-                              <w:t>100</w:t>
+                              <w:br/>
+                              <w:t>30 POKE 53248,20       :REM 53248 HPOSP0 (W) Horizontal position of player 0</w:t>
                             </w:r>
                             <w:r>
                               <w:rPr>
-                                <w:sz w:val="20"/>
-                                <w:szCs w:val="20"/>
+                                <w:i/>
+                                <w:iCs/>
+                                <w:sz w:val="16"/>
+                                <w:szCs w:val="16"/>
                               </w:rPr>
-                              <w:t>)</w:t>
+                              <w:br/>
+                              <w:t>40 WHT=15</w:t>
                             </w:r>
                             <w:r>
                               <w:rPr>
-                                <w:sz w:val="20"/>
-                                <w:szCs w:val="20"/>
+                                <w:i/>
+                                <w:iCs/>
+                                <w:sz w:val="16"/>
+                                <w:szCs w:val="16"/>
+                              </w:rPr>
+                              <w:br/>
+                              <w:t xml:space="preserve">50 POKE 704,WHT         :REM Locations 704 to 712 ($2C0 to $2C8) are the color registers for players, </w:t>
+                            </w:r>
+                            <w:proofErr w:type="spellStart"/>
+                            <w:r>
+                              <w:rPr>
+                                <w:i/>
+                                <w:iCs/>
+                                <w:sz w:val="16"/>
+                                <w:szCs w:val="16"/>
+                              </w:rPr>
+                              <w:t>missiles,and</w:t>
+                            </w:r>
+                            <w:proofErr w:type="spellEnd"/>
+                            <w:r>
+                              <w:rPr>
+                                <w:i/>
+                                <w:iCs/>
+                                <w:sz w:val="16"/>
+                                <w:szCs w:val="16"/>
+                              </w:rPr>
+                              <w:t xml:space="preserve"> playfields</w:t>
+                            </w:r>
+                            <w:r>
+                              <w:rPr>
+                                <w:i/>
+                                <w:iCs/>
+                                <w:sz w:val="16"/>
+                                <w:szCs w:val="16"/>
+                              </w:rPr>
+                              <w:br/>
+                              <w:t>60 I=PEEK(106)-8        :REM RAMTOP - RAM size, defined by powerup</w:t>
+                            </w:r>
+                            <w:r>
+                              <w:rPr>
+                                <w:i/>
+                                <w:iCs/>
+                                <w:sz w:val="16"/>
+                                <w:szCs w:val="16"/>
+                              </w:rPr>
+                              <w:br/>
+                              <w:t>70 POKE 54279,I         :REM CONSOL (W/R) Used to see if one of the three yellow console buttons has been pressed (not the RESET button!).</w:t>
+                            </w:r>
+                            <w:r>
+                              <w:rPr>
+                                <w:i/>
+                                <w:iCs/>
+                                <w:sz w:val="16"/>
+                                <w:szCs w:val="16"/>
+                              </w:rPr>
+                              <w:br/>
+                              <w:t>80 POKE 53277,3         :REM GRACTL (W) Used to turn on players and to turn on missiles.</w:t>
+                            </w:r>
+                            <w:r>
+                              <w:rPr>
+                                <w:i/>
+                                <w:iCs/>
+                                <w:sz w:val="16"/>
+                                <w:szCs w:val="16"/>
+                              </w:rPr>
+                              <w:br/>
+                              <w:t>90 POKE 53256,3         :REM SIZEP0 (W) Size of player 0.</w:t>
+                            </w:r>
+                            <w:r>
+                              <w:rPr>
+                                <w:i/>
+                                <w:iCs/>
+                                <w:sz w:val="16"/>
+                                <w:szCs w:val="16"/>
                               </w:rPr>
                               <w:br/>
                             </w:r>
@@ -1075,80 +1140,48 @@
                               <w:rPr>
                                 <w:i/>
                                 <w:iCs/>
-                                <w:sz w:val="20"/>
-                                <w:szCs w:val="20"/>
+                                <w:sz w:val="16"/>
+                                <w:szCs w:val="16"/>
                               </w:rPr>
-                              <w:t>20</w:t>
-                            </w:r>
-                            <w:r>
-                              <w:rPr>
-                                <w:sz w:val="20"/>
-                                <w:szCs w:val="20"/>
-                              </w:rPr>
-                              <w:t xml:space="preserve"> GRAPHICS </w:t>
+                              <w:br/>
+                              <w:t>100 REM DRAW 10 LINES (BACKGROUND)</w:t>
                             </w:r>
                             <w:r>
                               <w:rPr>
                                 <w:i/>
                                 <w:iCs/>
-                                <w:sz w:val="20"/>
-                                <w:szCs w:val="20"/>
+                                <w:sz w:val="16"/>
+                                <w:szCs w:val="16"/>
                               </w:rPr>
-                              <w:t>8</w:t>
+                              <w:br/>
+                              <w:t>110 FOR A = 70 TO 100 STEP 3</w:t>
                             </w:r>
                             <w:r>
                               <w:rPr>
                                 <w:i/>
                                 <w:iCs/>
-                                <w:sz w:val="20"/>
-                                <w:szCs w:val="20"/>
+                                <w:sz w:val="16"/>
+                                <w:szCs w:val="16"/>
                               </w:rPr>
                               <w:br/>
-                              <w:t>30</w:t>
-                            </w:r>
-                            <w:r>
-                              <w:rPr>
-                                <w:sz w:val="20"/>
-                                <w:szCs w:val="20"/>
-                              </w:rPr>
-                              <w:t xml:space="preserve"> POKE </w:t>
+                              <w:t>120 COLOR 1: PLOT 100,A: DRAWTO 315,A+20</w:t>
                             </w:r>
                             <w:r>
                               <w:rPr>
                                 <w:i/>
                                 <w:iCs/>
-                                <w:sz w:val="20"/>
-                                <w:szCs w:val="20"/>
+                                <w:sz w:val="16"/>
+                                <w:szCs w:val="16"/>
                               </w:rPr>
-                              <w:t>559</w:t>
-                            </w:r>
-                            <w:r>
-                              <w:rPr>
-                                <w:sz w:val="20"/>
-                                <w:szCs w:val="20"/>
-                              </w:rPr>
-                              <w:t>,</w:t>
+                              <w:br/>
+                              <w:t>130 NEXT A</w:t>
                             </w:r>
                             <w:r>
                               <w:rPr>
                                 <w:i/>
                                 <w:iCs/>
-                                <w:sz w:val="20"/>
-                                <w:szCs w:val="20"/>
-                              </w:rPr>
-                              <w:t>62</w:t>
-                            </w:r>
-                            <w:r>
-                              <w:rPr>
-                                <w:sz w:val="20"/>
-                                <w:szCs w:val="20"/>
-                              </w:rPr>
-                              <w:t xml:space="preserve">          :REM SDMCTL Direct Memory Access (DMA) enable</w:t>
-                            </w:r>
-                            <w:r>
-                              <w:rPr>
-                                <w:sz w:val="20"/>
-                                <w:szCs w:val="20"/>
+                                <w:sz w:val="16"/>
+                                <w:szCs w:val="16"/>
                               </w:rPr>
                               <w:br/>
                             </w:r>
@@ -1156,176 +1189,108 @@
                               <w:rPr>
                                 <w:i/>
                                 <w:iCs/>
-                                <w:sz w:val="20"/>
-                                <w:szCs w:val="20"/>
+                                <w:sz w:val="16"/>
+                                <w:szCs w:val="16"/>
                               </w:rPr>
-                              <w:t>40</w:t>
-                            </w:r>
-                            <w:r>
-                              <w:rPr>
-                                <w:sz w:val="20"/>
-                                <w:szCs w:val="20"/>
-                              </w:rPr>
-                              <w:t xml:space="preserve"> POKE </w:t>
+                              <w:br/>
+                              <w:t>200 J=I*256+1024</w:t>
                             </w:r>
                             <w:r>
                               <w:rPr>
                                 <w:i/>
                                 <w:iCs/>
-                                <w:sz w:val="20"/>
-                                <w:szCs w:val="20"/>
+                                <w:sz w:val="16"/>
+                                <w:szCs w:val="16"/>
                               </w:rPr>
-                              <w:t>53248</w:t>
-                            </w:r>
-                            <w:r>
-                              <w:rPr>
-                                <w:sz w:val="20"/>
-                                <w:szCs w:val="20"/>
-                              </w:rPr>
-                              <w:t>,</w:t>
+                              <w:br/>
+                              <w:t>210 FOR Y=J+120 TO J+137</w:t>
                             </w:r>
                             <w:r>
                               <w:rPr>
                                 <w:i/>
                                 <w:iCs/>
-                                <w:sz w:val="20"/>
-                                <w:szCs w:val="20"/>
+                                <w:sz w:val="16"/>
+                                <w:szCs w:val="16"/>
                               </w:rPr>
-                              <w:t>120</w:t>
-                            </w:r>
-                            <w:r>
-                              <w:rPr>
-                                <w:sz w:val="20"/>
-                                <w:szCs w:val="20"/>
-                              </w:rPr>
-                              <w:t xml:space="preserve">       :REM </w:t>
+                              <w:br/>
+                              <w:t>220 READ Z</w:t>
                             </w:r>
                             <w:r>
                               <w:rPr>
                                 <w:i/>
                                 <w:iCs/>
-                                <w:sz w:val="20"/>
-                                <w:szCs w:val="20"/>
+                                <w:sz w:val="16"/>
+                                <w:szCs w:val="16"/>
                               </w:rPr>
-                              <w:t xml:space="preserve">53248 </w:t>
-                            </w:r>
-                            <w:r>
-                              <w:rPr>
-                                <w:sz w:val="20"/>
-                                <w:szCs w:val="20"/>
-                              </w:rPr>
-                              <w:t xml:space="preserve">HPOSP0 (W) Horizontal position of player </w:t>
+                              <w:br/>
+                              <w:t>230 POKE Y,Z</w:t>
                             </w:r>
                             <w:r>
                               <w:rPr>
                                 <w:i/>
                                 <w:iCs/>
-                                <w:sz w:val="20"/>
-                                <w:szCs w:val="20"/>
+                                <w:sz w:val="16"/>
+                                <w:szCs w:val="16"/>
                               </w:rPr>
-                              <w:t>0</w:t>
+                              <w:br/>
+                              <w:t>240 NEXT Y</w:t>
                             </w:r>
                             <w:r>
                               <w:rPr>
                                 <w:i/>
                                 <w:iCs/>
-                                <w:sz w:val="20"/>
-                                <w:szCs w:val="20"/>
+                                <w:sz w:val="16"/>
+                                <w:szCs w:val="16"/>
                               </w:rPr>
                               <w:br/>
-                              <w:t>50</w:t>
-                            </w:r>
-                            <w:r>
-                              <w:rPr>
-                                <w:sz w:val="20"/>
-                                <w:szCs w:val="20"/>
-                              </w:rPr>
-                              <w:t xml:space="preserve"> POKE </w:t>
+                              <w:t>250 FOR X=221 TO 48 STEP -1:GOSUB 500:NEXT X</w:t>
                             </w:r>
                             <w:r>
                               <w:rPr>
                                 <w:i/>
                                 <w:iCs/>
-                                <w:sz w:val="20"/>
-                                <w:szCs w:val="20"/>
+                                <w:sz w:val="16"/>
+                                <w:szCs w:val="16"/>
                               </w:rPr>
-                              <w:t>704</w:t>
-                            </w:r>
-                            <w:r>
-                              <w:rPr>
-                                <w:sz w:val="20"/>
-                                <w:szCs w:val="20"/>
-                              </w:rPr>
-                              <w:t>,</w:t>
+                              <w:br/>
+                              <w:t>260 GOTO 250</w:t>
                             </w:r>
                             <w:r>
                               <w:rPr>
                                 <w:i/>
                                 <w:iCs/>
-                                <w:sz w:val="20"/>
-                                <w:szCs w:val="20"/>
+                                <w:sz w:val="16"/>
+                                <w:szCs w:val="16"/>
                               </w:rPr>
-                              <w:t>88</w:t>
-                            </w:r>
-                            <w:r>
-                              <w:rPr>
-                                <w:sz w:val="20"/>
-                                <w:szCs w:val="20"/>
-                              </w:rPr>
-                              <w:t xml:space="preserve">          :REM Locations </w:t>
+                              <w:br/>
+                              <w:t>320 POKE Y,Z</w:t>
                             </w:r>
                             <w:r>
                               <w:rPr>
                                 <w:i/>
                                 <w:iCs/>
-                                <w:sz w:val="20"/>
-                                <w:szCs w:val="20"/>
+                                <w:sz w:val="16"/>
+                                <w:szCs w:val="16"/>
                               </w:rPr>
-                              <w:t xml:space="preserve">704 </w:t>
-                            </w:r>
-                            <w:r>
-                              <w:rPr>
-                                <w:sz w:val="20"/>
-                                <w:szCs w:val="20"/>
-                              </w:rPr>
-                              <w:t xml:space="preserve">to </w:t>
+                              <w:br/>
+                              <w:t>500 POKE 53248,X        :REM 53248 HPOSP0 (W) Horizontal position of player 0</w:t>
                             </w:r>
                             <w:r>
                               <w:rPr>
                                 <w:i/>
                                 <w:iCs/>
-                                <w:sz w:val="20"/>
-                                <w:szCs w:val="20"/>
+                                <w:sz w:val="16"/>
+                                <w:szCs w:val="16"/>
                               </w:rPr>
-                              <w:t xml:space="preserve">712 </w:t>
+                              <w:br/>
+                              <w:t>510 RETURN</w:t>
                             </w:r>
                             <w:r>
                               <w:rPr>
-                                <w:sz w:val="20"/>
-                                <w:szCs w:val="20"/>
-                              </w:rPr>
-                              <w:t xml:space="preserve">($2C0 to $2C8) are the color registers for players, </w:t>
-                            </w:r>
-                            <w:proofErr w:type="spellStart"/>
-                            <w:r>
-                              <w:rPr>
-                                <w:sz w:val="20"/>
-                                <w:szCs w:val="20"/>
-                              </w:rPr>
-                              <w:t>missiles,and</w:t>
-                            </w:r>
-                            <w:proofErr w:type="spellEnd"/>
-                            <w:r>
-                              <w:rPr>
-                                <w:sz w:val="20"/>
-                                <w:szCs w:val="20"/>
-                              </w:rPr>
-                              <w:t xml:space="preserve"> playfields</w:t>
-                            </w:r>
-                            <w:r>
-                              <w:rPr>
-                                <w:sz w:val="20"/>
-                                <w:szCs w:val="20"/>
+                                <w:i/>
+                                <w:iCs/>
+                                <w:sz w:val="16"/>
+                                <w:szCs w:val="16"/>
                               </w:rPr>
                               <w:br/>
                             </w:r>
@@ -1333,924 +1298,38 @@
                               <w:rPr>
                                 <w:i/>
                                 <w:iCs/>
-                                <w:sz w:val="20"/>
-                                <w:szCs w:val="20"/>
+                                <w:sz w:val="16"/>
+                                <w:szCs w:val="16"/>
                               </w:rPr>
-                              <w:t xml:space="preserve">60 </w:t>
-                            </w:r>
-                            <w:r>
-                              <w:rPr>
-                                <w:sz w:val="20"/>
-                                <w:szCs w:val="20"/>
-                              </w:rPr>
-                              <w:t>I=PEEK(</w:t>
+                              <w:br/>
+                              <w:t>600 DATA 128,64,44,18,18,18</w:t>
                             </w:r>
                             <w:r>
                               <w:rPr>
                                 <w:i/>
                                 <w:iCs/>
-                                <w:sz w:val="20"/>
-                                <w:szCs w:val="20"/>
+                                <w:sz w:val="16"/>
+                                <w:szCs w:val="16"/>
                               </w:rPr>
-                              <w:t>106</w:t>
-                            </w:r>
-                            <w:r>
-                              <w:rPr>
-                                <w:sz w:val="20"/>
-                                <w:szCs w:val="20"/>
-                              </w:rPr>
-                              <w:t>)</w:t>
+                              <w:br/>
+                              <w:t>610 DATA 127,129,60,195,153,195</w:t>
                             </w:r>
                             <w:r>
                               <w:rPr>
                                 <w:i/>
                                 <w:iCs/>
-                                <w:sz w:val="20"/>
-                                <w:szCs w:val="20"/>
-                              </w:rPr>
-                              <w:t>-8</w:t>
-                            </w:r>
-                            <w:r>
-                              <w:rPr>
-                                <w:sz w:val="20"/>
-                                <w:szCs w:val="20"/>
-                              </w:rPr>
-                              <w:t xml:space="preserve">        :REM RAMTOP - RAM size, defined by powerup</w:t>
-                            </w:r>
-                            <w:r>
-                              <w:rPr>
-                                <w:sz w:val="20"/>
-                                <w:szCs w:val="20"/>
+                                <w:sz w:val="16"/>
+                                <w:szCs w:val="16"/>
                               </w:rPr>
                               <w:br/>
-                            </w:r>
-                            <w:r>
-                              <w:rPr>
-                                <w:i/>
-                                <w:iCs/>
-                                <w:sz w:val="20"/>
-                                <w:szCs w:val="20"/>
-                              </w:rPr>
-                              <w:t>70</w:t>
-                            </w:r>
-                            <w:r>
-                              <w:rPr>
-                                <w:sz w:val="20"/>
-                                <w:szCs w:val="20"/>
-                              </w:rPr>
-                              <w:t xml:space="preserve"> POKE </w:t>
-                            </w:r>
-                            <w:r>
-                              <w:rPr>
-                                <w:i/>
-                                <w:iCs/>
-                                <w:sz w:val="20"/>
-                                <w:szCs w:val="20"/>
-                              </w:rPr>
-                              <w:t>54279</w:t>
-                            </w:r>
-                            <w:r>
-                              <w:rPr>
-                                <w:sz w:val="20"/>
-                                <w:szCs w:val="20"/>
-                              </w:rPr>
-                              <w:t xml:space="preserve">,I         :REM CONSOL (W/R) Used to see if one of the three yellow console buttons has </w:t>
-                            </w:r>
-                            <w:r>
-                              <w:rPr>
-                                <w:i/>
-                                <w:iCs/>
-                                <w:sz w:val="20"/>
-                                <w:szCs w:val="20"/>
-                              </w:rPr>
-                              <w:t xml:space="preserve">been </w:t>
-                            </w:r>
-                            <w:r>
-                              <w:rPr>
-                                <w:sz w:val="20"/>
-                                <w:szCs w:val="20"/>
-                              </w:rPr>
-                              <w:t>pressed (not the RESET button!).</w:t>
-                            </w:r>
-                            <w:r>
-                              <w:rPr>
-                                <w:sz w:val="20"/>
-                                <w:szCs w:val="20"/>
-                              </w:rPr>
-                              <w:br/>
-                            </w:r>
-                            <w:r>
-                              <w:rPr>
-                                <w:i/>
-                                <w:iCs/>
-                                <w:sz w:val="20"/>
-                                <w:szCs w:val="20"/>
-                              </w:rPr>
-                              <w:t>80</w:t>
-                            </w:r>
-                            <w:r>
-                              <w:rPr>
-                                <w:sz w:val="20"/>
-                                <w:szCs w:val="20"/>
-                              </w:rPr>
-                              <w:t xml:space="preserve"> POKE </w:t>
-                            </w:r>
-                            <w:r>
-                              <w:rPr>
-                                <w:i/>
-                                <w:iCs/>
-                                <w:sz w:val="20"/>
-                                <w:szCs w:val="20"/>
-                              </w:rPr>
-                              <w:t>53277</w:t>
-                            </w:r>
-                            <w:r>
-                              <w:rPr>
-                                <w:sz w:val="20"/>
-                                <w:szCs w:val="20"/>
-                              </w:rPr>
-                              <w:t>,</w:t>
-                            </w:r>
-                            <w:r>
-                              <w:rPr>
-                                <w:i/>
-                                <w:iCs/>
-                                <w:sz w:val="20"/>
-                                <w:szCs w:val="20"/>
-                              </w:rPr>
-                              <w:t>3</w:t>
-                            </w:r>
-                            <w:r>
-                              <w:rPr>
-                                <w:sz w:val="20"/>
-                                <w:szCs w:val="20"/>
-                              </w:rPr>
-                              <w:t xml:space="preserve">         :REM GRACTL (W) Used to turn on players and to turn on missiles.</w:t>
-                            </w:r>
-                            <w:r>
-                              <w:rPr>
-                                <w:sz w:val="20"/>
-                                <w:szCs w:val="20"/>
-                              </w:rPr>
-                              <w:br/>
-                            </w:r>
-                            <w:r>
-                              <w:rPr>
-                                <w:i/>
-                                <w:iCs/>
-                                <w:sz w:val="20"/>
-                                <w:szCs w:val="20"/>
-                              </w:rPr>
-                              <w:t>90</w:t>
-                            </w:r>
-                            <w:r>
-                              <w:rPr>
-                                <w:sz w:val="20"/>
-                                <w:szCs w:val="20"/>
-                              </w:rPr>
-                              <w:t xml:space="preserve"> POKE </w:t>
-                            </w:r>
-                            <w:r>
-                              <w:rPr>
-                                <w:i/>
-                                <w:iCs/>
-                                <w:sz w:val="20"/>
-                                <w:szCs w:val="20"/>
-                              </w:rPr>
-                              <w:t>53256</w:t>
-                            </w:r>
-                            <w:r>
-                              <w:rPr>
-                                <w:sz w:val="20"/>
-                                <w:szCs w:val="20"/>
-                              </w:rPr>
-                              <w:t>,</w:t>
-                            </w:r>
-                            <w:r>
-                              <w:rPr>
-                                <w:i/>
-                                <w:iCs/>
-                                <w:sz w:val="20"/>
-                                <w:szCs w:val="20"/>
-                              </w:rPr>
-                              <w:t>3</w:t>
-                            </w:r>
-                            <w:r>
-                              <w:rPr>
-                                <w:sz w:val="20"/>
-                                <w:szCs w:val="20"/>
-                              </w:rPr>
-                              <w:t xml:space="preserve">         :REM SIZEP0 (W) Size of player </w:t>
-                            </w:r>
-                            <w:r>
-                              <w:rPr>
-                                <w:i/>
-                                <w:iCs/>
-                                <w:sz w:val="20"/>
-                                <w:szCs w:val="20"/>
-                              </w:rPr>
-                              <w:t>0</w:t>
-                            </w:r>
-                            <w:r>
-                              <w:rPr>
-                                <w:sz w:val="20"/>
-                                <w:szCs w:val="20"/>
-                              </w:rPr>
-                              <w:t>.</w:t>
-                            </w:r>
-                            <w:r>
-                              <w:rPr>
-                                <w:sz w:val="20"/>
-                                <w:szCs w:val="20"/>
-                              </w:rPr>
-                              <w:br/>
-                            </w:r>
-                            <w:r>
-                              <w:rPr>
-                                <w:i/>
-                                <w:iCs/>
-                                <w:sz w:val="20"/>
-                                <w:szCs w:val="20"/>
-                              </w:rPr>
-                              <w:t xml:space="preserve">100 </w:t>
-                            </w:r>
-                            <w:r>
-                              <w:rPr>
-                                <w:sz w:val="20"/>
-                                <w:szCs w:val="20"/>
-                              </w:rPr>
-                              <w:t>J=I*</w:t>
-                            </w:r>
-                            <w:r>
-                              <w:rPr>
-                                <w:i/>
-                                <w:iCs/>
-                                <w:sz w:val="20"/>
-                                <w:szCs w:val="20"/>
-                              </w:rPr>
-                              <w:t>256</w:t>
-                            </w:r>
-                            <w:r>
-                              <w:rPr>
-                                <w:sz w:val="20"/>
-                                <w:szCs w:val="20"/>
-                              </w:rPr>
-                              <w:t>+</w:t>
-                            </w:r>
-                            <w:r>
-                              <w:rPr>
-                                <w:i/>
-                                <w:iCs/>
-                                <w:sz w:val="20"/>
-                                <w:szCs w:val="20"/>
-                              </w:rPr>
-                              <w:t>1024</w:t>
-                            </w:r>
-                            <w:r>
-                              <w:rPr>
-                                <w:i/>
-                                <w:iCs/>
-                                <w:sz w:val="20"/>
-                                <w:szCs w:val="20"/>
-                              </w:rPr>
-                              <w:br/>
-                              <w:t xml:space="preserve">110 </w:t>
-                            </w:r>
-                            <w:r>
-                              <w:rPr>
-                                <w:sz w:val="20"/>
-                                <w:szCs w:val="20"/>
-                              </w:rPr>
-                              <w:t>FOR Y=J+</w:t>
-                            </w:r>
-                            <w:r>
-                              <w:rPr>
-                                <w:i/>
-                                <w:iCs/>
-                                <w:sz w:val="20"/>
-                                <w:szCs w:val="20"/>
-                              </w:rPr>
-                              <w:t xml:space="preserve">120 </w:t>
-                            </w:r>
-                            <w:r>
-                              <w:rPr>
-                                <w:sz w:val="20"/>
-                                <w:szCs w:val="20"/>
-                              </w:rPr>
-                              <w:t>TO J+</w:t>
-                            </w:r>
-                            <w:r>
-                              <w:rPr>
-                                <w:i/>
-                                <w:iCs/>
-                                <w:sz w:val="20"/>
-                                <w:szCs w:val="20"/>
-                              </w:rPr>
-                              <w:t>137</w:t>
-                            </w:r>
-                            <w:r>
-                              <w:rPr>
-                                <w:i/>
-                                <w:iCs/>
-                                <w:sz w:val="20"/>
-                                <w:szCs w:val="20"/>
-                              </w:rPr>
-                              <w:br/>
-                              <w:t>120</w:t>
-                            </w:r>
-                            <w:r>
-                              <w:rPr>
-                                <w:sz w:val="20"/>
-                                <w:szCs w:val="20"/>
-                              </w:rPr>
-                              <w:t xml:space="preserve"> READ Z</w:t>
-                            </w:r>
-                            <w:r>
-                              <w:rPr>
-                                <w:sz w:val="20"/>
-                                <w:szCs w:val="20"/>
-                              </w:rPr>
-                              <w:br/>
-                            </w:r>
-                            <w:r>
-                              <w:rPr>
-                                <w:i/>
-                                <w:iCs/>
-                                <w:sz w:val="20"/>
-                                <w:szCs w:val="20"/>
-                              </w:rPr>
-                              <w:t>130</w:t>
-                            </w:r>
-                            <w:r>
-                              <w:rPr>
-                                <w:sz w:val="20"/>
-                                <w:szCs w:val="20"/>
-                              </w:rPr>
-                              <w:t xml:space="preserve"> POKE Y,Z</w:t>
-                            </w:r>
-                            <w:r>
-                              <w:rPr>
-                                <w:sz w:val="20"/>
-                                <w:szCs w:val="20"/>
-                              </w:rPr>
-                              <w:br/>
-                            </w:r>
-                            <w:r>
-                              <w:rPr>
-                                <w:i/>
-                                <w:iCs/>
-                                <w:sz w:val="20"/>
-                                <w:szCs w:val="20"/>
-                              </w:rPr>
-                              <w:t xml:space="preserve">140 </w:t>
-                            </w:r>
-                            <w:r>
-                              <w:rPr>
-                                <w:sz w:val="20"/>
-                                <w:szCs w:val="20"/>
-                              </w:rPr>
-                              <w:t>NEXT Y</w:t>
-                            </w:r>
-                            <w:r>
-                              <w:rPr>
-                                <w:sz w:val="20"/>
-                                <w:szCs w:val="20"/>
-                              </w:rPr>
-                              <w:br/>
-                            </w:r>
-                            <w:r>
-                              <w:rPr>
-                                <w:i/>
-                                <w:iCs/>
-                                <w:sz w:val="20"/>
-                                <w:szCs w:val="20"/>
-                              </w:rPr>
-                              <w:t xml:space="preserve">150 </w:t>
-                            </w:r>
-                            <w:r>
-                              <w:rPr>
-                                <w:sz w:val="20"/>
-                                <w:szCs w:val="20"/>
-                              </w:rPr>
-                              <w:t>FOR X=</w:t>
-                            </w:r>
-                            <w:r>
-                              <w:rPr>
-                                <w:i/>
-                                <w:iCs/>
-                                <w:sz w:val="20"/>
-                                <w:szCs w:val="20"/>
-                              </w:rPr>
-                              <w:t xml:space="preserve">48 </w:t>
-                            </w:r>
-                            <w:r>
-                              <w:rPr>
-                                <w:sz w:val="20"/>
-                                <w:szCs w:val="20"/>
-                              </w:rPr>
-                              <w:t xml:space="preserve">TO </w:t>
-                            </w:r>
-                            <w:r>
-                              <w:rPr>
-                                <w:i/>
-                                <w:iCs/>
-                                <w:sz w:val="20"/>
-                                <w:szCs w:val="20"/>
-                              </w:rPr>
-                              <w:t>221</w:t>
-                            </w:r>
-                            <w:r>
-                              <w:rPr>
-                                <w:sz w:val="20"/>
-                                <w:szCs w:val="20"/>
-                              </w:rPr>
-                              <w:t xml:space="preserve">:GOSUB </w:t>
-                            </w:r>
-                            <w:r>
-                              <w:rPr>
-                                <w:i/>
-                                <w:iCs/>
-                                <w:sz w:val="20"/>
-                                <w:szCs w:val="20"/>
-                              </w:rPr>
-                              <w:t>500</w:t>
-                            </w:r>
-                            <w:r>
-                              <w:rPr>
-                                <w:sz w:val="20"/>
-                                <w:szCs w:val="20"/>
-                              </w:rPr>
-                              <w:t>:NEXT X</w:t>
-                            </w:r>
-                            <w:r>
-                              <w:rPr>
-                                <w:sz w:val="20"/>
-                                <w:szCs w:val="20"/>
-                              </w:rPr>
-                              <w:br/>
-                            </w:r>
-                            <w:r>
-                              <w:rPr>
-                                <w:i/>
-                                <w:iCs/>
-                                <w:sz w:val="20"/>
-                                <w:szCs w:val="20"/>
-                              </w:rPr>
-                              <w:t>160</w:t>
-                            </w:r>
-                            <w:r>
-                              <w:rPr>
-                                <w:sz w:val="20"/>
-                                <w:szCs w:val="20"/>
-                              </w:rPr>
-                              <w:t xml:space="preserve"> GOTO </w:t>
-                            </w:r>
-                            <w:r>
-                              <w:rPr>
-                                <w:i/>
-                                <w:iCs/>
-                                <w:sz w:val="20"/>
-                                <w:szCs w:val="20"/>
-                              </w:rPr>
-                              <w:t>150</w:t>
-                            </w:r>
-                            <w:r>
-                              <w:rPr>
-                                <w:i/>
-                                <w:iCs/>
-                                <w:sz w:val="20"/>
-                                <w:szCs w:val="20"/>
-                              </w:rPr>
-                              <w:br/>
-                              <w:t>320</w:t>
-                            </w:r>
-                            <w:r>
-                              <w:rPr>
-                                <w:sz w:val="20"/>
-                                <w:szCs w:val="20"/>
-                              </w:rPr>
-                              <w:t xml:space="preserve"> POKE Y,Z</w:t>
-                            </w:r>
-                            <w:r>
-                              <w:rPr>
-                                <w:sz w:val="20"/>
-                                <w:szCs w:val="20"/>
-                              </w:rPr>
-                              <w:br/>
-                            </w:r>
-                            <w:r>
-                              <w:rPr>
-                                <w:i/>
-                                <w:iCs/>
-                                <w:sz w:val="20"/>
-                                <w:szCs w:val="20"/>
-                              </w:rPr>
-                              <w:t>500</w:t>
-                            </w:r>
-                            <w:r>
-                              <w:rPr>
-                                <w:sz w:val="20"/>
-                                <w:szCs w:val="20"/>
-                              </w:rPr>
-                              <w:t xml:space="preserve"> POKE </w:t>
-                            </w:r>
-                            <w:r>
-                              <w:rPr>
-                                <w:i/>
-                                <w:iCs/>
-                                <w:sz w:val="20"/>
-                                <w:szCs w:val="20"/>
-                              </w:rPr>
-                              <w:t>53248</w:t>
-                            </w:r>
-                            <w:r>
-                              <w:rPr>
-                                <w:sz w:val="20"/>
-                                <w:szCs w:val="20"/>
-                              </w:rPr>
-                              <w:t xml:space="preserve">,X        :REM </w:t>
-                            </w:r>
-                            <w:r>
-                              <w:rPr>
-                                <w:i/>
-                                <w:iCs/>
-                                <w:sz w:val="20"/>
-                                <w:szCs w:val="20"/>
-                              </w:rPr>
-                              <w:t xml:space="preserve">53248 </w:t>
-                            </w:r>
-                            <w:r>
-                              <w:rPr>
-                                <w:sz w:val="20"/>
-                                <w:szCs w:val="20"/>
-                              </w:rPr>
-                              <w:t xml:space="preserve">HPOSP0 (W) Horizontal position of player </w:t>
-                            </w:r>
-                            <w:r>
-                              <w:rPr>
-                                <w:i/>
-                                <w:iCs/>
-                                <w:sz w:val="20"/>
-                                <w:szCs w:val="20"/>
-                              </w:rPr>
-                              <w:t>0</w:t>
-                            </w:r>
-                            <w:r>
-                              <w:rPr>
-                                <w:i/>
-                                <w:iCs/>
-                                <w:sz w:val="20"/>
-                                <w:szCs w:val="20"/>
-                              </w:rPr>
-                              <w:br/>
-                              <w:t xml:space="preserve">510 </w:t>
-                            </w:r>
-                            <w:r>
-                              <w:rPr>
-                                <w:sz w:val="20"/>
-                                <w:szCs w:val="20"/>
-                              </w:rPr>
-                              <w:t>RETURN</w:t>
-                            </w:r>
-                            <w:r>
-                              <w:rPr>
-                                <w:sz w:val="20"/>
-                                <w:szCs w:val="20"/>
-                              </w:rPr>
-                              <w:br/>
-                            </w:r>
-                            <w:r>
-                              <w:rPr>
-                                <w:i/>
-                                <w:iCs/>
-                                <w:sz w:val="20"/>
-                                <w:szCs w:val="20"/>
-                              </w:rPr>
-                              <w:t>600</w:t>
-                            </w:r>
-                            <w:r>
-                              <w:rPr>
-                                <w:sz w:val="20"/>
-                                <w:szCs w:val="20"/>
-                              </w:rPr>
-                              <w:t xml:space="preserve"> DATA </w:t>
-                            </w:r>
-                            <w:r>
-                              <w:rPr>
-                                <w:i/>
-                                <w:iCs/>
-                                <w:sz w:val="20"/>
-                                <w:szCs w:val="20"/>
-                              </w:rPr>
-                              <w:t>128</w:t>
-                            </w:r>
-                            <w:r>
-                              <w:rPr>
-                                <w:sz w:val="20"/>
-                                <w:szCs w:val="20"/>
-                              </w:rPr>
-                              <w:t>,</w:t>
-                            </w:r>
-                            <w:r>
-                              <w:rPr>
-                                <w:i/>
-                                <w:iCs/>
-                                <w:sz w:val="20"/>
-                                <w:szCs w:val="20"/>
-                              </w:rPr>
-                              <w:t>6</w:t>
-                            </w:r>
-                            <w:r>
-                              <w:rPr>
-                                <w:i/>
-                                <w:iCs/>
-                                <w:sz w:val="20"/>
-                                <w:szCs w:val="20"/>
-                              </w:rPr>
-                              <w:t>4</w:t>
-                            </w:r>
-                            <w:r>
-                              <w:rPr>
-                                <w:sz w:val="20"/>
-                                <w:szCs w:val="20"/>
-                              </w:rPr>
-                              <w:t>,</w:t>
-                            </w:r>
-                            <w:r>
-                              <w:rPr>
-                                <w:i/>
-                                <w:iCs/>
-                                <w:sz w:val="20"/>
-                                <w:szCs w:val="20"/>
-                              </w:rPr>
-                              <w:t>44</w:t>
-                            </w:r>
-                            <w:r>
-                              <w:rPr>
-                                <w:sz w:val="20"/>
-                                <w:szCs w:val="20"/>
-                              </w:rPr>
-                              <w:t>,</w:t>
-                            </w:r>
-                            <w:r>
-                              <w:rPr>
-                                <w:i/>
-                                <w:iCs/>
-                                <w:sz w:val="20"/>
-                                <w:szCs w:val="20"/>
-                              </w:rPr>
-                              <w:t>18</w:t>
-                            </w:r>
-                            <w:r>
-                              <w:rPr>
-                                <w:sz w:val="20"/>
-                                <w:szCs w:val="20"/>
-                              </w:rPr>
-                              <w:t>,</w:t>
-                            </w:r>
-                            <w:r>
-                              <w:rPr>
-                                <w:i/>
-                                <w:iCs/>
-                                <w:sz w:val="20"/>
-                                <w:szCs w:val="20"/>
-                              </w:rPr>
-                              <w:t>18</w:t>
-                            </w:r>
-                            <w:r>
-                              <w:rPr>
-                                <w:sz w:val="20"/>
-                                <w:szCs w:val="20"/>
-                              </w:rPr>
-                              <w:t>,</w:t>
-                            </w:r>
-                            <w:r>
-                              <w:rPr>
-                                <w:i/>
-                                <w:iCs/>
-                                <w:sz w:val="20"/>
-                                <w:szCs w:val="20"/>
-                              </w:rPr>
-                              <w:t>127</w:t>
-                            </w:r>
-                            <w:r>
-                              <w:rPr>
-                                <w:i/>
-                                <w:iCs/>
-                                <w:sz w:val="20"/>
-                                <w:szCs w:val="20"/>
-                              </w:rPr>
-                              <w:br/>
-                              <w:t>610</w:t>
-                            </w:r>
-                            <w:r>
-                              <w:rPr>
-                                <w:sz w:val="20"/>
-                                <w:szCs w:val="20"/>
-                              </w:rPr>
-                              <w:t xml:space="preserve"> DATA </w:t>
-                            </w:r>
-                            <w:r>
-                              <w:rPr>
-                                <w:i/>
-                                <w:iCs/>
-                                <w:sz w:val="20"/>
-                                <w:szCs w:val="20"/>
-                              </w:rPr>
-                              <w:t>126</w:t>
-                            </w:r>
-                            <w:r>
-                              <w:rPr>
-                                <w:sz w:val="20"/>
-                                <w:szCs w:val="20"/>
-                              </w:rPr>
-                              <w:t>,</w:t>
-                            </w:r>
-                            <w:r>
-                              <w:rPr>
-                                <w:i/>
-                                <w:iCs/>
-                                <w:sz w:val="20"/>
-                                <w:szCs w:val="20"/>
-                              </w:rPr>
-                              <w:t>60</w:t>
-                            </w:r>
-                            <w:r>
-                              <w:rPr>
-                                <w:sz w:val="20"/>
-                                <w:szCs w:val="20"/>
-                              </w:rPr>
-                              <w:t>,</w:t>
-                            </w:r>
-                            <w:r>
-                              <w:rPr>
-                                <w:i/>
-                                <w:iCs/>
-                                <w:sz w:val="20"/>
-                                <w:szCs w:val="20"/>
-                              </w:rPr>
-                              <w:t>195</w:t>
-                            </w:r>
-                            <w:r>
-                              <w:rPr>
-                                <w:sz w:val="20"/>
-                                <w:szCs w:val="20"/>
-                              </w:rPr>
-                              <w:t>,</w:t>
-                            </w:r>
-                            <w:r>
-                              <w:rPr>
-                                <w:i/>
-                                <w:iCs/>
-                                <w:sz w:val="20"/>
-                                <w:szCs w:val="20"/>
-                              </w:rPr>
-                              <w:t>153</w:t>
-                            </w:r>
-                            <w:r>
-                              <w:rPr>
-                                <w:sz w:val="20"/>
-                                <w:szCs w:val="20"/>
-                              </w:rPr>
-                              <w:t>,</w:t>
-                            </w:r>
-                            <w:r>
-                              <w:rPr>
-                                <w:i/>
-                                <w:iCs/>
-                                <w:sz w:val="20"/>
-                                <w:szCs w:val="20"/>
-                              </w:rPr>
-                              <w:t>195</w:t>
-                            </w:r>
-                            <w:r>
-                              <w:rPr>
-                                <w:sz w:val="20"/>
-                                <w:szCs w:val="20"/>
-                              </w:rPr>
-                              <w:t>,</w:t>
-                            </w:r>
-                            <w:r>
-                              <w:rPr>
-                                <w:i/>
-                                <w:iCs/>
-                                <w:sz w:val="20"/>
-                                <w:szCs w:val="20"/>
-                              </w:rPr>
-                              <w:t>60</w:t>
-                            </w:r>
-                            <w:r>
-                              <w:rPr>
-                                <w:i/>
-                                <w:iCs/>
-                                <w:sz w:val="20"/>
-                                <w:szCs w:val="20"/>
-                              </w:rPr>
-                              <w:br/>
-                              <w:t>620</w:t>
-                            </w:r>
-                            <w:r>
-                              <w:rPr>
-                                <w:sz w:val="20"/>
-                                <w:szCs w:val="20"/>
-                              </w:rPr>
-                              <w:t xml:space="preserve"> DATA </w:t>
-                            </w:r>
-                            <w:r>
-                              <w:rPr>
-                                <w:i/>
-                                <w:iCs/>
-                                <w:sz w:val="20"/>
-                                <w:szCs w:val="20"/>
-                              </w:rPr>
-                              <w:t>0</w:t>
-                            </w:r>
-                            <w:r>
-                              <w:rPr>
-                                <w:sz w:val="20"/>
-                                <w:szCs w:val="20"/>
-                              </w:rPr>
-                              <w:t>,</w:t>
-                            </w:r>
-                            <w:r>
-                              <w:rPr>
-                                <w:i/>
-                                <w:iCs/>
-                                <w:sz w:val="20"/>
-                                <w:szCs w:val="20"/>
-                              </w:rPr>
-                              <w:t>0</w:t>
-                            </w:r>
-                            <w:r>
-                              <w:rPr>
-                                <w:sz w:val="20"/>
-                                <w:szCs w:val="20"/>
-                              </w:rPr>
-                              <w:t>,</w:t>
-                            </w:r>
-                            <w:r>
-                              <w:rPr>
-                                <w:i/>
-                                <w:iCs/>
-                                <w:sz w:val="20"/>
-                                <w:szCs w:val="20"/>
-                              </w:rPr>
-                              <w:t>0</w:t>
-                            </w:r>
-                            <w:r>
-                              <w:rPr>
-                                <w:sz w:val="20"/>
-                                <w:szCs w:val="20"/>
-                              </w:rPr>
-                              <w:t>,</w:t>
-                            </w:r>
-                            <w:r>
-                              <w:rPr>
-                                <w:i/>
-                                <w:iCs/>
-                                <w:sz w:val="20"/>
-                                <w:szCs w:val="20"/>
-                              </w:rPr>
-                              <w:t>0</w:t>
-                            </w:r>
-                            <w:r>
-                              <w:rPr>
-                                <w:sz w:val="20"/>
-                                <w:szCs w:val="20"/>
-                              </w:rPr>
-                              <w:t>,</w:t>
-                            </w:r>
-                            <w:r>
-                              <w:rPr>
-                                <w:i/>
-                                <w:iCs/>
-                                <w:sz w:val="20"/>
-                                <w:szCs w:val="20"/>
-                              </w:rPr>
-                              <w:t>0</w:t>
-                            </w:r>
-                            <w:r>
-                              <w:rPr>
-                                <w:sz w:val="20"/>
-                                <w:szCs w:val="20"/>
-                              </w:rPr>
-                              <w:t>,</w:t>
-                            </w:r>
-                            <w:r>
-                              <w:rPr>
-                                <w:i/>
-                                <w:iCs/>
-                                <w:sz w:val="20"/>
-                                <w:szCs w:val="20"/>
-                              </w:rPr>
-                              <w:t>0</w:t>
+                              <w:t>620 DATA 60,0,0,0,0,0</w:t>
                             </w:r>
                           </w:p>
                           <w:p>
                             <w:pPr>
                               <w:rPr>
-                                <w:sz w:val="20"/>
-                                <w:szCs w:val="20"/>
+                                <w:sz w:val="16"/>
+                                <w:szCs w:val="16"/>
                               </w:rPr>
                             </w:pPr>
                           </w:p>
@@ -2283,62 +1362,127 @@
                     <w:p>
                       <w:pPr>
                         <w:rPr>
-                          <w:sz w:val="20"/>
-                          <w:szCs w:val="20"/>
+                          <w:i/>
+                          <w:iCs/>
+                          <w:sz w:val="16"/>
+                          <w:szCs w:val="16"/>
                         </w:rPr>
                       </w:pPr>
                       <w:r>
                         <w:rPr>
                           <w:i/>
                           <w:iCs/>
-                          <w:sz w:val="20"/>
-                          <w:szCs w:val="20"/>
+                          <w:sz w:val="16"/>
+                          <w:szCs w:val="16"/>
                         </w:rPr>
-                        <w:t>10</w:t>
-                      </w:r>
-                      <w:r>
-                        <w:rPr>
-                          <w:sz w:val="20"/>
-                          <w:szCs w:val="20"/>
-                        </w:rPr>
-                        <w:t xml:space="preserve"> DIM A$(</w:t>
+                        <w:t>10 GRAPHICS 8</w:t>
                       </w:r>
                       <w:r>
                         <w:rPr>
                           <w:i/>
                           <w:iCs/>
-                          <w:sz w:val="20"/>
-                          <w:szCs w:val="20"/>
+                          <w:sz w:val="16"/>
+                          <w:szCs w:val="16"/>
                         </w:rPr>
-                        <w:t>10</w:t>
-                      </w:r>
-                      <w:r>
-                        <w:rPr>
-                          <w:sz w:val="20"/>
-                          <w:szCs w:val="20"/>
-                        </w:rPr>
-                        <w:t>),B$(</w:t>
+                        <w:br/>
+                        <w:t>20 POKE 559,62          :REM SDMCTL Direct Memory Access (DMA) enable</w:t>
                       </w:r>
                       <w:r>
                         <w:rPr>
                           <w:i/>
                           <w:iCs/>
-                          <w:sz w:val="20"/>
-                          <w:szCs w:val="20"/>
+                          <w:sz w:val="16"/>
+                          <w:szCs w:val="16"/>
                         </w:rPr>
-                        <w:t>100</w:t>
+                        <w:br/>
+                        <w:t>30 POKE 53248,20       :REM 53248 HPOSP0 (W) Horizontal position of player 0</w:t>
                       </w:r>
                       <w:r>
                         <w:rPr>
-                          <w:sz w:val="20"/>
-                          <w:szCs w:val="20"/>
+                          <w:i/>
+                          <w:iCs/>
+                          <w:sz w:val="16"/>
+                          <w:szCs w:val="16"/>
                         </w:rPr>
-                        <w:t>)</w:t>
+                        <w:br/>
+                        <w:t>40 WHT=15</w:t>
                       </w:r>
                       <w:r>
                         <w:rPr>
-                          <w:sz w:val="20"/>
-                          <w:szCs w:val="20"/>
+                          <w:i/>
+                          <w:iCs/>
+                          <w:sz w:val="16"/>
+                          <w:szCs w:val="16"/>
+                        </w:rPr>
+                        <w:br/>
+                        <w:t xml:space="preserve">50 POKE 704,WHT         :REM Locations 704 to 712 ($2C0 to $2C8) are the color registers for players, </w:t>
+                      </w:r>
+                      <w:proofErr w:type="spellStart"/>
+                      <w:r>
+                        <w:rPr>
+                          <w:i/>
+                          <w:iCs/>
+                          <w:sz w:val="16"/>
+                          <w:szCs w:val="16"/>
+                        </w:rPr>
+                        <w:t>missiles,and</w:t>
+                      </w:r>
+                      <w:proofErr w:type="spellEnd"/>
+                      <w:r>
+                        <w:rPr>
+                          <w:i/>
+                          <w:iCs/>
+                          <w:sz w:val="16"/>
+                          <w:szCs w:val="16"/>
+                        </w:rPr>
+                        <w:t xml:space="preserve"> playfields</w:t>
+                      </w:r>
+                      <w:r>
+                        <w:rPr>
+                          <w:i/>
+                          <w:iCs/>
+                          <w:sz w:val="16"/>
+                          <w:szCs w:val="16"/>
+                        </w:rPr>
+                        <w:br/>
+                        <w:t>60 I=PEEK(106)-8        :REM RAMTOP - RAM size, defined by powerup</w:t>
+                      </w:r>
+                      <w:r>
+                        <w:rPr>
+                          <w:i/>
+                          <w:iCs/>
+                          <w:sz w:val="16"/>
+                          <w:szCs w:val="16"/>
+                        </w:rPr>
+                        <w:br/>
+                        <w:t>70 POKE 54279,I         :REM CONSOL (W/R) Used to see if one of the three yellow console buttons has been pressed (not the RESET button!).</w:t>
+                      </w:r>
+                      <w:r>
+                        <w:rPr>
+                          <w:i/>
+                          <w:iCs/>
+                          <w:sz w:val="16"/>
+                          <w:szCs w:val="16"/>
+                        </w:rPr>
+                        <w:br/>
+                        <w:t>80 POKE 53277,3         :REM GRACTL (W) Used to turn on players and to turn on missiles.</w:t>
+                      </w:r>
+                      <w:r>
+                        <w:rPr>
+                          <w:i/>
+                          <w:iCs/>
+                          <w:sz w:val="16"/>
+                          <w:szCs w:val="16"/>
+                        </w:rPr>
+                        <w:br/>
+                        <w:t>90 POKE 53256,3         :REM SIZEP0 (W) Size of player 0.</w:t>
+                      </w:r>
+                      <w:r>
+                        <w:rPr>
+                          <w:i/>
+                          <w:iCs/>
+                          <w:sz w:val="16"/>
+                          <w:szCs w:val="16"/>
                         </w:rPr>
                         <w:br/>
                       </w:r>
@@ -2346,80 +1490,48 @@
                         <w:rPr>
                           <w:i/>
                           <w:iCs/>
-                          <w:sz w:val="20"/>
-                          <w:szCs w:val="20"/>
+                          <w:sz w:val="16"/>
+                          <w:szCs w:val="16"/>
                         </w:rPr>
-                        <w:t>20</w:t>
-                      </w:r>
-                      <w:r>
-                        <w:rPr>
-                          <w:sz w:val="20"/>
-                          <w:szCs w:val="20"/>
-                        </w:rPr>
-                        <w:t xml:space="preserve"> GRAPHICS </w:t>
+                        <w:br/>
+                        <w:t>100 REM DRAW 10 LINES (BACKGROUND)</w:t>
                       </w:r>
                       <w:r>
                         <w:rPr>
                           <w:i/>
                           <w:iCs/>
-                          <w:sz w:val="20"/>
-                          <w:szCs w:val="20"/>
+                          <w:sz w:val="16"/>
+                          <w:szCs w:val="16"/>
                         </w:rPr>
-                        <w:t>8</w:t>
+                        <w:br/>
+                        <w:t>110 FOR A = 70 TO 100 STEP 3</w:t>
                       </w:r>
                       <w:r>
                         <w:rPr>
                           <w:i/>
                           <w:iCs/>
-                          <w:sz w:val="20"/>
-                          <w:szCs w:val="20"/>
+                          <w:sz w:val="16"/>
+                          <w:szCs w:val="16"/>
                         </w:rPr>
                         <w:br/>
-                        <w:t>30</w:t>
-                      </w:r>
-                      <w:r>
-                        <w:rPr>
-                          <w:sz w:val="20"/>
-                          <w:szCs w:val="20"/>
-                        </w:rPr>
-                        <w:t xml:space="preserve"> POKE </w:t>
+                        <w:t>120 COLOR 1: PLOT 100,A: DRAWTO 315,A+20</w:t>
                       </w:r>
                       <w:r>
                         <w:rPr>
                           <w:i/>
                           <w:iCs/>
-                          <w:sz w:val="20"/>
-                          <w:szCs w:val="20"/>
+                          <w:sz w:val="16"/>
+                          <w:szCs w:val="16"/>
                         </w:rPr>
-                        <w:t>559</w:t>
-                      </w:r>
-                      <w:r>
-                        <w:rPr>
-                          <w:sz w:val="20"/>
-                          <w:szCs w:val="20"/>
-                        </w:rPr>
-                        <w:t>,</w:t>
+                        <w:br/>
+                        <w:t>130 NEXT A</w:t>
                       </w:r>
                       <w:r>
                         <w:rPr>
                           <w:i/>
                           <w:iCs/>
-                          <w:sz w:val="20"/>
-                          <w:szCs w:val="20"/>
-                        </w:rPr>
-                        <w:t>62</w:t>
-                      </w:r>
-                      <w:r>
-                        <w:rPr>
-                          <w:sz w:val="20"/>
-                          <w:szCs w:val="20"/>
-                        </w:rPr>
-                        <w:t xml:space="preserve">          :REM SDMCTL Direct Memory Access (DMA) enable</w:t>
-                      </w:r>
-                      <w:r>
-                        <w:rPr>
-                          <w:sz w:val="20"/>
-                          <w:szCs w:val="20"/>
+                          <w:sz w:val="16"/>
+                          <w:szCs w:val="16"/>
                         </w:rPr>
                         <w:br/>
                       </w:r>
@@ -2427,176 +1539,108 @@
                         <w:rPr>
                           <w:i/>
                           <w:iCs/>
-                          <w:sz w:val="20"/>
-                          <w:szCs w:val="20"/>
+                          <w:sz w:val="16"/>
+                          <w:szCs w:val="16"/>
                         </w:rPr>
-                        <w:t>40</w:t>
-                      </w:r>
-                      <w:r>
-                        <w:rPr>
-                          <w:sz w:val="20"/>
-                          <w:szCs w:val="20"/>
-                        </w:rPr>
-                        <w:t xml:space="preserve"> POKE </w:t>
+                        <w:br/>
+                        <w:t>200 J=I*256+1024</w:t>
                       </w:r>
                       <w:r>
                         <w:rPr>
                           <w:i/>
                           <w:iCs/>
-                          <w:sz w:val="20"/>
-                          <w:szCs w:val="20"/>
+                          <w:sz w:val="16"/>
+                          <w:szCs w:val="16"/>
                         </w:rPr>
-                        <w:t>53248</w:t>
-                      </w:r>
-                      <w:r>
-                        <w:rPr>
-                          <w:sz w:val="20"/>
-                          <w:szCs w:val="20"/>
-                        </w:rPr>
-                        <w:t>,</w:t>
+                        <w:br/>
+                        <w:t>210 FOR Y=J+120 TO J+137</w:t>
                       </w:r>
                       <w:r>
                         <w:rPr>
                           <w:i/>
                           <w:iCs/>
-                          <w:sz w:val="20"/>
-                          <w:szCs w:val="20"/>
+                          <w:sz w:val="16"/>
+                          <w:szCs w:val="16"/>
                         </w:rPr>
-                        <w:t>120</w:t>
-                      </w:r>
-                      <w:r>
-                        <w:rPr>
-                          <w:sz w:val="20"/>
-                          <w:szCs w:val="20"/>
-                        </w:rPr>
-                        <w:t xml:space="preserve">       :REM </w:t>
+                        <w:br/>
+                        <w:t>220 READ Z</w:t>
                       </w:r>
                       <w:r>
                         <w:rPr>
                           <w:i/>
                           <w:iCs/>
-                          <w:sz w:val="20"/>
-                          <w:szCs w:val="20"/>
+                          <w:sz w:val="16"/>
+                          <w:szCs w:val="16"/>
                         </w:rPr>
-                        <w:t xml:space="preserve">53248 </w:t>
-                      </w:r>
-                      <w:r>
-                        <w:rPr>
-                          <w:sz w:val="20"/>
-                          <w:szCs w:val="20"/>
-                        </w:rPr>
-                        <w:t xml:space="preserve">HPOSP0 (W) Horizontal position of player </w:t>
+                        <w:br/>
+                        <w:t>230 POKE Y,Z</w:t>
                       </w:r>
                       <w:r>
                         <w:rPr>
                           <w:i/>
                           <w:iCs/>
-                          <w:sz w:val="20"/>
-                          <w:szCs w:val="20"/>
+                          <w:sz w:val="16"/>
+                          <w:szCs w:val="16"/>
                         </w:rPr>
-                        <w:t>0</w:t>
+                        <w:br/>
+                        <w:t>240 NEXT Y</w:t>
                       </w:r>
                       <w:r>
                         <w:rPr>
                           <w:i/>
                           <w:iCs/>
-                          <w:sz w:val="20"/>
-                          <w:szCs w:val="20"/>
+                          <w:sz w:val="16"/>
+                          <w:szCs w:val="16"/>
                         </w:rPr>
                         <w:br/>
-                        <w:t>50</w:t>
-                      </w:r>
-                      <w:r>
-                        <w:rPr>
-                          <w:sz w:val="20"/>
-                          <w:szCs w:val="20"/>
-                        </w:rPr>
-                        <w:t xml:space="preserve"> POKE </w:t>
+                        <w:t>250 FOR X=221 TO 48 STEP -1:GOSUB 500:NEXT X</w:t>
                       </w:r>
                       <w:r>
                         <w:rPr>
                           <w:i/>
                           <w:iCs/>
-                          <w:sz w:val="20"/>
-                          <w:szCs w:val="20"/>
+                          <w:sz w:val="16"/>
+                          <w:szCs w:val="16"/>
                         </w:rPr>
-                        <w:t>704</w:t>
-                      </w:r>
-                      <w:r>
-                        <w:rPr>
-                          <w:sz w:val="20"/>
-                          <w:szCs w:val="20"/>
-                        </w:rPr>
-                        <w:t>,</w:t>
+                        <w:br/>
+                        <w:t>260 GOTO 250</w:t>
                       </w:r>
                       <w:r>
                         <w:rPr>
                           <w:i/>
                           <w:iCs/>
-                          <w:sz w:val="20"/>
-                          <w:szCs w:val="20"/>
+                          <w:sz w:val="16"/>
+                          <w:szCs w:val="16"/>
                         </w:rPr>
-                        <w:t>88</w:t>
-                      </w:r>
-                      <w:r>
-                        <w:rPr>
-                          <w:sz w:val="20"/>
-                          <w:szCs w:val="20"/>
-                        </w:rPr>
-                        <w:t xml:space="preserve">          :REM Locations </w:t>
+                        <w:br/>
+                        <w:t>320 POKE Y,Z</w:t>
                       </w:r>
                       <w:r>
                         <w:rPr>
                           <w:i/>
                           <w:iCs/>
-                          <w:sz w:val="20"/>
-                          <w:szCs w:val="20"/>
+                          <w:sz w:val="16"/>
+                          <w:szCs w:val="16"/>
                         </w:rPr>
-                        <w:t xml:space="preserve">704 </w:t>
-                      </w:r>
-                      <w:r>
-                        <w:rPr>
-                          <w:sz w:val="20"/>
-                          <w:szCs w:val="20"/>
-                        </w:rPr>
-                        <w:t xml:space="preserve">to </w:t>
+                        <w:br/>
+                        <w:t>500 POKE 53248,X        :REM 53248 HPOSP0 (W) Horizontal position of player 0</w:t>
                       </w:r>
                       <w:r>
                         <w:rPr>
                           <w:i/>
                           <w:iCs/>
-                          <w:sz w:val="20"/>
-                          <w:szCs w:val="20"/>
+                          <w:sz w:val="16"/>
+                          <w:szCs w:val="16"/>
                         </w:rPr>
-                        <w:t xml:space="preserve">712 </w:t>
+                        <w:br/>
+                        <w:t>510 RETURN</w:t>
                       </w:r>
                       <w:r>
                         <w:rPr>
-                          <w:sz w:val="20"/>
-                          <w:szCs w:val="20"/>
-                        </w:rPr>
-                        <w:t xml:space="preserve">($2C0 to $2C8) are the color registers for players, </w:t>
-                      </w:r>
-                      <w:proofErr w:type="spellStart"/>
-                      <w:r>
-                        <w:rPr>
-                          <w:sz w:val="20"/>
-                          <w:szCs w:val="20"/>
-                        </w:rPr>
-                        <w:t>missiles,and</w:t>
-                      </w:r>
-                      <w:proofErr w:type="spellEnd"/>
-                      <w:r>
-                        <w:rPr>
-                          <w:sz w:val="20"/>
-                          <w:szCs w:val="20"/>
-                        </w:rPr>
-                        <w:t xml:space="preserve"> playfields</w:t>
-                      </w:r>
-                      <w:r>
-                        <w:rPr>
-                          <w:sz w:val="20"/>
-                          <w:szCs w:val="20"/>
+                          <w:i/>
+                          <w:iCs/>
+                          <w:sz w:val="16"/>
+                          <w:szCs w:val="16"/>
                         </w:rPr>
                         <w:br/>
                       </w:r>
@@ -2604,924 +1648,38 @@
                         <w:rPr>
                           <w:i/>
                           <w:iCs/>
-                          <w:sz w:val="20"/>
-                          <w:szCs w:val="20"/>
+                          <w:sz w:val="16"/>
+                          <w:szCs w:val="16"/>
                         </w:rPr>
-                        <w:t xml:space="preserve">60 </w:t>
-                      </w:r>
-                      <w:r>
-                        <w:rPr>
-                          <w:sz w:val="20"/>
-                          <w:szCs w:val="20"/>
-                        </w:rPr>
-                        <w:t>I=PEEK(</w:t>
+                        <w:br/>
+                        <w:t>600 DATA 128,64,44,18,18,18</w:t>
                       </w:r>
                       <w:r>
                         <w:rPr>
                           <w:i/>
                           <w:iCs/>
-                          <w:sz w:val="20"/>
-                          <w:szCs w:val="20"/>
+                          <w:sz w:val="16"/>
+                          <w:szCs w:val="16"/>
                         </w:rPr>
-                        <w:t>106</w:t>
-                      </w:r>
-                      <w:r>
-                        <w:rPr>
-                          <w:sz w:val="20"/>
-                          <w:szCs w:val="20"/>
-                        </w:rPr>
-                        <w:t>)</w:t>
+                        <w:br/>
+                        <w:t>610 DATA 127,129,60,195,153,195</w:t>
                       </w:r>
                       <w:r>
                         <w:rPr>
                           <w:i/>
                           <w:iCs/>
-                          <w:sz w:val="20"/>
-                          <w:szCs w:val="20"/>
-                        </w:rPr>
-                        <w:t>-8</w:t>
-                      </w:r>
-                      <w:r>
-                        <w:rPr>
-                          <w:sz w:val="20"/>
-                          <w:szCs w:val="20"/>
-                        </w:rPr>
-                        <w:t xml:space="preserve">        :REM RAMTOP - RAM size, defined by powerup</w:t>
-                      </w:r>
-                      <w:r>
-                        <w:rPr>
-                          <w:sz w:val="20"/>
-                          <w:szCs w:val="20"/>
+                          <w:sz w:val="16"/>
+                          <w:szCs w:val="16"/>
                         </w:rPr>
                         <w:br/>
-                      </w:r>
-                      <w:r>
-                        <w:rPr>
-                          <w:i/>
-                          <w:iCs/>
-                          <w:sz w:val="20"/>
-                          <w:szCs w:val="20"/>
-                        </w:rPr>
-                        <w:t>70</w:t>
-                      </w:r>
-                      <w:r>
-                        <w:rPr>
-                          <w:sz w:val="20"/>
-                          <w:szCs w:val="20"/>
-                        </w:rPr>
-                        <w:t xml:space="preserve"> POKE </w:t>
-                      </w:r>
-                      <w:r>
-                        <w:rPr>
-                          <w:i/>
-                          <w:iCs/>
-                          <w:sz w:val="20"/>
-                          <w:szCs w:val="20"/>
-                        </w:rPr>
-                        <w:t>54279</w:t>
-                      </w:r>
-                      <w:r>
-                        <w:rPr>
-                          <w:sz w:val="20"/>
-                          <w:szCs w:val="20"/>
-                        </w:rPr>
-                        <w:t xml:space="preserve">,I         :REM CONSOL (W/R) Used to see if one of the three yellow console buttons has </w:t>
-                      </w:r>
-                      <w:r>
-                        <w:rPr>
-                          <w:i/>
-                          <w:iCs/>
-                          <w:sz w:val="20"/>
-                          <w:szCs w:val="20"/>
-                        </w:rPr>
-                        <w:t xml:space="preserve">been </w:t>
-                      </w:r>
-                      <w:r>
-                        <w:rPr>
-                          <w:sz w:val="20"/>
-                          <w:szCs w:val="20"/>
-                        </w:rPr>
-                        <w:t>pressed (not the RESET button!).</w:t>
-                      </w:r>
-                      <w:r>
-                        <w:rPr>
-                          <w:sz w:val="20"/>
-                          <w:szCs w:val="20"/>
-                        </w:rPr>
-                        <w:br/>
-                      </w:r>
-                      <w:r>
-                        <w:rPr>
-                          <w:i/>
-                          <w:iCs/>
-                          <w:sz w:val="20"/>
-                          <w:szCs w:val="20"/>
-                        </w:rPr>
-                        <w:t>80</w:t>
-                      </w:r>
-                      <w:r>
-                        <w:rPr>
-                          <w:sz w:val="20"/>
-                          <w:szCs w:val="20"/>
-                        </w:rPr>
-                        <w:t xml:space="preserve"> POKE </w:t>
-                      </w:r>
-                      <w:r>
-                        <w:rPr>
-                          <w:i/>
-                          <w:iCs/>
-                          <w:sz w:val="20"/>
-                          <w:szCs w:val="20"/>
-                        </w:rPr>
-                        <w:t>53277</w:t>
-                      </w:r>
-                      <w:r>
-                        <w:rPr>
-                          <w:sz w:val="20"/>
-                          <w:szCs w:val="20"/>
-                        </w:rPr>
-                        <w:t>,</w:t>
-                      </w:r>
-                      <w:r>
-                        <w:rPr>
-                          <w:i/>
-                          <w:iCs/>
-                          <w:sz w:val="20"/>
-                          <w:szCs w:val="20"/>
-                        </w:rPr>
-                        <w:t>3</w:t>
-                      </w:r>
-                      <w:r>
-                        <w:rPr>
-                          <w:sz w:val="20"/>
-                          <w:szCs w:val="20"/>
-                        </w:rPr>
-                        <w:t xml:space="preserve">         :REM GRACTL (W) Used to turn on players and to turn on missiles.</w:t>
-                      </w:r>
-                      <w:r>
-                        <w:rPr>
-                          <w:sz w:val="20"/>
-                          <w:szCs w:val="20"/>
-                        </w:rPr>
-                        <w:br/>
-                      </w:r>
-                      <w:r>
-                        <w:rPr>
-                          <w:i/>
-                          <w:iCs/>
-                          <w:sz w:val="20"/>
-                          <w:szCs w:val="20"/>
-                        </w:rPr>
-                        <w:t>90</w:t>
-                      </w:r>
-                      <w:r>
-                        <w:rPr>
-                          <w:sz w:val="20"/>
-                          <w:szCs w:val="20"/>
-                        </w:rPr>
-                        <w:t xml:space="preserve"> POKE </w:t>
-                      </w:r>
-                      <w:r>
-                        <w:rPr>
-                          <w:i/>
-                          <w:iCs/>
-                          <w:sz w:val="20"/>
-                          <w:szCs w:val="20"/>
-                        </w:rPr>
-                        <w:t>53256</w:t>
-                      </w:r>
-                      <w:r>
-                        <w:rPr>
-                          <w:sz w:val="20"/>
-                          <w:szCs w:val="20"/>
-                        </w:rPr>
-                        <w:t>,</w:t>
-                      </w:r>
-                      <w:r>
-                        <w:rPr>
-                          <w:i/>
-                          <w:iCs/>
-                          <w:sz w:val="20"/>
-                          <w:szCs w:val="20"/>
-                        </w:rPr>
-                        <w:t>3</w:t>
-                      </w:r>
-                      <w:r>
-                        <w:rPr>
-                          <w:sz w:val="20"/>
-                          <w:szCs w:val="20"/>
-                        </w:rPr>
-                        <w:t xml:space="preserve">         :REM SIZEP0 (W) Size of player </w:t>
-                      </w:r>
-                      <w:r>
-                        <w:rPr>
-                          <w:i/>
-                          <w:iCs/>
-                          <w:sz w:val="20"/>
-                          <w:szCs w:val="20"/>
-                        </w:rPr>
-                        <w:t>0</w:t>
-                      </w:r>
-                      <w:r>
-                        <w:rPr>
-                          <w:sz w:val="20"/>
-                          <w:szCs w:val="20"/>
-                        </w:rPr>
-                        <w:t>.</w:t>
-                      </w:r>
-                      <w:r>
-                        <w:rPr>
-                          <w:sz w:val="20"/>
-                          <w:szCs w:val="20"/>
-                        </w:rPr>
-                        <w:br/>
-                      </w:r>
-                      <w:r>
-                        <w:rPr>
-                          <w:i/>
-                          <w:iCs/>
-                          <w:sz w:val="20"/>
-                          <w:szCs w:val="20"/>
-                        </w:rPr>
-                        <w:t xml:space="preserve">100 </w:t>
-                      </w:r>
-                      <w:r>
-                        <w:rPr>
-                          <w:sz w:val="20"/>
-                          <w:szCs w:val="20"/>
-                        </w:rPr>
-                        <w:t>J=I*</w:t>
-                      </w:r>
-                      <w:r>
-                        <w:rPr>
-                          <w:i/>
-                          <w:iCs/>
-                          <w:sz w:val="20"/>
-                          <w:szCs w:val="20"/>
-                        </w:rPr>
-                        <w:t>256</w:t>
-                      </w:r>
-                      <w:r>
-                        <w:rPr>
-                          <w:sz w:val="20"/>
-                          <w:szCs w:val="20"/>
-                        </w:rPr>
-                        <w:t>+</w:t>
-                      </w:r>
-                      <w:r>
-                        <w:rPr>
-                          <w:i/>
-                          <w:iCs/>
-                          <w:sz w:val="20"/>
-                          <w:szCs w:val="20"/>
-                        </w:rPr>
-                        <w:t>1024</w:t>
-                      </w:r>
-                      <w:r>
-                        <w:rPr>
-                          <w:i/>
-                          <w:iCs/>
-                          <w:sz w:val="20"/>
-                          <w:szCs w:val="20"/>
-                        </w:rPr>
-                        <w:br/>
-                        <w:t xml:space="preserve">110 </w:t>
-                      </w:r>
-                      <w:r>
-                        <w:rPr>
-                          <w:sz w:val="20"/>
-                          <w:szCs w:val="20"/>
-                        </w:rPr>
-                        <w:t>FOR Y=J+</w:t>
-                      </w:r>
-                      <w:r>
-                        <w:rPr>
-                          <w:i/>
-                          <w:iCs/>
-                          <w:sz w:val="20"/>
-                          <w:szCs w:val="20"/>
-                        </w:rPr>
-                        <w:t xml:space="preserve">120 </w:t>
-                      </w:r>
-                      <w:r>
-                        <w:rPr>
-                          <w:sz w:val="20"/>
-                          <w:szCs w:val="20"/>
-                        </w:rPr>
-                        <w:t>TO J+</w:t>
-                      </w:r>
-                      <w:r>
-                        <w:rPr>
-                          <w:i/>
-                          <w:iCs/>
-                          <w:sz w:val="20"/>
-                          <w:szCs w:val="20"/>
-                        </w:rPr>
-                        <w:t>137</w:t>
-                      </w:r>
-                      <w:r>
-                        <w:rPr>
-                          <w:i/>
-                          <w:iCs/>
-                          <w:sz w:val="20"/>
-                          <w:szCs w:val="20"/>
-                        </w:rPr>
-                        <w:br/>
-                        <w:t>120</w:t>
-                      </w:r>
-                      <w:r>
-                        <w:rPr>
-                          <w:sz w:val="20"/>
-                          <w:szCs w:val="20"/>
-                        </w:rPr>
-                        <w:t xml:space="preserve"> READ Z</w:t>
-                      </w:r>
-                      <w:r>
-                        <w:rPr>
-                          <w:sz w:val="20"/>
-                          <w:szCs w:val="20"/>
-                        </w:rPr>
-                        <w:br/>
-                      </w:r>
-                      <w:r>
-                        <w:rPr>
-                          <w:i/>
-                          <w:iCs/>
-                          <w:sz w:val="20"/>
-                          <w:szCs w:val="20"/>
-                        </w:rPr>
-                        <w:t>130</w:t>
-                      </w:r>
-                      <w:r>
-                        <w:rPr>
-                          <w:sz w:val="20"/>
-                          <w:szCs w:val="20"/>
-                        </w:rPr>
-                        <w:t xml:space="preserve"> POKE Y,Z</w:t>
-                      </w:r>
-                      <w:r>
-                        <w:rPr>
-                          <w:sz w:val="20"/>
-                          <w:szCs w:val="20"/>
-                        </w:rPr>
-                        <w:br/>
-                      </w:r>
-                      <w:r>
-                        <w:rPr>
-                          <w:i/>
-                          <w:iCs/>
-                          <w:sz w:val="20"/>
-                          <w:szCs w:val="20"/>
-                        </w:rPr>
-                        <w:t xml:space="preserve">140 </w:t>
-                      </w:r>
-                      <w:r>
-                        <w:rPr>
-                          <w:sz w:val="20"/>
-                          <w:szCs w:val="20"/>
-                        </w:rPr>
-                        <w:t>NEXT Y</w:t>
-                      </w:r>
-                      <w:r>
-                        <w:rPr>
-                          <w:sz w:val="20"/>
-                          <w:szCs w:val="20"/>
-                        </w:rPr>
-                        <w:br/>
-                      </w:r>
-                      <w:r>
-                        <w:rPr>
-                          <w:i/>
-                          <w:iCs/>
-                          <w:sz w:val="20"/>
-                          <w:szCs w:val="20"/>
-                        </w:rPr>
-                        <w:t xml:space="preserve">150 </w:t>
-                      </w:r>
-                      <w:r>
-                        <w:rPr>
-                          <w:sz w:val="20"/>
-                          <w:szCs w:val="20"/>
-                        </w:rPr>
-                        <w:t>FOR X=</w:t>
-                      </w:r>
-                      <w:r>
-                        <w:rPr>
-                          <w:i/>
-                          <w:iCs/>
-                          <w:sz w:val="20"/>
-                          <w:szCs w:val="20"/>
-                        </w:rPr>
-                        <w:t xml:space="preserve">48 </w:t>
-                      </w:r>
-                      <w:r>
-                        <w:rPr>
-                          <w:sz w:val="20"/>
-                          <w:szCs w:val="20"/>
-                        </w:rPr>
-                        <w:t xml:space="preserve">TO </w:t>
-                      </w:r>
-                      <w:r>
-                        <w:rPr>
-                          <w:i/>
-                          <w:iCs/>
-                          <w:sz w:val="20"/>
-                          <w:szCs w:val="20"/>
-                        </w:rPr>
-                        <w:t>221</w:t>
-                      </w:r>
-                      <w:r>
-                        <w:rPr>
-                          <w:sz w:val="20"/>
-                          <w:szCs w:val="20"/>
-                        </w:rPr>
-                        <w:t xml:space="preserve">:GOSUB </w:t>
-                      </w:r>
-                      <w:r>
-                        <w:rPr>
-                          <w:i/>
-                          <w:iCs/>
-                          <w:sz w:val="20"/>
-                          <w:szCs w:val="20"/>
-                        </w:rPr>
-                        <w:t>500</w:t>
-                      </w:r>
-                      <w:r>
-                        <w:rPr>
-                          <w:sz w:val="20"/>
-                          <w:szCs w:val="20"/>
-                        </w:rPr>
-                        <w:t>:NEXT X</w:t>
-                      </w:r>
-                      <w:r>
-                        <w:rPr>
-                          <w:sz w:val="20"/>
-                          <w:szCs w:val="20"/>
-                        </w:rPr>
-                        <w:br/>
-                      </w:r>
-                      <w:r>
-                        <w:rPr>
-                          <w:i/>
-                          <w:iCs/>
-                          <w:sz w:val="20"/>
-                          <w:szCs w:val="20"/>
-                        </w:rPr>
-                        <w:t>160</w:t>
-                      </w:r>
-                      <w:r>
-                        <w:rPr>
-                          <w:sz w:val="20"/>
-                          <w:szCs w:val="20"/>
-                        </w:rPr>
-                        <w:t xml:space="preserve"> GOTO </w:t>
-                      </w:r>
-                      <w:r>
-                        <w:rPr>
-                          <w:i/>
-                          <w:iCs/>
-                          <w:sz w:val="20"/>
-                          <w:szCs w:val="20"/>
-                        </w:rPr>
-                        <w:t>150</w:t>
-                      </w:r>
-                      <w:r>
-                        <w:rPr>
-                          <w:i/>
-                          <w:iCs/>
-                          <w:sz w:val="20"/>
-                          <w:szCs w:val="20"/>
-                        </w:rPr>
-                        <w:br/>
-                        <w:t>320</w:t>
-                      </w:r>
-                      <w:r>
-                        <w:rPr>
-                          <w:sz w:val="20"/>
-                          <w:szCs w:val="20"/>
-                        </w:rPr>
-                        <w:t xml:space="preserve"> POKE Y,Z</w:t>
-                      </w:r>
-                      <w:r>
-                        <w:rPr>
-                          <w:sz w:val="20"/>
-                          <w:szCs w:val="20"/>
-                        </w:rPr>
-                        <w:br/>
-                      </w:r>
-                      <w:r>
-                        <w:rPr>
-                          <w:i/>
-                          <w:iCs/>
-                          <w:sz w:val="20"/>
-                          <w:szCs w:val="20"/>
-                        </w:rPr>
-                        <w:t>500</w:t>
-                      </w:r>
-                      <w:r>
-                        <w:rPr>
-                          <w:sz w:val="20"/>
-                          <w:szCs w:val="20"/>
-                        </w:rPr>
-                        <w:t xml:space="preserve"> POKE </w:t>
-                      </w:r>
-                      <w:r>
-                        <w:rPr>
-                          <w:i/>
-                          <w:iCs/>
-                          <w:sz w:val="20"/>
-                          <w:szCs w:val="20"/>
-                        </w:rPr>
-                        <w:t>53248</w:t>
-                      </w:r>
-                      <w:r>
-                        <w:rPr>
-                          <w:sz w:val="20"/>
-                          <w:szCs w:val="20"/>
-                        </w:rPr>
-                        <w:t xml:space="preserve">,X        :REM </w:t>
-                      </w:r>
-                      <w:r>
-                        <w:rPr>
-                          <w:i/>
-                          <w:iCs/>
-                          <w:sz w:val="20"/>
-                          <w:szCs w:val="20"/>
-                        </w:rPr>
-                        <w:t xml:space="preserve">53248 </w:t>
-                      </w:r>
-                      <w:r>
-                        <w:rPr>
-                          <w:sz w:val="20"/>
-                          <w:szCs w:val="20"/>
-                        </w:rPr>
-                        <w:t xml:space="preserve">HPOSP0 (W) Horizontal position of player </w:t>
-                      </w:r>
-                      <w:r>
-                        <w:rPr>
-                          <w:i/>
-                          <w:iCs/>
-                          <w:sz w:val="20"/>
-                          <w:szCs w:val="20"/>
-                        </w:rPr>
-                        <w:t>0</w:t>
-                      </w:r>
-                      <w:r>
-                        <w:rPr>
-                          <w:i/>
-                          <w:iCs/>
-                          <w:sz w:val="20"/>
-                          <w:szCs w:val="20"/>
-                        </w:rPr>
-                        <w:br/>
-                        <w:t xml:space="preserve">510 </w:t>
-                      </w:r>
-                      <w:r>
-                        <w:rPr>
-                          <w:sz w:val="20"/>
-                          <w:szCs w:val="20"/>
-                        </w:rPr>
-                        <w:t>RETURN</w:t>
-                      </w:r>
-                      <w:r>
-                        <w:rPr>
-                          <w:sz w:val="20"/>
-                          <w:szCs w:val="20"/>
-                        </w:rPr>
-                        <w:br/>
-                      </w:r>
-                      <w:r>
-                        <w:rPr>
-                          <w:i/>
-                          <w:iCs/>
-                          <w:sz w:val="20"/>
-                          <w:szCs w:val="20"/>
-                        </w:rPr>
-                        <w:t>600</w:t>
-                      </w:r>
-                      <w:r>
-                        <w:rPr>
-                          <w:sz w:val="20"/>
-                          <w:szCs w:val="20"/>
-                        </w:rPr>
-                        <w:t xml:space="preserve"> DATA </w:t>
-                      </w:r>
-                      <w:r>
-                        <w:rPr>
-                          <w:i/>
-                          <w:iCs/>
-                          <w:sz w:val="20"/>
-                          <w:szCs w:val="20"/>
-                        </w:rPr>
-                        <w:t>128</w:t>
-                      </w:r>
-                      <w:r>
-                        <w:rPr>
-                          <w:sz w:val="20"/>
-                          <w:szCs w:val="20"/>
-                        </w:rPr>
-                        <w:t>,</w:t>
-                      </w:r>
-                      <w:r>
-                        <w:rPr>
-                          <w:i/>
-                          <w:iCs/>
-                          <w:sz w:val="20"/>
-                          <w:szCs w:val="20"/>
-                        </w:rPr>
-                        <w:t>6</w:t>
-                      </w:r>
-                      <w:r>
-                        <w:rPr>
-                          <w:i/>
-                          <w:iCs/>
-                          <w:sz w:val="20"/>
-                          <w:szCs w:val="20"/>
-                        </w:rPr>
-                        <w:t>4</w:t>
-                      </w:r>
-                      <w:r>
-                        <w:rPr>
-                          <w:sz w:val="20"/>
-                          <w:szCs w:val="20"/>
-                        </w:rPr>
-                        <w:t>,</w:t>
-                      </w:r>
-                      <w:r>
-                        <w:rPr>
-                          <w:i/>
-                          <w:iCs/>
-                          <w:sz w:val="20"/>
-                          <w:szCs w:val="20"/>
-                        </w:rPr>
-                        <w:t>44</w:t>
-                      </w:r>
-                      <w:r>
-                        <w:rPr>
-                          <w:sz w:val="20"/>
-                          <w:szCs w:val="20"/>
-                        </w:rPr>
-                        <w:t>,</w:t>
-                      </w:r>
-                      <w:r>
-                        <w:rPr>
-                          <w:i/>
-                          <w:iCs/>
-                          <w:sz w:val="20"/>
-                          <w:szCs w:val="20"/>
-                        </w:rPr>
-                        <w:t>18</w:t>
-                      </w:r>
-                      <w:r>
-                        <w:rPr>
-                          <w:sz w:val="20"/>
-                          <w:szCs w:val="20"/>
-                        </w:rPr>
-                        <w:t>,</w:t>
-                      </w:r>
-                      <w:r>
-                        <w:rPr>
-                          <w:i/>
-                          <w:iCs/>
-                          <w:sz w:val="20"/>
-                          <w:szCs w:val="20"/>
-                        </w:rPr>
-                        <w:t>18</w:t>
-                      </w:r>
-                      <w:r>
-                        <w:rPr>
-                          <w:sz w:val="20"/>
-                          <w:szCs w:val="20"/>
-                        </w:rPr>
-                        <w:t>,</w:t>
-                      </w:r>
-                      <w:r>
-                        <w:rPr>
-                          <w:i/>
-                          <w:iCs/>
-                          <w:sz w:val="20"/>
-                          <w:szCs w:val="20"/>
-                        </w:rPr>
-                        <w:t>127</w:t>
-                      </w:r>
-                      <w:r>
-                        <w:rPr>
-                          <w:i/>
-                          <w:iCs/>
-                          <w:sz w:val="20"/>
-                          <w:szCs w:val="20"/>
-                        </w:rPr>
-                        <w:br/>
-                        <w:t>610</w:t>
-                      </w:r>
-                      <w:r>
-                        <w:rPr>
-                          <w:sz w:val="20"/>
-                          <w:szCs w:val="20"/>
-                        </w:rPr>
-                        <w:t xml:space="preserve"> DATA </w:t>
-                      </w:r>
-                      <w:r>
-                        <w:rPr>
-                          <w:i/>
-                          <w:iCs/>
-                          <w:sz w:val="20"/>
-                          <w:szCs w:val="20"/>
-                        </w:rPr>
-                        <w:t>126</w:t>
-                      </w:r>
-                      <w:r>
-                        <w:rPr>
-                          <w:sz w:val="20"/>
-                          <w:szCs w:val="20"/>
-                        </w:rPr>
-                        <w:t>,</w:t>
-                      </w:r>
-                      <w:r>
-                        <w:rPr>
-                          <w:i/>
-                          <w:iCs/>
-                          <w:sz w:val="20"/>
-                          <w:szCs w:val="20"/>
-                        </w:rPr>
-                        <w:t>60</w:t>
-                      </w:r>
-                      <w:r>
-                        <w:rPr>
-                          <w:sz w:val="20"/>
-                          <w:szCs w:val="20"/>
-                        </w:rPr>
-                        <w:t>,</w:t>
-                      </w:r>
-                      <w:r>
-                        <w:rPr>
-                          <w:i/>
-                          <w:iCs/>
-                          <w:sz w:val="20"/>
-                          <w:szCs w:val="20"/>
-                        </w:rPr>
-                        <w:t>195</w:t>
-                      </w:r>
-                      <w:r>
-                        <w:rPr>
-                          <w:sz w:val="20"/>
-                          <w:szCs w:val="20"/>
-                        </w:rPr>
-                        <w:t>,</w:t>
-                      </w:r>
-                      <w:r>
-                        <w:rPr>
-                          <w:i/>
-                          <w:iCs/>
-                          <w:sz w:val="20"/>
-                          <w:szCs w:val="20"/>
-                        </w:rPr>
-                        <w:t>153</w:t>
-                      </w:r>
-                      <w:r>
-                        <w:rPr>
-                          <w:sz w:val="20"/>
-                          <w:szCs w:val="20"/>
-                        </w:rPr>
-                        <w:t>,</w:t>
-                      </w:r>
-                      <w:r>
-                        <w:rPr>
-                          <w:i/>
-                          <w:iCs/>
-                          <w:sz w:val="20"/>
-                          <w:szCs w:val="20"/>
-                        </w:rPr>
-                        <w:t>195</w:t>
-                      </w:r>
-                      <w:r>
-                        <w:rPr>
-                          <w:sz w:val="20"/>
-                          <w:szCs w:val="20"/>
-                        </w:rPr>
-                        <w:t>,</w:t>
-                      </w:r>
-                      <w:r>
-                        <w:rPr>
-                          <w:i/>
-                          <w:iCs/>
-                          <w:sz w:val="20"/>
-                          <w:szCs w:val="20"/>
-                        </w:rPr>
-                        <w:t>60</w:t>
-                      </w:r>
-                      <w:r>
-                        <w:rPr>
-                          <w:i/>
-                          <w:iCs/>
-                          <w:sz w:val="20"/>
-                          <w:szCs w:val="20"/>
-                        </w:rPr>
-                        <w:br/>
-                        <w:t>620</w:t>
-                      </w:r>
-                      <w:r>
-                        <w:rPr>
-                          <w:sz w:val="20"/>
-                          <w:szCs w:val="20"/>
-                        </w:rPr>
-                        <w:t xml:space="preserve"> DATA </w:t>
-                      </w:r>
-                      <w:r>
-                        <w:rPr>
-                          <w:i/>
-                          <w:iCs/>
-                          <w:sz w:val="20"/>
-                          <w:szCs w:val="20"/>
-                        </w:rPr>
-                        <w:t>0</w:t>
-                      </w:r>
-                      <w:r>
-                        <w:rPr>
-                          <w:sz w:val="20"/>
-                          <w:szCs w:val="20"/>
-                        </w:rPr>
-                        <w:t>,</w:t>
-                      </w:r>
-                      <w:r>
-                        <w:rPr>
-                          <w:i/>
-                          <w:iCs/>
-                          <w:sz w:val="20"/>
-                          <w:szCs w:val="20"/>
-                        </w:rPr>
-                        <w:t>0</w:t>
-                      </w:r>
-                      <w:r>
-                        <w:rPr>
-                          <w:sz w:val="20"/>
-                          <w:szCs w:val="20"/>
-                        </w:rPr>
-                        <w:t>,</w:t>
-                      </w:r>
-                      <w:r>
-                        <w:rPr>
-                          <w:i/>
-                          <w:iCs/>
-                          <w:sz w:val="20"/>
-                          <w:szCs w:val="20"/>
-                        </w:rPr>
-                        <w:t>0</w:t>
-                      </w:r>
-                      <w:r>
-                        <w:rPr>
-                          <w:sz w:val="20"/>
-                          <w:szCs w:val="20"/>
-                        </w:rPr>
-                        <w:t>,</w:t>
-                      </w:r>
-                      <w:r>
-                        <w:rPr>
-                          <w:i/>
-                          <w:iCs/>
-                          <w:sz w:val="20"/>
-                          <w:szCs w:val="20"/>
-                        </w:rPr>
-                        <w:t>0</w:t>
-                      </w:r>
-                      <w:r>
-                        <w:rPr>
-                          <w:sz w:val="20"/>
-                          <w:szCs w:val="20"/>
-                        </w:rPr>
-                        <w:t>,</w:t>
-                      </w:r>
-                      <w:r>
-                        <w:rPr>
-                          <w:i/>
-                          <w:iCs/>
-                          <w:sz w:val="20"/>
-                          <w:szCs w:val="20"/>
-                        </w:rPr>
-                        <w:t>0</w:t>
-                      </w:r>
-                      <w:r>
-                        <w:rPr>
-                          <w:sz w:val="20"/>
-                          <w:szCs w:val="20"/>
-                        </w:rPr>
-                        <w:t>,</w:t>
-                      </w:r>
-                      <w:r>
-                        <w:rPr>
-                          <w:i/>
-                          <w:iCs/>
-                          <w:sz w:val="20"/>
-                          <w:szCs w:val="20"/>
-                        </w:rPr>
-                        <w:t>0</w:t>
+                        <w:t>620 DATA 60,0,0,0,0,0</w:t>
                       </w:r>
                     </w:p>
                     <w:p>
                       <w:pPr>
                         <w:rPr>
-                          <w:sz w:val="20"/>
-                          <w:szCs w:val="20"/>
+                          <w:sz w:val="16"/>
+                          <w:szCs w:val="16"/>
                         </w:rPr>
                       </w:pPr>
                     </w:p>
@@ -12564,7 +10722,6 @@
   <w:style w:type="character" w:default="1" w:styleId="DefaultParagraphFont">
     <w:name w:val="Default Paragraph Font"/>
     <w:uiPriority w:val="1"/>
-    <w:semiHidden/>
     <w:unhideWhenUsed/>
   </w:style>
   <w:style w:type="table" w:default="1" w:styleId="TableNormal">

</xml_diff>

<commit_message>
Decades of sprites 6 (#24)
</commit_message>
<xml_diff>
--- a/LECTURES/DecadesOfSprites/Decades of SPRITES.docx
+++ b/LECTURES/DecadesOfSprites/Decades of SPRITES.docx
@@ -1012,62 +1012,127 @@
                           <w:p>
                             <w:pPr>
                               <w:rPr>
-                                <w:sz w:val="20"/>
-                                <w:szCs w:val="20"/>
+                                <w:i/>
+                                <w:iCs/>
+                                <w:sz w:val="16"/>
+                                <w:szCs w:val="16"/>
                               </w:rPr>
                             </w:pPr>
                             <w:r>
                               <w:rPr>
                                 <w:i/>
                                 <w:iCs/>
-                                <w:sz w:val="20"/>
-                                <w:szCs w:val="20"/>
+                                <w:sz w:val="16"/>
+                                <w:szCs w:val="16"/>
                               </w:rPr>
-                              <w:t>10</w:t>
-                            </w:r>
-                            <w:r>
-                              <w:rPr>
-                                <w:sz w:val="20"/>
-                                <w:szCs w:val="20"/>
-                              </w:rPr>
-                              <w:t xml:space="preserve"> DIM A$(</w:t>
+                              <w:t>10 GRAPHICS 8</w:t>
                             </w:r>
                             <w:r>
                               <w:rPr>
                                 <w:i/>
                                 <w:iCs/>
-                                <w:sz w:val="20"/>
-                                <w:szCs w:val="20"/>
+                                <w:sz w:val="16"/>
+                                <w:szCs w:val="16"/>
                               </w:rPr>
-                              <w:t>10</w:t>
-                            </w:r>
-                            <w:r>
-                              <w:rPr>
-                                <w:sz w:val="20"/>
-                                <w:szCs w:val="20"/>
-                              </w:rPr>
-                              <w:t>),B$(</w:t>
+                              <w:br/>
+                              <w:t>20 POKE 559,62          :REM SDMCTL Direct Memory Access (DMA) enable</w:t>
                             </w:r>
                             <w:r>
                               <w:rPr>
                                 <w:i/>
                                 <w:iCs/>
-                                <w:sz w:val="20"/>
-                                <w:szCs w:val="20"/>
+                                <w:sz w:val="16"/>
+                                <w:szCs w:val="16"/>
                               </w:rPr>
-                              <w:t>100</w:t>
+                              <w:br/>
+                              <w:t>30 POKE 53248,20       :REM 53248 HPOSP0 (W) Horizontal position of player 0</w:t>
                             </w:r>
                             <w:r>
                               <w:rPr>
-                                <w:sz w:val="20"/>
-                                <w:szCs w:val="20"/>
+                                <w:i/>
+                                <w:iCs/>
+                                <w:sz w:val="16"/>
+                                <w:szCs w:val="16"/>
                               </w:rPr>
-                              <w:t>)</w:t>
+                              <w:br/>
+                              <w:t>40 WHT=15</w:t>
                             </w:r>
                             <w:r>
                               <w:rPr>
-                                <w:sz w:val="20"/>
-                                <w:szCs w:val="20"/>
+                                <w:i/>
+                                <w:iCs/>
+                                <w:sz w:val="16"/>
+                                <w:szCs w:val="16"/>
+                              </w:rPr>
+                              <w:br/>
+                              <w:t xml:space="preserve">50 POKE 704,WHT         :REM Locations 704 to 712 ($2C0 to $2C8) are the color registers for players, </w:t>
+                            </w:r>
+                            <w:proofErr w:type="spellStart"/>
+                            <w:r>
+                              <w:rPr>
+                                <w:i/>
+                                <w:iCs/>
+                                <w:sz w:val="16"/>
+                                <w:szCs w:val="16"/>
+                              </w:rPr>
+                              <w:t>missiles,and</w:t>
+                            </w:r>
+                            <w:proofErr w:type="spellEnd"/>
+                            <w:r>
+                              <w:rPr>
+                                <w:i/>
+                                <w:iCs/>
+                                <w:sz w:val="16"/>
+                                <w:szCs w:val="16"/>
+                              </w:rPr>
+                              <w:t xml:space="preserve"> playfields</w:t>
+                            </w:r>
+                            <w:r>
+                              <w:rPr>
+                                <w:i/>
+                                <w:iCs/>
+                                <w:sz w:val="16"/>
+                                <w:szCs w:val="16"/>
+                              </w:rPr>
+                              <w:br/>
+                              <w:t>60 I=PEEK(106)-8        :REM RAMTOP - RAM size, defined by powerup</w:t>
+                            </w:r>
+                            <w:r>
+                              <w:rPr>
+                                <w:i/>
+                                <w:iCs/>
+                                <w:sz w:val="16"/>
+                                <w:szCs w:val="16"/>
+                              </w:rPr>
+                              <w:br/>
+                              <w:t>70 POKE 54279,I         :REM CONSOL (W/R) Used to see if one of the three yellow console buttons has been pressed (not the RESET button!).</w:t>
+                            </w:r>
+                            <w:r>
+                              <w:rPr>
+                                <w:i/>
+                                <w:iCs/>
+                                <w:sz w:val="16"/>
+                                <w:szCs w:val="16"/>
+                              </w:rPr>
+                              <w:br/>
+                              <w:t>80 POKE 53277,3         :REM GRACTL (W) Used to turn on players and to turn on missiles.</w:t>
+                            </w:r>
+                            <w:r>
+                              <w:rPr>
+                                <w:i/>
+                                <w:iCs/>
+                                <w:sz w:val="16"/>
+                                <w:szCs w:val="16"/>
+                              </w:rPr>
+                              <w:br/>
+                              <w:t>90 POKE 53256,3         :REM SIZEP0 (W) Size of player 0.</w:t>
+                            </w:r>
+                            <w:r>
+                              <w:rPr>
+                                <w:i/>
+                                <w:iCs/>
+                                <w:sz w:val="16"/>
+                                <w:szCs w:val="16"/>
                               </w:rPr>
                               <w:br/>
                             </w:r>
@@ -1075,80 +1140,48 @@
                               <w:rPr>
                                 <w:i/>
                                 <w:iCs/>
-                                <w:sz w:val="20"/>
-                                <w:szCs w:val="20"/>
+                                <w:sz w:val="16"/>
+                                <w:szCs w:val="16"/>
                               </w:rPr>
-                              <w:t>20</w:t>
-                            </w:r>
-                            <w:r>
-                              <w:rPr>
-                                <w:sz w:val="20"/>
-                                <w:szCs w:val="20"/>
-                              </w:rPr>
-                              <w:t xml:space="preserve"> GRAPHICS </w:t>
+                              <w:br/>
+                              <w:t>100 REM DRAW 10 LINES (BACKGROUND)</w:t>
                             </w:r>
                             <w:r>
                               <w:rPr>
                                 <w:i/>
                                 <w:iCs/>
-                                <w:sz w:val="20"/>
-                                <w:szCs w:val="20"/>
+                                <w:sz w:val="16"/>
+                                <w:szCs w:val="16"/>
                               </w:rPr>
-                              <w:t>8</w:t>
+                              <w:br/>
+                              <w:t>110 FOR A = 70 TO 100 STEP 3</w:t>
                             </w:r>
                             <w:r>
                               <w:rPr>
                                 <w:i/>
                                 <w:iCs/>
-                                <w:sz w:val="20"/>
-                                <w:szCs w:val="20"/>
+                                <w:sz w:val="16"/>
+                                <w:szCs w:val="16"/>
                               </w:rPr>
                               <w:br/>
-                              <w:t>30</w:t>
-                            </w:r>
-                            <w:r>
-                              <w:rPr>
-                                <w:sz w:val="20"/>
-                                <w:szCs w:val="20"/>
-                              </w:rPr>
-                              <w:t xml:space="preserve"> POKE </w:t>
+                              <w:t>120 COLOR 1: PLOT 100,A: DRAWTO 315,A+20</w:t>
                             </w:r>
                             <w:r>
                               <w:rPr>
                                 <w:i/>
                                 <w:iCs/>
-                                <w:sz w:val="20"/>
-                                <w:szCs w:val="20"/>
+                                <w:sz w:val="16"/>
+                                <w:szCs w:val="16"/>
                               </w:rPr>
-                              <w:t>559</w:t>
-                            </w:r>
-                            <w:r>
-                              <w:rPr>
-                                <w:sz w:val="20"/>
-                                <w:szCs w:val="20"/>
-                              </w:rPr>
-                              <w:t>,</w:t>
+                              <w:br/>
+                              <w:t>130 NEXT A</w:t>
                             </w:r>
                             <w:r>
                               <w:rPr>
                                 <w:i/>
                                 <w:iCs/>
-                                <w:sz w:val="20"/>
-                                <w:szCs w:val="20"/>
-                              </w:rPr>
-                              <w:t>62</w:t>
-                            </w:r>
-                            <w:r>
-                              <w:rPr>
-                                <w:sz w:val="20"/>
-                                <w:szCs w:val="20"/>
-                              </w:rPr>
-                              <w:t xml:space="preserve">          :REM SDMCTL Direct Memory Access (DMA) enable</w:t>
-                            </w:r>
-                            <w:r>
-                              <w:rPr>
-                                <w:sz w:val="20"/>
-                                <w:szCs w:val="20"/>
+                                <w:sz w:val="16"/>
+                                <w:szCs w:val="16"/>
                               </w:rPr>
                               <w:br/>
                             </w:r>
@@ -1156,176 +1189,108 @@
                               <w:rPr>
                                 <w:i/>
                                 <w:iCs/>
-                                <w:sz w:val="20"/>
-                                <w:szCs w:val="20"/>
+                                <w:sz w:val="16"/>
+                                <w:szCs w:val="16"/>
                               </w:rPr>
-                              <w:t>40</w:t>
-                            </w:r>
-                            <w:r>
-                              <w:rPr>
-                                <w:sz w:val="20"/>
-                                <w:szCs w:val="20"/>
-                              </w:rPr>
-                              <w:t xml:space="preserve"> POKE </w:t>
+                              <w:br/>
+                              <w:t>200 J=I*256+1024</w:t>
                             </w:r>
                             <w:r>
                               <w:rPr>
                                 <w:i/>
                                 <w:iCs/>
-                                <w:sz w:val="20"/>
-                                <w:szCs w:val="20"/>
+                                <w:sz w:val="16"/>
+                                <w:szCs w:val="16"/>
                               </w:rPr>
-                              <w:t>53248</w:t>
-                            </w:r>
-                            <w:r>
-                              <w:rPr>
-                                <w:sz w:val="20"/>
-                                <w:szCs w:val="20"/>
-                              </w:rPr>
-                              <w:t>,</w:t>
+                              <w:br/>
+                              <w:t>210 FOR Y=J+120 TO J+137</w:t>
                             </w:r>
                             <w:r>
                               <w:rPr>
                                 <w:i/>
                                 <w:iCs/>
-                                <w:sz w:val="20"/>
-                                <w:szCs w:val="20"/>
+                                <w:sz w:val="16"/>
+                                <w:szCs w:val="16"/>
                               </w:rPr>
-                              <w:t>120</w:t>
-                            </w:r>
-                            <w:r>
-                              <w:rPr>
-                                <w:sz w:val="20"/>
-                                <w:szCs w:val="20"/>
-                              </w:rPr>
-                              <w:t xml:space="preserve">       :REM </w:t>
+                              <w:br/>
+                              <w:t>220 READ Z</w:t>
                             </w:r>
                             <w:r>
                               <w:rPr>
                                 <w:i/>
                                 <w:iCs/>
-                                <w:sz w:val="20"/>
-                                <w:szCs w:val="20"/>
+                                <w:sz w:val="16"/>
+                                <w:szCs w:val="16"/>
                               </w:rPr>
-                              <w:t xml:space="preserve">53248 </w:t>
-                            </w:r>
-                            <w:r>
-                              <w:rPr>
-                                <w:sz w:val="20"/>
-                                <w:szCs w:val="20"/>
-                              </w:rPr>
-                              <w:t xml:space="preserve">HPOSP0 (W) Horizontal position of player </w:t>
+                              <w:br/>
+                              <w:t>230 POKE Y,Z</w:t>
                             </w:r>
                             <w:r>
                               <w:rPr>
                                 <w:i/>
                                 <w:iCs/>
-                                <w:sz w:val="20"/>
-                                <w:szCs w:val="20"/>
+                                <w:sz w:val="16"/>
+                                <w:szCs w:val="16"/>
                               </w:rPr>
-                              <w:t>0</w:t>
+                              <w:br/>
+                              <w:t>240 NEXT Y</w:t>
                             </w:r>
                             <w:r>
                               <w:rPr>
                                 <w:i/>
                                 <w:iCs/>
-                                <w:sz w:val="20"/>
-                                <w:szCs w:val="20"/>
+                                <w:sz w:val="16"/>
+                                <w:szCs w:val="16"/>
                               </w:rPr>
                               <w:br/>
-                              <w:t>50</w:t>
-                            </w:r>
-                            <w:r>
-                              <w:rPr>
-                                <w:sz w:val="20"/>
-                                <w:szCs w:val="20"/>
-                              </w:rPr>
-                              <w:t xml:space="preserve"> POKE </w:t>
+                              <w:t>250 FOR X=221 TO 48 STEP -1:GOSUB 500:NEXT X</w:t>
                             </w:r>
                             <w:r>
                               <w:rPr>
                                 <w:i/>
                                 <w:iCs/>
-                                <w:sz w:val="20"/>
-                                <w:szCs w:val="20"/>
+                                <w:sz w:val="16"/>
+                                <w:szCs w:val="16"/>
                               </w:rPr>
-                              <w:t>704</w:t>
-                            </w:r>
-                            <w:r>
-                              <w:rPr>
-                                <w:sz w:val="20"/>
-                                <w:szCs w:val="20"/>
-                              </w:rPr>
-                              <w:t>,</w:t>
+                              <w:br/>
+                              <w:t>260 GOTO 250</w:t>
                             </w:r>
                             <w:r>
                               <w:rPr>
                                 <w:i/>
                                 <w:iCs/>
-                                <w:sz w:val="20"/>
-                                <w:szCs w:val="20"/>
+                                <w:sz w:val="16"/>
+                                <w:szCs w:val="16"/>
                               </w:rPr>
-                              <w:t>88</w:t>
-                            </w:r>
-                            <w:r>
-                              <w:rPr>
-                                <w:sz w:val="20"/>
-                                <w:szCs w:val="20"/>
-                              </w:rPr>
-                              <w:t xml:space="preserve">          :REM Locations </w:t>
+                              <w:br/>
+                              <w:t>320 POKE Y,Z</w:t>
                             </w:r>
                             <w:r>
                               <w:rPr>
                                 <w:i/>
                                 <w:iCs/>
-                                <w:sz w:val="20"/>
-                                <w:szCs w:val="20"/>
+                                <w:sz w:val="16"/>
+                                <w:szCs w:val="16"/>
                               </w:rPr>
-                              <w:t xml:space="preserve">704 </w:t>
-                            </w:r>
-                            <w:r>
-                              <w:rPr>
-                                <w:sz w:val="20"/>
-                                <w:szCs w:val="20"/>
-                              </w:rPr>
-                              <w:t xml:space="preserve">to </w:t>
+                              <w:br/>
+                              <w:t>500 POKE 53248,X        :REM 53248 HPOSP0 (W) Horizontal position of player 0</w:t>
                             </w:r>
                             <w:r>
                               <w:rPr>
                                 <w:i/>
                                 <w:iCs/>
-                                <w:sz w:val="20"/>
-                                <w:szCs w:val="20"/>
+                                <w:sz w:val="16"/>
+                                <w:szCs w:val="16"/>
                               </w:rPr>
-                              <w:t xml:space="preserve">712 </w:t>
+                              <w:br/>
+                              <w:t>510 RETURN</w:t>
                             </w:r>
                             <w:r>
                               <w:rPr>
-                                <w:sz w:val="20"/>
-                                <w:szCs w:val="20"/>
-                              </w:rPr>
-                              <w:t xml:space="preserve">($2C0 to $2C8) are the color registers for players, </w:t>
-                            </w:r>
-                            <w:proofErr w:type="spellStart"/>
-                            <w:r>
-                              <w:rPr>
-                                <w:sz w:val="20"/>
-                                <w:szCs w:val="20"/>
-                              </w:rPr>
-                              <w:t>missiles,and</w:t>
-                            </w:r>
-                            <w:proofErr w:type="spellEnd"/>
-                            <w:r>
-                              <w:rPr>
-                                <w:sz w:val="20"/>
-                                <w:szCs w:val="20"/>
-                              </w:rPr>
-                              <w:t xml:space="preserve"> playfields</w:t>
-                            </w:r>
-                            <w:r>
-                              <w:rPr>
-                                <w:sz w:val="20"/>
-                                <w:szCs w:val="20"/>
+                                <w:i/>
+                                <w:iCs/>
+                                <w:sz w:val="16"/>
+                                <w:szCs w:val="16"/>
                               </w:rPr>
                               <w:br/>
                             </w:r>
@@ -1333,924 +1298,38 @@
                               <w:rPr>
                                 <w:i/>
                                 <w:iCs/>
-                                <w:sz w:val="20"/>
-                                <w:szCs w:val="20"/>
+                                <w:sz w:val="16"/>
+                                <w:szCs w:val="16"/>
                               </w:rPr>
-                              <w:t xml:space="preserve">60 </w:t>
-                            </w:r>
-                            <w:r>
-                              <w:rPr>
-                                <w:sz w:val="20"/>
-                                <w:szCs w:val="20"/>
-                              </w:rPr>
-                              <w:t>I=PEEK(</w:t>
+                              <w:br/>
+                              <w:t>600 DATA 128,64,44,18,18,18</w:t>
                             </w:r>
                             <w:r>
                               <w:rPr>
                                 <w:i/>
                                 <w:iCs/>
-                                <w:sz w:val="20"/>
-                                <w:szCs w:val="20"/>
+                                <w:sz w:val="16"/>
+                                <w:szCs w:val="16"/>
                               </w:rPr>
-                              <w:t>106</w:t>
-                            </w:r>
-                            <w:r>
-                              <w:rPr>
-                                <w:sz w:val="20"/>
-                                <w:szCs w:val="20"/>
-                              </w:rPr>
-                              <w:t>)</w:t>
+                              <w:br/>
+                              <w:t>610 DATA 127,129,60,195,153,195</w:t>
                             </w:r>
                             <w:r>
                               <w:rPr>
                                 <w:i/>
                                 <w:iCs/>
-                                <w:sz w:val="20"/>
-                                <w:szCs w:val="20"/>
-                              </w:rPr>
-                              <w:t>-8</w:t>
-                            </w:r>
-                            <w:r>
-                              <w:rPr>
-                                <w:sz w:val="20"/>
-                                <w:szCs w:val="20"/>
-                              </w:rPr>
-                              <w:t xml:space="preserve">        :REM RAMTOP - RAM size, defined by powerup</w:t>
-                            </w:r>
-                            <w:r>
-                              <w:rPr>
-                                <w:sz w:val="20"/>
-                                <w:szCs w:val="20"/>
+                                <w:sz w:val="16"/>
+                                <w:szCs w:val="16"/>
                               </w:rPr>
                               <w:br/>
-                            </w:r>
-                            <w:r>
-                              <w:rPr>
-                                <w:i/>
-                                <w:iCs/>
-                                <w:sz w:val="20"/>
-                                <w:szCs w:val="20"/>
-                              </w:rPr>
-                              <w:t>70</w:t>
-                            </w:r>
-                            <w:r>
-                              <w:rPr>
-                                <w:sz w:val="20"/>
-                                <w:szCs w:val="20"/>
-                              </w:rPr>
-                              <w:t xml:space="preserve"> POKE </w:t>
-                            </w:r>
-                            <w:r>
-                              <w:rPr>
-                                <w:i/>
-                                <w:iCs/>
-                                <w:sz w:val="20"/>
-                                <w:szCs w:val="20"/>
-                              </w:rPr>
-                              <w:t>54279</w:t>
-                            </w:r>
-                            <w:r>
-                              <w:rPr>
-                                <w:sz w:val="20"/>
-                                <w:szCs w:val="20"/>
-                              </w:rPr>
-                              <w:t xml:space="preserve">,I         :REM CONSOL (W/R) Used to see if one of the three yellow console buttons has </w:t>
-                            </w:r>
-                            <w:r>
-                              <w:rPr>
-                                <w:i/>
-                                <w:iCs/>
-                                <w:sz w:val="20"/>
-                                <w:szCs w:val="20"/>
-                              </w:rPr>
-                              <w:t xml:space="preserve">been </w:t>
-                            </w:r>
-                            <w:r>
-                              <w:rPr>
-                                <w:sz w:val="20"/>
-                                <w:szCs w:val="20"/>
-                              </w:rPr>
-                              <w:t>pressed (not the RESET button!).</w:t>
-                            </w:r>
-                            <w:r>
-                              <w:rPr>
-                                <w:sz w:val="20"/>
-                                <w:szCs w:val="20"/>
-                              </w:rPr>
-                              <w:br/>
-                            </w:r>
-                            <w:r>
-                              <w:rPr>
-                                <w:i/>
-                                <w:iCs/>
-                                <w:sz w:val="20"/>
-                                <w:szCs w:val="20"/>
-                              </w:rPr>
-                              <w:t>80</w:t>
-                            </w:r>
-                            <w:r>
-                              <w:rPr>
-                                <w:sz w:val="20"/>
-                                <w:szCs w:val="20"/>
-                              </w:rPr>
-                              <w:t xml:space="preserve"> POKE </w:t>
-                            </w:r>
-                            <w:r>
-                              <w:rPr>
-                                <w:i/>
-                                <w:iCs/>
-                                <w:sz w:val="20"/>
-                                <w:szCs w:val="20"/>
-                              </w:rPr>
-                              <w:t>53277</w:t>
-                            </w:r>
-                            <w:r>
-                              <w:rPr>
-                                <w:sz w:val="20"/>
-                                <w:szCs w:val="20"/>
-                              </w:rPr>
-                              <w:t>,</w:t>
-                            </w:r>
-                            <w:r>
-                              <w:rPr>
-                                <w:i/>
-                                <w:iCs/>
-                                <w:sz w:val="20"/>
-                                <w:szCs w:val="20"/>
-                              </w:rPr>
-                              <w:t>3</w:t>
-                            </w:r>
-                            <w:r>
-                              <w:rPr>
-                                <w:sz w:val="20"/>
-                                <w:szCs w:val="20"/>
-                              </w:rPr>
-                              <w:t xml:space="preserve">         :REM GRACTL (W) Used to turn on players and to turn on missiles.</w:t>
-                            </w:r>
-                            <w:r>
-                              <w:rPr>
-                                <w:sz w:val="20"/>
-                                <w:szCs w:val="20"/>
-                              </w:rPr>
-                              <w:br/>
-                            </w:r>
-                            <w:r>
-                              <w:rPr>
-                                <w:i/>
-                                <w:iCs/>
-                                <w:sz w:val="20"/>
-                                <w:szCs w:val="20"/>
-                              </w:rPr>
-                              <w:t>90</w:t>
-                            </w:r>
-                            <w:r>
-                              <w:rPr>
-                                <w:sz w:val="20"/>
-                                <w:szCs w:val="20"/>
-                              </w:rPr>
-                              <w:t xml:space="preserve"> POKE </w:t>
-                            </w:r>
-                            <w:r>
-                              <w:rPr>
-                                <w:i/>
-                                <w:iCs/>
-                                <w:sz w:val="20"/>
-                                <w:szCs w:val="20"/>
-                              </w:rPr>
-                              <w:t>53256</w:t>
-                            </w:r>
-                            <w:r>
-                              <w:rPr>
-                                <w:sz w:val="20"/>
-                                <w:szCs w:val="20"/>
-                              </w:rPr>
-                              <w:t>,</w:t>
-                            </w:r>
-                            <w:r>
-                              <w:rPr>
-                                <w:i/>
-                                <w:iCs/>
-                                <w:sz w:val="20"/>
-                                <w:szCs w:val="20"/>
-                              </w:rPr>
-                              <w:t>3</w:t>
-                            </w:r>
-                            <w:r>
-                              <w:rPr>
-                                <w:sz w:val="20"/>
-                                <w:szCs w:val="20"/>
-                              </w:rPr>
-                              <w:t xml:space="preserve">         :REM SIZEP0 (W) Size of player </w:t>
-                            </w:r>
-                            <w:r>
-                              <w:rPr>
-                                <w:i/>
-                                <w:iCs/>
-                                <w:sz w:val="20"/>
-                                <w:szCs w:val="20"/>
-                              </w:rPr>
-                              <w:t>0</w:t>
-                            </w:r>
-                            <w:r>
-                              <w:rPr>
-                                <w:sz w:val="20"/>
-                                <w:szCs w:val="20"/>
-                              </w:rPr>
-                              <w:t>.</w:t>
-                            </w:r>
-                            <w:r>
-                              <w:rPr>
-                                <w:sz w:val="20"/>
-                                <w:szCs w:val="20"/>
-                              </w:rPr>
-                              <w:br/>
-                            </w:r>
-                            <w:r>
-                              <w:rPr>
-                                <w:i/>
-                                <w:iCs/>
-                                <w:sz w:val="20"/>
-                                <w:szCs w:val="20"/>
-                              </w:rPr>
-                              <w:t xml:space="preserve">100 </w:t>
-                            </w:r>
-                            <w:r>
-                              <w:rPr>
-                                <w:sz w:val="20"/>
-                                <w:szCs w:val="20"/>
-                              </w:rPr>
-                              <w:t>J=I*</w:t>
-                            </w:r>
-                            <w:r>
-                              <w:rPr>
-                                <w:i/>
-                                <w:iCs/>
-                                <w:sz w:val="20"/>
-                                <w:szCs w:val="20"/>
-                              </w:rPr>
-                              <w:t>256</w:t>
-                            </w:r>
-                            <w:r>
-                              <w:rPr>
-                                <w:sz w:val="20"/>
-                                <w:szCs w:val="20"/>
-                              </w:rPr>
-                              <w:t>+</w:t>
-                            </w:r>
-                            <w:r>
-                              <w:rPr>
-                                <w:i/>
-                                <w:iCs/>
-                                <w:sz w:val="20"/>
-                                <w:szCs w:val="20"/>
-                              </w:rPr>
-                              <w:t>1024</w:t>
-                            </w:r>
-                            <w:r>
-                              <w:rPr>
-                                <w:i/>
-                                <w:iCs/>
-                                <w:sz w:val="20"/>
-                                <w:szCs w:val="20"/>
-                              </w:rPr>
-                              <w:br/>
-                              <w:t xml:space="preserve">110 </w:t>
-                            </w:r>
-                            <w:r>
-                              <w:rPr>
-                                <w:sz w:val="20"/>
-                                <w:szCs w:val="20"/>
-                              </w:rPr>
-                              <w:t>FOR Y=J+</w:t>
-                            </w:r>
-                            <w:r>
-                              <w:rPr>
-                                <w:i/>
-                                <w:iCs/>
-                                <w:sz w:val="20"/>
-                                <w:szCs w:val="20"/>
-                              </w:rPr>
-                              <w:t xml:space="preserve">120 </w:t>
-                            </w:r>
-                            <w:r>
-                              <w:rPr>
-                                <w:sz w:val="20"/>
-                                <w:szCs w:val="20"/>
-                              </w:rPr>
-                              <w:t>TO J+</w:t>
-                            </w:r>
-                            <w:r>
-                              <w:rPr>
-                                <w:i/>
-                                <w:iCs/>
-                                <w:sz w:val="20"/>
-                                <w:szCs w:val="20"/>
-                              </w:rPr>
-                              <w:t>137</w:t>
-                            </w:r>
-                            <w:r>
-                              <w:rPr>
-                                <w:i/>
-                                <w:iCs/>
-                                <w:sz w:val="20"/>
-                                <w:szCs w:val="20"/>
-                              </w:rPr>
-                              <w:br/>
-                              <w:t>120</w:t>
-                            </w:r>
-                            <w:r>
-                              <w:rPr>
-                                <w:sz w:val="20"/>
-                                <w:szCs w:val="20"/>
-                              </w:rPr>
-                              <w:t xml:space="preserve"> READ Z</w:t>
-                            </w:r>
-                            <w:r>
-                              <w:rPr>
-                                <w:sz w:val="20"/>
-                                <w:szCs w:val="20"/>
-                              </w:rPr>
-                              <w:br/>
-                            </w:r>
-                            <w:r>
-                              <w:rPr>
-                                <w:i/>
-                                <w:iCs/>
-                                <w:sz w:val="20"/>
-                                <w:szCs w:val="20"/>
-                              </w:rPr>
-                              <w:t>130</w:t>
-                            </w:r>
-                            <w:r>
-                              <w:rPr>
-                                <w:sz w:val="20"/>
-                                <w:szCs w:val="20"/>
-                              </w:rPr>
-                              <w:t xml:space="preserve"> POKE Y,Z</w:t>
-                            </w:r>
-                            <w:r>
-                              <w:rPr>
-                                <w:sz w:val="20"/>
-                                <w:szCs w:val="20"/>
-                              </w:rPr>
-                              <w:br/>
-                            </w:r>
-                            <w:r>
-                              <w:rPr>
-                                <w:i/>
-                                <w:iCs/>
-                                <w:sz w:val="20"/>
-                                <w:szCs w:val="20"/>
-                              </w:rPr>
-                              <w:t xml:space="preserve">140 </w:t>
-                            </w:r>
-                            <w:r>
-                              <w:rPr>
-                                <w:sz w:val="20"/>
-                                <w:szCs w:val="20"/>
-                              </w:rPr>
-                              <w:t>NEXT Y</w:t>
-                            </w:r>
-                            <w:r>
-                              <w:rPr>
-                                <w:sz w:val="20"/>
-                                <w:szCs w:val="20"/>
-                              </w:rPr>
-                              <w:br/>
-                            </w:r>
-                            <w:r>
-                              <w:rPr>
-                                <w:i/>
-                                <w:iCs/>
-                                <w:sz w:val="20"/>
-                                <w:szCs w:val="20"/>
-                              </w:rPr>
-                              <w:t xml:space="preserve">150 </w:t>
-                            </w:r>
-                            <w:r>
-                              <w:rPr>
-                                <w:sz w:val="20"/>
-                                <w:szCs w:val="20"/>
-                              </w:rPr>
-                              <w:t>FOR X=</w:t>
-                            </w:r>
-                            <w:r>
-                              <w:rPr>
-                                <w:i/>
-                                <w:iCs/>
-                                <w:sz w:val="20"/>
-                                <w:szCs w:val="20"/>
-                              </w:rPr>
-                              <w:t xml:space="preserve">48 </w:t>
-                            </w:r>
-                            <w:r>
-                              <w:rPr>
-                                <w:sz w:val="20"/>
-                                <w:szCs w:val="20"/>
-                              </w:rPr>
-                              <w:t xml:space="preserve">TO </w:t>
-                            </w:r>
-                            <w:r>
-                              <w:rPr>
-                                <w:i/>
-                                <w:iCs/>
-                                <w:sz w:val="20"/>
-                                <w:szCs w:val="20"/>
-                              </w:rPr>
-                              <w:t>221</w:t>
-                            </w:r>
-                            <w:r>
-                              <w:rPr>
-                                <w:sz w:val="20"/>
-                                <w:szCs w:val="20"/>
-                              </w:rPr>
-                              <w:t xml:space="preserve">:GOSUB </w:t>
-                            </w:r>
-                            <w:r>
-                              <w:rPr>
-                                <w:i/>
-                                <w:iCs/>
-                                <w:sz w:val="20"/>
-                                <w:szCs w:val="20"/>
-                              </w:rPr>
-                              <w:t>500</w:t>
-                            </w:r>
-                            <w:r>
-                              <w:rPr>
-                                <w:sz w:val="20"/>
-                                <w:szCs w:val="20"/>
-                              </w:rPr>
-                              <w:t>:NEXT X</w:t>
-                            </w:r>
-                            <w:r>
-                              <w:rPr>
-                                <w:sz w:val="20"/>
-                                <w:szCs w:val="20"/>
-                              </w:rPr>
-                              <w:br/>
-                            </w:r>
-                            <w:r>
-                              <w:rPr>
-                                <w:i/>
-                                <w:iCs/>
-                                <w:sz w:val="20"/>
-                                <w:szCs w:val="20"/>
-                              </w:rPr>
-                              <w:t>160</w:t>
-                            </w:r>
-                            <w:r>
-                              <w:rPr>
-                                <w:sz w:val="20"/>
-                                <w:szCs w:val="20"/>
-                              </w:rPr>
-                              <w:t xml:space="preserve"> GOTO </w:t>
-                            </w:r>
-                            <w:r>
-                              <w:rPr>
-                                <w:i/>
-                                <w:iCs/>
-                                <w:sz w:val="20"/>
-                                <w:szCs w:val="20"/>
-                              </w:rPr>
-                              <w:t>150</w:t>
-                            </w:r>
-                            <w:r>
-                              <w:rPr>
-                                <w:i/>
-                                <w:iCs/>
-                                <w:sz w:val="20"/>
-                                <w:szCs w:val="20"/>
-                              </w:rPr>
-                              <w:br/>
-                              <w:t>320</w:t>
-                            </w:r>
-                            <w:r>
-                              <w:rPr>
-                                <w:sz w:val="20"/>
-                                <w:szCs w:val="20"/>
-                              </w:rPr>
-                              <w:t xml:space="preserve"> POKE Y,Z</w:t>
-                            </w:r>
-                            <w:r>
-                              <w:rPr>
-                                <w:sz w:val="20"/>
-                                <w:szCs w:val="20"/>
-                              </w:rPr>
-                              <w:br/>
-                            </w:r>
-                            <w:r>
-                              <w:rPr>
-                                <w:i/>
-                                <w:iCs/>
-                                <w:sz w:val="20"/>
-                                <w:szCs w:val="20"/>
-                              </w:rPr>
-                              <w:t>500</w:t>
-                            </w:r>
-                            <w:r>
-                              <w:rPr>
-                                <w:sz w:val="20"/>
-                                <w:szCs w:val="20"/>
-                              </w:rPr>
-                              <w:t xml:space="preserve"> POKE </w:t>
-                            </w:r>
-                            <w:r>
-                              <w:rPr>
-                                <w:i/>
-                                <w:iCs/>
-                                <w:sz w:val="20"/>
-                                <w:szCs w:val="20"/>
-                              </w:rPr>
-                              <w:t>53248</w:t>
-                            </w:r>
-                            <w:r>
-                              <w:rPr>
-                                <w:sz w:val="20"/>
-                                <w:szCs w:val="20"/>
-                              </w:rPr>
-                              <w:t xml:space="preserve">,X        :REM </w:t>
-                            </w:r>
-                            <w:r>
-                              <w:rPr>
-                                <w:i/>
-                                <w:iCs/>
-                                <w:sz w:val="20"/>
-                                <w:szCs w:val="20"/>
-                              </w:rPr>
-                              <w:t xml:space="preserve">53248 </w:t>
-                            </w:r>
-                            <w:r>
-                              <w:rPr>
-                                <w:sz w:val="20"/>
-                                <w:szCs w:val="20"/>
-                              </w:rPr>
-                              <w:t xml:space="preserve">HPOSP0 (W) Horizontal position of player </w:t>
-                            </w:r>
-                            <w:r>
-                              <w:rPr>
-                                <w:i/>
-                                <w:iCs/>
-                                <w:sz w:val="20"/>
-                                <w:szCs w:val="20"/>
-                              </w:rPr>
-                              <w:t>0</w:t>
-                            </w:r>
-                            <w:r>
-                              <w:rPr>
-                                <w:i/>
-                                <w:iCs/>
-                                <w:sz w:val="20"/>
-                                <w:szCs w:val="20"/>
-                              </w:rPr>
-                              <w:br/>
-                              <w:t xml:space="preserve">510 </w:t>
-                            </w:r>
-                            <w:r>
-                              <w:rPr>
-                                <w:sz w:val="20"/>
-                                <w:szCs w:val="20"/>
-                              </w:rPr>
-                              <w:t>RETURN</w:t>
-                            </w:r>
-                            <w:r>
-                              <w:rPr>
-                                <w:sz w:val="20"/>
-                                <w:szCs w:val="20"/>
-                              </w:rPr>
-                              <w:br/>
-                            </w:r>
-                            <w:r>
-                              <w:rPr>
-                                <w:i/>
-                                <w:iCs/>
-                                <w:sz w:val="20"/>
-                                <w:szCs w:val="20"/>
-                              </w:rPr>
-                              <w:t>600</w:t>
-                            </w:r>
-                            <w:r>
-                              <w:rPr>
-                                <w:sz w:val="20"/>
-                                <w:szCs w:val="20"/>
-                              </w:rPr>
-                              <w:t xml:space="preserve"> DATA </w:t>
-                            </w:r>
-                            <w:r>
-                              <w:rPr>
-                                <w:i/>
-                                <w:iCs/>
-                                <w:sz w:val="20"/>
-                                <w:szCs w:val="20"/>
-                              </w:rPr>
-                              <w:t>128</w:t>
-                            </w:r>
-                            <w:r>
-                              <w:rPr>
-                                <w:sz w:val="20"/>
-                                <w:szCs w:val="20"/>
-                              </w:rPr>
-                              <w:t>,</w:t>
-                            </w:r>
-                            <w:r>
-                              <w:rPr>
-                                <w:i/>
-                                <w:iCs/>
-                                <w:sz w:val="20"/>
-                                <w:szCs w:val="20"/>
-                              </w:rPr>
-                              <w:t>6</w:t>
-                            </w:r>
-                            <w:r>
-                              <w:rPr>
-                                <w:i/>
-                                <w:iCs/>
-                                <w:sz w:val="20"/>
-                                <w:szCs w:val="20"/>
-                              </w:rPr>
-                              <w:t>4</w:t>
-                            </w:r>
-                            <w:r>
-                              <w:rPr>
-                                <w:sz w:val="20"/>
-                                <w:szCs w:val="20"/>
-                              </w:rPr>
-                              <w:t>,</w:t>
-                            </w:r>
-                            <w:r>
-                              <w:rPr>
-                                <w:i/>
-                                <w:iCs/>
-                                <w:sz w:val="20"/>
-                                <w:szCs w:val="20"/>
-                              </w:rPr>
-                              <w:t>44</w:t>
-                            </w:r>
-                            <w:r>
-                              <w:rPr>
-                                <w:sz w:val="20"/>
-                                <w:szCs w:val="20"/>
-                              </w:rPr>
-                              <w:t>,</w:t>
-                            </w:r>
-                            <w:r>
-                              <w:rPr>
-                                <w:i/>
-                                <w:iCs/>
-                                <w:sz w:val="20"/>
-                                <w:szCs w:val="20"/>
-                              </w:rPr>
-                              <w:t>18</w:t>
-                            </w:r>
-                            <w:r>
-                              <w:rPr>
-                                <w:sz w:val="20"/>
-                                <w:szCs w:val="20"/>
-                              </w:rPr>
-                              <w:t>,</w:t>
-                            </w:r>
-                            <w:r>
-                              <w:rPr>
-                                <w:i/>
-                                <w:iCs/>
-                                <w:sz w:val="20"/>
-                                <w:szCs w:val="20"/>
-                              </w:rPr>
-                              <w:t>18</w:t>
-                            </w:r>
-                            <w:r>
-                              <w:rPr>
-                                <w:sz w:val="20"/>
-                                <w:szCs w:val="20"/>
-                              </w:rPr>
-                              <w:t>,</w:t>
-                            </w:r>
-                            <w:r>
-                              <w:rPr>
-                                <w:i/>
-                                <w:iCs/>
-                                <w:sz w:val="20"/>
-                                <w:szCs w:val="20"/>
-                              </w:rPr>
-                              <w:t>127</w:t>
-                            </w:r>
-                            <w:r>
-                              <w:rPr>
-                                <w:i/>
-                                <w:iCs/>
-                                <w:sz w:val="20"/>
-                                <w:szCs w:val="20"/>
-                              </w:rPr>
-                              <w:br/>
-                              <w:t>610</w:t>
-                            </w:r>
-                            <w:r>
-                              <w:rPr>
-                                <w:sz w:val="20"/>
-                                <w:szCs w:val="20"/>
-                              </w:rPr>
-                              <w:t xml:space="preserve"> DATA </w:t>
-                            </w:r>
-                            <w:r>
-                              <w:rPr>
-                                <w:i/>
-                                <w:iCs/>
-                                <w:sz w:val="20"/>
-                                <w:szCs w:val="20"/>
-                              </w:rPr>
-                              <w:t>126</w:t>
-                            </w:r>
-                            <w:r>
-                              <w:rPr>
-                                <w:sz w:val="20"/>
-                                <w:szCs w:val="20"/>
-                              </w:rPr>
-                              <w:t>,</w:t>
-                            </w:r>
-                            <w:r>
-                              <w:rPr>
-                                <w:i/>
-                                <w:iCs/>
-                                <w:sz w:val="20"/>
-                                <w:szCs w:val="20"/>
-                              </w:rPr>
-                              <w:t>60</w:t>
-                            </w:r>
-                            <w:r>
-                              <w:rPr>
-                                <w:sz w:val="20"/>
-                                <w:szCs w:val="20"/>
-                              </w:rPr>
-                              <w:t>,</w:t>
-                            </w:r>
-                            <w:r>
-                              <w:rPr>
-                                <w:i/>
-                                <w:iCs/>
-                                <w:sz w:val="20"/>
-                                <w:szCs w:val="20"/>
-                              </w:rPr>
-                              <w:t>195</w:t>
-                            </w:r>
-                            <w:r>
-                              <w:rPr>
-                                <w:sz w:val="20"/>
-                                <w:szCs w:val="20"/>
-                              </w:rPr>
-                              <w:t>,</w:t>
-                            </w:r>
-                            <w:r>
-                              <w:rPr>
-                                <w:i/>
-                                <w:iCs/>
-                                <w:sz w:val="20"/>
-                                <w:szCs w:val="20"/>
-                              </w:rPr>
-                              <w:t>153</w:t>
-                            </w:r>
-                            <w:r>
-                              <w:rPr>
-                                <w:sz w:val="20"/>
-                                <w:szCs w:val="20"/>
-                              </w:rPr>
-                              <w:t>,</w:t>
-                            </w:r>
-                            <w:r>
-                              <w:rPr>
-                                <w:i/>
-                                <w:iCs/>
-                                <w:sz w:val="20"/>
-                                <w:szCs w:val="20"/>
-                              </w:rPr>
-                              <w:t>195</w:t>
-                            </w:r>
-                            <w:r>
-                              <w:rPr>
-                                <w:sz w:val="20"/>
-                                <w:szCs w:val="20"/>
-                              </w:rPr>
-                              <w:t>,</w:t>
-                            </w:r>
-                            <w:r>
-                              <w:rPr>
-                                <w:i/>
-                                <w:iCs/>
-                                <w:sz w:val="20"/>
-                                <w:szCs w:val="20"/>
-                              </w:rPr>
-                              <w:t>60</w:t>
-                            </w:r>
-                            <w:r>
-                              <w:rPr>
-                                <w:i/>
-                                <w:iCs/>
-                                <w:sz w:val="20"/>
-                                <w:szCs w:val="20"/>
-                              </w:rPr>
-                              <w:br/>
-                              <w:t>620</w:t>
-                            </w:r>
-                            <w:r>
-                              <w:rPr>
-                                <w:sz w:val="20"/>
-                                <w:szCs w:val="20"/>
-                              </w:rPr>
-                              <w:t xml:space="preserve"> DATA </w:t>
-                            </w:r>
-                            <w:r>
-                              <w:rPr>
-                                <w:i/>
-                                <w:iCs/>
-                                <w:sz w:val="20"/>
-                                <w:szCs w:val="20"/>
-                              </w:rPr>
-                              <w:t>0</w:t>
-                            </w:r>
-                            <w:r>
-                              <w:rPr>
-                                <w:sz w:val="20"/>
-                                <w:szCs w:val="20"/>
-                              </w:rPr>
-                              <w:t>,</w:t>
-                            </w:r>
-                            <w:r>
-                              <w:rPr>
-                                <w:i/>
-                                <w:iCs/>
-                                <w:sz w:val="20"/>
-                                <w:szCs w:val="20"/>
-                              </w:rPr>
-                              <w:t>0</w:t>
-                            </w:r>
-                            <w:r>
-                              <w:rPr>
-                                <w:sz w:val="20"/>
-                                <w:szCs w:val="20"/>
-                              </w:rPr>
-                              <w:t>,</w:t>
-                            </w:r>
-                            <w:r>
-                              <w:rPr>
-                                <w:i/>
-                                <w:iCs/>
-                                <w:sz w:val="20"/>
-                                <w:szCs w:val="20"/>
-                              </w:rPr>
-                              <w:t>0</w:t>
-                            </w:r>
-                            <w:r>
-                              <w:rPr>
-                                <w:sz w:val="20"/>
-                                <w:szCs w:val="20"/>
-                              </w:rPr>
-                              <w:t>,</w:t>
-                            </w:r>
-                            <w:r>
-                              <w:rPr>
-                                <w:i/>
-                                <w:iCs/>
-                                <w:sz w:val="20"/>
-                                <w:szCs w:val="20"/>
-                              </w:rPr>
-                              <w:t>0</w:t>
-                            </w:r>
-                            <w:r>
-                              <w:rPr>
-                                <w:sz w:val="20"/>
-                                <w:szCs w:val="20"/>
-                              </w:rPr>
-                              <w:t>,</w:t>
-                            </w:r>
-                            <w:r>
-                              <w:rPr>
-                                <w:i/>
-                                <w:iCs/>
-                                <w:sz w:val="20"/>
-                                <w:szCs w:val="20"/>
-                              </w:rPr>
-                              <w:t>0</w:t>
-                            </w:r>
-                            <w:r>
-                              <w:rPr>
-                                <w:sz w:val="20"/>
-                                <w:szCs w:val="20"/>
-                              </w:rPr>
-                              <w:t>,</w:t>
-                            </w:r>
-                            <w:r>
-                              <w:rPr>
-                                <w:i/>
-                                <w:iCs/>
-                                <w:sz w:val="20"/>
-                                <w:szCs w:val="20"/>
-                              </w:rPr>
-                              <w:t>0</w:t>
+                              <w:t>620 DATA 60,0,0,0,0,0</w:t>
                             </w:r>
                           </w:p>
                           <w:p>
                             <w:pPr>
                               <w:rPr>
-                                <w:sz w:val="20"/>
-                                <w:szCs w:val="20"/>
+                                <w:sz w:val="16"/>
+                                <w:szCs w:val="16"/>
                               </w:rPr>
                             </w:pPr>
                           </w:p>
@@ -2283,62 +1362,127 @@
                     <w:p>
                       <w:pPr>
                         <w:rPr>
-                          <w:sz w:val="20"/>
-                          <w:szCs w:val="20"/>
+                          <w:i/>
+                          <w:iCs/>
+                          <w:sz w:val="16"/>
+                          <w:szCs w:val="16"/>
                         </w:rPr>
                       </w:pPr>
                       <w:r>
                         <w:rPr>
                           <w:i/>
                           <w:iCs/>
-                          <w:sz w:val="20"/>
-                          <w:szCs w:val="20"/>
+                          <w:sz w:val="16"/>
+                          <w:szCs w:val="16"/>
                         </w:rPr>
-                        <w:t>10</w:t>
-                      </w:r>
-                      <w:r>
-                        <w:rPr>
-                          <w:sz w:val="20"/>
-                          <w:szCs w:val="20"/>
-                        </w:rPr>
-                        <w:t xml:space="preserve"> DIM A$(</w:t>
+                        <w:t>10 GRAPHICS 8</w:t>
                       </w:r>
                       <w:r>
                         <w:rPr>
                           <w:i/>
                           <w:iCs/>
-                          <w:sz w:val="20"/>
-                          <w:szCs w:val="20"/>
+                          <w:sz w:val="16"/>
+                          <w:szCs w:val="16"/>
                         </w:rPr>
-                        <w:t>10</w:t>
-                      </w:r>
-                      <w:r>
-                        <w:rPr>
-                          <w:sz w:val="20"/>
-                          <w:szCs w:val="20"/>
-                        </w:rPr>
-                        <w:t>),B$(</w:t>
+                        <w:br/>
+                        <w:t>20 POKE 559,62          :REM SDMCTL Direct Memory Access (DMA) enable</w:t>
                       </w:r>
                       <w:r>
                         <w:rPr>
                           <w:i/>
                           <w:iCs/>
-                          <w:sz w:val="20"/>
-                          <w:szCs w:val="20"/>
+                          <w:sz w:val="16"/>
+                          <w:szCs w:val="16"/>
                         </w:rPr>
-                        <w:t>100</w:t>
+                        <w:br/>
+                        <w:t>30 POKE 53248,20       :REM 53248 HPOSP0 (W) Horizontal position of player 0</w:t>
                       </w:r>
                       <w:r>
                         <w:rPr>
-                          <w:sz w:val="20"/>
-                          <w:szCs w:val="20"/>
+                          <w:i/>
+                          <w:iCs/>
+                          <w:sz w:val="16"/>
+                          <w:szCs w:val="16"/>
                         </w:rPr>
-                        <w:t>)</w:t>
+                        <w:br/>
+                        <w:t>40 WHT=15</w:t>
                       </w:r>
                       <w:r>
                         <w:rPr>
-                          <w:sz w:val="20"/>
-                          <w:szCs w:val="20"/>
+                          <w:i/>
+                          <w:iCs/>
+                          <w:sz w:val="16"/>
+                          <w:szCs w:val="16"/>
+                        </w:rPr>
+                        <w:br/>
+                        <w:t xml:space="preserve">50 POKE 704,WHT         :REM Locations 704 to 712 ($2C0 to $2C8) are the color registers for players, </w:t>
+                      </w:r>
+                      <w:proofErr w:type="spellStart"/>
+                      <w:r>
+                        <w:rPr>
+                          <w:i/>
+                          <w:iCs/>
+                          <w:sz w:val="16"/>
+                          <w:szCs w:val="16"/>
+                        </w:rPr>
+                        <w:t>missiles,and</w:t>
+                      </w:r>
+                      <w:proofErr w:type="spellEnd"/>
+                      <w:r>
+                        <w:rPr>
+                          <w:i/>
+                          <w:iCs/>
+                          <w:sz w:val="16"/>
+                          <w:szCs w:val="16"/>
+                        </w:rPr>
+                        <w:t xml:space="preserve"> playfields</w:t>
+                      </w:r>
+                      <w:r>
+                        <w:rPr>
+                          <w:i/>
+                          <w:iCs/>
+                          <w:sz w:val="16"/>
+                          <w:szCs w:val="16"/>
+                        </w:rPr>
+                        <w:br/>
+                        <w:t>60 I=PEEK(106)-8        :REM RAMTOP - RAM size, defined by powerup</w:t>
+                      </w:r>
+                      <w:r>
+                        <w:rPr>
+                          <w:i/>
+                          <w:iCs/>
+                          <w:sz w:val="16"/>
+                          <w:szCs w:val="16"/>
+                        </w:rPr>
+                        <w:br/>
+                        <w:t>70 POKE 54279,I         :REM CONSOL (W/R) Used to see if one of the three yellow console buttons has been pressed (not the RESET button!).</w:t>
+                      </w:r>
+                      <w:r>
+                        <w:rPr>
+                          <w:i/>
+                          <w:iCs/>
+                          <w:sz w:val="16"/>
+                          <w:szCs w:val="16"/>
+                        </w:rPr>
+                        <w:br/>
+                        <w:t>80 POKE 53277,3         :REM GRACTL (W) Used to turn on players and to turn on missiles.</w:t>
+                      </w:r>
+                      <w:r>
+                        <w:rPr>
+                          <w:i/>
+                          <w:iCs/>
+                          <w:sz w:val="16"/>
+                          <w:szCs w:val="16"/>
+                        </w:rPr>
+                        <w:br/>
+                        <w:t>90 POKE 53256,3         :REM SIZEP0 (W) Size of player 0.</w:t>
+                      </w:r>
+                      <w:r>
+                        <w:rPr>
+                          <w:i/>
+                          <w:iCs/>
+                          <w:sz w:val="16"/>
+                          <w:szCs w:val="16"/>
                         </w:rPr>
                         <w:br/>
                       </w:r>
@@ -2346,80 +1490,48 @@
                         <w:rPr>
                           <w:i/>
                           <w:iCs/>
-                          <w:sz w:val="20"/>
-                          <w:szCs w:val="20"/>
+                          <w:sz w:val="16"/>
+                          <w:szCs w:val="16"/>
                         </w:rPr>
-                        <w:t>20</w:t>
-                      </w:r>
-                      <w:r>
-                        <w:rPr>
-                          <w:sz w:val="20"/>
-                          <w:szCs w:val="20"/>
-                        </w:rPr>
-                        <w:t xml:space="preserve"> GRAPHICS </w:t>
+                        <w:br/>
+                        <w:t>100 REM DRAW 10 LINES (BACKGROUND)</w:t>
                       </w:r>
                       <w:r>
                         <w:rPr>
                           <w:i/>
                           <w:iCs/>
-                          <w:sz w:val="20"/>
-                          <w:szCs w:val="20"/>
+                          <w:sz w:val="16"/>
+                          <w:szCs w:val="16"/>
                         </w:rPr>
-                        <w:t>8</w:t>
+                        <w:br/>
+                        <w:t>110 FOR A = 70 TO 100 STEP 3</w:t>
                       </w:r>
                       <w:r>
                         <w:rPr>
                           <w:i/>
                           <w:iCs/>
-                          <w:sz w:val="20"/>
-                          <w:szCs w:val="20"/>
+                          <w:sz w:val="16"/>
+                          <w:szCs w:val="16"/>
                         </w:rPr>
                         <w:br/>
-                        <w:t>30</w:t>
-                      </w:r>
-                      <w:r>
-                        <w:rPr>
-                          <w:sz w:val="20"/>
-                          <w:szCs w:val="20"/>
-                        </w:rPr>
-                        <w:t xml:space="preserve"> POKE </w:t>
+                        <w:t>120 COLOR 1: PLOT 100,A: DRAWTO 315,A+20</w:t>
                       </w:r>
                       <w:r>
                         <w:rPr>
                           <w:i/>
                           <w:iCs/>
-                          <w:sz w:val="20"/>
-                          <w:szCs w:val="20"/>
+                          <w:sz w:val="16"/>
+                          <w:szCs w:val="16"/>
                         </w:rPr>
-                        <w:t>559</w:t>
-                      </w:r>
-                      <w:r>
-                        <w:rPr>
-                          <w:sz w:val="20"/>
-                          <w:szCs w:val="20"/>
-                        </w:rPr>
-                        <w:t>,</w:t>
+                        <w:br/>
+                        <w:t>130 NEXT A</w:t>
                       </w:r>
                       <w:r>
                         <w:rPr>
                           <w:i/>
                           <w:iCs/>
-                          <w:sz w:val="20"/>
-                          <w:szCs w:val="20"/>
-                        </w:rPr>
-                        <w:t>62</w:t>
-                      </w:r>
-                      <w:r>
-                        <w:rPr>
-                          <w:sz w:val="20"/>
-                          <w:szCs w:val="20"/>
-                        </w:rPr>
-                        <w:t xml:space="preserve">          :REM SDMCTL Direct Memory Access (DMA) enable</w:t>
-                      </w:r>
-                      <w:r>
-                        <w:rPr>
-                          <w:sz w:val="20"/>
-                          <w:szCs w:val="20"/>
+                          <w:sz w:val="16"/>
+                          <w:szCs w:val="16"/>
                         </w:rPr>
                         <w:br/>
                       </w:r>
@@ -2427,176 +1539,108 @@
                         <w:rPr>
                           <w:i/>
                           <w:iCs/>
-                          <w:sz w:val="20"/>
-                          <w:szCs w:val="20"/>
+                          <w:sz w:val="16"/>
+                          <w:szCs w:val="16"/>
                         </w:rPr>
-                        <w:t>40</w:t>
-                      </w:r>
-                      <w:r>
-                        <w:rPr>
-                          <w:sz w:val="20"/>
-                          <w:szCs w:val="20"/>
-                        </w:rPr>
-                        <w:t xml:space="preserve"> POKE </w:t>
+                        <w:br/>
+                        <w:t>200 J=I*256+1024</w:t>
                       </w:r>
                       <w:r>
                         <w:rPr>
                           <w:i/>
                           <w:iCs/>
-                          <w:sz w:val="20"/>
-                          <w:szCs w:val="20"/>
+                          <w:sz w:val="16"/>
+                          <w:szCs w:val="16"/>
                         </w:rPr>
-                        <w:t>53248</w:t>
-                      </w:r>
-                      <w:r>
-                        <w:rPr>
-                          <w:sz w:val="20"/>
-                          <w:szCs w:val="20"/>
-                        </w:rPr>
-                        <w:t>,</w:t>
+                        <w:br/>
+                        <w:t>210 FOR Y=J+120 TO J+137</w:t>
                       </w:r>
                       <w:r>
                         <w:rPr>
                           <w:i/>
                           <w:iCs/>
-                          <w:sz w:val="20"/>
-                          <w:szCs w:val="20"/>
+                          <w:sz w:val="16"/>
+                          <w:szCs w:val="16"/>
                         </w:rPr>
-                        <w:t>120</w:t>
-                      </w:r>
-                      <w:r>
-                        <w:rPr>
-                          <w:sz w:val="20"/>
-                          <w:szCs w:val="20"/>
-                        </w:rPr>
-                        <w:t xml:space="preserve">       :REM </w:t>
+                        <w:br/>
+                        <w:t>220 READ Z</w:t>
                       </w:r>
                       <w:r>
                         <w:rPr>
                           <w:i/>
                           <w:iCs/>
-                          <w:sz w:val="20"/>
-                          <w:szCs w:val="20"/>
+                          <w:sz w:val="16"/>
+                          <w:szCs w:val="16"/>
                         </w:rPr>
-                        <w:t xml:space="preserve">53248 </w:t>
-                      </w:r>
-                      <w:r>
-                        <w:rPr>
-                          <w:sz w:val="20"/>
-                          <w:szCs w:val="20"/>
-                        </w:rPr>
-                        <w:t xml:space="preserve">HPOSP0 (W) Horizontal position of player </w:t>
+                        <w:br/>
+                        <w:t>230 POKE Y,Z</w:t>
                       </w:r>
                       <w:r>
                         <w:rPr>
                           <w:i/>
                           <w:iCs/>
-                          <w:sz w:val="20"/>
-                          <w:szCs w:val="20"/>
+                          <w:sz w:val="16"/>
+                          <w:szCs w:val="16"/>
                         </w:rPr>
-                        <w:t>0</w:t>
+                        <w:br/>
+                        <w:t>240 NEXT Y</w:t>
                       </w:r>
                       <w:r>
                         <w:rPr>
                           <w:i/>
                           <w:iCs/>
-                          <w:sz w:val="20"/>
-                          <w:szCs w:val="20"/>
+                          <w:sz w:val="16"/>
+                          <w:szCs w:val="16"/>
                         </w:rPr>
                         <w:br/>
-                        <w:t>50</w:t>
-                      </w:r>
-                      <w:r>
-                        <w:rPr>
-                          <w:sz w:val="20"/>
-                          <w:szCs w:val="20"/>
-                        </w:rPr>
-                        <w:t xml:space="preserve"> POKE </w:t>
+                        <w:t>250 FOR X=221 TO 48 STEP -1:GOSUB 500:NEXT X</w:t>
                       </w:r>
                       <w:r>
                         <w:rPr>
                           <w:i/>
                           <w:iCs/>
-                          <w:sz w:val="20"/>
-                          <w:szCs w:val="20"/>
+                          <w:sz w:val="16"/>
+                          <w:szCs w:val="16"/>
                         </w:rPr>
-                        <w:t>704</w:t>
-                      </w:r>
-                      <w:r>
-                        <w:rPr>
-                          <w:sz w:val="20"/>
-                          <w:szCs w:val="20"/>
-                        </w:rPr>
-                        <w:t>,</w:t>
+                        <w:br/>
+                        <w:t>260 GOTO 250</w:t>
                       </w:r>
                       <w:r>
                         <w:rPr>
                           <w:i/>
                           <w:iCs/>
-                          <w:sz w:val="20"/>
-                          <w:szCs w:val="20"/>
+                          <w:sz w:val="16"/>
+                          <w:szCs w:val="16"/>
                         </w:rPr>
-                        <w:t>88</w:t>
-                      </w:r>
-                      <w:r>
-                        <w:rPr>
-                          <w:sz w:val="20"/>
-                          <w:szCs w:val="20"/>
-                        </w:rPr>
-                        <w:t xml:space="preserve">          :REM Locations </w:t>
+                        <w:br/>
+                        <w:t>320 POKE Y,Z</w:t>
                       </w:r>
                       <w:r>
                         <w:rPr>
                           <w:i/>
                           <w:iCs/>
-                          <w:sz w:val="20"/>
-                          <w:szCs w:val="20"/>
+                          <w:sz w:val="16"/>
+                          <w:szCs w:val="16"/>
                         </w:rPr>
-                        <w:t xml:space="preserve">704 </w:t>
-                      </w:r>
-                      <w:r>
-                        <w:rPr>
-                          <w:sz w:val="20"/>
-                          <w:szCs w:val="20"/>
-                        </w:rPr>
-                        <w:t xml:space="preserve">to </w:t>
+                        <w:br/>
+                        <w:t>500 POKE 53248,X        :REM 53248 HPOSP0 (W) Horizontal position of player 0</w:t>
                       </w:r>
                       <w:r>
                         <w:rPr>
                           <w:i/>
                           <w:iCs/>
-                          <w:sz w:val="20"/>
-                          <w:szCs w:val="20"/>
+                          <w:sz w:val="16"/>
+                          <w:szCs w:val="16"/>
                         </w:rPr>
-                        <w:t xml:space="preserve">712 </w:t>
+                        <w:br/>
+                        <w:t>510 RETURN</w:t>
                       </w:r>
                       <w:r>
                         <w:rPr>
-                          <w:sz w:val="20"/>
-                          <w:szCs w:val="20"/>
-                        </w:rPr>
-                        <w:t xml:space="preserve">($2C0 to $2C8) are the color registers for players, </w:t>
-                      </w:r>
-                      <w:proofErr w:type="spellStart"/>
-                      <w:r>
-                        <w:rPr>
-                          <w:sz w:val="20"/>
-                          <w:szCs w:val="20"/>
-                        </w:rPr>
-                        <w:t>missiles,and</w:t>
-                      </w:r>
-                      <w:proofErr w:type="spellEnd"/>
-                      <w:r>
-                        <w:rPr>
-                          <w:sz w:val="20"/>
-                          <w:szCs w:val="20"/>
-                        </w:rPr>
-                        <w:t xml:space="preserve"> playfields</w:t>
-                      </w:r>
-                      <w:r>
-                        <w:rPr>
-                          <w:sz w:val="20"/>
-                          <w:szCs w:val="20"/>
+                          <w:i/>
+                          <w:iCs/>
+                          <w:sz w:val="16"/>
+                          <w:szCs w:val="16"/>
                         </w:rPr>
                         <w:br/>
                       </w:r>
@@ -2604,924 +1648,38 @@
                         <w:rPr>
                           <w:i/>
                           <w:iCs/>
-                          <w:sz w:val="20"/>
-                          <w:szCs w:val="20"/>
+                          <w:sz w:val="16"/>
+                          <w:szCs w:val="16"/>
                         </w:rPr>
-                        <w:t xml:space="preserve">60 </w:t>
-                      </w:r>
-                      <w:r>
-                        <w:rPr>
-                          <w:sz w:val="20"/>
-                          <w:szCs w:val="20"/>
-                        </w:rPr>
-                        <w:t>I=PEEK(</w:t>
+                        <w:br/>
+                        <w:t>600 DATA 128,64,44,18,18,18</w:t>
                       </w:r>
                       <w:r>
                         <w:rPr>
                           <w:i/>
                           <w:iCs/>
-                          <w:sz w:val="20"/>
-                          <w:szCs w:val="20"/>
+                          <w:sz w:val="16"/>
+                          <w:szCs w:val="16"/>
                         </w:rPr>
-                        <w:t>106</w:t>
-                      </w:r>
-                      <w:r>
-                        <w:rPr>
-                          <w:sz w:val="20"/>
-                          <w:szCs w:val="20"/>
-                        </w:rPr>
-                        <w:t>)</w:t>
+                        <w:br/>
+                        <w:t>610 DATA 127,129,60,195,153,195</w:t>
                       </w:r>
                       <w:r>
                         <w:rPr>
                           <w:i/>
                           <w:iCs/>
-                          <w:sz w:val="20"/>
-                          <w:szCs w:val="20"/>
-                        </w:rPr>
-                        <w:t>-8</w:t>
-                      </w:r>
-                      <w:r>
-                        <w:rPr>
-                          <w:sz w:val="20"/>
-                          <w:szCs w:val="20"/>
-                        </w:rPr>
-                        <w:t xml:space="preserve">        :REM RAMTOP - RAM size, defined by powerup</w:t>
-                      </w:r>
-                      <w:r>
-                        <w:rPr>
-                          <w:sz w:val="20"/>
-                          <w:szCs w:val="20"/>
+                          <w:sz w:val="16"/>
+                          <w:szCs w:val="16"/>
                         </w:rPr>
                         <w:br/>
-                      </w:r>
-                      <w:r>
-                        <w:rPr>
-                          <w:i/>
-                          <w:iCs/>
-                          <w:sz w:val="20"/>
-                          <w:szCs w:val="20"/>
-                        </w:rPr>
-                        <w:t>70</w:t>
-                      </w:r>
-                      <w:r>
-                        <w:rPr>
-                          <w:sz w:val="20"/>
-                          <w:szCs w:val="20"/>
-                        </w:rPr>
-                        <w:t xml:space="preserve"> POKE </w:t>
-                      </w:r>
-                      <w:r>
-                        <w:rPr>
-                          <w:i/>
-                          <w:iCs/>
-                          <w:sz w:val="20"/>
-                          <w:szCs w:val="20"/>
-                        </w:rPr>
-                        <w:t>54279</w:t>
-                      </w:r>
-                      <w:r>
-                        <w:rPr>
-                          <w:sz w:val="20"/>
-                          <w:szCs w:val="20"/>
-                        </w:rPr>
-                        <w:t xml:space="preserve">,I         :REM CONSOL (W/R) Used to see if one of the three yellow console buttons has </w:t>
-                      </w:r>
-                      <w:r>
-                        <w:rPr>
-                          <w:i/>
-                          <w:iCs/>
-                          <w:sz w:val="20"/>
-                          <w:szCs w:val="20"/>
-                        </w:rPr>
-                        <w:t xml:space="preserve">been </w:t>
-                      </w:r>
-                      <w:r>
-                        <w:rPr>
-                          <w:sz w:val="20"/>
-                          <w:szCs w:val="20"/>
-                        </w:rPr>
-                        <w:t>pressed (not the RESET button!).</w:t>
-                      </w:r>
-                      <w:r>
-                        <w:rPr>
-                          <w:sz w:val="20"/>
-                          <w:szCs w:val="20"/>
-                        </w:rPr>
-                        <w:br/>
-                      </w:r>
-                      <w:r>
-                        <w:rPr>
-                          <w:i/>
-                          <w:iCs/>
-                          <w:sz w:val="20"/>
-                          <w:szCs w:val="20"/>
-                        </w:rPr>
-                        <w:t>80</w:t>
-                      </w:r>
-                      <w:r>
-                        <w:rPr>
-                          <w:sz w:val="20"/>
-                          <w:szCs w:val="20"/>
-                        </w:rPr>
-                        <w:t xml:space="preserve"> POKE </w:t>
-                      </w:r>
-                      <w:r>
-                        <w:rPr>
-                          <w:i/>
-                          <w:iCs/>
-                          <w:sz w:val="20"/>
-                          <w:szCs w:val="20"/>
-                        </w:rPr>
-                        <w:t>53277</w:t>
-                      </w:r>
-                      <w:r>
-                        <w:rPr>
-                          <w:sz w:val="20"/>
-                          <w:szCs w:val="20"/>
-                        </w:rPr>
-                        <w:t>,</w:t>
-                      </w:r>
-                      <w:r>
-                        <w:rPr>
-                          <w:i/>
-                          <w:iCs/>
-                          <w:sz w:val="20"/>
-                          <w:szCs w:val="20"/>
-                        </w:rPr>
-                        <w:t>3</w:t>
-                      </w:r>
-                      <w:r>
-                        <w:rPr>
-                          <w:sz w:val="20"/>
-                          <w:szCs w:val="20"/>
-                        </w:rPr>
-                        <w:t xml:space="preserve">         :REM GRACTL (W) Used to turn on players and to turn on missiles.</w:t>
-                      </w:r>
-                      <w:r>
-                        <w:rPr>
-                          <w:sz w:val="20"/>
-                          <w:szCs w:val="20"/>
-                        </w:rPr>
-                        <w:br/>
-                      </w:r>
-                      <w:r>
-                        <w:rPr>
-                          <w:i/>
-                          <w:iCs/>
-                          <w:sz w:val="20"/>
-                          <w:szCs w:val="20"/>
-                        </w:rPr>
-                        <w:t>90</w:t>
-                      </w:r>
-                      <w:r>
-                        <w:rPr>
-                          <w:sz w:val="20"/>
-                          <w:szCs w:val="20"/>
-                        </w:rPr>
-                        <w:t xml:space="preserve"> POKE </w:t>
-                      </w:r>
-                      <w:r>
-                        <w:rPr>
-                          <w:i/>
-                          <w:iCs/>
-                          <w:sz w:val="20"/>
-                          <w:szCs w:val="20"/>
-                        </w:rPr>
-                        <w:t>53256</w:t>
-                      </w:r>
-                      <w:r>
-                        <w:rPr>
-                          <w:sz w:val="20"/>
-                          <w:szCs w:val="20"/>
-                        </w:rPr>
-                        <w:t>,</w:t>
-                      </w:r>
-                      <w:r>
-                        <w:rPr>
-                          <w:i/>
-                          <w:iCs/>
-                          <w:sz w:val="20"/>
-                          <w:szCs w:val="20"/>
-                        </w:rPr>
-                        <w:t>3</w:t>
-                      </w:r>
-                      <w:r>
-                        <w:rPr>
-                          <w:sz w:val="20"/>
-                          <w:szCs w:val="20"/>
-                        </w:rPr>
-                        <w:t xml:space="preserve">         :REM SIZEP0 (W) Size of player </w:t>
-                      </w:r>
-                      <w:r>
-                        <w:rPr>
-                          <w:i/>
-                          <w:iCs/>
-                          <w:sz w:val="20"/>
-                          <w:szCs w:val="20"/>
-                        </w:rPr>
-                        <w:t>0</w:t>
-                      </w:r>
-                      <w:r>
-                        <w:rPr>
-                          <w:sz w:val="20"/>
-                          <w:szCs w:val="20"/>
-                        </w:rPr>
-                        <w:t>.</w:t>
-                      </w:r>
-                      <w:r>
-                        <w:rPr>
-                          <w:sz w:val="20"/>
-                          <w:szCs w:val="20"/>
-                        </w:rPr>
-                        <w:br/>
-                      </w:r>
-                      <w:r>
-                        <w:rPr>
-                          <w:i/>
-                          <w:iCs/>
-                          <w:sz w:val="20"/>
-                          <w:szCs w:val="20"/>
-                        </w:rPr>
-                        <w:t xml:space="preserve">100 </w:t>
-                      </w:r>
-                      <w:r>
-                        <w:rPr>
-                          <w:sz w:val="20"/>
-                          <w:szCs w:val="20"/>
-                        </w:rPr>
-                        <w:t>J=I*</w:t>
-                      </w:r>
-                      <w:r>
-                        <w:rPr>
-                          <w:i/>
-                          <w:iCs/>
-                          <w:sz w:val="20"/>
-                          <w:szCs w:val="20"/>
-                        </w:rPr>
-                        <w:t>256</w:t>
-                      </w:r>
-                      <w:r>
-                        <w:rPr>
-                          <w:sz w:val="20"/>
-                          <w:szCs w:val="20"/>
-                        </w:rPr>
-                        <w:t>+</w:t>
-                      </w:r>
-                      <w:r>
-                        <w:rPr>
-                          <w:i/>
-                          <w:iCs/>
-                          <w:sz w:val="20"/>
-                          <w:szCs w:val="20"/>
-                        </w:rPr>
-                        <w:t>1024</w:t>
-                      </w:r>
-                      <w:r>
-                        <w:rPr>
-                          <w:i/>
-                          <w:iCs/>
-                          <w:sz w:val="20"/>
-                          <w:szCs w:val="20"/>
-                        </w:rPr>
-                        <w:br/>
-                        <w:t xml:space="preserve">110 </w:t>
-                      </w:r>
-                      <w:r>
-                        <w:rPr>
-                          <w:sz w:val="20"/>
-                          <w:szCs w:val="20"/>
-                        </w:rPr>
-                        <w:t>FOR Y=J+</w:t>
-                      </w:r>
-                      <w:r>
-                        <w:rPr>
-                          <w:i/>
-                          <w:iCs/>
-                          <w:sz w:val="20"/>
-                          <w:szCs w:val="20"/>
-                        </w:rPr>
-                        <w:t xml:space="preserve">120 </w:t>
-                      </w:r>
-                      <w:r>
-                        <w:rPr>
-                          <w:sz w:val="20"/>
-                          <w:szCs w:val="20"/>
-                        </w:rPr>
-                        <w:t>TO J+</w:t>
-                      </w:r>
-                      <w:r>
-                        <w:rPr>
-                          <w:i/>
-                          <w:iCs/>
-                          <w:sz w:val="20"/>
-                          <w:szCs w:val="20"/>
-                        </w:rPr>
-                        <w:t>137</w:t>
-                      </w:r>
-                      <w:r>
-                        <w:rPr>
-                          <w:i/>
-                          <w:iCs/>
-                          <w:sz w:val="20"/>
-                          <w:szCs w:val="20"/>
-                        </w:rPr>
-                        <w:br/>
-                        <w:t>120</w:t>
-                      </w:r>
-                      <w:r>
-                        <w:rPr>
-                          <w:sz w:val="20"/>
-                          <w:szCs w:val="20"/>
-                        </w:rPr>
-                        <w:t xml:space="preserve"> READ Z</w:t>
-                      </w:r>
-                      <w:r>
-                        <w:rPr>
-                          <w:sz w:val="20"/>
-                          <w:szCs w:val="20"/>
-                        </w:rPr>
-                        <w:br/>
-                      </w:r>
-                      <w:r>
-                        <w:rPr>
-                          <w:i/>
-                          <w:iCs/>
-                          <w:sz w:val="20"/>
-                          <w:szCs w:val="20"/>
-                        </w:rPr>
-                        <w:t>130</w:t>
-                      </w:r>
-                      <w:r>
-                        <w:rPr>
-                          <w:sz w:val="20"/>
-                          <w:szCs w:val="20"/>
-                        </w:rPr>
-                        <w:t xml:space="preserve"> POKE Y,Z</w:t>
-                      </w:r>
-                      <w:r>
-                        <w:rPr>
-                          <w:sz w:val="20"/>
-                          <w:szCs w:val="20"/>
-                        </w:rPr>
-                        <w:br/>
-                      </w:r>
-                      <w:r>
-                        <w:rPr>
-                          <w:i/>
-                          <w:iCs/>
-                          <w:sz w:val="20"/>
-                          <w:szCs w:val="20"/>
-                        </w:rPr>
-                        <w:t xml:space="preserve">140 </w:t>
-                      </w:r>
-                      <w:r>
-                        <w:rPr>
-                          <w:sz w:val="20"/>
-                          <w:szCs w:val="20"/>
-                        </w:rPr>
-                        <w:t>NEXT Y</w:t>
-                      </w:r>
-                      <w:r>
-                        <w:rPr>
-                          <w:sz w:val="20"/>
-                          <w:szCs w:val="20"/>
-                        </w:rPr>
-                        <w:br/>
-                      </w:r>
-                      <w:r>
-                        <w:rPr>
-                          <w:i/>
-                          <w:iCs/>
-                          <w:sz w:val="20"/>
-                          <w:szCs w:val="20"/>
-                        </w:rPr>
-                        <w:t xml:space="preserve">150 </w:t>
-                      </w:r>
-                      <w:r>
-                        <w:rPr>
-                          <w:sz w:val="20"/>
-                          <w:szCs w:val="20"/>
-                        </w:rPr>
-                        <w:t>FOR X=</w:t>
-                      </w:r>
-                      <w:r>
-                        <w:rPr>
-                          <w:i/>
-                          <w:iCs/>
-                          <w:sz w:val="20"/>
-                          <w:szCs w:val="20"/>
-                        </w:rPr>
-                        <w:t xml:space="preserve">48 </w:t>
-                      </w:r>
-                      <w:r>
-                        <w:rPr>
-                          <w:sz w:val="20"/>
-                          <w:szCs w:val="20"/>
-                        </w:rPr>
-                        <w:t xml:space="preserve">TO </w:t>
-                      </w:r>
-                      <w:r>
-                        <w:rPr>
-                          <w:i/>
-                          <w:iCs/>
-                          <w:sz w:val="20"/>
-                          <w:szCs w:val="20"/>
-                        </w:rPr>
-                        <w:t>221</w:t>
-                      </w:r>
-                      <w:r>
-                        <w:rPr>
-                          <w:sz w:val="20"/>
-                          <w:szCs w:val="20"/>
-                        </w:rPr>
-                        <w:t xml:space="preserve">:GOSUB </w:t>
-                      </w:r>
-                      <w:r>
-                        <w:rPr>
-                          <w:i/>
-                          <w:iCs/>
-                          <w:sz w:val="20"/>
-                          <w:szCs w:val="20"/>
-                        </w:rPr>
-                        <w:t>500</w:t>
-                      </w:r>
-                      <w:r>
-                        <w:rPr>
-                          <w:sz w:val="20"/>
-                          <w:szCs w:val="20"/>
-                        </w:rPr>
-                        <w:t>:NEXT X</w:t>
-                      </w:r>
-                      <w:r>
-                        <w:rPr>
-                          <w:sz w:val="20"/>
-                          <w:szCs w:val="20"/>
-                        </w:rPr>
-                        <w:br/>
-                      </w:r>
-                      <w:r>
-                        <w:rPr>
-                          <w:i/>
-                          <w:iCs/>
-                          <w:sz w:val="20"/>
-                          <w:szCs w:val="20"/>
-                        </w:rPr>
-                        <w:t>160</w:t>
-                      </w:r>
-                      <w:r>
-                        <w:rPr>
-                          <w:sz w:val="20"/>
-                          <w:szCs w:val="20"/>
-                        </w:rPr>
-                        <w:t xml:space="preserve"> GOTO </w:t>
-                      </w:r>
-                      <w:r>
-                        <w:rPr>
-                          <w:i/>
-                          <w:iCs/>
-                          <w:sz w:val="20"/>
-                          <w:szCs w:val="20"/>
-                        </w:rPr>
-                        <w:t>150</w:t>
-                      </w:r>
-                      <w:r>
-                        <w:rPr>
-                          <w:i/>
-                          <w:iCs/>
-                          <w:sz w:val="20"/>
-                          <w:szCs w:val="20"/>
-                        </w:rPr>
-                        <w:br/>
-                        <w:t>320</w:t>
-                      </w:r>
-                      <w:r>
-                        <w:rPr>
-                          <w:sz w:val="20"/>
-                          <w:szCs w:val="20"/>
-                        </w:rPr>
-                        <w:t xml:space="preserve"> POKE Y,Z</w:t>
-                      </w:r>
-                      <w:r>
-                        <w:rPr>
-                          <w:sz w:val="20"/>
-                          <w:szCs w:val="20"/>
-                        </w:rPr>
-                        <w:br/>
-                      </w:r>
-                      <w:r>
-                        <w:rPr>
-                          <w:i/>
-                          <w:iCs/>
-                          <w:sz w:val="20"/>
-                          <w:szCs w:val="20"/>
-                        </w:rPr>
-                        <w:t>500</w:t>
-                      </w:r>
-                      <w:r>
-                        <w:rPr>
-                          <w:sz w:val="20"/>
-                          <w:szCs w:val="20"/>
-                        </w:rPr>
-                        <w:t xml:space="preserve"> POKE </w:t>
-                      </w:r>
-                      <w:r>
-                        <w:rPr>
-                          <w:i/>
-                          <w:iCs/>
-                          <w:sz w:val="20"/>
-                          <w:szCs w:val="20"/>
-                        </w:rPr>
-                        <w:t>53248</w:t>
-                      </w:r>
-                      <w:r>
-                        <w:rPr>
-                          <w:sz w:val="20"/>
-                          <w:szCs w:val="20"/>
-                        </w:rPr>
-                        <w:t xml:space="preserve">,X        :REM </w:t>
-                      </w:r>
-                      <w:r>
-                        <w:rPr>
-                          <w:i/>
-                          <w:iCs/>
-                          <w:sz w:val="20"/>
-                          <w:szCs w:val="20"/>
-                        </w:rPr>
-                        <w:t xml:space="preserve">53248 </w:t>
-                      </w:r>
-                      <w:r>
-                        <w:rPr>
-                          <w:sz w:val="20"/>
-                          <w:szCs w:val="20"/>
-                        </w:rPr>
-                        <w:t xml:space="preserve">HPOSP0 (W) Horizontal position of player </w:t>
-                      </w:r>
-                      <w:r>
-                        <w:rPr>
-                          <w:i/>
-                          <w:iCs/>
-                          <w:sz w:val="20"/>
-                          <w:szCs w:val="20"/>
-                        </w:rPr>
-                        <w:t>0</w:t>
-                      </w:r>
-                      <w:r>
-                        <w:rPr>
-                          <w:i/>
-                          <w:iCs/>
-                          <w:sz w:val="20"/>
-                          <w:szCs w:val="20"/>
-                        </w:rPr>
-                        <w:br/>
-                        <w:t xml:space="preserve">510 </w:t>
-                      </w:r>
-                      <w:r>
-                        <w:rPr>
-                          <w:sz w:val="20"/>
-                          <w:szCs w:val="20"/>
-                        </w:rPr>
-                        <w:t>RETURN</w:t>
-                      </w:r>
-                      <w:r>
-                        <w:rPr>
-                          <w:sz w:val="20"/>
-                          <w:szCs w:val="20"/>
-                        </w:rPr>
-                        <w:br/>
-                      </w:r>
-                      <w:r>
-                        <w:rPr>
-                          <w:i/>
-                          <w:iCs/>
-                          <w:sz w:val="20"/>
-                          <w:szCs w:val="20"/>
-                        </w:rPr>
-                        <w:t>600</w:t>
-                      </w:r>
-                      <w:r>
-                        <w:rPr>
-                          <w:sz w:val="20"/>
-                          <w:szCs w:val="20"/>
-                        </w:rPr>
-                        <w:t xml:space="preserve"> DATA </w:t>
-                      </w:r>
-                      <w:r>
-                        <w:rPr>
-                          <w:i/>
-                          <w:iCs/>
-                          <w:sz w:val="20"/>
-                          <w:szCs w:val="20"/>
-                        </w:rPr>
-                        <w:t>128</w:t>
-                      </w:r>
-                      <w:r>
-                        <w:rPr>
-                          <w:sz w:val="20"/>
-                          <w:szCs w:val="20"/>
-                        </w:rPr>
-                        <w:t>,</w:t>
-                      </w:r>
-                      <w:r>
-                        <w:rPr>
-                          <w:i/>
-                          <w:iCs/>
-                          <w:sz w:val="20"/>
-                          <w:szCs w:val="20"/>
-                        </w:rPr>
-                        <w:t>6</w:t>
-                      </w:r>
-                      <w:r>
-                        <w:rPr>
-                          <w:i/>
-                          <w:iCs/>
-                          <w:sz w:val="20"/>
-                          <w:szCs w:val="20"/>
-                        </w:rPr>
-                        <w:t>4</w:t>
-                      </w:r>
-                      <w:r>
-                        <w:rPr>
-                          <w:sz w:val="20"/>
-                          <w:szCs w:val="20"/>
-                        </w:rPr>
-                        <w:t>,</w:t>
-                      </w:r>
-                      <w:r>
-                        <w:rPr>
-                          <w:i/>
-                          <w:iCs/>
-                          <w:sz w:val="20"/>
-                          <w:szCs w:val="20"/>
-                        </w:rPr>
-                        <w:t>44</w:t>
-                      </w:r>
-                      <w:r>
-                        <w:rPr>
-                          <w:sz w:val="20"/>
-                          <w:szCs w:val="20"/>
-                        </w:rPr>
-                        <w:t>,</w:t>
-                      </w:r>
-                      <w:r>
-                        <w:rPr>
-                          <w:i/>
-                          <w:iCs/>
-                          <w:sz w:val="20"/>
-                          <w:szCs w:val="20"/>
-                        </w:rPr>
-                        <w:t>18</w:t>
-                      </w:r>
-                      <w:r>
-                        <w:rPr>
-                          <w:sz w:val="20"/>
-                          <w:szCs w:val="20"/>
-                        </w:rPr>
-                        <w:t>,</w:t>
-                      </w:r>
-                      <w:r>
-                        <w:rPr>
-                          <w:i/>
-                          <w:iCs/>
-                          <w:sz w:val="20"/>
-                          <w:szCs w:val="20"/>
-                        </w:rPr>
-                        <w:t>18</w:t>
-                      </w:r>
-                      <w:r>
-                        <w:rPr>
-                          <w:sz w:val="20"/>
-                          <w:szCs w:val="20"/>
-                        </w:rPr>
-                        <w:t>,</w:t>
-                      </w:r>
-                      <w:r>
-                        <w:rPr>
-                          <w:i/>
-                          <w:iCs/>
-                          <w:sz w:val="20"/>
-                          <w:szCs w:val="20"/>
-                        </w:rPr>
-                        <w:t>127</w:t>
-                      </w:r>
-                      <w:r>
-                        <w:rPr>
-                          <w:i/>
-                          <w:iCs/>
-                          <w:sz w:val="20"/>
-                          <w:szCs w:val="20"/>
-                        </w:rPr>
-                        <w:br/>
-                        <w:t>610</w:t>
-                      </w:r>
-                      <w:r>
-                        <w:rPr>
-                          <w:sz w:val="20"/>
-                          <w:szCs w:val="20"/>
-                        </w:rPr>
-                        <w:t xml:space="preserve"> DATA </w:t>
-                      </w:r>
-                      <w:r>
-                        <w:rPr>
-                          <w:i/>
-                          <w:iCs/>
-                          <w:sz w:val="20"/>
-                          <w:szCs w:val="20"/>
-                        </w:rPr>
-                        <w:t>126</w:t>
-                      </w:r>
-                      <w:r>
-                        <w:rPr>
-                          <w:sz w:val="20"/>
-                          <w:szCs w:val="20"/>
-                        </w:rPr>
-                        <w:t>,</w:t>
-                      </w:r>
-                      <w:r>
-                        <w:rPr>
-                          <w:i/>
-                          <w:iCs/>
-                          <w:sz w:val="20"/>
-                          <w:szCs w:val="20"/>
-                        </w:rPr>
-                        <w:t>60</w:t>
-                      </w:r>
-                      <w:r>
-                        <w:rPr>
-                          <w:sz w:val="20"/>
-                          <w:szCs w:val="20"/>
-                        </w:rPr>
-                        <w:t>,</w:t>
-                      </w:r>
-                      <w:r>
-                        <w:rPr>
-                          <w:i/>
-                          <w:iCs/>
-                          <w:sz w:val="20"/>
-                          <w:szCs w:val="20"/>
-                        </w:rPr>
-                        <w:t>195</w:t>
-                      </w:r>
-                      <w:r>
-                        <w:rPr>
-                          <w:sz w:val="20"/>
-                          <w:szCs w:val="20"/>
-                        </w:rPr>
-                        <w:t>,</w:t>
-                      </w:r>
-                      <w:r>
-                        <w:rPr>
-                          <w:i/>
-                          <w:iCs/>
-                          <w:sz w:val="20"/>
-                          <w:szCs w:val="20"/>
-                        </w:rPr>
-                        <w:t>153</w:t>
-                      </w:r>
-                      <w:r>
-                        <w:rPr>
-                          <w:sz w:val="20"/>
-                          <w:szCs w:val="20"/>
-                        </w:rPr>
-                        <w:t>,</w:t>
-                      </w:r>
-                      <w:r>
-                        <w:rPr>
-                          <w:i/>
-                          <w:iCs/>
-                          <w:sz w:val="20"/>
-                          <w:szCs w:val="20"/>
-                        </w:rPr>
-                        <w:t>195</w:t>
-                      </w:r>
-                      <w:r>
-                        <w:rPr>
-                          <w:sz w:val="20"/>
-                          <w:szCs w:val="20"/>
-                        </w:rPr>
-                        <w:t>,</w:t>
-                      </w:r>
-                      <w:r>
-                        <w:rPr>
-                          <w:i/>
-                          <w:iCs/>
-                          <w:sz w:val="20"/>
-                          <w:szCs w:val="20"/>
-                        </w:rPr>
-                        <w:t>60</w:t>
-                      </w:r>
-                      <w:r>
-                        <w:rPr>
-                          <w:i/>
-                          <w:iCs/>
-                          <w:sz w:val="20"/>
-                          <w:szCs w:val="20"/>
-                        </w:rPr>
-                        <w:br/>
-                        <w:t>620</w:t>
-                      </w:r>
-                      <w:r>
-                        <w:rPr>
-                          <w:sz w:val="20"/>
-                          <w:szCs w:val="20"/>
-                        </w:rPr>
-                        <w:t xml:space="preserve"> DATA </w:t>
-                      </w:r>
-                      <w:r>
-                        <w:rPr>
-                          <w:i/>
-                          <w:iCs/>
-                          <w:sz w:val="20"/>
-                          <w:szCs w:val="20"/>
-                        </w:rPr>
-                        <w:t>0</w:t>
-                      </w:r>
-                      <w:r>
-                        <w:rPr>
-                          <w:sz w:val="20"/>
-                          <w:szCs w:val="20"/>
-                        </w:rPr>
-                        <w:t>,</w:t>
-                      </w:r>
-                      <w:r>
-                        <w:rPr>
-                          <w:i/>
-                          <w:iCs/>
-                          <w:sz w:val="20"/>
-                          <w:szCs w:val="20"/>
-                        </w:rPr>
-                        <w:t>0</w:t>
-                      </w:r>
-                      <w:r>
-                        <w:rPr>
-                          <w:sz w:val="20"/>
-                          <w:szCs w:val="20"/>
-                        </w:rPr>
-                        <w:t>,</w:t>
-                      </w:r>
-                      <w:r>
-                        <w:rPr>
-                          <w:i/>
-                          <w:iCs/>
-                          <w:sz w:val="20"/>
-                          <w:szCs w:val="20"/>
-                        </w:rPr>
-                        <w:t>0</w:t>
-                      </w:r>
-                      <w:r>
-                        <w:rPr>
-                          <w:sz w:val="20"/>
-                          <w:szCs w:val="20"/>
-                        </w:rPr>
-                        <w:t>,</w:t>
-                      </w:r>
-                      <w:r>
-                        <w:rPr>
-                          <w:i/>
-                          <w:iCs/>
-                          <w:sz w:val="20"/>
-                          <w:szCs w:val="20"/>
-                        </w:rPr>
-                        <w:t>0</w:t>
-                      </w:r>
-                      <w:r>
-                        <w:rPr>
-                          <w:sz w:val="20"/>
-                          <w:szCs w:val="20"/>
-                        </w:rPr>
-                        <w:t>,</w:t>
-                      </w:r>
-                      <w:r>
-                        <w:rPr>
-                          <w:i/>
-                          <w:iCs/>
-                          <w:sz w:val="20"/>
-                          <w:szCs w:val="20"/>
-                        </w:rPr>
-                        <w:t>0</w:t>
-                      </w:r>
-                      <w:r>
-                        <w:rPr>
-                          <w:sz w:val="20"/>
-                          <w:szCs w:val="20"/>
-                        </w:rPr>
-                        <w:t>,</w:t>
-                      </w:r>
-                      <w:r>
-                        <w:rPr>
-                          <w:i/>
-                          <w:iCs/>
-                          <w:sz w:val="20"/>
-                          <w:szCs w:val="20"/>
-                        </w:rPr>
-                        <w:t>0</w:t>
+                        <w:t>620 DATA 60,0,0,0,0,0</w:t>
                       </w:r>
                     </w:p>
                     <w:p>
                       <w:pPr>
                         <w:rPr>
-                          <w:sz w:val="20"/>
-                          <w:szCs w:val="20"/>
+                          <w:sz w:val="16"/>
+                          <w:szCs w:val="16"/>
                         </w:rPr>
                       </w:pPr>
                     </w:p>
@@ -12564,7 +10722,6 @@
   <w:style w:type="character" w:default="1" w:styleId="DefaultParagraphFont">
     <w:name w:val="Default Paragraph Font"/>
     <w:uiPriority w:val="1"/>
-    <w:semiHidden/>
     <w:unhideWhenUsed/>
   </w:style>
   <w:style w:type="table" w:default="1" w:styleId="TableNormal">

</xml_diff>

<commit_message>
go: C64Games demo, empty- struct and some improvements to presentation
</commit_message>
<xml_diff>
--- a/LECTURES/DecadesOfSprites/Decades of SPRITES.docx
+++ b/LECTURES/DecadesOfSprites/Decades of SPRITES.docx
@@ -7293,14 +7293,6 @@
     </w:p>
     <w:p>
       <w:pPr>
-        <w:rPr>
-          <w:rFonts w:ascii="C64 Pro Mono" w:hAnsi="C64 Pro Mono"/>
-          <w:color w:val="FFFFFF" w:themeColor="background1"/>
-        </w:rPr>
-      </w:pPr>
-    </w:p>
-    <w:p>
-      <w:pPr>
         <w:pStyle w:val="ListParagraph"/>
         <w:numPr>
           <w:ilvl w:val="0"/>
@@ -7336,19 +7328,258 @@
         </w:rPr>
         <w:t>(Atari 800, C64, Amiga, PC DOS C, Python, Java, JavaScript)</w:t>
       </w:r>
-      <w:r>
+    </w:p>
+    <w:p>
+      <w:pPr>
+        <w:pStyle w:val="ListParagraph"/>
         <w:rPr>
           <w:rFonts w:ascii="C64 Pro Mono" w:hAnsi="C64 Pro Mono"/>
           <w:color w:val="FFFFFF" w:themeColor="background1"/>
           <w:sz w:val="16"/>
           <w:szCs w:val="16"/>
         </w:rPr>
+      </w:pPr>
+    </w:p>
+    <w:p>
+      <w:pPr>
+        <w:pStyle w:val="ListParagraph"/>
+        <w:rPr>
+          <w:rFonts w:ascii="C64 Pro Mono" w:hAnsi="C64 Pro Mono"/>
+          <w:color w:val="FFFFFF" w:themeColor="background1"/>
+        </w:rPr>
+      </w:pPr>
+    </w:p>
+    <w:p>
+      <w:pPr>
+        <w:pStyle w:val="ListParagraph"/>
+        <w:numPr>
+          <w:ilvl w:val="0"/>
+          <w:numId w:val="17"/>
+        </w:numPr>
+        <w:rPr>
+          <w:rFonts w:ascii="C64 Pro Mono" w:hAnsi="C64 Pro Mono"/>
+          <w:color w:val="FFFFFF" w:themeColor="background1"/>
+        </w:rPr>
+      </w:pPr>
+      <w:r>
+        <w:rPr>
+          <w:rFonts w:ascii="C64 Pro Mono" w:hAnsi="C64 Pro Mono"/>
+          <w:color w:val="FFFFFF" w:themeColor="background1"/>
+        </w:rPr>
+        <w:t>Sprites still exist in p</w:t>
+      </w:r>
+      <w:r>
+        <w:rPr>
+          <w:rFonts w:ascii="C64 Pro Mono" w:hAnsi="C64 Pro Mono"/>
+          <w:color w:val="FFFFFF" w:themeColor="background1"/>
+        </w:rPr>
+        <w:t>r</w:t>
+      </w:r>
+      <w:r>
+        <w:rPr>
+          <w:rFonts w:ascii="C64 Pro Mono" w:hAnsi="C64 Pro Mono"/>
+          <w:color w:val="FFFFFF" w:themeColor="background1"/>
+        </w:rPr>
+        <w:t>ogramming languages</w:t>
+      </w:r>
+    </w:p>
+    <w:p>
+      <w:pPr>
+        <w:pStyle w:val="ListParagraph"/>
+        <w:rPr>
+          <w:rFonts w:ascii="C64 Pro Mono" w:hAnsi="C64 Pro Mono"/>
+          <w:color w:val="FFFFFF" w:themeColor="background1"/>
+        </w:rPr>
+      </w:pPr>
+    </w:p>
+    <w:p>
+      <w:pPr>
+        <w:pStyle w:val="ListParagraph"/>
+        <w:rPr>
+          <w:rFonts w:ascii="C64 Pro Mono" w:hAnsi="C64 Pro Mono"/>
+          <w:color w:val="FFFFFF" w:themeColor="background1"/>
+          <w:sz w:val="16"/>
+          <w:szCs w:val="16"/>
+        </w:rPr>
+      </w:pPr>
+      <w:r>
+        <w:rPr>
+          <w:rFonts w:ascii="C64 Pro Mono" w:hAnsi="C64 Pro Mono"/>
+          <w:color w:val="FFFFFF" w:themeColor="background1"/>
+        </w:rPr>
+        <w:t>Other modern languages supporting sprites:</w:t>
+      </w:r>
+      <w:r>
+        <w:rPr>
+          <w:rFonts w:ascii="C64 Pro Mono" w:hAnsi="C64 Pro Mono"/>
+          <w:color w:val="FFFFFF" w:themeColor="background1"/>
+        </w:rPr>
+        <w:br/>
+      </w:r>
+      <w:r>
+        <w:rPr>
+          <w:rFonts w:ascii="C64 Pro Mono" w:hAnsi="C64 Pro Mono"/>
+          <w:color w:val="FFFFFF" w:themeColor="background1"/>
+          <w:sz w:val="18"/>
+          <w:szCs w:val="18"/>
+        </w:rPr>
+        <w:t xml:space="preserve">C# (Unity, </w:t>
+      </w:r>
+      <w:proofErr w:type="spellStart"/>
+      <w:r>
+        <w:rPr>
+          <w:rFonts w:ascii="C64 Pro Mono" w:hAnsi="C64 Pro Mono"/>
+          <w:color w:val="FFFFFF" w:themeColor="background1"/>
+          <w:sz w:val="18"/>
+          <w:szCs w:val="18"/>
+        </w:rPr>
+        <w:t>MonoGame</w:t>
+      </w:r>
+      <w:proofErr w:type="spellEnd"/>
+      <w:r>
+        <w:rPr>
+          <w:rFonts w:ascii="C64 Pro Mono" w:hAnsi="C64 Pro Mono"/>
+          <w:color w:val="FFFFFF" w:themeColor="background1"/>
+          <w:sz w:val="18"/>
+          <w:szCs w:val="18"/>
+        </w:rPr>
+        <w:t xml:space="preserve">) </w:t>
+      </w:r>
+      <w:r>
+        <w:rPr>
+          <w:rFonts w:ascii="C64 Pro Mono" w:hAnsi="C64 Pro Mono"/>
+          <w:color w:val="FFFFFF" w:themeColor="background1"/>
+          <w:sz w:val="18"/>
+          <w:szCs w:val="18"/>
+        </w:rPr>
+        <w:br/>
+      </w:r>
+      <w:r>
+        <w:rPr>
+          <w:rFonts w:ascii="C64 Pro Mono" w:hAnsi="C64 Pro Mono"/>
+          <w:color w:val="FFFFFF" w:themeColor="background1"/>
+          <w:sz w:val="18"/>
+          <w:szCs w:val="18"/>
+        </w:rPr>
+        <w:t>Swift</w:t>
+      </w:r>
+      <w:r>
+        <w:rPr>
+          <w:rFonts w:ascii="C64 Pro Mono" w:hAnsi="C64 Pro Mono"/>
+          <w:color w:val="FFFFFF" w:themeColor="background1"/>
+          <w:sz w:val="18"/>
+          <w:szCs w:val="18"/>
+        </w:rPr>
         <w:t xml:space="preserve"> </w:t>
       </w:r>
-    </w:p>
-    <w:p>
-      <w:pPr>
-        <w:pStyle w:val="ListParagraph"/>
+      <w:r>
+        <w:rPr>
+          <w:rFonts w:ascii="C64 Pro Mono" w:hAnsi="C64 Pro Mono"/>
+          <w:color w:val="FFFFFF" w:themeColor="background1"/>
+          <w:sz w:val="18"/>
+          <w:szCs w:val="18"/>
+        </w:rPr>
+        <w:t>(</w:t>
+      </w:r>
+      <w:proofErr w:type="spellStart"/>
+      <w:r>
+        <w:rPr>
+          <w:rFonts w:ascii="C64 Pro Mono" w:hAnsi="C64 Pro Mono"/>
+          <w:color w:val="FFFFFF" w:themeColor="background1"/>
+          <w:sz w:val="18"/>
+          <w:szCs w:val="18"/>
+        </w:rPr>
+        <w:t>SpriteKit</w:t>
+      </w:r>
+      <w:proofErr w:type="spellEnd"/>
+      <w:r>
+        <w:rPr>
+          <w:rFonts w:ascii="C64 Pro Mono" w:hAnsi="C64 Pro Mono"/>
+          <w:color w:val="FFFFFF" w:themeColor="background1"/>
+          <w:sz w:val="18"/>
+          <w:szCs w:val="18"/>
+        </w:rPr>
+        <w:t>)</w:t>
+      </w:r>
+      <w:r>
+        <w:rPr>
+          <w:rFonts w:ascii="C64 Pro Mono" w:hAnsi="C64 Pro Mono"/>
+          <w:color w:val="FFFFFF" w:themeColor="background1"/>
+          <w:sz w:val="18"/>
+          <w:szCs w:val="18"/>
+        </w:rPr>
+        <w:br/>
+        <w:t>Rust</w:t>
+      </w:r>
+      <w:r>
+        <w:rPr>
+          <w:rFonts w:ascii="C64 Pro Mono" w:hAnsi="C64 Pro Mono"/>
+          <w:color w:val="FFFFFF" w:themeColor="background1"/>
+          <w:sz w:val="18"/>
+          <w:szCs w:val="18"/>
+        </w:rPr>
+        <w:t xml:space="preserve"> </w:t>
+      </w:r>
+      <w:r>
+        <w:rPr>
+          <w:rFonts w:ascii="C64 Pro Mono" w:hAnsi="C64 Pro Mono"/>
+          <w:color w:val="FFFFFF" w:themeColor="background1"/>
+          <w:sz w:val="18"/>
+          <w:szCs w:val="18"/>
+        </w:rPr>
+        <w:t xml:space="preserve">(Bevy, </w:t>
+      </w:r>
+      <w:proofErr w:type="spellStart"/>
+      <w:r>
+        <w:rPr>
+          <w:rFonts w:ascii="C64 Pro Mono" w:hAnsi="C64 Pro Mono"/>
+          <w:color w:val="FFFFFF" w:themeColor="background1"/>
+          <w:sz w:val="18"/>
+          <w:szCs w:val="18"/>
+        </w:rPr>
+        <w:t>ggez</w:t>
+      </w:r>
+      <w:proofErr w:type="spellEnd"/>
+      <w:r>
+        <w:rPr>
+          <w:rFonts w:ascii="C64 Pro Mono" w:hAnsi="C64 Pro Mono"/>
+          <w:color w:val="FFFFFF" w:themeColor="background1"/>
+          <w:sz w:val="18"/>
+          <w:szCs w:val="18"/>
+        </w:rPr>
+        <w:t>),</w:t>
+      </w:r>
+      <w:r>
+        <w:rPr>
+          <w:rFonts w:ascii="C64 Pro Mono" w:hAnsi="C64 Pro Mono"/>
+          <w:color w:val="FFFFFF" w:themeColor="background1"/>
+          <w:sz w:val="18"/>
+          <w:szCs w:val="18"/>
+        </w:rPr>
+        <w:br/>
+        <w:t>Lua</w:t>
+      </w:r>
+      <w:r>
+        <w:rPr>
+          <w:rFonts w:ascii="C64 Pro Mono" w:hAnsi="C64 Pro Mono"/>
+          <w:color w:val="FFFFFF" w:themeColor="background1"/>
+          <w:sz w:val="18"/>
+          <w:szCs w:val="18"/>
+        </w:rPr>
+        <w:t xml:space="preserve"> </w:t>
+      </w:r>
+      <w:r>
+        <w:rPr>
+          <w:rFonts w:ascii="C64 Pro Mono" w:hAnsi="C64 Pro Mono"/>
+          <w:color w:val="FFFFFF" w:themeColor="background1"/>
+          <w:sz w:val="18"/>
+          <w:szCs w:val="18"/>
+        </w:rPr>
+        <w:t>(Love2D)</w:t>
+      </w:r>
+    </w:p>
+    <w:p>
+      <w:pPr>
         <w:rPr>
           <w:rFonts w:ascii="C64 Pro Mono" w:hAnsi="C64 Pro Mono"/>
           <w:color w:val="FFFFFF" w:themeColor="background1"/>
@@ -7372,23 +7603,7 @@
           <w:rFonts w:ascii="C64 Pro Mono" w:hAnsi="C64 Pro Mono"/>
           <w:color w:val="FFFFFF" w:themeColor="background1"/>
         </w:rPr>
-        <w:t xml:space="preserve">Sprites still exist in </w:t>
-      </w:r>
-      <w:proofErr w:type="spellStart"/>
-      <w:r>
-        <w:rPr>
-          <w:rFonts w:ascii="C64 Pro Mono" w:hAnsi="C64 Pro Mono"/>
-          <w:color w:val="FFFFFF" w:themeColor="background1"/>
-        </w:rPr>
-        <w:t>pogramming</w:t>
-      </w:r>
-      <w:proofErr w:type="spellEnd"/>
-      <w:r>
-        <w:rPr>
-          <w:rFonts w:ascii="C64 Pro Mono" w:hAnsi="C64 Pro Mono"/>
-          <w:color w:val="FFFFFF" w:themeColor="background1"/>
-        </w:rPr>
-        <w:t xml:space="preserve"> languages</w:t>
+        <w:t>Sprites are no more hardware-based</w:t>
       </w:r>
     </w:p>
     <w:p>
@@ -7416,50 +7631,7 @@
           <w:rFonts w:ascii="C64 Pro Mono" w:hAnsi="C64 Pro Mono"/>
           <w:color w:val="FFFFFF" w:themeColor="background1"/>
         </w:rPr>
-        <w:t>Sprites are no more hardware-based</w:t>
-      </w:r>
-    </w:p>
-    <w:p>
-      <w:pPr>
-        <w:rPr>
-          <w:rFonts w:ascii="C64 Pro Mono" w:hAnsi="C64 Pro Mono"/>
-          <w:color w:val="FFFFFF" w:themeColor="background1"/>
-        </w:rPr>
-      </w:pPr>
-    </w:p>
-    <w:p>
-      <w:pPr>
-        <w:pStyle w:val="ListParagraph"/>
-        <w:numPr>
-          <w:ilvl w:val="0"/>
-          <w:numId w:val="12"/>
-        </w:numPr>
-        <w:rPr>
-          <w:rFonts w:ascii="C64 Pro Mono" w:hAnsi="C64 Pro Mono"/>
-          <w:color w:val="FFFFFF" w:themeColor="background1"/>
-        </w:rPr>
-      </w:pPr>
-      <w:r>
-        <w:rPr>
-          <w:rFonts w:ascii="C64 Pro Mono" w:hAnsi="C64 Pro Mono"/>
-          <w:color w:val="FFFFFF" w:themeColor="background1"/>
-        </w:rPr>
         <w:t>Games went 3D, making 2D sprites not that crucial in game development</w:t>
-      </w:r>
-    </w:p>
-    <w:p>
-      <w:pPr>
-        <w:rPr>
-          <w:rFonts w:ascii="C64 Pro Mono" w:hAnsi="C64 Pro Mono"/>
-          <w:color w:val="FFFFFF" w:themeColor="background1"/>
-        </w:rPr>
-      </w:pPr>
-      <w:r>
-        <w:rPr>
-          <w:rFonts w:ascii="C64 Pro Mono" w:hAnsi="C64 Pro Mono"/>
-          <w:color w:val="FFFFFF" w:themeColor="background1"/>
-        </w:rPr>
-        <w:br w:type="page"/>
       </w:r>
     </w:p>
     <w:p>
@@ -10722,6 +10894,7 @@
   <w:style w:type="character" w:default="1" w:styleId="DefaultParagraphFont">
     <w:name w:val="Default Paragraph Font"/>
     <w:uiPriority w:val="1"/>
+    <w:semiHidden/>
     <w:unhideWhenUsed/>
   </w:style>
   <w:style w:type="table" w:default="1" w:styleId="TableNormal">

</xml_diff>